<commit_message>
docs: synchronize SnapIMS v0.5.1 operator documentation
</commit_message>
<xml_diff>
--- a/SnapIMS_Operator_Guide.docx
+++ b/SnapIMS_Operator_Guide.docx
@@ -4,14 +4,14 @@
   <w:body>
     <w:p>
       <w:pPr>
-        <w:spacing w:before="1800"/>
+        <w:spacing w:before="2160"/>
         <w:jc w:val="center"/>
       </w:pPr>
       <w:r>
         <w:rPr>
           <w:b/>
-          <w:color w:val="18744E"/>
-          <w:sz w:val="104"/>
+          <w:color w:val="1B774F"/>
+          <w:sz w:val="80"/>
         </w:rPr>
         <w:t>SnapIMS</w:t>
       </w:r>
@@ -23,7 +23,7 @@
       <w:r>
         <w:rPr>
           <w:b/>
-          <w:sz w:val="60"/>
+          <w:sz w:val="56"/>
         </w:rPr>
         <w:t>Operator Guide</w:t>
       </w:r>
@@ -34,53 +34,47 @@
       </w:pPr>
       <w:r>
         <w:rPr>
-          <w:color w:val="5A6460"/>
           <w:sz w:val="32"/>
         </w:rPr>
-        <w:t>Version 0.5.0 - Reconstruction Release</w:t>
+        <w:t>Version 0.5.1 - Verification Hardening Patch</w:t>
       </w:r>
     </w:p>
     <w:p>
       <w:pPr>
-        <w:spacing w:before="360"/>
         <w:jc w:val="center"/>
       </w:pPr>
       <w:r>
-        <w:rPr>
-          <w:sz w:val="28"/>
-        </w:rPr>
         <w:t>Photo-first inventory ingestion for Canada VHS</w:t>
+        <w:br/>
+        <w:t>FastAPI/Jinja browser workstation · SQLite schema 5</w:t>
       </w:r>
     </w:p>
     <w:p>
       <w:pPr>
-        <w:spacing w:before="1800"/>
+        <w:spacing w:before="1728"/>
         <w:jc w:val="center"/>
       </w:pPr>
       <w:r>
-        <w:t>Use the browser application as the source of truth. This guide matches the verified v0.5.0 interface.</w:t>
+        <w:t>Use the final browser UI as the source of truth.</w:t>
+        <w:br/>
+        <w:t>Mock and simulation screenshots do not prove live AI or live Shopify.</w:t>
       </w:r>
     </w:p>
     <w:p>
+      <w:r>
+        <w:br w:type="page"/>
+      </w:r>
+    </w:p>
+    <w:p>
       <w:pPr>
         <w:pStyle w:val="Heading1"/>
-        <w:keepNext/>
-        <w:pageBreakBefore/>
-        <w:spacing w:before="0"/>
-        <w:jc w:val="left"/>
       </w:pPr>
       <w:r>
         <w:t>Quick start</w:t>
       </w:r>
     </w:p>
     <w:p>
-      <w:pPr>
-        <w:spacing w:after="140"/>
-      </w:pPr>
       <w:r>
-        <w:rPr>
-          <w:color w:val="555F5C"/>
-        </w:rPr>
         <w:t>The routine operator flow is intentionally short.</w:t>
       </w:r>
     </w:p>
@@ -88,88 +82,67 @@
       <w:tblPr>
         <w:tblStyle w:val="TableGrid"/>
         <w:tblW w:type="auto" w:w="0"/>
-        <w:jc w:val="center"/>
         <w:tblLook w:firstColumn="1" w:firstRow="1" w:lastColumn="0" w:lastRow="0" w:noHBand="0" w:noVBand="1" w:val="04A0"/>
       </w:tblPr>
       <w:tblGrid>
-        <w:gridCol w:w="2851"/>
-        <w:gridCol w:w="2851"/>
-        <w:gridCol w:w="2851"/>
-        <w:gridCol w:w="2851"/>
-        <w:gridCol w:w="2851"/>
+        <w:gridCol w:w="2045"/>
+        <w:gridCol w:w="2045"/>
+        <w:gridCol w:w="2045"/>
+        <w:gridCol w:w="2045"/>
+        <w:gridCol w:w="2045"/>
       </w:tblGrid>
       <w:tr>
         <w:tc>
           <w:tcPr>
-            <w:tcW w:type="dxa" w:w="2851"/>
-            <w:vAlign w:val="center"/>
+            <w:tcW w:type="dxa" w:w="2045"/>
+            <w:shd w:fill="D9EDE3"/>
           </w:tcPr>
           <w:p>
             <w:r>
-              <w:rPr>
-                <w:b/>
-                <w:color w:val="18744E"/>
-              </w:rPr>
               <w:t>1. Photograph</w:t>
             </w:r>
           </w:p>
         </w:tc>
         <w:tc>
           <w:tcPr>
-            <w:tcW w:type="dxa" w:w="2851"/>
-            <w:vAlign w:val="center"/>
+            <w:tcW w:type="dxa" w:w="2045"/>
+            <w:shd w:fill="D9EDE3"/>
           </w:tcPr>
           <w:p>
             <w:r>
-              <w:rPr>
-                <w:b/>
-                <w:color w:val="18744E"/>
-              </w:rPr>
               <w:t>2. Import</w:t>
             </w:r>
           </w:p>
         </w:tc>
         <w:tc>
           <w:tcPr>
-            <w:tcW w:type="dxa" w:w="2851"/>
-            <w:vAlign w:val="center"/>
+            <w:tcW w:type="dxa" w:w="2045"/>
+            <w:shd w:fill="D9EDE3"/>
           </w:tcPr>
           <w:p>
             <w:r>
-              <w:rPr>
-                <w:b/>
-                <w:color w:val="18744E"/>
-              </w:rPr>
               <w:t>3. Identify</w:t>
             </w:r>
           </w:p>
         </w:tc>
         <w:tc>
           <w:tcPr>
-            <w:tcW w:type="dxa" w:w="2851"/>
-            <w:vAlign w:val="center"/>
+            <w:tcW w:type="dxa" w:w="2045"/>
+            <w:shd w:fill="D9EDE3"/>
           </w:tcPr>
           <w:p>
             <w:r>
-              <w:rPr>
-                <w:b/>
-                <w:color w:val="18744E"/>
-              </w:rPr>
               <w:t>4. Review</w:t>
             </w:r>
           </w:p>
         </w:tc>
         <w:tc>
           <w:tcPr>
-            <w:tcW w:type="dxa" w:w="2851"/>
-            <w:vAlign w:val="center"/>
+            <w:tcW w:type="dxa" w:w="2045"/>
+            <w:shd w:fill="D9EDE3"/>
           </w:tcPr>
           <w:p>
             <w:r>
-              <w:rPr>
-                <w:b/>
-                <w:color w:val="18744E"/>
-              </w:rPr>
               <w:t>5. Publish</w:t>
             </w:r>
           </w:p>
@@ -178,7 +151,7 @@
       <w:tr>
         <w:tc>
           <w:tcPr>
-            <w:tcW w:type="dxa" w:w="2851"/>
+            <w:tcW w:type="dxa" w:w="2045"/>
           </w:tcPr>
           <w:p>
             <w:r>
@@ -188,7 +161,7 @@
         </w:tc>
         <w:tc>
           <w:tcPr>
-            <w:tcW w:type="dxa" w:w="2851"/>
+            <w:tcW w:type="dxa" w:w="2045"/>
           </w:tcPr>
           <w:p>
             <w:r>
@@ -198,7 +171,7 @@
         </w:tc>
         <w:tc>
           <w:tcPr>
-            <w:tcW w:type="dxa" w:w="2851"/>
+            <w:tcW w:type="dxa" w:w="2045"/>
           </w:tcPr>
           <w:p>
             <w:r>
@@ -208,17 +181,17 @@
         </w:tc>
         <w:tc>
           <w:tcPr>
-            <w:tcW w:type="dxa" w:w="2851"/>
+            <w:tcW w:type="dxa" w:w="2045"/>
           </w:tcPr>
           <w:p>
             <w:r>
-              <w:t>Confirm the title; optionally change Price or Discount; press ✓ Approve &amp; Next.</w:t>
+              <w:t>Confirm title; optionally adjust Price or Discount; Approve &amp; Next.</w:t>
             </w:r>
           </w:p>
         </w:tc>
         <w:tc>
           <w:tcPr>
-            <w:tcW w:type="dxa" w:w="2851"/>
+            <w:tcW w:type="dxa" w:w="2045"/>
           </w:tcPr>
           <w:p>
             <w:r>
@@ -231,69 +204,59 @@
     <w:p>
       <w:pPr>
         <w:pStyle w:val="ListBullet"/>
-        <w:spacing w:after="40"/>
       </w:pPr>
       <w:r>
-        <w:t>Use Edit only when the recognized record needs deeper correction.</w:t>
+        <w:t>Edit is exception mode, not the routine path.</w:t>
       </w:r>
     </w:p>
     <w:p>
       <w:pPr>
         <w:pStyle w:val="ListBullet"/>
-        <w:spacing w:after="40"/>
       </w:pPr>
       <w:r>
-        <w:t>Use Later to postpone a tape without finishing it.</w:t>
+        <w:t>Later postpones a tape and leaves it unfinished.</w:t>
       </w:r>
     </w:p>
     <w:p>
       <w:pPr>
         <w:pStyle w:val="ListBullet"/>
-        <w:spacing w:after="40"/>
       </w:pPr>
       <w:r>
-        <w:t>Never change an Item ID. It is the permanent identity used by Review, CSV, and Shopify.</w:t>
+        <w:t>Never change Item ID; it is permanent across Review, CSV, and Shopify.</w:t>
       </w:r>
     </w:p>
     <w:p>
       <w:pPr>
-        <w:pStyle w:val="Heading1"/>
-        <w:keepNext/>
-        <w:pageBreakBefore/>
-        <w:spacing w:before="0"/>
-        <w:jc w:val="left"/>
+        <w:pStyle w:val="ListBullet"/>
+      </w:pPr>
+      <w:r>
+        <w:t>Real operator time per tape must be measured during the live pilot.</w:t>
+      </w:r>
+    </w:p>
+    <w:p>
+      <w:pPr>
+        <w:pStyle w:val="Heading2"/>
       </w:pPr>
       <w:r>
         <w:t>QR photography sequence</w:t>
       </w:r>
     </w:p>
-    <w:p>
-      <w:pPr>
-        <w:spacing w:after="140"/>
-      </w:pPr>
-      <w:r>
-        <w:rPr>
-          <w:color w:val="555F5C"/>
-        </w:rPr>
-        <w:t>NEXT is the sole normal item boundary. Time gaps never split items.</w:t>
-      </w:r>
-    </w:p>
     <w:tbl>
       <w:tblPr>
-        <w:tblStyle w:val="LightShading-Accent1"/>
+        <w:tblStyle w:val="TableGrid"/>
         <w:tblW w:type="auto" w:w="0"/>
-        <w:jc w:val="center"/>
         <w:tblLook w:firstColumn="1" w:firstRow="1" w:lastColumn="0" w:lastRow="0" w:noHBand="0" w:noVBand="1" w:val="04A0"/>
       </w:tblPr>
       <w:tblGrid>
-        <w:gridCol w:w="4752"/>
-        <w:gridCol w:w="4752"/>
-        <w:gridCol w:w="4752"/>
+        <w:gridCol w:w="3408"/>
+        <w:gridCol w:w="3408"/>
+        <w:gridCol w:w="3408"/>
       </w:tblGrid>
       <w:tr>
         <w:tc>
           <w:tcPr>
-            <w:tcW w:type="dxa" w:w="4752"/>
+            <w:tcW w:type="dxa" w:w="3408"/>
+            <w:shd w:fill="D9EDE3"/>
           </w:tcPr>
           <w:p>
             <w:r>
@@ -303,7 +266,8 @@
         </w:tc>
         <w:tc>
           <w:tcPr>
-            <w:tcW w:type="dxa" w:w="4752"/>
+            <w:tcW w:type="dxa" w:w="3408"/>
+            <w:shd w:fill="D9EDE3"/>
           </w:tcPr>
           <w:p>
             <w:r>
@@ -313,7 +277,8 @@
         </w:tc>
         <w:tc>
           <w:tcPr>
-            <w:tcW w:type="dxa" w:w="4752"/>
+            <w:tcW w:type="dxa" w:w="3408"/>
+            <w:shd w:fill="D9EDE3"/>
           </w:tcPr>
           <w:p>
             <w:r>
@@ -325,7 +290,7 @@
       <w:tr>
         <w:tc>
           <w:tcPr>
-            <w:tcW w:type="dxa" w:w="4752"/>
+            <w:tcW w:type="dxa" w:w="3408"/>
           </w:tcPr>
           <w:p>
             <w:r>
@@ -335,7 +300,7 @@
         </w:tc>
         <w:tc>
           <w:tcPr>
-            <w:tcW w:type="dxa" w:w="4752"/>
+            <w:tcW w:type="dxa" w:w="3408"/>
           </w:tcPr>
           <w:p>
             <w:r>
@@ -345,7 +310,7 @@
         </w:tc>
         <w:tc>
           <w:tcPr>
-            <w:tcW w:type="dxa" w:w="4752"/>
+            <w:tcW w:type="dxa" w:w="3408"/>
           </w:tcPr>
           <w:p>
             <w:r>
@@ -357,7 +322,7 @@
       <w:tr>
         <w:tc>
           <w:tcPr>
-            <w:tcW w:type="dxa" w:w="4752"/>
+            <w:tcW w:type="dxa" w:w="3408"/>
           </w:tcPr>
           <w:p>
             <w:r>
@@ -367,7 +332,7 @@
         </w:tc>
         <w:tc>
           <w:tcPr>
-            <w:tcW w:type="dxa" w:w="4752"/>
+            <w:tcW w:type="dxa" w:w="3408"/>
           </w:tcPr>
           <w:p>
             <w:r>
@@ -377,11 +342,11 @@
         </w:tc>
         <w:tc>
           <w:tcPr>
-            <w:tcW w:type="dxa" w:w="4752"/>
+            <w:tcW w:type="dxa" w:w="3408"/>
           </w:tcPr>
           <w:p>
             <w:r>
-              <w:t>Applies the shelf to following items.</w:t>
+              <w:t>Applies shelf to following items.</w:t>
             </w:r>
           </w:p>
         </w:tc>
@@ -389,31 +354,31 @@
       <w:tr>
         <w:tc>
           <w:tcPr>
-            <w:tcW w:type="dxa" w:w="4752"/>
+            <w:tcW w:type="dxa" w:w="3408"/>
           </w:tcPr>
           <w:p>
             <w:r>
-              <w:t>PRODUCT PHOTOS</w:t>
+              <w:t>PRODUCT</w:t>
             </w:r>
           </w:p>
         </w:tc>
         <w:tc>
           <w:tcPr>
-            <w:tcW w:type="dxa" w:w="4752"/>
+            <w:tcW w:type="dxa" w:w="3408"/>
           </w:tcPr>
           <w:p>
             <w:r>
-              <w:t>Front, back, spine, open case</w:t>
+              <w:t>ordinary photos</w:t>
             </w:r>
           </w:p>
         </w:tc>
         <w:tc>
           <w:tcPr>
-            <w:tcW w:type="dxa" w:w="4752"/>
+            <w:tcW w:type="dxa" w:w="3408"/>
           </w:tcPr>
           <w:p>
             <w:r>
-              <w:t>The first product photo becomes Front.</w:t>
+              <w:t>First product photo is Front.</w:t>
             </w:r>
           </w:p>
         </w:tc>
@@ -421,7 +386,7 @@
       <w:tr>
         <w:tc>
           <w:tcPr>
-            <w:tcW w:type="dxa" w:w="4752"/>
+            <w:tcW w:type="dxa" w:w="3408"/>
           </w:tcPr>
           <w:p>
             <w:r>
@@ -431,7 +396,7 @@
         </w:tc>
         <w:tc>
           <w:tcPr>
-            <w:tcW w:type="dxa" w:w="4752"/>
+            <w:tcW w:type="dxa" w:w="3408"/>
           </w:tcPr>
           <w:p>
             <w:r>
@@ -441,11 +406,11 @@
         </w:tc>
         <w:tc>
           <w:tcPr>
-            <w:tcW w:type="dxa" w:w="4752"/>
+            <w:tcW w:type="dxa" w:w="3408"/>
           </w:tcPr>
           <w:p>
             <w:r>
-              <w:t>Closes the current item and starts the next item when the next ordinary photo arrives.</w:t>
+              <w:t>Sole normal item boundary.</w:t>
             </w:r>
           </w:p>
         </w:tc>
@@ -453,7 +418,7 @@
       <w:tr>
         <w:tc>
           <w:tcPr>
-            <w:tcW w:type="dxa" w:w="4752"/>
+            <w:tcW w:type="dxa" w:w="3408"/>
           </w:tcPr>
           <w:p>
             <w:r>
@@ -463,7 +428,7 @@
         </w:tc>
         <w:tc>
           <w:tcPr>
-            <w:tcW w:type="dxa" w:w="4752"/>
+            <w:tcW w:type="dxa" w:w="3408"/>
           </w:tcPr>
           <w:p>
             <w:r>
@@ -473,11 +438,11 @@
         </w:tc>
         <w:tc>
           <w:tcPr>
-            <w:tcW w:type="dxa" w:w="4752"/>
+            <w:tcW w:type="dxa" w:w="3408"/>
           </w:tcPr>
           <w:p>
             <w:r>
-              <w:t>Apply to the next item and then reset.</w:t>
+              <w:t>Apply to next item, then reset.</w:t>
             </w:r>
           </w:p>
         </w:tc>
@@ -485,7 +450,7 @@
       <w:tr>
         <w:tc>
           <w:tcPr>
-            <w:tcW w:type="dxa" w:w="4752"/>
+            <w:tcW w:type="dxa" w:w="3408"/>
           </w:tcPr>
           <w:p>
             <w:r>
@@ -495,7 +460,7 @@
         </w:tc>
         <w:tc>
           <w:tcPr>
-            <w:tcW w:type="dxa" w:w="4752"/>
+            <w:tcW w:type="dxa" w:w="3408"/>
           </w:tcPr>
           <w:p>
             <w:r>
@@ -505,50 +470,29 @@
         </w:tc>
         <w:tc>
           <w:tcPr>
-            <w:tcW w:type="dxa" w:w="4752"/>
+            <w:tcW w:type="dxa" w:w="3408"/>
           </w:tcPr>
           <w:p>
             <w:r>
-              <w:t>Closes the final item and batch.</w:t>
+              <w:t>Closes final item and batch.</w:t>
             </w:r>
           </w:p>
         </w:tc>
       </w:tr>
     </w:tbl>
     <w:p>
-      <w:pPr>
-        <w:pStyle w:val="ListBullet"/>
-        <w:spacing w:after="40"/>
-      </w:pPr>
       <w:r>
-        <w:t>Do not photograph CONT in normal operation. It is deprecated compatibility only.</w:t>
+        <w:t>Time gaps never split items. CONT is deprecated compatibility only. Command images are preserved for audit but never attached to products.</w:t>
       </w:r>
     </w:p>
     <w:p>
-      <w:pPr>
-        <w:pStyle w:val="ListBullet"/>
-        <w:spacing w:after="40"/>
-      </w:pPr>
       <w:r>
-        <w:t>Do not place a LOCATION card inside an item unless you intend the new shelf to begin after NEXT.</w:t>
+        <w:br w:type="page"/>
       </w:r>
     </w:p>
     <w:p>
       <w:pPr>
-        <w:pStyle w:val="ListBullet"/>
-        <w:spacing w:after="40"/>
-      </w:pPr>
-      <w:r>
-        <w:t>Command images are preserved for audit but never attached to products.</w:t>
-      </w:r>
-    </w:p>
-    <w:p>
-      <w:pPr>
-        <w:pStyle w:val="Heading1"/>
-        <w:keepNext/>
-        <w:pageBreakBefore/>
-        <w:spacing w:before="0"/>
-        <w:jc w:val="left"/>
+        <w:pStyle w:val="Title"/>
       </w:pPr>
       <w:r>
         <w:t>Home</w:t>
@@ -556,51 +500,20 @@
     </w:p>
     <w:p>
       <w:pPr>
-        <w:spacing w:after="140"/>
+        <w:spacing w:after="160"/>
       </w:pPr>
       <w:r>
-        <w:rPr>
-          <w:color w:val="555F5C"/>
-        </w:rPr>
-        <w:t>Your starting point and current workload.</w:t>
+        <w:t>Start here. Import a new camera roll or continue the active batch. The summary cards show current workload.</w:t>
       </w:r>
     </w:p>
     <w:p>
       <w:pPr>
-        <w:pStyle w:val="ListBullet"/>
-        <w:spacing w:after="40"/>
-      </w:pPr>
-      <w:r>
-        <w:t>Use Import new batch to begin a camera roll.</w:t>
-      </w:r>
-    </w:p>
-    <w:p>
-      <w:pPr>
-        <w:pStyle w:val="ListBullet"/>
-        <w:spacing w:after="40"/>
-      </w:pPr>
-      <w:r>
-        <w:t>Continue Review returns to the active batch.</w:t>
-      </w:r>
-    </w:p>
-    <w:p>
-      <w:pPr>
-        <w:pStyle w:val="ListBullet"/>
-        <w:spacing w:after="40"/>
-      </w:pPr>
-      <w:r>
-        <w:t>Recent batches remain available without terminal commands.</w:t>
-      </w:r>
-    </w:p>
-    <w:p>
-      <w:pPr>
-        <w:spacing w:before="80"/>
         <w:jc w:val="center"/>
       </w:pPr>
       <w:r>
         <w:drawing>
           <wp:inline xmlns:a="http://schemas.openxmlformats.org/drawingml/2006/main" xmlns:pic="http://schemas.openxmlformats.org/drawingml/2006/picture">
-            <wp:extent cx="5825809" cy="5166360"/>
+            <wp:extent cx="5989320" cy="4159249"/>
             <wp:docPr id="1" name="Picture 1"/>
             <wp:cNvGraphicFramePr>
               <a:graphicFrameLocks noChangeAspect="1"/>
@@ -613,7 +526,7 @@
                     <pic:cNvPicPr/>
                   </pic:nvPicPr>
                   <pic:blipFill>
-                    <a:blip r:embed="rId10"/>
+                    <a:blip r:embed="rId11"/>
                     <a:stretch>
                       <a:fillRect/>
                     </a:stretch>
@@ -621,7 +534,7 @@
                   <pic:spPr>
                     <a:xfrm>
                       <a:off x="0" y="0"/>
-                      <a:ext cx="5825809" cy="5166360"/>
+                      <a:ext cx="5989320" cy="4159249"/>
                     </a:xfrm>
                     <a:prstGeom prst="rect"/>
                   </pic:spPr>
@@ -634,11 +547,21 @@
     </w:p>
     <w:p>
       <w:pPr>
-        <w:pStyle w:val="Heading1"/>
-        <w:keepNext/>
-        <w:pageBreakBefore/>
-        <w:spacing w:before="0"/>
-        <w:jc w:val="left"/>
+        <w:pStyle w:val="Caption"/>
+        <w:jc w:val="center"/>
+      </w:pPr>
+      <w:r>
+        <w:t>00-home.png</w:t>
+      </w:r>
+    </w:p>
+    <w:p>
+      <w:r>
+        <w:br w:type="page"/>
+      </w:r>
+    </w:p>
+    <w:p>
+      <w:pPr>
+        <w:pStyle w:val="Title"/>
       </w:pPr>
       <w:r>
         <w:t>Import - first run</w:t>
@@ -646,51 +569,20 @@
     </w:p>
     <w:p>
       <w:pPr>
-        <w:spacing w:after="140"/>
+        <w:spacing w:after="160"/>
       </w:pPr>
       <w:r>
-        <w:rPr>
-          <w:color w:val="555F5C"/>
-        </w:rPr>
-        <w:t>Routine folder selection is visible; manual path entry remains Advanced.</w:t>
+        <w:t>Use Advanced once to choose the camera-roll folder. Save it as the incoming folder so routine later imports use the selector.</w:t>
       </w:r>
     </w:p>
     <w:p>
       <w:pPr>
-        <w:pStyle w:val="ListBullet"/>
-        <w:spacing w:after="40"/>
-      </w:pPr>
-      <w:r>
-        <w:t>Select the configured incoming folder.</w:t>
-      </w:r>
-    </w:p>
-    <w:p>
-      <w:pPr>
-        <w:pStyle w:val="ListBullet"/>
-        <w:spacing w:after="40"/>
-      </w:pPr>
-      <w:r>
-        <w:t>Enter an optional batch name.</w:t>
-      </w:r>
-    </w:p>
-    <w:p>
-      <w:pPr>
-        <w:pStyle w:val="ListBullet"/>
-        <w:spacing w:after="40"/>
-      </w:pPr>
-      <w:r>
-        <w:t>Open Advanced only for first-time setup or recovery.</w:t>
-      </w:r>
-    </w:p>
-    <w:p>
-      <w:pPr>
-        <w:spacing w:before="80"/>
         <w:jc w:val="center"/>
       </w:pPr>
       <w:r>
         <w:drawing>
           <wp:inline xmlns:a="http://schemas.openxmlformats.org/drawingml/2006/main" xmlns:pic="http://schemas.openxmlformats.org/drawingml/2006/picture">
-            <wp:extent cx="7439558" cy="5166360"/>
+            <wp:extent cx="5989320" cy="4159249"/>
             <wp:docPr id="2" name="Picture 2"/>
             <wp:cNvGraphicFramePr>
               <a:graphicFrameLocks noChangeAspect="1"/>
@@ -703,7 +595,7 @@
                     <pic:cNvPicPr/>
                   </pic:nvPicPr>
                   <pic:blipFill>
-                    <a:blip r:embed="rId11"/>
+                    <a:blip r:embed="rId12"/>
                     <a:stretch>
                       <a:fillRect/>
                     </a:stretch>
@@ -711,7 +603,7 @@
                   <pic:spPr>
                     <a:xfrm>
                       <a:off x="0" y="0"/>
-                      <a:ext cx="7439558" cy="5166360"/>
+                      <a:ext cx="5989320" cy="4159249"/>
                     </a:xfrm>
                     <a:prstGeom prst="rect"/>
                   </pic:spPr>
@@ -724,63 +616,42 @@
     </w:p>
     <w:p>
       <w:pPr>
-        <w:pStyle w:val="Heading1"/>
-        <w:keepNext/>
-        <w:pageBreakBefore/>
-        <w:spacing w:before="0"/>
-        <w:jc w:val="left"/>
+        <w:pStyle w:val="Caption"/>
+        <w:jc w:val="center"/>
       </w:pPr>
       <w:r>
-        <w:t>Preview the camera roll</w:t>
+        <w:t>01-first-run-import.png</w:t>
       </w:r>
     </w:p>
     <w:p>
-      <w:pPr>
-        <w:spacing w:after="140"/>
-      </w:pPr>
       <w:r>
-        <w:rPr>
-          <w:color w:val="555F5C"/>
-        </w:rPr>
-        <w:t>Preview is explicitly temporary and shows no durable Batch ID.</w:t>
+        <w:br w:type="page"/>
       </w:r>
     </w:p>
     <w:p>
       <w:pPr>
-        <w:pStyle w:val="ListBullet"/>
-        <w:spacing w:after="40"/>
+        <w:pStyle w:val="Title"/>
       </w:pPr>
       <w:r>
-        <w:t>Confirm item, product-photo, command, and warning counts.</w:t>
+        <w:t>Preview - not imported yet</w:t>
       </w:r>
     </w:p>
     <w:p>
       <w:pPr>
-        <w:pStyle w:val="ListBullet"/>
-        <w:spacing w:after="40"/>
+        <w:spacing w:after="160"/>
       </w:pPr>
       <w:r>
-        <w:t>Do not import when grouping is wrong. Fix the camera roll or QR sequence first.</w:t>
+        <w:t>Confirm item, product-photo, command, and warning counts. Preview is temporary and does not display a durable Batch ID.</w:t>
       </w:r>
     </w:p>
     <w:p>
       <w:pPr>
-        <w:pStyle w:val="ListBullet"/>
-        <w:spacing w:after="40"/>
-      </w:pPr>
-      <w:r>
-        <w:t>Press Preserve and import batch only after the preview is correct.</w:t>
-      </w:r>
-    </w:p>
-    <w:p>
-      <w:pPr>
-        <w:spacing w:before="80"/>
         <w:jc w:val="center"/>
       </w:pPr>
       <w:r>
         <w:drawing>
           <wp:inline xmlns:a="http://schemas.openxmlformats.org/drawingml/2006/main" xmlns:pic="http://schemas.openxmlformats.org/drawingml/2006/picture">
-            <wp:extent cx="6531657" cy="5166360"/>
+            <wp:extent cx="5989320" cy="4229957"/>
             <wp:docPr id="3" name="Picture 3"/>
             <wp:cNvGraphicFramePr>
               <a:graphicFrameLocks noChangeAspect="1"/>
@@ -793,7 +664,7 @@
                     <pic:cNvPicPr/>
                   </pic:nvPicPr>
                   <pic:blipFill>
-                    <a:blip r:embed="rId12"/>
+                    <a:blip r:embed="rId13"/>
                     <a:stretch>
                       <a:fillRect/>
                     </a:stretch>
@@ -801,7 +672,7 @@
                   <pic:spPr>
                     <a:xfrm>
                       <a:off x="0" y="0"/>
-                      <a:ext cx="6531657" cy="5166360"/>
+                      <a:ext cx="5989320" cy="4229957"/>
                     </a:xfrm>
                     <a:prstGeom prst="rect"/>
                   </pic:spPr>
@@ -814,11 +685,21 @@
     </w:p>
     <w:p>
       <w:pPr>
-        <w:pStyle w:val="Heading1"/>
-        <w:keepNext/>
-        <w:pageBreakBefore/>
-        <w:spacing w:before="0"/>
-        <w:jc w:val="left"/>
+        <w:pStyle w:val="Caption"/>
+        <w:jc w:val="center"/>
+      </w:pPr>
+      <w:r>
+        <w:t>02-preview-not-imported.png</w:t>
+      </w:r>
+    </w:p>
+    <w:p>
+      <w:r>
+        <w:br w:type="page"/>
+      </w:r>
+    </w:p>
+    <w:p>
+      <w:pPr>
+        <w:pStyle w:val="Title"/>
       </w:pPr>
       <w:r>
         <w:t>Preserve and import</w:t>
@@ -826,51 +707,20 @@
     </w:p>
     <w:p>
       <w:pPr>
-        <w:spacing w:after="140"/>
+        <w:spacing w:after="160"/>
       </w:pPr>
       <w:r>
-        <w:rPr>
-          <w:color w:val="555F5C"/>
-        </w:rPr>
-        <w:t>The import produces one durable Batch ID.</w:t>
+        <w:t>After grouping is correct, preserve/import. SnapIMS displays exactly one durable Batch ID and leaves source photographs untouched.</w:t>
       </w:r>
     </w:p>
     <w:p>
       <w:pPr>
-        <w:pStyle w:val="ListBullet"/>
-        <w:spacing w:after="40"/>
-      </w:pPr>
-      <w:r>
-        <w:t>Record the displayed Batch ID when troubleshooting.</w:t>
-      </w:r>
-    </w:p>
-    <w:p>
-      <w:pPr>
-        <w:pStyle w:val="ListBullet"/>
-        <w:spacing w:after="40"/>
-      </w:pPr>
-      <w:r>
-        <w:t>Original source photographs remain untouched.</w:t>
-      </w:r>
-    </w:p>
-    <w:p>
-      <w:pPr>
-        <w:pStyle w:val="ListBullet"/>
-        <w:spacing w:after="40"/>
-      </w:pPr>
-      <w:r>
-        <w:t>Press Continue to Review to open the exact imported batch.</w:t>
-      </w:r>
-    </w:p>
-    <w:p>
-      <w:pPr>
-        <w:spacing w:before="80"/>
         <w:jc w:val="center"/>
       </w:pPr>
       <w:r>
         <w:drawing>
           <wp:inline xmlns:a="http://schemas.openxmlformats.org/drawingml/2006/main" xmlns:pic="http://schemas.openxmlformats.org/drawingml/2006/picture">
-            <wp:extent cx="7439558" cy="5166360"/>
+            <wp:extent cx="5989320" cy="4159249"/>
             <wp:docPr id="4" name="Picture 4"/>
             <wp:cNvGraphicFramePr>
               <a:graphicFrameLocks noChangeAspect="1"/>
@@ -879,11 +729,11 @@
               <a:graphicData uri="http://schemas.openxmlformats.org/drawingml/2006/picture">
                 <pic:pic>
                   <pic:nvPicPr>
-                    <pic:cNvPr id="0" name="03-imported-durable-id.png"/>
+                    <pic:cNvPr id="0" name="02-imported-durable-id.png"/>
                     <pic:cNvPicPr/>
                   </pic:nvPicPr>
                   <pic:blipFill>
-                    <a:blip r:embed="rId13"/>
+                    <a:blip r:embed="rId14"/>
                     <a:stretch>
                       <a:fillRect/>
                     </a:stretch>
@@ -891,7 +741,7 @@
                   <pic:spPr>
                     <a:xfrm>
                       <a:off x="0" y="0"/>
-                      <a:ext cx="7439558" cy="5166360"/>
+                      <a:ext cx="5989320" cy="4159249"/>
                     </a:xfrm>
                     <a:prstGeom prst="rect"/>
                   </pic:spPr>
@@ -904,63 +754,42 @@
     </w:p>
     <w:p>
       <w:pPr>
-        <w:pStyle w:val="Heading1"/>
-        <w:keepNext/>
-        <w:pageBreakBefore/>
-        <w:spacing w:before="0"/>
-        <w:jc w:val="left"/>
+        <w:pStyle w:val="Caption"/>
+        <w:jc w:val="center"/>
       </w:pPr>
       <w:r>
-        <w:t>Review - before identification</w:t>
+        <w:t>02-imported-durable-id.png</w:t>
       </w:r>
     </w:p>
     <w:p>
-      <w:pPr>
-        <w:spacing w:after="140"/>
-      </w:pPr>
       <w:r>
-        <w:rPr>
-          <w:color w:val="555F5C"/>
-        </w:rPr>
-        <w:t>One compact status explains what action is required.</w:t>
+        <w:br w:type="page"/>
       </w:r>
     </w:p>
     <w:p>
       <w:pPr>
-        <w:pStyle w:val="ListBullet"/>
-        <w:spacing w:after="40"/>
+        <w:pStyle w:val="Title"/>
       </w:pPr>
       <w:r>
-        <w:t>Select the provider. Mock is for testing; OpenAI requires a configured key.</w:t>
+        <w:t>Review before identification</w:t>
       </w:r>
     </w:p>
     <w:p>
       <w:pPr>
-        <w:pStyle w:val="ListBullet"/>
-        <w:spacing w:after="40"/>
+        <w:spacing w:after="160"/>
       </w:pPr>
       <w:r>
-        <w:t>Press Identify items once. A duplicate start action is not shown while running.</w:t>
+        <w:t>The compact status explains the next action. Select a provider and choose Identify items once.</w:t>
       </w:r>
     </w:p>
     <w:p>
       <w:pPr>
-        <w:pStyle w:val="ListBullet"/>
-        <w:spacing w:after="40"/>
-      </w:pPr>
-      <w:r>
-        <w:t>Physical item position remains visible below the status.</w:t>
-      </w:r>
-    </w:p>
-    <w:p>
-      <w:pPr>
-        <w:spacing w:before="80"/>
         <w:jc w:val="center"/>
       </w:pPr>
       <w:r>
         <w:drawing>
           <wp:inline xmlns:a="http://schemas.openxmlformats.org/drawingml/2006/main" xmlns:pic="http://schemas.openxmlformats.org/drawingml/2006/picture">
-            <wp:extent cx="5518960" cy="5166360"/>
+            <wp:extent cx="5989320" cy="5606669"/>
             <wp:docPr id="5" name="Picture 5"/>
             <wp:cNvGraphicFramePr>
               <a:graphicFrameLocks noChangeAspect="1"/>
@@ -969,11 +798,11 @@
               <a:graphicData uri="http://schemas.openxmlformats.org/drawingml/2006/picture">
                 <pic:pic>
                   <pic:nvPicPr>
-                    <pic:cNvPr id="0" name="04-review-ready-to-identify.png"/>
+                    <pic:cNvPr id="0" name="04-review-before-identification.png"/>
                     <pic:cNvPicPr/>
                   </pic:nvPicPr>
                   <pic:blipFill>
-                    <a:blip r:embed="rId14"/>
+                    <a:blip r:embed="rId15"/>
                     <a:stretch>
                       <a:fillRect/>
                     </a:stretch>
@@ -981,7 +810,7 @@
                   <pic:spPr>
                     <a:xfrm>
                       <a:off x="0" y="0"/>
-                      <a:ext cx="5518960" cy="5166360"/>
+                      <a:ext cx="5989320" cy="5606669"/>
                     </a:xfrm>
                     <a:prstGeom prst="rect"/>
                   </pic:spPr>
@@ -994,63 +823,42 @@
     </w:p>
     <w:p>
       <w:pPr>
-        <w:pStyle w:val="Heading1"/>
-        <w:keepNext/>
-        <w:pageBreakBefore/>
-        <w:spacing w:before="0"/>
-        <w:jc w:val="left"/>
+        <w:pStyle w:val="Caption"/>
+        <w:jc w:val="center"/>
       </w:pPr>
       <w:r>
-        <w:t>Review - fast path</w:t>
+        <w:t>04-review-before-identification.png</w:t>
       </w:r>
     </w:p>
     <w:p>
-      <w:pPr>
-        <w:spacing w:after="140"/>
-      </w:pPr>
       <w:r>
-        <w:rPr>
-          <w:color w:val="555F5C"/>
-        </w:rPr>
-        <w:t>The active tape, suggestion, Price, Discount, and primary action fit together.</w:t>
+        <w:br w:type="page"/>
       </w:r>
     </w:p>
     <w:p>
       <w:pPr>
-        <w:pStyle w:val="ListBullet"/>
-        <w:spacing w:after="40"/>
+        <w:pStyle w:val="Title"/>
       </w:pPr>
       <w:r>
-        <w:t>Look at the photograph and confirm the suggested title.</w:t>
+        <w:t>Recognition complete</w:t>
       </w:r>
     </w:p>
     <w:p>
       <w:pPr>
-        <w:pStyle w:val="ListBullet"/>
-        <w:spacing w:after="40"/>
+        <w:spacing w:after="160"/>
       </w:pPr>
       <w:r>
-        <w:t>Leave Price and Discount unchanged when correct.</w:t>
+        <w:t>The suggested title, Price, Discount, physical position, and primary action are visible together.</w:t>
       </w:r>
     </w:p>
     <w:p>
       <w:pPr>
-        <w:pStyle w:val="ListBullet"/>
-        <w:spacing w:after="40"/>
-      </w:pPr>
-      <w:r>
-        <w:t>Press ✓ Approve &amp; Next. No Edit mode or second confirmation is required.</w:t>
-      </w:r>
-    </w:p>
-    <w:p>
-      <w:pPr>
-        <w:spacing w:before="80"/>
         <w:jc w:val="center"/>
       </w:pPr>
       <w:r>
         <w:drawing>
           <wp:inline xmlns:a="http://schemas.openxmlformats.org/drawingml/2006/main" xmlns:pic="http://schemas.openxmlformats.org/drawingml/2006/picture">
-            <wp:extent cx="5821250" cy="5166360"/>
+            <wp:extent cx="5989320" cy="5315521"/>
             <wp:docPr id="6" name="Picture 6"/>
             <wp:cNvGraphicFramePr>
               <a:graphicFrameLocks noChangeAspect="1"/>
@@ -1063,7 +871,7 @@
                     <pic:cNvPicPr/>
                   </pic:nvPicPr>
                   <pic:blipFill>
-                    <a:blip r:embed="rId15"/>
+                    <a:blip r:embed="rId16"/>
                     <a:stretch>
                       <a:fillRect/>
                     </a:stretch>
@@ -1071,7 +879,7 @@
                   <pic:spPr>
                     <a:xfrm>
                       <a:off x="0" y="0"/>
-                      <a:ext cx="5821250" cy="5166360"/>
+                      <a:ext cx="5989320" cy="5315521"/>
                     </a:xfrm>
                     <a:prstGeom prst="rect"/>
                   </pic:spPr>
@@ -1084,11 +892,21 @@
     </w:p>
     <w:p>
       <w:pPr>
-        <w:pStyle w:val="Heading1"/>
-        <w:keepNext/>
-        <w:pageBreakBefore/>
-        <w:spacing w:before="0"/>
-        <w:jc w:val="left"/>
+        <w:pStyle w:val="Caption"/>
+        <w:jc w:val="center"/>
+      </w:pPr>
+      <w:r>
+        <w:t>05-recognition-complete.png</w:t>
+      </w:r>
+    </w:p>
+    <w:p>
+      <w:r>
+        <w:br w:type="page"/>
+      </w:r>
+    </w:p>
+    <w:p>
+      <w:pPr>
+        <w:pStyle w:val="Title"/>
       </w:pPr>
       <w:r>
         <w:t>Quick edit - Price</w:t>
@@ -1096,51 +914,20 @@
     </w:p>
     <w:p>
       <w:pPr>
-        <w:spacing w:after="140"/>
+        <w:spacing w:after="160"/>
       </w:pPr>
       <w:r>
-        <w:rPr>
-          <w:color w:val="555F5C"/>
-        </w:rPr>
-        <w:t>Price can be corrected without entering the exception editor.</w:t>
+        <w:t>Enter a corrected CAD price directly in Review, then choose Approve &amp; Next. No separate Save is required.</w:t>
       </w:r>
     </w:p>
     <w:p>
       <w:pPr>
-        <w:pStyle w:val="ListBullet"/>
-        <w:spacing w:after="40"/>
-      </w:pPr>
-      <w:r>
-        <w:t>Click Price, type the correct CAD value, then press ✓ Approve &amp; Next.</w:t>
-      </w:r>
-    </w:p>
-    <w:p>
-      <w:pPr>
-        <w:pStyle w:val="ListBullet"/>
-        <w:spacing w:after="40"/>
-      </w:pPr>
-      <w:r>
-        <w:t>The typed value and accepted AI fields are saved together.</w:t>
-      </w:r>
-    </w:p>
-    <w:p>
-      <w:pPr>
-        <w:pStyle w:val="ListBullet"/>
-        <w:spacing w:after="40"/>
-      </w:pPr>
-      <w:r>
-        <w:t>There is no additional Save button.</w:t>
-      </w:r>
-    </w:p>
-    <w:p>
-      <w:pPr>
-        <w:spacing w:before="80"/>
         <w:jc w:val="center"/>
       </w:pPr>
       <w:r>
         <w:drawing>
           <wp:inline xmlns:a="http://schemas.openxmlformats.org/drawingml/2006/main" xmlns:pic="http://schemas.openxmlformats.org/drawingml/2006/picture">
-            <wp:extent cx="5514869" cy="5166360"/>
+            <wp:extent cx="5989320" cy="5610828"/>
             <wp:docPr id="7" name="Picture 7"/>
             <wp:cNvGraphicFramePr>
               <a:graphicFrameLocks noChangeAspect="1"/>
@@ -1153,7 +940,7 @@
                     <pic:cNvPicPr/>
                   </pic:nvPicPr>
                   <pic:blipFill>
-                    <a:blip r:embed="rId16"/>
+                    <a:blip r:embed="rId17"/>
                     <a:stretch>
                       <a:fillRect/>
                     </a:stretch>
@@ -1161,7 +948,7 @@
                   <pic:spPr>
                     <a:xfrm>
                       <a:off x="0" y="0"/>
-                      <a:ext cx="5514869" cy="5166360"/>
+                      <a:ext cx="5989320" cy="5610828"/>
                     </a:xfrm>
                     <a:prstGeom prst="rect"/>
                   </pic:spPr>
@@ -1174,11 +961,21 @@
     </w:p>
     <w:p>
       <w:pPr>
-        <w:pStyle w:val="Heading1"/>
-        <w:keepNext/>
-        <w:pageBreakBefore/>
-        <w:spacing w:before="0"/>
-        <w:jc w:val="left"/>
+        <w:pStyle w:val="Caption"/>
+        <w:jc w:val="center"/>
+      </w:pPr>
+      <w:r>
+        <w:t>06-price-quick-edit.png</w:t>
+      </w:r>
+    </w:p>
+    <w:p>
+      <w:r>
+        <w:br w:type="page"/>
+      </w:r>
+    </w:p>
+    <w:p>
+      <w:pPr>
+        <w:pStyle w:val="Title"/>
       </w:pPr>
       <w:r>
         <w:t>Quick edit - Discount</w:t>
@@ -1186,51 +983,20 @@
     </w:p>
     <w:p>
       <w:pPr>
-        <w:spacing w:after="140"/>
+        <w:spacing w:after="160"/>
       </w:pPr>
       <w:r>
-        <w:rPr>
-          <w:color w:val="555F5C"/>
-        </w:rPr>
-        <w:t>Discount is part of the same one-action approval flow.</w:t>
+        <w:t>Enter the percentage directly in Review, then choose Approve &amp; Next once.</w:t>
       </w:r>
     </w:p>
     <w:p>
       <w:pPr>
-        <w:pStyle w:val="ListBullet"/>
-        <w:spacing w:after="40"/>
-      </w:pPr>
-      <w:r>
-        <w:t>Enter a percentage from 0 to 100.</w:t>
-      </w:r>
-    </w:p>
-    <w:p>
-      <w:pPr>
-        <w:pStyle w:val="ListBullet"/>
-        <w:spacing w:after="40"/>
-      </w:pPr>
-      <w:r>
-        <w:t>The Publish simulation displays base price, discount, and final price.</w:t>
-      </w:r>
-    </w:p>
-    <w:p>
-      <w:pPr>
-        <w:pStyle w:val="ListBullet"/>
-        <w:spacing w:after="40"/>
-      </w:pPr>
-      <w:r>
-        <w:t>Press ✓ Approve &amp; Next once.</w:t>
-      </w:r>
-    </w:p>
-    <w:p>
-      <w:pPr>
-        <w:spacing w:before="80"/>
         <w:jc w:val="center"/>
       </w:pPr>
       <w:r>
         <w:drawing>
           <wp:inline xmlns:a="http://schemas.openxmlformats.org/drawingml/2006/main" xmlns:pic="http://schemas.openxmlformats.org/drawingml/2006/picture">
-            <wp:extent cx="5514869" cy="5166360"/>
+            <wp:extent cx="5989320" cy="5610828"/>
             <wp:docPr id="8" name="Picture 8"/>
             <wp:cNvGraphicFramePr>
               <a:graphicFrameLocks noChangeAspect="1"/>
@@ -1243,7 +1009,7 @@
                     <pic:cNvPicPr/>
                   </pic:nvPicPr>
                   <pic:blipFill>
-                    <a:blip r:embed="rId17"/>
+                    <a:blip r:embed="rId18"/>
                     <a:stretch>
                       <a:fillRect/>
                     </a:stretch>
@@ -1251,7 +1017,7 @@
                   <pic:spPr>
                     <a:xfrm>
                       <a:off x="0" y="0"/>
-                      <a:ext cx="5514869" cy="5166360"/>
+                      <a:ext cx="5989320" cy="5610828"/>
                     </a:xfrm>
                     <a:prstGeom prst="rect"/>
                   </pic:spPr>
@@ -1264,11 +1030,21 @@
     </w:p>
     <w:p>
       <w:pPr>
-        <w:pStyle w:val="Heading1"/>
-        <w:keepNext/>
-        <w:pageBreakBefore/>
-        <w:spacing w:before="0"/>
-        <w:jc w:val="left"/>
+        <w:pStyle w:val="Caption"/>
+        <w:jc w:val="center"/>
+      </w:pPr>
+      <w:r>
+        <w:t>07-discount-quick-edit.png</w:t>
+      </w:r>
+    </w:p>
+    <w:p>
+      <w:r>
+        <w:br w:type="page"/>
+      </w:r>
+    </w:p>
+    <w:p>
+      <w:pPr>
+        <w:pStyle w:val="Title"/>
       </w:pPr>
       <w:r>
         <w:t>Quick edit - Price and Discount</w:t>
@@ -1276,42 +1052,20 @@
     </w:p>
     <w:p>
       <w:pPr>
-        <w:spacing w:after="140"/>
+        <w:spacing w:after="160"/>
       </w:pPr>
       <w:r>
-        <w:rPr>
-          <w:color w:val="555F5C"/>
-        </w:rPr>
-        <w:t>Both quick fields can be changed before one approval.</w:t>
+        <w:t>Both fields can be changed before the same one-action approval.</w:t>
       </w:r>
     </w:p>
     <w:p>
       <w:pPr>
-        <w:pStyle w:val="ListBullet"/>
-        <w:spacing w:after="40"/>
-      </w:pPr>
-      <w:r>
-        <w:t>Use this only when the normal listing needs both adjustments.</w:t>
-      </w:r>
-    </w:p>
-    <w:p>
-      <w:pPr>
-        <w:pStyle w:val="ListBullet"/>
-        <w:spacing w:after="40"/>
-      </w:pPr>
-      <w:r>
-        <w:t>Approval marks the item Done and opens the next unfinished physical tape.</w:t>
-      </w:r>
-    </w:p>
-    <w:p>
-      <w:pPr>
-        <w:spacing w:before="80"/>
         <w:jc w:val="center"/>
       </w:pPr>
       <w:r>
         <w:drawing>
           <wp:inline xmlns:a="http://schemas.openxmlformats.org/drawingml/2006/main" xmlns:pic="http://schemas.openxmlformats.org/drawingml/2006/picture">
-            <wp:extent cx="5514869" cy="5166360"/>
+            <wp:extent cx="5989320" cy="5610828"/>
             <wp:docPr id="9" name="Picture 9"/>
             <wp:cNvGraphicFramePr>
               <a:graphicFrameLocks noChangeAspect="1"/>
@@ -1324,7 +1078,7 @@
                     <pic:cNvPicPr/>
                   </pic:nvPicPr>
                   <pic:blipFill>
-                    <a:blip r:embed="rId18"/>
+                    <a:blip r:embed="rId19"/>
                     <a:stretch>
                       <a:fillRect/>
                     </a:stretch>
@@ -1332,7 +1086,7 @@
                   <pic:spPr>
                     <a:xfrm>
                       <a:off x="0" y="0"/>
-                      <a:ext cx="5514869" cy="5166360"/>
+                      <a:ext cx="5989320" cy="5610828"/>
                     </a:xfrm>
                     <a:prstGeom prst="rect"/>
                   </pic:spPr>
@@ -1345,11 +1099,21 @@
     </w:p>
     <w:p>
       <w:pPr>
-        <w:pStyle w:val="Heading1"/>
-        <w:keepNext/>
-        <w:pageBreakBefore/>
-        <w:spacing w:before="0"/>
-        <w:jc w:val="left"/>
+        <w:pStyle w:val="Caption"/>
+        <w:jc w:val="center"/>
+      </w:pPr>
+      <w:r>
+        <w:t>08-price-discount-quick-edit.png</w:t>
+      </w:r>
+    </w:p>
+    <w:p>
+      <w:r>
+        <w:br w:type="page"/>
+      </w:r>
+    </w:p>
+    <w:p>
+      <w:pPr>
+        <w:pStyle w:val="Title"/>
       </w:pPr>
       <w:r>
         <w:t>Automatic advancement</w:t>
@@ -1357,51 +1121,20 @@
     </w:p>
     <w:p>
       <w:pPr>
-        <w:spacing w:after="140"/>
+        <w:spacing w:after="160"/>
       </w:pPr>
       <w:r>
-        <w:rPr>
-          <w:color w:val="555F5C"/>
-        </w:rPr>
-        <w:t>Approval advances exactly once and decrements unfinished count.</w:t>
+        <w:t>Approve &amp; Next marks the current item Done, decrements unfinished count, and opens the next physical item exactly once.</w:t>
       </w:r>
     </w:p>
     <w:p>
       <w:pPr>
-        <w:pStyle w:val="ListBullet"/>
-        <w:spacing w:after="40"/>
-      </w:pPr>
-      <w:r>
-        <w:t>Confirm the header changes to the next physical sequence.</w:t>
-      </w:r>
-    </w:p>
-    <w:p>
-      <w:pPr>
-        <w:pStyle w:val="ListBullet"/>
-        <w:spacing w:after="40"/>
-      </w:pPr>
-      <w:r>
-        <w:t>Previous and Next retain physical batch orientation.</w:t>
-      </w:r>
-    </w:p>
-    <w:p>
-      <w:pPr>
-        <w:pStyle w:val="ListBullet"/>
-        <w:spacing w:after="40"/>
-      </w:pPr>
-      <w:r>
-        <w:t>Filtered queue position never replaces the physical item number.</w:t>
-      </w:r>
-    </w:p>
-    <w:p>
-      <w:pPr>
-        <w:spacing w:before="80"/>
         <w:jc w:val="center"/>
       </w:pPr>
       <w:r>
         <w:drawing>
           <wp:inline xmlns:a="http://schemas.openxmlformats.org/drawingml/2006/main" xmlns:pic="http://schemas.openxmlformats.org/drawingml/2006/picture">
-            <wp:extent cx="5514869" cy="5166360"/>
+            <wp:extent cx="5989320" cy="5610828"/>
             <wp:docPr id="10" name="Picture 10"/>
             <wp:cNvGraphicFramePr>
               <a:graphicFrameLocks noChangeAspect="1"/>
@@ -1414,7 +1147,7 @@
                     <pic:cNvPicPr/>
                   </pic:nvPicPr>
                   <pic:blipFill>
-                    <a:blip r:embed="rId19"/>
+                    <a:blip r:embed="rId20"/>
                     <a:stretch>
                       <a:fillRect/>
                     </a:stretch>
@@ -1422,7 +1155,7 @@
                   <pic:spPr>
                     <a:xfrm>
                       <a:off x="0" y="0"/>
-                      <a:ext cx="5514869" cy="5166360"/>
+                      <a:ext cx="5989320" cy="5610828"/>
                     </a:xfrm>
                     <a:prstGeom prst="rect"/>
                   </pic:spPr>
@@ -1435,101 +1168,21 @@
     </w:p>
     <w:p>
       <w:pPr>
-        <w:pStyle w:val="Heading1"/>
-        <w:keepNext/>
-        <w:pageBreakBefore/>
-        <w:spacing w:before="0"/>
-        <w:jc w:val="left"/>
+        <w:pStyle w:val="Caption"/>
+        <w:jc w:val="center"/>
       </w:pPr>
       <w:r>
-        <w:t>Postpone with Later</w:t>
+        <w:t>09-next-item-opened.png</w:t>
       </w:r>
     </w:p>
     <w:p>
-      <w:pPr>
-        <w:spacing w:after="140"/>
-      </w:pPr>
       <w:r>
-        <w:rPr>
-          <w:color w:val="555F5C"/>
-        </w:rPr>
-        <w:t>Later is not a completion action.</w:t>
+        <w:br w:type="page"/>
       </w:r>
     </w:p>
     <w:p>
       <w:pPr>
-        <w:pStyle w:val="ListBullet"/>
-        <w:spacing w:after="40"/>
-      </w:pPr>
-      <w:r>
-        <w:t>Press Later when the tape needs research or physical inspection.</w:t>
-      </w:r>
-    </w:p>
-    <w:p>
-      <w:pPr>
-        <w:pStyle w:val="ListBullet"/>
-        <w:spacing w:after="40"/>
-      </w:pPr>
-      <w:r>
-        <w:t>The notice confirms the tape remains unfinished.</w:t>
-      </w:r>
-    </w:p>
-    <w:p>
-      <w:pPr>
-        <w:pStyle w:val="ListBullet"/>
-        <w:spacing w:after="40"/>
-      </w:pPr>
-      <w:r>
-        <w:t>Return through the Unresolved queue.</w:t>
-      </w:r>
-    </w:p>
-    <w:p>
-      <w:pPr>
-        <w:spacing w:before="80"/>
-        <w:jc w:val="center"/>
-      </w:pPr>
-      <w:r>
-        <w:drawing>
-          <wp:inline xmlns:a="http://schemas.openxmlformats.org/drawingml/2006/main" xmlns:pic="http://schemas.openxmlformats.org/drawingml/2006/picture">
-            <wp:extent cx="5514869" cy="5166360"/>
-            <wp:docPr id="11" name="Picture 11"/>
-            <wp:cNvGraphicFramePr>
-              <a:graphicFrameLocks noChangeAspect="1"/>
-            </wp:cNvGraphicFramePr>
-            <a:graphic>
-              <a:graphicData uri="http://schemas.openxmlformats.org/drawingml/2006/picture">
-                <pic:pic>
-                  <pic:nvPicPr>
-                    <pic:cNvPr id="0" name="16-later-preserves-unfinished.png"/>
-                    <pic:cNvPicPr/>
-                  </pic:nvPicPr>
-                  <pic:blipFill>
-                    <a:blip r:embed="rId20"/>
-                    <a:stretch>
-                      <a:fillRect/>
-                    </a:stretch>
-                  </pic:blipFill>
-                  <pic:spPr>
-                    <a:xfrm>
-                      <a:off x="0" y="0"/>
-                      <a:ext cx="5514869" cy="5166360"/>
-                    </a:xfrm>
-                    <a:prstGeom prst="rect"/>
-                  </pic:spPr>
-                </pic:pic>
-              </a:graphicData>
-            </a:graphic>
-          </wp:inline>
-        </w:drawing>
-      </w:r>
-    </w:p>
-    <w:p>
-      <w:pPr>
-        <w:pStyle w:val="Heading1"/>
-        <w:keepNext/>
-        <w:pageBreakBefore/>
-        <w:spacing w:before="0"/>
-        <w:jc w:val="left"/>
+        <w:pStyle w:val="Title"/>
       </w:pPr>
       <w:r>
         <w:t>Review complete</w:t>
@@ -1537,43 +1190,21 @@
     </w:p>
     <w:p>
       <w:pPr>
-        <w:spacing w:after="140"/>
+        <w:spacing w:after="160"/>
       </w:pPr>
       <w:r>
-        <w:rPr>
-          <w:color w:val="555F5C"/>
-        </w:rPr>
-        <w:t>The batch-level completion message replaces ordinary recognition actions.</w:t>
+        <w:t>When unfinished count reaches zero, the Review-complete message replaces normal recognition actions. Use Done to inspect records.</w:t>
       </w:r>
     </w:p>
     <w:p>
       <w:pPr>
-        <w:pStyle w:val="ListBullet"/>
-        <w:spacing w:after="40"/>
-      </w:pPr>
-      <w:r>
-        <w:t>Open the Done queue to inspect or correct completed records.</w:t>
-      </w:r>
-    </w:p>
-    <w:p>
-      <w:pPr>
-        <w:pStyle w:val="ListBullet"/>
-        <w:spacing w:after="40"/>
-      </w:pPr>
-      <w:r>
-        <w:t>Proceed to Publish only after unfinished count reaches zero.</w:t>
-      </w:r>
-    </w:p>
-    <w:p>
-      <w:pPr>
-        <w:spacing w:before="80"/>
         <w:jc w:val="center"/>
       </w:pPr>
       <w:r>
         <w:drawing>
           <wp:inline xmlns:a="http://schemas.openxmlformats.org/drawingml/2006/main" xmlns:pic="http://schemas.openxmlformats.org/drawingml/2006/picture">
-            <wp:extent cx="5514869" cy="5166360"/>
-            <wp:docPr id="12" name="Picture 12"/>
+            <wp:extent cx="5989320" cy="5610828"/>
+            <wp:docPr id="11" name="Picture 11"/>
             <wp:cNvGraphicFramePr>
               <a:graphicFrameLocks noChangeAspect="1"/>
             </wp:cNvGraphicFramePr>
@@ -1593,7 +1224,7 @@
                   <pic:spPr>
                     <a:xfrm>
                       <a:off x="0" y="0"/>
-                      <a:ext cx="5514869" cy="5166360"/>
+                      <a:ext cx="5989320" cy="5610828"/>
                     </a:xfrm>
                     <a:prstGeom prst="rect"/>
                   </pic:spPr>
@@ -1606,11 +1237,21 @@
     </w:p>
     <w:p>
       <w:pPr>
-        <w:pStyle w:val="Heading1"/>
-        <w:keepNext/>
-        <w:pageBreakBefore/>
-        <w:spacing w:before="0"/>
-        <w:jc w:val="left"/>
+        <w:pStyle w:val="Caption"/>
+        <w:jc w:val="center"/>
+      </w:pPr>
+      <w:r>
+        <w:t>10-review-complete.png</w:t>
+      </w:r>
+    </w:p>
+    <w:p>
+      <w:r>
+        <w:br w:type="page"/>
+      </w:r>
+    </w:p>
+    <w:p>
+      <w:pPr>
+        <w:pStyle w:val="Title"/>
       </w:pPr>
       <w:r>
         <w:t>Correct a completed item</w:t>
@@ -1618,52 +1259,21 @@
     </w:p>
     <w:p>
       <w:pPr>
-        <w:spacing w:after="140"/>
+        <w:spacing w:after="160"/>
       </w:pPr>
       <w:r>
-        <w:rPr>
-          <w:color w:val="555F5C"/>
-        </w:rPr>
-        <w:t>Edit item opens the saved record, not stale AI output.</w:t>
+        <w:t>Edit item opens saved data. Save changes stays on the same immutable Item ID.</w:t>
       </w:r>
     </w:p>
     <w:p>
       <w:pPr>
-        <w:pStyle w:val="ListBullet"/>
-        <w:spacing w:after="40"/>
-      </w:pPr>
-      <w:r>
-        <w:t>Change only the incorrect fields.</w:t>
-      </w:r>
-    </w:p>
-    <w:p>
-      <w:pPr>
-        <w:pStyle w:val="ListBullet"/>
-        <w:spacing w:after="40"/>
-      </w:pPr>
-      <w:r>
-        <w:t>Save changes remains on the same immutable Item ID.</w:t>
-      </w:r>
-    </w:p>
-    <w:p>
-      <w:pPr>
-        <w:pStyle w:val="ListBullet"/>
-        <w:spacing w:after="40"/>
-      </w:pPr>
-      <w:r>
-        <w:t>The corrected record becomes authoritative in Review, CSV, and Publish.</w:t>
-      </w:r>
-    </w:p>
-    <w:p>
-      <w:pPr>
-        <w:spacing w:before="80"/>
         <w:jc w:val="center"/>
       </w:pPr>
       <w:r>
         <w:drawing>
           <wp:inline xmlns:a="http://schemas.openxmlformats.org/drawingml/2006/main" xmlns:pic="http://schemas.openxmlformats.org/drawingml/2006/picture">
-            <wp:extent cx="5514869" cy="5166360"/>
-            <wp:docPr id="13" name="Picture 13"/>
+            <wp:extent cx="5989320" cy="5610828"/>
+            <wp:docPr id="12" name="Picture 12"/>
             <wp:cNvGraphicFramePr>
               <a:graphicFrameLocks noChangeAspect="1"/>
             </wp:cNvGraphicFramePr>
@@ -1671,7 +1281,7 @@
               <a:graphicData uri="http://schemas.openxmlformats.org/drawingml/2006/picture">
                 <pic:pic>
                   <pic:nvPicPr>
-                    <pic:cNvPr id="0" name="12-completed-item-corrected.png"/>
+                    <pic:cNvPr id="0" name="11-completed-item-corrected.png"/>
                     <pic:cNvPicPr/>
                   </pic:nvPicPr>
                   <pic:blipFill>
@@ -1683,7 +1293,7 @@
                   <pic:spPr>
                     <a:xfrm>
                       <a:off x="0" y="0"/>
-                      <a:ext cx="5514869" cy="5166360"/>
+                      <a:ext cx="5989320" cy="5610828"/>
                     </a:xfrm>
                     <a:prstGeom prst="rect"/>
                   </pic:spPr>
@@ -1696,64 +1306,43 @@
     </w:p>
     <w:p>
       <w:pPr>
-        <w:pStyle w:val="Heading1"/>
-        <w:keepNext/>
-        <w:pageBreakBefore/>
-        <w:spacing w:before="0"/>
-        <w:jc w:val="left"/>
+        <w:pStyle w:val="Caption"/>
+        <w:jc w:val="center"/>
       </w:pPr>
       <w:r>
-        <w:t>Validation and Cancel</w:t>
+        <w:t>11-completed-item-corrected.png</w:t>
       </w:r>
     </w:p>
     <w:p>
-      <w:pPr>
-        <w:spacing w:after="140"/>
-      </w:pPr>
       <w:r>
-        <w:rPr>
-          <w:color w:val="555F5C"/>
-        </w:rPr>
-        <w:t>Invalid changes do not overwrite the last valid record.</w:t>
+        <w:br w:type="page"/>
       </w:r>
     </w:p>
     <w:p>
       <w:pPr>
-        <w:pStyle w:val="ListBullet"/>
-        <w:spacing w:after="40"/>
+        <w:pStyle w:val="Title"/>
       </w:pPr>
       <w:r>
-        <w:t>The editor stays open and lists exact blockers.</w:t>
+        <w:t>Validation blocks invalid changes</w:t>
       </w:r>
     </w:p>
     <w:p>
       <w:pPr>
-        <w:pStyle w:val="ListBullet"/>
-        <w:spacing w:after="40"/>
+        <w:spacing w:after="160"/>
       </w:pPr>
       <w:r>
-        <w:t>Correct the fields or use Cancel changes to restore the saved record.</w:t>
+        <w:t>Blank Title and zero Price are rejected atomically. The editor remains open with exact errors.</w:t>
       </w:r>
     </w:p>
     <w:p>
       <w:pPr>
-        <w:pStyle w:val="ListBullet"/>
-        <w:spacing w:after="40"/>
-      </w:pPr>
-      <w:r>
-        <w:t>Title and a price greater than zero are required.</w:t>
-      </w:r>
-    </w:p>
-    <w:p>
-      <w:pPr>
-        <w:spacing w:before="80"/>
         <w:jc w:val="center"/>
       </w:pPr>
       <w:r>
         <w:drawing>
           <wp:inline xmlns:a="http://schemas.openxmlformats.org/drawingml/2006/main" xmlns:pic="http://schemas.openxmlformats.org/drawingml/2006/picture">
-            <wp:extent cx="3318268" cy="5166360"/>
-            <wp:docPr id="14" name="Picture 14"/>
+            <wp:extent cx="3729381" cy="5806440"/>
+            <wp:docPr id="13" name="Picture 13"/>
             <wp:cNvGraphicFramePr>
               <a:graphicFrameLocks noChangeAspect="1"/>
             </wp:cNvGraphicFramePr>
@@ -1761,7 +1350,7 @@
               <a:graphicData uri="http://schemas.openxmlformats.org/drawingml/2006/picture">
                 <pic:pic>
                   <pic:nvPicPr>
-                    <pic:cNvPr id="0" name="13-invalid-edit-blocked.png"/>
+                    <pic:cNvPr id="0" name="12-invalid-edit-blocked.png"/>
                     <pic:cNvPicPr/>
                   </pic:nvPicPr>
                   <pic:blipFill>
@@ -1773,7 +1362,7 @@
                   <pic:spPr>
                     <a:xfrm>
                       <a:off x="0" y="0"/>
-                      <a:ext cx="3318268" cy="5166360"/>
+                      <a:ext cx="3729381" cy="5806440"/>
                     </a:xfrm>
                     <a:prstGeom prst="rect"/>
                   </pic:spPr>
@@ -1786,55 +1375,43 @@
     </w:p>
     <w:p>
       <w:pPr>
-        <w:pStyle w:val="Heading1"/>
-        <w:keepNext/>
-        <w:pageBreakBefore/>
-        <w:spacing w:before="0"/>
-        <w:jc w:val="left"/>
+        <w:pStyle w:val="Caption"/>
+        <w:jc w:val="center"/>
       </w:pPr>
       <w:r>
-        <w:t>Restart durability</w:t>
+        <w:t>12-invalid-edit-blocked.png</w:t>
       </w:r>
     </w:p>
     <w:p>
-      <w:pPr>
-        <w:spacing w:after="140"/>
-      </w:pPr>
       <w:r>
-        <w:rPr>
-          <w:color w:val="555F5C"/>
-        </w:rPr>
-        <w:t>A new application process reloads the saved record from SQLite.</w:t>
+        <w:br w:type="page"/>
       </w:r>
     </w:p>
     <w:p>
       <w:pPr>
-        <w:pStyle w:val="ListBullet"/>
-        <w:spacing w:after="40"/>
+        <w:pStyle w:val="Title"/>
       </w:pPr>
       <w:r>
-        <w:t>Confirm title, price, shelf, flags, and Item ID after restart.</w:t>
+        <w:t>Cancel invalid changes</w:t>
       </w:r>
     </w:p>
     <w:p>
       <w:pPr>
-        <w:pStyle w:val="ListBullet"/>
-        <w:spacing w:after="40"/>
+        <w:spacing w:after="160"/>
       </w:pPr>
       <w:r>
-        <w:t>A recognition run abandoned during shutdown returns as Paused.</w:t>
+        <w:t>Cancel changes restores the last valid saved record without altering the Item ID.</w:t>
       </w:r>
     </w:p>
     <w:p>
       <w:pPr>
-        <w:spacing w:before="80"/>
         <w:jc w:val="center"/>
       </w:pPr>
       <w:r>
         <w:drawing>
           <wp:inline xmlns:a="http://schemas.openxmlformats.org/drawingml/2006/main" xmlns:pic="http://schemas.openxmlformats.org/drawingml/2006/picture">
-            <wp:extent cx="5821250" cy="5166360"/>
-            <wp:docPr id="15" name="Picture 15"/>
+            <wp:extent cx="5989320" cy="5315521"/>
+            <wp:docPr id="14" name="Picture 14"/>
             <wp:cNvGraphicFramePr>
               <a:graphicFrameLocks noChangeAspect="1"/>
             </wp:cNvGraphicFramePr>
@@ -1842,7 +1419,7 @@
               <a:graphicData uri="http://schemas.openxmlformats.org/drawingml/2006/picture">
                 <pic:pic>
                   <pic:nvPicPr>
-                    <pic:cNvPr id="0" name="14-restart-durable-correction.png"/>
+                    <pic:cNvPr id="0" name="13-invalid-edit-cancelled.png"/>
                     <pic:cNvPicPr/>
                   </pic:nvPicPr>
                   <pic:blipFill>
@@ -1854,7 +1431,7 @@
                   <pic:spPr>
                     <a:xfrm>
                       <a:off x="0" y="0"/>
-                      <a:ext cx="5821250" cy="5166360"/>
+                      <a:ext cx="5989320" cy="5315521"/>
                     </a:xfrm>
                     <a:prstGeom prst="rect"/>
                   </pic:spPr>
@@ -1867,63 +1444,111 @@
     </w:p>
     <w:p>
       <w:pPr>
-        <w:pStyle w:val="Heading1"/>
-        <w:keepNext/>
-        <w:pageBreakBefore/>
-        <w:spacing w:before="0"/>
-        <w:jc w:val="left"/>
+        <w:pStyle w:val="Caption"/>
+        <w:jc w:val="center"/>
       </w:pPr>
       <w:r>
-        <w:t>Continue interrupted identification</w:t>
+        <w:t>13-invalid-edit-cancelled.png</w:t>
       </w:r>
     </w:p>
     <w:p>
-      <w:pPr>
-        <w:spacing w:after="140"/>
-      </w:pPr>
       <w:r>
-        <w:rPr>
-          <w:color w:val="555F5C"/>
-        </w:rPr>
-        <w:t>Paused wording shows exact completed and remaining counts.</w:t>
+        <w:br w:type="page"/>
       </w:r>
     </w:p>
     <w:p>
       <w:pPr>
-        <w:pStyle w:val="ListBullet"/>
-        <w:spacing w:after="40"/>
+        <w:pStyle w:val="Title"/>
       </w:pPr>
       <w:r>
-        <w:t>Press Continue identification once.</w:t>
+        <w:t>Restart durability</w:t>
       </w:r>
     </w:p>
     <w:p>
       <w:pPr>
-        <w:pStyle w:val="ListBullet"/>
-        <w:spacing w:after="40"/>
+        <w:spacing w:after="160"/>
       </w:pPr>
       <w:r>
-        <w:t>Completed item boundaries are not repeated.</w:t>
+        <w:t>After a full application-process restart, saved metadata and Item ID remain available from SQLite.</w:t>
       </w:r>
     </w:p>
     <w:p>
       <w:pPr>
-        <w:pStyle w:val="ListBullet"/>
-        <w:spacing w:after="40"/>
+        <w:jc w:val="center"/>
       </w:pPr>
       <w:r>
-        <w:t>Do not force-reprocess accepted manual records during normal recovery.</w:t>
+        <w:drawing>
+          <wp:inline xmlns:a="http://schemas.openxmlformats.org/drawingml/2006/main" xmlns:pic="http://schemas.openxmlformats.org/drawingml/2006/picture">
+            <wp:extent cx="5989320" cy="5315521"/>
+            <wp:docPr id="15" name="Picture 15"/>
+            <wp:cNvGraphicFramePr>
+              <a:graphicFrameLocks noChangeAspect="1"/>
+            </wp:cNvGraphicFramePr>
+            <a:graphic>
+              <a:graphicData uri="http://schemas.openxmlformats.org/drawingml/2006/picture">
+                <pic:pic>
+                  <pic:nvPicPr>
+                    <pic:cNvPr id="0" name="13-invalid-edit-cancelled.png"/>
+                    <pic:cNvPicPr/>
+                  </pic:nvPicPr>
+                  <pic:blipFill>
+                    <a:blip r:embed="rId24"/>
+                    <a:stretch>
+                      <a:fillRect/>
+                    </a:stretch>
+                  </pic:blipFill>
+                  <pic:spPr>
+                    <a:xfrm>
+                      <a:off x="0" y="0"/>
+                      <a:ext cx="5989320" cy="5315521"/>
+                    </a:xfrm>
+                    <a:prstGeom prst="rect"/>
+                  </pic:spPr>
+                </pic:pic>
+              </a:graphicData>
+            </a:graphic>
+          </wp:inline>
+        </w:drawing>
       </w:r>
     </w:p>
     <w:p>
       <w:pPr>
-        <w:spacing w:before="80"/>
+        <w:pStyle w:val="Caption"/>
+        <w:jc w:val="center"/>
+      </w:pPr>
+      <w:r>
+        <w:t>14-restart-durable-correction.png</w:t>
+      </w:r>
+    </w:p>
+    <w:p>
+      <w:r>
+        <w:br w:type="page"/>
+      </w:r>
+    </w:p>
+    <w:p>
+      <w:pPr>
+        <w:pStyle w:val="Title"/>
+      </w:pPr>
+      <w:r>
+        <w:t>Publish simulation</w:t>
+      </w:r>
+    </w:p>
+    <w:p>
+      <w:pPr>
+        <w:spacing w:after="160"/>
+      </w:pPr>
+      <w:r>
+        <w:t>Confirm Ready/Blocked counts and payload previews. Download the inventory CSV before any live-draft acceptance test.</w:t>
+      </w:r>
+    </w:p>
+    <w:p>
+      <w:pPr>
         <w:jc w:val="center"/>
       </w:pPr>
       <w:r>
         <w:drawing>
           <wp:inline xmlns:a="http://schemas.openxmlformats.org/drawingml/2006/main" xmlns:pic="http://schemas.openxmlformats.org/drawingml/2006/picture">
-            <wp:extent cx="5518960" cy="5166360"/>
+            <wp:extent cx="2484776" cy="5806440"/>
             <wp:docPr id="16" name="Picture 16"/>
             <wp:cNvGraphicFramePr>
               <a:graphicFrameLocks noChangeAspect="1"/>
@@ -1932,7 +1557,7 @@
               <a:graphicData uri="http://schemas.openxmlformats.org/drawingml/2006/picture">
                 <pic:pic>
                   <pic:nvPicPr>
-                    <pic:cNvPr id="0" name="17-recognition-paused-after-restart.png"/>
+                    <pic:cNvPr id="0" name="15-publish-simulation.png"/>
                     <pic:cNvPicPr/>
                   </pic:nvPicPr>
                   <pic:blipFill>
@@ -1944,7 +1569,7 @@
                   <pic:spPr>
                     <a:xfrm>
                       <a:off x="0" y="0"/>
-                      <a:ext cx="5518960" cy="5166360"/>
+                      <a:ext cx="2484776" cy="5806440"/>
                     </a:xfrm>
                     <a:prstGeom prst="rect"/>
                   </pic:spPr>
@@ -1957,63 +1582,42 @@
     </w:p>
     <w:p>
       <w:pPr>
-        <w:pStyle w:val="Heading1"/>
-        <w:keepNext/>
-        <w:pageBreakBefore/>
-        <w:spacing w:before="0"/>
-        <w:jc w:val="left"/>
+        <w:pStyle w:val="Caption"/>
+        <w:jc w:val="center"/>
       </w:pPr>
       <w:r>
-        <w:t>Recognition failure</w:t>
+        <w:t>15-publish-simulation.png</w:t>
       </w:r>
     </w:p>
     <w:p>
-      <w:pPr>
-        <w:spacing w:after="140"/>
-      </w:pPr>
       <w:r>
-        <w:rPr>
-          <w:color w:val="555F5C"/>
-        </w:rPr>
-        <w:t>Failures stay attached to the same physical item.</w:t>
+        <w:br w:type="page"/>
       </w:r>
     </w:p>
     <w:p>
       <w:pPr>
-        <w:pStyle w:val="ListBullet"/>
-        <w:spacing w:after="40"/>
+        <w:pStyle w:val="Title"/>
       </w:pPr>
       <w:r>
-        <w:t>Open the Failed queue.</w:t>
+        <w:t>Routine second import - Preview</w:t>
       </w:r>
     </w:p>
     <w:p>
       <w:pPr>
-        <w:pStyle w:val="ListBullet"/>
-        <w:spacing w:after="40"/>
+        <w:spacing w:after="160"/>
       </w:pPr>
       <w:r>
-        <w:t>Read the provider error.</w:t>
+        <w:t>Configured and recent folders avoid routine absolute-path typing.</w:t>
       </w:r>
     </w:p>
     <w:p>
       <w:pPr>
-        <w:pStyle w:val="ListBullet"/>
-        <w:spacing w:after="40"/>
-      </w:pPr>
-      <w:r>
-        <w:t>Choose a working provider and press Retry.</w:t>
-      </w:r>
-    </w:p>
-    <w:p>
-      <w:pPr>
-        <w:spacing w:before="80"/>
         <w:jc w:val="center"/>
       </w:pPr>
       <w:r>
         <w:drawing>
           <wp:inline xmlns:a="http://schemas.openxmlformats.org/drawingml/2006/main" xmlns:pic="http://schemas.openxmlformats.org/drawingml/2006/picture">
-            <wp:extent cx="5821250" cy="5166360"/>
+            <wp:extent cx="5989320" cy="4229957"/>
             <wp:docPr id="17" name="Picture 17"/>
             <wp:cNvGraphicFramePr>
               <a:graphicFrameLocks noChangeAspect="1"/>
@@ -2022,7 +1626,7 @@
               <a:graphicData uri="http://schemas.openxmlformats.org/drawingml/2006/picture">
                 <pic:pic>
                   <pic:nvPicPr>
-                    <pic:cNvPr id="0" name="18-recognition-failure.png"/>
+                    <pic:cNvPr id="0" name="16-preview-not-imported.png"/>
                     <pic:cNvPicPr/>
                   </pic:nvPicPr>
                   <pic:blipFill>
@@ -2034,7 +1638,7 @@
                   <pic:spPr>
                     <a:xfrm>
                       <a:off x="0" y="0"/>
-                      <a:ext cx="5821250" cy="5166360"/>
+                      <a:ext cx="5989320" cy="4229957"/>
                     </a:xfrm>
                     <a:prstGeom prst="rect"/>
                   </pic:spPr>
@@ -2047,54 +1651,42 @@
     </w:p>
     <w:p>
       <w:pPr>
-        <w:pStyle w:val="Heading1"/>
-        <w:keepNext/>
-        <w:pageBreakBefore/>
-        <w:spacing w:before="0"/>
-        <w:jc w:val="left"/>
+        <w:pStyle w:val="Caption"/>
+        <w:jc w:val="center"/>
       </w:pPr>
       <w:r>
-        <w:t>Recovered recognition</w:t>
+        <w:t>16-preview-not-imported.png</w:t>
       </w:r>
     </w:p>
     <w:p>
-      <w:pPr>
-        <w:spacing w:after="140"/>
-      </w:pPr>
       <w:r>
-        <w:rPr>
-          <w:color w:val="555F5C"/>
-        </w:rPr>
-        <w:t>Retry restores a reviewable suggestion without creating another item.</w:t>
+        <w:br w:type="page"/>
       </w:r>
     </w:p>
     <w:p>
       <w:pPr>
-        <w:pStyle w:val="ListBullet"/>
-        <w:spacing w:after="40"/>
+        <w:pStyle w:val="Title"/>
       </w:pPr>
       <w:r>
-        <w:t>Verify the physical position and Item ID are unchanged.</w:t>
+        <w:t>Routine second import - durable ID</w:t>
       </w:r>
     </w:p>
     <w:p>
       <w:pPr>
-        <w:pStyle w:val="ListBullet"/>
-        <w:spacing w:after="40"/>
+        <w:spacing w:after="160"/>
       </w:pPr>
       <w:r>
-        <w:t>Continue through the normal fast path or Edit the exception.</w:t>
+        <w:t>A successful import is available immediately through Continue to Review.</w:t>
       </w:r>
     </w:p>
     <w:p>
       <w:pPr>
-        <w:spacing w:before="80"/>
         <w:jc w:val="center"/>
       </w:pPr>
       <w:r>
         <w:drawing>
           <wp:inline xmlns:a="http://schemas.openxmlformats.org/drawingml/2006/main" xmlns:pic="http://schemas.openxmlformats.org/drawingml/2006/picture">
-            <wp:extent cx="5821250" cy="5166360"/>
+            <wp:extent cx="5989320" cy="4159249"/>
             <wp:docPr id="18" name="Picture 18"/>
             <wp:cNvGraphicFramePr>
               <a:graphicFrameLocks noChangeAspect="1"/>
@@ -2103,7 +1695,7 @@
               <a:graphicData uri="http://schemas.openxmlformats.org/drawingml/2006/picture">
                 <pic:pic>
                   <pic:nvPicPr>
-                    <pic:cNvPr id="0" name="19-recognition-failure-recovered.png"/>
+                    <pic:cNvPr id="0" name="16-imported-durable-id.png"/>
                     <pic:cNvPicPr/>
                   </pic:nvPicPr>
                   <pic:blipFill>
@@ -2115,7 +1707,7 @@
                   <pic:spPr>
                     <a:xfrm>
                       <a:off x="0" y="0"/>
-                      <a:ext cx="5821250" cy="5166360"/>
+                      <a:ext cx="5989320" cy="4159249"/>
                     </a:xfrm>
                     <a:prstGeom prst="rect"/>
                   </pic:spPr>
@@ -2128,63 +1720,42 @@
     </w:p>
     <w:p>
       <w:pPr>
-        <w:pStyle w:val="Heading1"/>
-        <w:keepNext/>
-        <w:pageBreakBefore/>
-        <w:spacing w:before="0"/>
-        <w:jc w:val="left"/>
+        <w:pStyle w:val="Caption"/>
+        <w:jc w:val="center"/>
       </w:pPr>
       <w:r>
-        <w:t>Publish simulation</w:t>
+        <w:t>16-imported-durable-id.png</w:t>
       </w:r>
     </w:p>
     <w:p>
-      <w:pPr>
-        <w:spacing w:after="140"/>
-      </w:pPr>
       <w:r>
-        <w:rPr>
-          <w:color w:val="555F5C"/>
-        </w:rPr>
-        <w:t>Simulation uses the same saved records as Review and CSV.</w:t>
+        <w:br w:type="page"/>
       </w:r>
     </w:p>
     <w:p>
       <w:pPr>
-        <w:pStyle w:val="ListBullet"/>
-        <w:spacing w:after="40"/>
+        <w:pStyle w:val="Title"/>
       </w:pPr>
       <w:r>
-        <w:t>Confirm Ready and Blocked counts.</w:t>
+        <w:t>Postpone with Later</w:t>
       </w:r>
     </w:p>
     <w:p>
       <w:pPr>
-        <w:pStyle w:val="ListBullet"/>
-        <w:spacing w:after="40"/>
+        <w:spacing w:after="160"/>
       </w:pPr>
       <w:r>
-        <w:t>Expand Payload preview for field-level reconciliation.</w:t>
+        <w:t>Later does not finish the tape. The notice confirms it remains unfinished; return through Unresolved.</w:t>
       </w:r>
     </w:p>
     <w:p>
       <w:pPr>
-        <w:pStyle w:val="ListBullet"/>
-        <w:spacing w:after="40"/>
-      </w:pPr>
-      <w:r>
-        <w:t>Download inventory CSV before any live draft acceptance test.</w:t>
-      </w:r>
-    </w:p>
-    <w:p>
-      <w:pPr>
-        <w:spacing w:before="80"/>
         <w:jc w:val="center"/>
       </w:pPr>
       <w:r>
         <w:drawing>
           <wp:inline xmlns:a="http://schemas.openxmlformats.org/drawingml/2006/main" xmlns:pic="http://schemas.openxmlformats.org/drawingml/2006/picture">
-            <wp:extent cx="2210864" cy="5166360"/>
+            <wp:extent cx="5989320" cy="5610828"/>
             <wp:docPr id="19" name="Picture 19"/>
             <wp:cNvGraphicFramePr>
               <a:graphicFrameLocks noChangeAspect="1"/>
@@ -2193,7 +1764,7 @@
               <a:graphicData uri="http://schemas.openxmlformats.org/drawingml/2006/picture">
                 <pic:pic>
                   <pic:nvPicPr>
-                    <pic:cNvPr id="0" name="11-publish-simulation.png"/>
+                    <pic:cNvPr id="0" name="18-later-preserves-unfinished.png"/>
                     <pic:cNvPicPr/>
                   </pic:nvPicPr>
                   <pic:blipFill>
@@ -2205,7 +1776,7 @@
                   <pic:spPr>
                     <a:xfrm>
                       <a:off x="0" y="0"/>
-                      <a:ext cx="2210864" cy="5166360"/>
+                      <a:ext cx="5989320" cy="5610828"/>
                     </a:xfrm>
                     <a:prstGeom prst="rect"/>
                   </pic:spPr>
@@ -2218,11 +1789,21 @@
     </w:p>
     <w:p>
       <w:pPr>
-        <w:pStyle w:val="Heading1"/>
-        <w:keepNext/>
-        <w:pageBreakBefore/>
-        <w:spacing w:before="0"/>
-        <w:jc w:val="left"/>
+        <w:pStyle w:val="Caption"/>
+        <w:jc w:val="center"/>
+      </w:pPr>
+      <w:r>
+        <w:t>18-later-preserves-unfinished.png</w:t>
+      </w:r>
+    </w:p>
+    <w:p>
+      <w:r>
+        <w:br w:type="page"/>
+      </w:r>
+    </w:p>
+    <w:p>
+      <w:pPr>
+        <w:pStyle w:val="Title"/>
       </w:pPr>
       <w:r>
         <w:t>Missing incoming folder</w:t>
@@ -2230,42 +1811,20 @@
     </w:p>
     <w:p>
       <w:pPr>
-        <w:spacing w:after="140"/>
+        <w:spacing w:after="160"/>
       </w:pPr>
       <w:r>
-        <w:rPr>
-          <w:color w:val="555F5C"/>
-        </w:rPr>
-        <w:t>Import fails closed and does not scan a different directory.</w:t>
+        <w:t>SnapIMS fails closed and does not scan another folder. Reconnect the device or use Advanced recovery.</w:t>
       </w:r>
     </w:p>
     <w:p>
       <w:pPr>
-        <w:pStyle w:val="ListBullet"/>
-        <w:spacing w:after="40"/>
-      </w:pPr>
-      <w:r>
-        <w:t>Reconnect the device or open Advanced.</w:t>
-      </w:r>
-    </w:p>
-    <w:p>
-      <w:pPr>
-        <w:pStyle w:val="ListBullet"/>
-        <w:spacing w:after="40"/>
-      </w:pPr>
-      <w:r>
-        <w:t>Choose a valid folder and save it if it should become the new routine default.</w:t>
-      </w:r>
-    </w:p>
-    <w:p>
-      <w:pPr>
-        <w:spacing w:before="80"/>
         <w:jc w:val="center"/>
       </w:pPr>
       <w:r>
         <w:drawing>
           <wp:inline xmlns:a="http://schemas.openxmlformats.org/drawingml/2006/main" xmlns:pic="http://schemas.openxmlformats.org/drawingml/2006/picture">
-            <wp:extent cx="7439558" cy="5166360"/>
+            <wp:extent cx="5989320" cy="4159249"/>
             <wp:docPr id="20" name="Picture 20"/>
             <wp:cNvGraphicFramePr>
               <a:graphicFrameLocks noChangeAspect="1"/>
@@ -2274,7 +1833,7 @@
               <a:graphicData uri="http://schemas.openxmlformats.org/drawingml/2006/picture">
                 <pic:pic>
                   <pic:nvPicPr>
-                    <pic:cNvPr id="0" name="15-missing-folder-recovery.png"/>
+                    <pic:cNvPr id="0" name="19-missing-folder-recovery.png"/>
                     <pic:cNvPicPr/>
                   </pic:nvPicPr>
                   <pic:blipFill>
@@ -2286,7 +1845,7 @@
                   <pic:spPr>
                     <a:xfrm>
                       <a:off x="0" y="0"/>
-                      <a:ext cx="7439558" cy="5166360"/>
+                      <a:ext cx="5989320" cy="4159249"/>
                     </a:xfrm>
                     <a:prstGeom prst="rect"/>
                   </pic:spPr>
@@ -2299,63 +1858,42 @@
     </w:p>
     <w:p>
       <w:pPr>
-        <w:pStyle w:val="Heading1"/>
-        <w:keepNext/>
-        <w:pageBreakBefore/>
-        <w:spacing w:before="0"/>
-        <w:jc w:val="left"/>
+        <w:pStyle w:val="Caption"/>
+        <w:jc w:val="center"/>
       </w:pPr>
       <w:r>
-        <w:t>Settings</w:t>
+        <w:t>19-missing-folder-recovery.png</w:t>
       </w:r>
     </w:p>
     <w:p>
-      <w:pPr>
-        <w:spacing w:after="140"/>
-      </w:pPr>
       <w:r>
-        <w:rPr>
-          <w:color w:val="555F5C"/>
-        </w:rPr>
-        <w:t>Settings centralize incoming-folder and provider status.</w:t>
+        <w:br w:type="page"/>
       </w:r>
     </w:p>
     <w:p>
       <w:pPr>
-        <w:pStyle w:val="ListBullet"/>
-        <w:spacing w:after="40"/>
+        <w:pStyle w:val="Title"/>
       </w:pPr>
       <w:r>
-        <w:t>Set the normal camera-roll folder.</w:t>
+        <w:t>Recognition failure fixture - Preview</w:t>
       </w:r>
     </w:p>
     <w:p>
       <w:pPr>
-        <w:pStyle w:val="ListBullet"/>
-        <w:spacing w:after="40"/>
+        <w:spacing w:after="160"/>
       </w:pPr>
       <w:r>
-        <w:t>Review the bounded recent-folder list.</w:t>
+        <w:t>The normal Preview contract remains unchanged for a one-item failure test.</w:t>
       </w:r>
     </w:p>
     <w:p>
       <w:pPr>
-        <w:pStyle w:val="ListBullet"/>
-        <w:spacing w:after="40"/>
-      </w:pPr>
-      <w:r>
-        <w:t>Confirm the intended recognition provider is available before a real pilot.</w:t>
-      </w:r>
-    </w:p>
-    <w:p>
-      <w:pPr>
-        <w:spacing w:before="80"/>
         <w:jc w:val="center"/>
       </w:pPr>
       <w:r>
         <w:drawing>
           <wp:inline xmlns:a="http://schemas.openxmlformats.org/drawingml/2006/main" xmlns:pic="http://schemas.openxmlformats.org/drawingml/2006/picture">
-            <wp:extent cx="7439558" cy="5166360"/>
+            <wp:extent cx="5989320" cy="4229957"/>
             <wp:docPr id="21" name="Picture 21"/>
             <wp:cNvGraphicFramePr>
               <a:graphicFrameLocks noChangeAspect="1"/>
@@ -2364,7 +1902,7 @@
               <a:graphicData uri="http://schemas.openxmlformats.org/drawingml/2006/picture">
                 <pic:pic>
                   <pic:nvPicPr>
-                    <pic:cNvPr id="0" name="20-settings.png"/>
+                    <pic:cNvPr id="0" name="20-preview-not-imported.png"/>
                     <pic:cNvPicPr/>
                   </pic:nvPicPr>
                   <pic:blipFill>
@@ -2376,7 +1914,7 @@
                   <pic:spPr>
                     <a:xfrm>
                       <a:off x="0" y="0"/>
-                      <a:ext cx="7439558" cy="5166360"/>
+                      <a:ext cx="5989320" cy="4229957"/>
                     </a:xfrm>
                     <a:prstGeom prst="rect"/>
                   </pic:spPr>
@@ -2389,63 +1927,42 @@
     </w:p>
     <w:p>
       <w:pPr>
-        <w:pStyle w:val="Heading1"/>
-        <w:keepNext/>
-        <w:pageBreakBefore/>
-        <w:spacing w:before="0"/>
-        <w:jc w:val="left"/>
+        <w:pStyle w:val="Caption"/>
+        <w:jc w:val="center"/>
       </w:pPr>
       <w:r>
-        <w:t>Diagnostics</w:t>
+        <w:t>20-preview-not-imported.png</w:t>
       </w:r>
     </w:p>
     <w:p>
-      <w:pPr>
-        <w:spacing w:after="140"/>
-      </w:pPr>
       <w:r>
-        <w:rPr>
-          <w:color w:val="555F5C"/>
-        </w:rPr>
-        <w:t>Diagnostics separates technical checks from routine operation.</w:t>
+        <w:br w:type="page"/>
       </w:r>
     </w:p>
     <w:p>
       <w:pPr>
-        <w:pStyle w:val="ListBullet"/>
-        <w:spacing w:after="40"/>
+        <w:pStyle w:val="Title"/>
       </w:pPr>
       <w:r>
-        <w:t>SQLite integrity must be ok.</w:t>
+        <w:t>Recognition failure fixture - Import</w:t>
       </w:r>
     </w:p>
     <w:p>
       <w:pPr>
-        <w:pStyle w:val="ListBullet"/>
-        <w:spacing w:after="40"/>
+        <w:spacing w:after="160"/>
       </w:pPr>
       <w:r>
-        <w:t>Foreign-key violations must be zero.</w:t>
+        <w:t>The failed provider attempt remains attached to this same durable item.</w:t>
       </w:r>
     </w:p>
     <w:p>
       <w:pPr>
-        <w:pStyle w:val="ListBullet"/>
-        <w:spacing w:after="40"/>
-      </w:pPr>
-      <w:r>
-        <w:t>Confirm schema version 5 and the workspace path before restoring a backup.</w:t>
-      </w:r>
-    </w:p>
-    <w:p>
-      <w:pPr>
-        <w:spacing w:before="80"/>
         <w:jc w:val="center"/>
       </w:pPr>
       <w:r>
         <w:drawing>
           <wp:inline xmlns:a="http://schemas.openxmlformats.org/drawingml/2006/main" xmlns:pic="http://schemas.openxmlformats.org/drawingml/2006/picture">
-            <wp:extent cx="7439558" cy="5166360"/>
+            <wp:extent cx="5989320" cy="4159249"/>
             <wp:docPr id="22" name="Picture 22"/>
             <wp:cNvGraphicFramePr>
               <a:graphicFrameLocks noChangeAspect="1"/>
@@ -2454,7 +1971,7 @@
               <a:graphicData uri="http://schemas.openxmlformats.org/drawingml/2006/picture">
                 <pic:pic>
                   <pic:nvPicPr>
-                    <pic:cNvPr id="0" name="21-diagnostics.png"/>
+                    <pic:cNvPr id="0" name="20-imported-durable-id.png"/>
                     <pic:cNvPicPr/>
                   </pic:nvPicPr>
                   <pic:blipFill>
@@ -2466,7 +1983,7 @@
                   <pic:spPr>
                     <a:xfrm>
                       <a:off x="0" y="0"/>
-                      <a:ext cx="7439558" cy="5166360"/>
+                      <a:ext cx="5989320" cy="4159249"/>
                     </a:xfrm>
                     <a:prstGeom prst="rect"/>
                   </pic:spPr>
@@ -2479,142 +1996,710 @@
     </w:p>
     <w:p>
       <w:pPr>
+        <w:pStyle w:val="Caption"/>
+        <w:jc w:val="center"/>
+      </w:pPr>
+      <w:r>
+        <w:t>20-imported-durable-id.png</w:t>
+      </w:r>
+    </w:p>
+    <w:p>
+      <w:r>
+        <w:br w:type="page"/>
+      </w:r>
+    </w:p>
+    <w:p>
+      <w:pPr>
+        <w:pStyle w:val="Title"/>
+      </w:pPr>
+      <w:r>
+        <w:t>Recognition failure</w:t>
+      </w:r>
+    </w:p>
+    <w:p>
+      <w:pPr>
+        <w:spacing w:after="160"/>
+      </w:pPr>
+      <w:r>
+        <w:t>Open the Failed queue, read the provider error, choose a working provider, and Retry.</w:t>
+      </w:r>
+    </w:p>
+    <w:p>
+      <w:pPr>
+        <w:jc w:val="center"/>
+      </w:pPr>
+      <w:r>
+        <w:drawing>
+          <wp:inline xmlns:a="http://schemas.openxmlformats.org/drawingml/2006/main" xmlns:pic="http://schemas.openxmlformats.org/drawingml/2006/picture">
+            <wp:extent cx="5989320" cy="5315521"/>
+            <wp:docPr id="23" name="Picture 23"/>
+            <wp:cNvGraphicFramePr>
+              <a:graphicFrameLocks noChangeAspect="1"/>
+            </wp:cNvGraphicFramePr>
+            <a:graphic>
+              <a:graphicData uri="http://schemas.openxmlformats.org/drawingml/2006/picture">
+                <pic:pic>
+                  <pic:nvPicPr>
+                    <pic:cNvPr id="0" name="22-recognition-failure.png"/>
+                    <pic:cNvPicPr/>
+                  </pic:nvPicPr>
+                  <pic:blipFill>
+                    <a:blip r:embed="rId32"/>
+                    <a:stretch>
+                      <a:fillRect/>
+                    </a:stretch>
+                  </pic:blipFill>
+                  <pic:spPr>
+                    <a:xfrm>
+                      <a:off x="0" y="0"/>
+                      <a:ext cx="5989320" cy="5315521"/>
+                    </a:xfrm>
+                    <a:prstGeom prst="rect"/>
+                  </pic:spPr>
+                </pic:pic>
+              </a:graphicData>
+            </a:graphic>
+          </wp:inline>
+        </w:drawing>
+      </w:r>
+    </w:p>
+    <w:p>
+      <w:pPr>
+        <w:pStyle w:val="Caption"/>
+        <w:jc w:val="center"/>
+      </w:pPr>
+      <w:r>
+        <w:t>22-recognition-failure.png</w:t>
+      </w:r>
+    </w:p>
+    <w:p>
+      <w:r>
+        <w:br w:type="page"/>
+      </w:r>
+    </w:p>
+    <w:p>
+      <w:pPr>
+        <w:pStyle w:val="Title"/>
+      </w:pPr>
+      <w:r>
+        <w:t>Recognition recovered</w:t>
+      </w:r>
+    </w:p>
+    <w:p>
+      <w:pPr>
+        <w:spacing w:after="160"/>
+      </w:pPr>
+      <w:r>
+        <w:t>Retry restores a reviewable suggestion without creating another item or changing physical position.</w:t>
+      </w:r>
+    </w:p>
+    <w:p>
+      <w:pPr>
+        <w:jc w:val="center"/>
+      </w:pPr>
+      <w:r>
+        <w:drawing>
+          <wp:inline xmlns:a="http://schemas.openxmlformats.org/drawingml/2006/main" xmlns:pic="http://schemas.openxmlformats.org/drawingml/2006/picture">
+            <wp:extent cx="5989320" cy="5610828"/>
+            <wp:docPr id="24" name="Picture 24"/>
+            <wp:cNvGraphicFramePr>
+              <a:graphicFrameLocks noChangeAspect="1"/>
+            </wp:cNvGraphicFramePr>
+            <a:graphic>
+              <a:graphicData uri="http://schemas.openxmlformats.org/drawingml/2006/picture">
+                <pic:pic>
+                  <pic:nvPicPr>
+                    <pic:cNvPr id="0" name="23-recognition-failure-recovered.png"/>
+                    <pic:cNvPicPr/>
+                  </pic:nvPicPr>
+                  <pic:blipFill>
+                    <a:blip r:embed="rId33"/>
+                    <a:stretch>
+                      <a:fillRect/>
+                    </a:stretch>
+                  </pic:blipFill>
+                  <pic:spPr>
+                    <a:xfrm>
+                      <a:off x="0" y="0"/>
+                      <a:ext cx="5989320" cy="5610828"/>
+                    </a:xfrm>
+                    <a:prstGeom prst="rect"/>
+                  </pic:spPr>
+                </pic:pic>
+              </a:graphicData>
+            </a:graphic>
+          </wp:inline>
+        </w:drawing>
+      </w:r>
+    </w:p>
+    <w:p>
+      <w:pPr>
+        <w:pStyle w:val="Caption"/>
+        <w:jc w:val="center"/>
+      </w:pPr>
+      <w:r>
+        <w:t>23-recognition-failure-recovered.png</w:t>
+      </w:r>
+    </w:p>
+    <w:p>
+      <w:r>
+        <w:br w:type="page"/>
+      </w:r>
+    </w:p>
+    <w:p>
+      <w:pPr>
+        <w:pStyle w:val="Title"/>
+      </w:pPr>
+      <w:r>
+        <w:t>Interruption fixture - Preview</w:t>
+      </w:r>
+    </w:p>
+    <w:p>
+      <w:pPr>
+        <w:spacing w:after="160"/>
+      </w:pPr>
+      <w:r>
+        <w:t>A large deterministic batch keeps recognition visibly active long enough to test process interruption.</w:t>
+      </w:r>
+    </w:p>
+    <w:p>
+      <w:pPr>
+        <w:jc w:val="center"/>
+      </w:pPr>
+      <w:r>
+        <w:drawing>
+          <wp:inline xmlns:a="http://schemas.openxmlformats.org/drawingml/2006/main" xmlns:pic="http://schemas.openxmlformats.org/drawingml/2006/picture">
+            <wp:extent cx="5989320" cy="4229957"/>
+            <wp:docPr id="25" name="Picture 25"/>
+            <wp:cNvGraphicFramePr>
+              <a:graphicFrameLocks noChangeAspect="1"/>
+            </wp:cNvGraphicFramePr>
+            <a:graphic>
+              <a:graphicData uri="http://schemas.openxmlformats.org/drawingml/2006/picture">
+                <pic:pic>
+                  <pic:nvPicPr>
+                    <pic:cNvPr id="0" name="24-preview-not-imported.png"/>
+                    <pic:cNvPicPr/>
+                  </pic:nvPicPr>
+                  <pic:blipFill>
+                    <a:blip r:embed="rId34"/>
+                    <a:stretch>
+                      <a:fillRect/>
+                    </a:stretch>
+                  </pic:blipFill>
+                  <pic:spPr>
+                    <a:xfrm>
+                      <a:off x="0" y="0"/>
+                      <a:ext cx="5989320" cy="4229957"/>
+                    </a:xfrm>
+                    <a:prstGeom prst="rect"/>
+                  </pic:spPr>
+                </pic:pic>
+              </a:graphicData>
+            </a:graphic>
+          </wp:inline>
+        </w:drawing>
+      </w:r>
+    </w:p>
+    <w:p>
+      <w:pPr>
+        <w:pStyle w:val="Caption"/>
+        <w:jc w:val="center"/>
+      </w:pPr>
+      <w:r>
+        <w:t>24-preview-not-imported.png</w:t>
+      </w:r>
+    </w:p>
+    <w:p>
+      <w:r>
+        <w:br w:type="page"/>
+      </w:r>
+    </w:p>
+    <w:p>
+      <w:pPr>
+        <w:pStyle w:val="Title"/>
+      </w:pPr>
+      <w:r>
+        <w:t>Interruption fixture - Import</w:t>
+      </w:r>
+    </w:p>
+    <w:p>
+      <w:pPr>
+        <w:spacing w:after="160"/>
+      </w:pPr>
+      <w:r>
+        <w:t>The 40-item batch receives one durable identity before recognition starts.</w:t>
+      </w:r>
+    </w:p>
+    <w:p>
+      <w:pPr>
+        <w:jc w:val="center"/>
+      </w:pPr>
+      <w:r>
+        <w:drawing>
+          <wp:inline xmlns:a="http://schemas.openxmlformats.org/drawingml/2006/main" xmlns:pic="http://schemas.openxmlformats.org/drawingml/2006/picture">
+            <wp:extent cx="5989320" cy="4159249"/>
+            <wp:docPr id="26" name="Picture 26"/>
+            <wp:cNvGraphicFramePr>
+              <a:graphicFrameLocks noChangeAspect="1"/>
+            </wp:cNvGraphicFramePr>
+            <a:graphic>
+              <a:graphicData uri="http://schemas.openxmlformats.org/drawingml/2006/picture">
+                <pic:pic>
+                  <pic:nvPicPr>
+                    <pic:cNvPr id="0" name="24-imported-durable-id.png"/>
+                    <pic:cNvPicPr/>
+                  </pic:nvPicPr>
+                  <pic:blipFill>
+                    <a:blip r:embed="rId35"/>
+                    <a:stretch>
+                      <a:fillRect/>
+                    </a:stretch>
+                  </pic:blipFill>
+                  <pic:spPr>
+                    <a:xfrm>
+                      <a:off x="0" y="0"/>
+                      <a:ext cx="5989320" cy="4159249"/>
+                    </a:xfrm>
+                    <a:prstGeom prst="rect"/>
+                  </pic:spPr>
+                </pic:pic>
+              </a:graphicData>
+            </a:graphic>
+          </wp:inline>
+        </w:drawing>
+      </w:r>
+    </w:p>
+    <w:p>
+      <w:pPr>
+        <w:pStyle w:val="Caption"/>
+        <w:jc w:val="center"/>
+      </w:pPr>
+      <w:r>
+        <w:t>24-imported-durable-id.png</w:t>
+      </w:r>
+    </w:p>
+    <w:p>
+      <w:r>
+        <w:br w:type="page"/>
+      </w:r>
+    </w:p>
+    <w:p>
+      <w:pPr>
+        <w:pStyle w:val="Title"/>
+      </w:pPr>
+      <w:r>
+        <w:t>Recognition running</w:t>
+      </w:r>
+    </w:p>
+    <w:p>
+      <w:pPr>
+        <w:spacing w:after="160"/>
+      </w:pPr>
+      <w:r>
+        <w:t>The browser shows committed progress before the application process is terminated.</w:t>
+      </w:r>
+    </w:p>
+    <w:p>
+      <w:pPr>
+        <w:jc w:val="center"/>
+      </w:pPr>
+      <w:r>
+        <w:drawing>
+          <wp:inline xmlns:a="http://schemas.openxmlformats.org/drawingml/2006/main" xmlns:pic="http://schemas.openxmlformats.org/drawingml/2006/picture">
+            <wp:extent cx="5989320" cy="5315521"/>
+            <wp:docPr id="27" name="Picture 27"/>
+            <wp:cNvGraphicFramePr>
+              <a:graphicFrameLocks noChangeAspect="1"/>
+            </wp:cNvGraphicFramePr>
+            <a:graphic>
+              <a:graphicData uri="http://schemas.openxmlformats.org/drawingml/2006/picture">
+                <pic:pic>
+                  <pic:nvPicPr>
+                    <pic:cNvPr id="0" name="26-recognition-running-before-kill.png"/>
+                    <pic:cNvPicPr/>
+                  </pic:nvPicPr>
+                  <pic:blipFill>
+                    <a:blip r:embed="rId36"/>
+                    <a:stretch>
+                      <a:fillRect/>
+                    </a:stretch>
+                  </pic:blipFill>
+                  <pic:spPr>
+                    <a:xfrm>
+                      <a:off x="0" y="0"/>
+                      <a:ext cx="5989320" cy="5315521"/>
+                    </a:xfrm>
+                    <a:prstGeom prst="rect"/>
+                  </pic:spPr>
+                </pic:pic>
+              </a:graphicData>
+            </a:graphic>
+          </wp:inline>
+        </w:drawing>
+      </w:r>
+    </w:p>
+    <w:p>
+      <w:pPr>
+        <w:pStyle w:val="Caption"/>
+        <w:jc w:val="center"/>
+      </w:pPr>
+      <w:r>
+        <w:t>26-recognition-running-before-kill.png</w:t>
+      </w:r>
+    </w:p>
+    <w:p>
+      <w:r>
+        <w:br w:type="page"/>
+      </w:r>
+    </w:p>
+    <w:p>
+      <w:pPr>
+        <w:pStyle w:val="Title"/>
+      </w:pPr>
+      <w:r>
+        <w:t>Recognition paused after restart</w:t>
+      </w:r>
+    </w:p>
+    <w:p>
+      <w:pPr>
+        <w:spacing w:after="160"/>
+      </w:pPr>
+      <w:r>
+        <w:t>Startup converts the orphaned Running job to Paused with exact completed/remaining counts and one Continue action.</w:t>
+      </w:r>
+    </w:p>
+    <w:p>
+      <w:pPr>
+        <w:jc w:val="center"/>
+      </w:pPr>
+      <w:r>
+        <w:drawing>
+          <wp:inline xmlns:a="http://schemas.openxmlformats.org/drawingml/2006/main" xmlns:pic="http://schemas.openxmlformats.org/drawingml/2006/picture">
+            <wp:extent cx="5989320" cy="5606669"/>
+            <wp:docPr id="28" name="Picture 28"/>
+            <wp:cNvGraphicFramePr>
+              <a:graphicFrameLocks noChangeAspect="1"/>
+            </wp:cNvGraphicFramePr>
+            <a:graphic>
+              <a:graphicData uri="http://schemas.openxmlformats.org/drawingml/2006/picture">
+                <pic:pic>
+                  <pic:nvPicPr>
+                    <pic:cNvPr id="0" name="27-recognition-paused-after-restart.png"/>
+                    <pic:cNvPicPr/>
+                  </pic:nvPicPr>
+                  <pic:blipFill>
+                    <a:blip r:embed="rId37"/>
+                    <a:stretch>
+                      <a:fillRect/>
+                    </a:stretch>
+                  </pic:blipFill>
+                  <pic:spPr>
+                    <a:xfrm>
+                      <a:off x="0" y="0"/>
+                      <a:ext cx="5989320" cy="5606669"/>
+                    </a:xfrm>
+                    <a:prstGeom prst="rect"/>
+                  </pic:spPr>
+                </pic:pic>
+              </a:graphicData>
+            </a:graphic>
+          </wp:inline>
+        </w:drawing>
+      </w:r>
+    </w:p>
+    <w:p>
+      <w:pPr>
+        <w:pStyle w:val="Caption"/>
+        <w:jc w:val="center"/>
+      </w:pPr>
+      <w:r>
+        <w:t>27-recognition-paused-after-restart.png</w:t>
+      </w:r>
+    </w:p>
+    <w:p>
+      <w:r>
+        <w:br w:type="page"/>
+      </w:r>
+    </w:p>
+    <w:p>
+      <w:pPr>
+        <w:pStyle w:val="Title"/>
+      </w:pPr>
+      <w:r>
+        <w:t>Continue interrupted identification</w:t>
+      </w:r>
+    </w:p>
+    <w:p>
+      <w:pPr>
+        <w:spacing w:after="160"/>
+      </w:pPr>
+      <w:r>
+        <w:t>Continue resumes from committed boundaries and completes without duplicate recognition attempts.</w:t>
+      </w:r>
+    </w:p>
+    <w:p>
+      <w:pPr>
+        <w:jc w:val="center"/>
+      </w:pPr>
+      <w:r>
+        <w:drawing>
+          <wp:inline xmlns:a="http://schemas.openxmlformats.org/drawingml/2006/main" xmlns:pic="http://schemas.openxmlformats.org/drawingml/2006/picture">
+            <wp:extent cx="5989320" cy="5315521"/>
+            <wp:docPr id="29" name="Picture 29"/>
+            <wp:cNvGraphicFramePr>
+              <a:graphicFrameLocks noChangeAspect="1"/>
+            </wp:cNvGraphicFramePr>
+            <a:graphic>
+              <a:graphicData uri="http://schemas.openxmlformats.org/drawingml/2006/picture">
+                <pic:pic>
+                  <pic:nvPicPr>
+                    <pic:cNvPr id="0" name="28-recognition-resumed-complete.png"/>
+                    <pic:cNvPicPr/>
+                  </pic:nvPicPr>
+                  <pic:blipFill>
+                    <a:blip r:embed="rId38"/>
+                    <a:stretch>
+                      <a:fillRect/>
+                    </a:stretch>
+                  </pic:blipFill>
+                  <pic:spPr>
+                    <a:xfrm>
+                      <a:off x="0" y="0"/>
+                      <a:ext cx="5989320" cy="5315521"/>
+                    </a:xfrm>
+                    <a:prstGeom prst="rect"/>
+                  </pic:spPr>
+                </pic:pic>
+              </a:graphicData>
+            </a:graphic>
+          </wp:inline>
+        </w:drawing>
+      </w:r>
+    </w:p>
+    <w:p>
+      <w:pPr>
+        <w:pStyle w:val="Caption"/>
+        <w:jc w:val="center"/>
+      </w:pPr>
+      <w:r>
+        <w:t>28-recognition-resumed-complete.png</w:t>
+      </w:r>
+    </w:p>
+    <w:p>
+      <w:r>
+        <w:br w:type="page"/>
+      </w:r>
+    </w:p>
+    <w:p>
+      <w:pPr>
+        <w:pStyle w:val="Title"/>
+      </w:pPr>
+      <w:r>
+        <w:t>Settings</w:t>
+      </w:r>
+    </w:p>
+    <w:p>
+      <w:pPr>
+        <w:spacing w:after="160"/>
+      </w:pPr>
+      <w:r>
+        <w:t>Set the normal incoming folder, inspect recent folders, and confirm provider availability before a real pilot.</w:t>
+      </w:r>
+    </w:p>
+    <w:p>
+      <w:pPr>
+        <w:jc w:val="center"/>
+      </w:pPr>
+      <w:r>
+        <w:drawing>
+          <wp:inline xmlns:a="http://schemas.openxmlformats.org/drawingml/2006/main" xmlns:pic="http://schemas.openxmlformats.org/drawingml/2006/picture">
+            <wp:extent cx="5989320" cy="4159249"/>
+            <wp:docPr id="30" name="Picture 30"/>
+            <wp:cNvGraphicFramePr>
+              <a:graphicFrameLocks noChangeAspect="1"/>
+            </wp:cNvGraphicFramePr>
+            <a:graphic>
+              <a:graphicData uri="http://schemas.openxmlformats.org/drawingml/2006/picture">
+                <pic:pic>
+                  <pic:nvPicPr>
+                    <pic:cNvPr id="0" name="29-settings.png"/>
+                    <pic:cNvPicPr/>
+                  </pic:nvPicPr>
+                  <pic:blipFill>
+                    <a:blip r:embed="rId39"/>
+                    <a:stretch>
+                      <a:fillRect/>
+                    </a:stretch>
+                  </pic:blipFill>
+                  <pic:spPr>
+                    <a:xfrm>
+                      <a:off x="0" y="0"/>
+                      <a:ext cx="5989320" cy="4159249"/>
+                    </a:xfrm>
+                    <a:prstGeom prst="rect"/>
+                  </pic:spPr>
+                </pic:pic>
+              </a:graphicData>
+            </a:graphic>
+          </wp:inline>
+        </w:drawing>
+      </w:r>
+    </w:p>
+    <w:p>
+      <w:pPr>
+        <w:pStyle w:val="Caption"/>
+        <w:jc w:val="center"/>
+      </w:pPr>
+      <w:r>
+        <w:t>29-settings.png</w:t>
+      </w:r>
+    </w:p>
+    <w:p>
+      <w:r>
+        <w:br w:type="page"/>
+      </w:r>
+    </w:p>
+    <w:p>
+      <w:pPr>
+        <w:pStyle w:val="Title"/>
+      </w:pPr>
+      <w:r>
+        <w:t>Diagnostics</w:t>
+      </w:r>
+    </w:p>
+    <w:p>
+      <w:pPr>
+        <w:spacing w:after="160"/>
+      </w:pPr>
+      <w:r>
+        <w:t>SQLite integrity must be ok, foreign-key violations zero, and schema version 5 before operation or restore.</w:t>
+      </w:r>
+    </w:p>
+    <w:p>
+      <w:pPr>
+        <w:jc w:val="center"/>
+      </w:pPr>
+      <w:r>
+        <w:drawing>
+          <wp:inline xmlns:a="http://schemas.openxmlformats.org/drawingml/2006/main" xmlns:pic="http://schemas.openxmlformats.org/drawingml/2006/picture">
+            <wp:extent cx="5989320" cy="4159249"/>
+            <wp:docPr id="31" name="Picture 31"/>
+            <wp:cNvGraphicFramePr>
+              <a:graphicFrameLocks noChangeAspect="1"/>
+            </wp:cNvGraphicFramePr>
+            <a:graphic>
+              <a:graphicData uri="http://schemas.openxmlformats.org/drawingml/2006/picture">
+                <pic:pic>
+                  <pic:nvPicPr>
+                    <pic:cNvPr id="0" name="30-diagnostics.png"/>
+                    <pic:cNvPicPr/>
+                  </pic:nvPicPr>
+                  <pic:blipFill>
+                    <a:blip r:embed="rId40"/>
+                    <a:stretch>
+                      <a:fillRect/>
+                    </a:stretch>
+                  </pic:blipFill>
+                  <pic:spPr>
+                    <a:xfrm>
+                      <a:off x="0" y="0"/>
+                      <a:ext cx="5989320" cy="4159249"/>
+                    </a:xfrm>
+                    <a:prstGeom prst="rect"/>
+                  </pic:spPr>
+                </pic:pic>
+              </a:graphicData>
+            </a:graphic>
+          </wp:inline>
+        </w:drawing>
+      </w:r>
+    </w:p>
+    <w:p>
+      <w:pPr>
+        <w:pStyle w:val="Caption"/>
+        <w:jc w:val="center"/>
+      </w:pPr>
+      <w:r>
+        <w:t>30-diagnostics.png</w:t>
+      </w:r>
+    </w:p>
+    <w:p>
+      <w:r>
+        <w:br w:type="page"/>
+      </w:r>
+    </w:p>
+    <w:p>
+      <w:pPr>
         <w:pStyle w:val="Heading1"/>
-        <w:keepNext/>
-        <w:pageBreakBefore/>
-        <w:spacing w:before="0"/>
-        <w:jc w:val="left"/>
       </w:pPr>
       <w:r>
         <w:t>End-of-batch checklist</w:t>
       </w:r>
     </w:p>
     <w:p>
-      <w:pPr>
-        <w:spacing w:after="140"/>
-      </w:pPr>
       <w:r>
-        <w:rPr>
-          <w:color w:val="555F5C"/>
-        </w:rPr>
-        <w:t>Complete this before treating a batch as finished.</w:t>
+        <w:t>☐ Unfinished count is zero and Review shows Review complete.</w:t>
       </w:r>
     </w:p>
     <w:p>
-      <w:pPr>
-        <w:spacing w:after="140"/>
-      </w:pPr>
       <w:r>
-        <w:rPr>
-          <w:sz w:val="26"/>
-        </w:rPr>
-        <w:t>☐  Unfinished count is zero and Review shows Review complete.</w:t>
+        <w:t>☐ Every title matches the photograph.</w:t>
       </w:r>
     </w:p>
     <w:p>
-      <w:pPr>
-        <w:spacing w:after="140"/>
-      </w:pPr>
       <w:r>
-        <w:rPr>
-          <w:sz w:val="26"/>
-        </w:rPr>
-        <w:t>☐  Every title matches the photograph.</w:t>
+        <w:t>☐ Quick-edited Price and Discount values are intentional.</w:t>
       </w:r>
     </w:p>
     <w:p>
-      <w:pPr>
-        <w:spacing w:after="140"/>
-      </w:pPr>
       <w:r>
-        <w:rPr>
-          <w:sz w:val="26"/>
-        </w:rPr>
-        <w:t>☐  Quick-edited Price and Discount values are intentional.</w:t>
+        <w:t>☐ Shelf and Rare / Physical Review flags match the physical tape.</w:t>
       </w:r>
     </w:p>
     <w:p>
-      <w:pPr>
-        <w:spacing w:after="140"/>
-      </w:pPr>
       <w:r>
-        <w:rPr>
-          <w:sz w:val="26"/>
-        </w:rPr>
-        <w:t>☐  Shelf and Rare / Physical Review flags match the physical tape.</w:t>
+        <w:t>☐ Completed corrections retain the original Item ID.</w:t>
       </w:r>
     </w:p>
     <w:p>
-      <w:pPr>
-        <w:spacing w:after="140"/>
-      </w:pPr>
       <w:r>
-        <w:rPr>
-          <w:sz w:val="26"/>
-        </w:rPr>
-        <w:t>☐  Completed corrections retain the original Item ID.</w:t>
+        <w:t>☐ Publish simulation shows expected Ready and Blocked counts.</w:t>
       </w:r>
     </w:p>
     <w:p>
-      <w:pPr>
-        <w:spacing w:after="140"/>
-      </w:pPr>
       <w:r>
-        <w:rPr>
-          <w:sz w:val="26"/>
-        </w:rPr>
-        <w:t>☐  Publish simulation shows expected Ready and Blocked counts.</w:t>
+        <w:t>☐ The browser-downloaded CSV contains the same Item IDs and saved titles.</w:t>
       </w:r>
     </w:p>
     <w:p>
-      <w:pPr>
-        <w:spacing w:after="140"/>
-      </w:pPr>
       <w:r>
-        <w:rPr>
-          <w:sz w:val="26"/>
-        </w:rPr>
-        <w:t>☐  The downloaded CSV contains the same Item IDs and saved titles.</w:t>
+        <w:t>☐ During the first real pilot, keep Shopify in simulation until physical CSV reconciliation passes.</w:t>
       </w:r>
     </w:p>
     <w:p>
-      <w:pPr>
-        <w:spacing w:after="140"/>
-      </w:pPr>
       <w:r>
-        <w:rPr>
-          <w:sz w:val="26"/>
-        </w:rPr>
-        <w:t>☐  For the first production pilot, Shopify remains simulation-only until CSV reconciliation passes.</w:t>
+        <w:t>☐ For the live-draft acceptance test, create exactly one draft and inspect it in Shopify.</w:t>
       </w:r>
     </w:p>
     <w:p>
       <w:pPr>
-        <w:spacing w:after="140"/>
+        <w:pStyle w:val="Heading2"/>
       </w:pPr>
       <w:r>
-        <w:rPr>
-          <w:sz w:val="26"/>
-        </w:rPr>
-        <w:t>☐  For a live-draft acceptance test, create exactly one draft and inspect it in Shopify before continuing.</w:t>
+        <w:t>1.0 acceptance gate</w:t>
       </w:r>
     </w:p>
     <w:p>
-      <w:pPr>
-        <w:spacing w:before="360"/>
-      </w:pPr>
       <w:r>
-        <w:rPr>
-          <w:b/>
-          <w:color w:val="962323"/>
-        </w:rPr>
-        <w:t>1.0.0 is forbidden until the real Pixel pilot, live AI, live Shopify draft, CSV verification, restart durability, guide walkthrough, browser verification, and blocker review all pass.</w:t>
+        <w:t>Version 1.0.0 is forbidden until the real 20-tape Pixel pilot, live AI, one live Shopify draft, physical CSV verification, restart durability, independent guide walkthrough, browser verification, and blocker review all pass.</w:t>
       </w:r>
     </w:p>
     <w:sectPr>
-      <w:footerReference w:type="default" r:id="rId9"/>
-      <w:pgSz w:w="15840" w:h="12240" w:orient="landscape"/>
-      <w:pgMar w:top="648" w:right="792" w:bottom="648" w:left="792" w:header="720" w:footer="720" w:gutter="0"/>
+      <w:headerReference w:type="default" r:id="rId9"/>
+      <w:footerReference w:type="default" r:id="rId10"/>
+      <w:pgSz w:w="12240" w:h="15840"/>
+      <w:pgMar w:top="792" w:right="1008" w:bottom="792" w:left="1008" w:header="720" w:footer="720" w:gutter="0"/>
       <w:cols w:space="720"/>
       <w:docGrid w:linePitch="360"/>
     </w:sectPr>
@@ -2627,18 +2712,39 @@
   <w:p>
     <w:pPr>
       <w:pStyle w:val="Footer"/>
+      <w:jc w:val="center"/>
+    </w:pPr>
+    <w:r>
+      <w:rPr>
+        <w:sz w:val="16"/>
+      </w:rPr>
+      <w:t xml:space="preserve">SnapIMS 0.5.1 Operator Guide  |  Page </w:t>
+    </w:r>
+    <w:r>
+      <w:fldChar w:fldCharType="begin"/>
+      <w:instrText xml:space="preserve">PAGE</w:instrText>
+      <w:fldChar w:fldCharType="separate"/>
+      <w:fldChar w:fldCharType="end"/>
+    </w:r>
+  </w:p>
+</w:ftr>
+</file>
+
+<file path=word/header1.xml><?xml version="1.0" encoding="utf-8"?>
+<w:hdr xmlns:m="http://schemas.openxmlformats.org/officeDocument/2006/math" xmlns:mc="http://schemas.openxmlformats.org/markup-compatibility/2006" xmlns:mo="http://schemas.microsoft.com/office/mac/office/2008/main" xmlns:mv="urn:schemas-microsoft-com:mac:vml" xmlns:o="urn:schemas-microsoft-com:office:office" xmlns:r="http://schemas.openxmlformats.org/officeDocument/2006/relationships" xmlns:v="urn:schemas-microsoft-com:vml" xmlns:w10="urn:schemas-microsoft-com:office:word" xmlns:w14="http://schemas.microsoft.com/office/word/2010/wordml" xmlns:w="http://schemas.openxmlformats.org/wordprocessingml/2006/main" xmlns:wne="http://schemas.microsoft.com/office/word/2006/wordml" xmlns:wp14="http://schemas.microsoft.com/office/word/2010/wordprocessingDrawing" xmlns:wp="http://schemas.openxmlformats.org/drawingml/2006/wordprocessingDrawing" xmlns:wpc="http://schemas.microsoft.com/office/word/2010/wordprocessingCanvas" xmlns:wpg="http://schemas.microsoft.com/office/word/2010/wordprocessingGroup" xmlns:wpi="http://schemas.microsoft.com/office/word/2010/wordprocessingInk" xmlns:wps="http://schemas.microsoft.com/office/word/2010/wordprocessingShape" mc:Ignorable="w14 wp14">
+  <w:p>
+    <w:pPr>
+      <w:pStyle w:val="Header"/>
       <w:jc w:val="right"/>
     </w:pPr>
     <w:r>
       <w:rPr>
-        <w:color w:val="646464"/>
         <w:sz w:val="16"/>
       </w:rPr>
-      <w:t xml:space="preserve">SnapIMS 0.5.0 Operator Guide  |  Page </w:t>
+      <w:t>SnapIMS 0.5.1 Operator Guide</w:t>
     </w:r>
-    <w:fldSimple w:instr="PAGE"/>
   </w:p>
-</w:ftr>
+</w:hdr>
 </file>
 
 <file path=word/numbering.xml><?xml version="1.0" encoding="utf-8"?>
@@ -3005,7 +3111,7 @@
     <w:qFormat/>
     <w:rsid w:val="00FC693F"/>
     <w:rPr>
-      <w:rFonts w:ascii="Aptos" w:hAnsi="Aptos"/>
+      <w:rFonts w:ascii="Liberation Sans" w:hAnsi="Liberation Sans"/>
       <w:sz w:val="21"/>
     </w:rPr>
   </w:style>
@@ -3068,11 +3174,11 @@
       <w:outlineLvl w:val="0"/>
     </w:pPr>
     <w:rPr>
-      <w:rFonts w:asciiTheme="majorHAnsi" w:eastAsiaTheme="majorEastAsia" w:hAnsiTheme="majorHAnsi" w:cstheme="majorBidi" w:ascii="Aptos Display" w:hAnsi="Aptos Display"/>
+      <w:rFonts w:asciiTheme="majorHAnsi" w:eastAsiaTheme="majorEastAsia" w:hAnsiTheme="majorHAnsi" w:cstheme="majorBidi" w:ascii="Liberation Sans" w:hAnsi="Liberation Sans"/>
       <w:b/>
       <w:bCs/>
-      <w:color w:val="18744E"/>
-      <w:sz w:val="44"/>
+      <w:color w:val="1B774F"/>
+      <w:sz w:val="28"/>
       <w:szCs w:val="28"/>
     </w:rPr>
   </w:style>
@@ -3092,11 +3198,11 @@
       <w:outlineLvl w:val="1"/>
     </w:pPr>
     <w:rPr>
-      <w:rFonts w:asciiTheme="majorHAnsi" w:eastAsiaTheme="majorEastAsia" w:hAnsiTheme="majorHAnsi" w:cstheme="majorBidi" w:ascii="Aptos Display" w:hAnsi="Aptos Display"/>
+      <w:rFonts w:asciiTheme="majorHAnsi" w:eastAsiaTheme="majorEastAsia" w:hAnsiTheme="majorHAnsi" w:cstheme="majorBidi" w:ascii="Liberation Sans" w:hAnsi="Liberation Sans"/>
       <w:b/>
       <w:bCs/>
-      <w:color w:val="4F81BD" w:themeColor="accent1"/>
-      <w:sz w:val="30"/>
+      <w:color w:val="1B774F"/>
+      <w:sz w:val="26"/>
       <w:szCs w:val="26"/>
     </w:rPr>
   </w:style>
@@ -3357,12 +3463,12 @@
       <w:contextualSpacing/>
     </w:pPr>
     <w:rPr>
-      <w:rFonts w:asciiTheme="majorHAnsi" w:eastAsiaTheme="majorEastAsia" w:hAnsiTheme="majorHAnsi" w:cstheme="majorBidi" w:ascii="Aptos Display" w:hAnsi="Aptos Display"/>
+      <w:rFonts w:asciiTheme="majorHAnsi" w:eastAsiaTheme="majorEastAsia" w:hAnsiTheme="majorHAnsi" w:cstheme="majorBidi" w:ascii="Liberation Sans" w:hAnsi="Liberation Sans"/>
       <w:b/>
-      <w:color w:val="14231E"/>
+      <w:color w:val="1B774F"/>
       <w:spacing w:val="5"/>
       <w:kern w:val="28"/>
-      <w:sz w:val="68"/>
+      <w:sz w:val="48"/>
       <w:szCs w:val="52"/>
     </w:rPr>
   </w:style>
@@ -3800,10 +3906,11 @@
       <w:spacing w:line="240" w:lineRule="auto"/>
     </w:pPr>
     <w:rPr>
+      <w:rFonts w:ascii="Liberation Sans" w:hAnsi="Liberation Sans"/>
       <w:b/>
       <w:bCs/>
       <w:color w:val="4F81BD" w:themeColor="accent1"/>
-      <w:sz w:val="18"/>
+      <w:sz w:val="16"/>
       <w:szCs w:val="18"/>
     </w:rPr>
   </w:style>

</xml_diff>

<commit_message>
docs: synchronize SnapIMS v0.6.0 operator release
</commit_message>
<xml_diff>
--- a/SnapIMS_Operator_Guide.docx
+++ b/SnapIMS_Operator_Guide.docx
@@ -4,60 +4,263 @@
   <w:body>
     <w:p>
       <w:pPr>
-        <w:spacing w:before="2160"/>
+        <w:spacing w:before="1200"/>
         <w:jc w:val="center"/>
       </w:pPr>
       <w:r>
         <w:rPr>
+          <w:rFonts w:ascii="Liberation Sans" w:hAnsi="Liberation Sans"/>
           <w:b/>
-          <w:color w:val="1B774F"/>
-          <w:sz w:val="80"/>
+          <w:color w:val="8055D9"/>
+          <w:sz w:val="84"/>
         </w:rPr>
         <w:t>SnapIMS</w:t>
       </w:r>
     </w:p>
     <w:p>
       <w:pPr>
+        <w:pStyle w:val="Title"/>
         <w:jc w:val="center"/>
       </w:pPr>
       <w:r>
-        <w:rPr>
-          <w:b/>
-          <w:sz w:val="56"/>
-        </w:rPr>
         <w:t>Operator Guide</w:t>
       </w:r>
     </w:p>
     <w:p>
       <w:pPr>
+        <w:pStyle w:val="Subtitle"/>
         <w:jc w:val="center"/>
       </w:pPr>
       <w:r>
-        <w:rPr>
-          <w:sz w:val="32"/>
-        </w:rPr>
-        <w:t>Version 0.5.1 - Verification Hardening Patch</w:t>
+        <w:t>Version 0.6.0 - Operator Workstation Release</w:t>
+      </w:r>
+    </w:p>
+    <w:p/>
+    <w:tbl>
+      <w:tblPr>
+        <w:tblW w:type="auto" w:w="0"/>
+        <w:tblLayout w:type="autofit"/>
+        <w:tblLook w:firstColumn="1" w:firstRow="1" w:lastColumn="0" w:lastRow="0" w:noHBand="0" w:noVBand="1" w:val="04A0"/>
+      </w:tblPr>
+      <w:tblGrid>
+        <w:gridCol w:w="10224"/>
+      </w:tblGrid>
+      <w:tr>
+        <w:tc>
+          <w:tcPr>
+            <w:tcW w:type="dxa" w:w="10224"/>
+            <w:shd w:fill="F4F0FA"/>
+            <w:vAlign w:val="center"/>
+          </w:tcPr>
+          <w:p>
+            <w:pPr>
+              <w:spacing w:after="60"/>
+            </w:pPr>
+            <w:r>
+              <w:rPr>
+                <w:b/>
+                <w:color w:val="8055D9"/>
+              </w:rPr>
+              <w:t>Purpose</w:t>
+            </w:r>
+          </w:p>
+          <w:p>
+            <w:pPr>
+              <w:spacing w:after="0"/>
+            </w:pPr>
+            <w:r>
+              <w:t>SnapIMS converts an ordered photo stream into durable inventory records, routes uncertainty to an operator, supports fast individual or batch-wide correction, and prepares validated CSV or Shopify output.</w:t>
+            </w:r>
+          </w:p>
+        </w:tc>
+      </w:tr>
+    </w:tbl>
+    <w:p/>
+    <w:tbl>
+      <w:tblPr>
+        <w:tblW w:type="auto" w:w="0"/>
+        <w:tblLayout w:type="autofit"/>
+        <w:tblLook w:firstColumn="1" w:firstRow="1" w:lastColumn="0" w:lastRow="0" w:noHBand="0" w:noVBand="1" w:val="04A0"/>
+      </w:tblPr>
+      <w:tblGrid>
+        <w:gridCol w:w="10224"/>
+      </w:tblGrid>
+      <w:tr>
+        <w:tc>
+          <w:tcPr>
+            <w:tcW w:type="dxa" w:w="10224"/>
+            <w:shd w:fill="FFF4DB"/>
+            <w:vAlign w:val="center"/>
+          </w:tcPr>
+          <w:p>
+            <w:pPr>
+              <w:spacing w:after="60"/>
+            </w:pPr>
+            <w:r>
+              <w:rPr>
+                <w:b/>
+                <w:color w:val="8A5A00"/>
+              </w:rPr>
+              <w:t>Release status</w:t>
+            </w:r>
+          </w:p>
+          <w:p>
+            <w:pPr>
+              <w:spacing w:after="0"/>
+            </w:pPr>
+            <w:r>
+              <w:t>Version 0.6.0 is a production-pilot candidate, not 1.0. Live AI, a real Pixel batch, one live Shopify draft, physical CSV reconciliation, and final independent acceptance remain required.</w:t>
+            </w:r>
+          </w:p>
+        </w:tc>
+      </w:tr>
+    </w:tbl>
+    <w:p/>
+    <w:p>
+      <w:r>
+        <w:br w:type="page"/>
       </w:r>
     </w:p>
     <w:p>
       <w:pPr>
-        <w:jc w:val="center"/>
+        <w:pStyle w:val="Heading1"/>
       </w:pPr>
       <w:r>
-        <w:t>Photo-first inventory ingestion for Canada VHS</w:t>
-        <w:br/>
-        <w:t>FastAPI/Jinja browser workstation · SQLite schema 5</w:t>
+        <w:t>Fast Start</w:t>
       </w:r>
     </w:p>
     <w:p>
-      <w:pPr>
-        <w:spacing w:before="1728"/>
-        <w:jc w:val="center"/>
-      </w:pPr>
       <w:r>
-        <w:t>Use the final browser UI as the source of truth.</w:t>
+        <w:t>Launch SnapIMS from the repository virtual environment:</w:t>
+      </w:r>
+    </w:p>
+    <w:p>
+      <w:pPr/>
+      <w:r>
+        <w:rPr>
+          <w:rFonts w:ascii="Liberation Mono" w:hAnsi="Liberation Mono"/>
+          <w:sz w:val="18"/>
+        </w:rPr>
+        <w:t>cd ~/Projects/SnapIMS-v0.6.0</w:t>
         <w:br/>
-        <w:t>Mock and simulation screenshots do not prove live AI or live Shopify.</w:t>
+        <w:t>source .venv/bin/activate</w:t>
+        <w:br/>
+        <w:t>snapims --data-dir ~/SnapIMS-data serve</w:t>
+      </w:r>
+    </w:p>
+    <w:tbl>
+      <w:tblPr>
+        <w:tblW w:type="auto" w:w="0"/>
+        <w:tblLayout w:type="autofit"/>
+        <w:tblLook w:firstColumn="1" w:firstRow="1" w:lastColumn="0" w:lastRow="0" w:noHBand="0" w:noVBand="1" w:val="04A0"/>
+      </w:tblPr>
+      <w:tblGrid>
+        <w:gridCol w:w="10224"/>
+      </w:tblGrid>
+      <w:tr>
+        <w:tc>
+          <w:tcPr>
+            <w:tcW w:type="dxa" w:w="10224"/>
+            <w:shd w:fill="EAF6F0"/>
+            <w:vAlign w:val="center"/>
+          </w:tcPr>
+          <w:p>
+            <w:pPr>
+              <w:spacing w:after="60"/>
+            </w:pPr>
+            <w:r>
+              <w:rPr>
+                <w:b/>
+                <w:color w:val="2F7D5A"/>
+              </w:rPr>
+              <w:t>Browser address</w:t>
+            </w:r>
+          </w:p>
+          <w:p>
+            <w:pPr>
+              <w:spacing w:after="0"/>
+            </w:pPr>
+            <w:r>
+              <w:t>Open http://127.0.0.1:8767. Keep the terminal running. Ctrl+C stops the server.</w:t>
+            </w:r>
+          </w:p>
+        </w:tc>
+      </w:tr>
+    </w:tbl>
+    <w:p/>
+    <w:p>
+      <w:pPr>
+        <w:ind w:left="173" w:hanging="173"/>
+      </w:pPr>
+      <w:r>
+        <w:rPr>
+          <w:b/>
+          <w:color w:val="8055D9"/>
+        </w:rPr>
+        <w:t xml:space="preserve">1. </w:t>
+      </w:r>
+      <w:r>
+        <w:t>Import a folder containing the chronological camera photo stream.</w:t>
+      </w:r>
+    </w:p>
+    <w:p>
+      <w:pPr>
+        <w:ind w:left="173" w:hanging="173"/>
+      </w:pPr>
+      <w:r>
+        <w:rPr>
+          <w:b/>
+          <w:color w:val="8055D9"/>
+        </w:rPr>
+        <w:t xml:space="preserve">2. </w:t>
+      </w:r>
+      <w:r>
+        <w:t>Run recognition, or continue with manual review when a provider is unavailable.</w:t>
+      </w:r>
+    </w:p>
+    <w:p>
+      <w:pPr>
+        <w:ind w:left="173" w:hanging="173"/>
+      </w:pPr>
+      <w:r>
+        <w:rPr>
+          <w:b/>
+          <w:color w:val="8055D9"/>
+        </w:rPr>
+        <w:t xml:space="preserve">3. </w:t>
+      </w:r>
+      <w:r>
+        <w:t>Resolve items one at a time in Review or work across the batch in Batch Editor.</w:t>
+      </w:r>
+    </w:p>
+    <w:p>
+      <w:pPr>
+        <w:ind w:left="173" w:hanging="173"/>
+      </w:pPr>
+      <w:r>
+        <w:rPr>
+          <w:b/>
+          <w:color w:val="8055D9"/>
+        </w:rPr>
+        <w:t xml:space="preserve">4. </w:t>
+      </w:r>
+      <w:r>
+        <w:t>Use CSV download/upload only when an external spreadsheet is useful.</w:t>
+      </w:r>
+    </w:p>
+    <w:p>
+      <w:pPr>
+        <w:ind w:left="173" w:hanging="173"/>
+      </w:pPr>
+      <w:r>
+        <w:rPr>
+          <w:b/>
+          <w:color w:val="8055D9"/>
+        </w:rPr>
+        <w:t xml:space="preserve">5. </w:t>
+      </w:r>
+      <w:r>
+        <w:t>Validate the current working batch in Publish, then simulate or create the requested output.</w:t>
       </w:r>
     </w:p>
     <w:p>
@@ -70,419 +273,126 @@
         <w:pStyle w:val="Heading1"/>
       </w:pPr>
       <w:r>
-        <w:t>Quick start</w:t>
+        <w:t>1. Home Dashboard</w:t>
       </w:r>
     </w:p>
     <w:p>
       <w:r>
-        <w:t>The routine operator flow is intentionally short.</w:t>
-      </w:r>
-    </w:p>
-    <w:tbl>
-      <w:tblPr>
-        <w:tblStyle w:val="TableGrid"/>
-        <w:tblW w:type="auto" w:w="0"/>
-        <w:tblLook w:firstColumn="1" w:firstRow="1" w:lastColumn="0" w:lastRow="0" w:noHBand="0" w:noVBand="1" w:val="04A0"/>
-      </w:tblPr>
-      <w:tblGrid>
-        <w:gridCol w:w="2045"/>
-        <w:gridCol w:w="2045"/>
-        <w:gridCol w:w="2045"/>
-        <w:gridCol w:w="2045"/>
-        <w:gridCol w:w="2045"/>
-      </w:tblGrid>
-      <w:tr>
-        <w:tc>
-          <w:tcPr>
-            <w:tcW w:type="dxa" w:w="2045"/>
-            <w:shd w:fill="D9EDE3"/>
-          </w:tcPr>
-          <w:p>
-            <w:r>
-              <w:t>1. Photograph</w:t>
-            </w:r>
-          </w:p>
-        </w:tc>
-        <w:tc>
-          <w:tcPr>
-            <w:tcW w:type="dxa" w:w="2045"/>
-            <w:shd w:fill="D9EDE3"/>
-          </w:tcPr>
-          <w:p>
-            <w:r>
-              <w:t>2. Import</w:t>
-            </w:r>
-          </w:p>
-        </w:tc>
-        <w:tc>
-          <w:tcPr>
-            <w:tcW w:type="dxa" w:w="2045"/>
-            <w:shd w:fill="D9EDE3"/>
-          </w:tcPr>
-          <w:p>
-            <w:r>
-              <w:t>3. Identify</w:t>
-            </w:r>
-          </w:p>
-        </w:tc>
-        <w:tc>
-          <w:tcPr>
-            <w:tcW w:type="dxa" w:w="2045"/>
-            <w:shd w:fill="D9EDE3"/>
-          </w:tcPr>
-          <w:p>
-            <w:r>
-              <w:t>4. Review</w:t>
-            </w:r>
-          </w:p>
-        </w:tc>
-        <w:tc>
-          <w:tcPr>
-            <w:tcW w:type="dxa" w:w="2045"/>
-            <w:shd w:fill="D9EDE3"/>
-          </w:tcPr>
-          <w:p>
-            <w:r>
-              <w:t>5. Publish</w:t>
-            </w:r>
-          </w:p>
-        </w:tc>
-      </w:tr>
-      <w:tr>
-        <w:tc>
-          <w:tcPr>
-            <w:tcW w:type="dxa" w:w="2045"/>
-          </w:tcPr>
-          <w:p>
-            <w:r>
-              <w:t>START, shelf, tape photos, NEXT, repeat, END.</w:t>
-            </w:r>
-          </w:p>
-        </w:tc>
-        <w:tc>
-          <w:tcPr>
-            <w:tcW w:type="dxa" w:w="2045"/>
-          </w:tcPr>
-          <w:p>
-            <w:r>
-              <w:t>Preview grouping, then preserve/import.</w:t>
-            </w:r>
-          </w:p>
-        </w:tc>
-        <w:tc>
-          <w:tcPr>
-            <w:tcW w:type="dxa" w:w="2045"/>
-          </w:tcPr>
-          <w:p>
-            <w:r>
-              <w:t>Choose a provider and identify the batch.</w:t>
-            </w:r>
-          </w:p>
-        </w:tc>
-        <w:tc>
-          <w:tcPr>
-            <w:tcW w:type="dxa" w:w="2045"/>
-          </w:tcPr>
-          <w:p>
-            <w:r>
-              <w:t>Confirm title; optionally adjust Price or Discount; Approve &amp; Next.</w:t>
-            </w:r>
-          </w:p>
-        </w:tc>
-        <w:tc>
-          <w:tcPr>
-            <w:tcW w:type="dxa" w:w="2045"/>
-          </w:tcPr>
-          <w:p>
-            <w:r>
-              <w:t>Simulate drafts and download the CSV.</w:t>
-            </w:r>
-          </w:p>
-        </w:tc>
-      </w:tr>
-    </w:tbl>
-    <w:p>
-      <w:pPr>
-        <w:pStyle w:val="ListBullet"/>
-      </w:pPr>
-      <w:r>
-        <w:t>Edit is exception mode, not the routine path.</w:t>
+        <w:t>Home shows the active batches, recognition state, unfinished work, and the next logical actions.</w:t>
       </w:r>
     </w:p>
     <w:p>
       <w:pPr>
-        <w:pStyle w:val="ListBullet"/>
+        <w:ind w:left="173" w:hanging="173"/>
       </w:pPr>
       <w:r>
-        <w:t>Later postpones a tape and leaves it unfinished.</w:t>
+        <w:rPr>
+          <w:b/>
+          <w:color w:val="8055D9"/>
+        </w:rPr>
+        <w:t xml:space="preserve">1. </w:t>
+      </w:r>
+      <w:r>
+        <w:t>Choose Import to create a new batch.</w:t>
       </w:r>
     </w:p>
     <w:p>
       <w:pPr>
-        <w:pStyle w:val="ListBullet"/>
+        <w:ind w:left="173" w:hanging="173"/>
       </w:pPr>
       <w:r>
-        <w:t>Never change Item ID; it is permanent across Review, CSV, and Shopify.</w:t>
+        <w:rPr>
+          <w:b/>
+          <w:color w:val="8055D9"/>
+        </w:rPr>
+        <w:t xml:space="preserve">2. </w:t>
+      </w:r>
+      <w:r>
+        <w:t>Open Review for the one-tape workstation.</w:t>
       </w:r>
     </w:p>
     <w:p>
       <w:pPr>
-        <w:pStyle w:val="ListBullet"/>
+        <w:ind w:left="173" w:hanging="173"/>
       </w:pPr>
       <w:r>
-        <w:t>Real operator time per tape must be measured during the live pilot.</w:t>
+        <w:rPr>
+          <w:b/>
+          <w:color w:val="8055D9"/>
+        </w:rPr>
+        <w:t xml:space="preserve">3. </w:t>
+      </w:r>
+      <w:r>
+        <w:t>Open Batch Editor for bulk changes and low-confidence triage.</w:t>
       </w:r>
     </w:p>
     <w:p>
       <w:pPr>
-        <w:pStyle w:val="Heading2"/>
+        <w:ind w:left="173" w:hanging="173"/>
       </w:pPr>
       <w:r>
-        <w:t>QR photography sequence</w:t>
+        <w:rPr>
+          <w:b/>
+          <w:color w:val="8055D9"/>
+        </w:rPr>
+        <w:t xml:space="preserve">4. </w:t>
+      </w:r>
+      <w:r>
+        <w:t>Open Publish only after the working batch has no blockers.</w:t>
       </w:r>
     </w:p>
-    <w:tbl>
-      <w:tblPr>
-        <w:tblStyle w:val="TableGrid"/>
-        <w:tblW w:type="auto" w:w="0"/>
-        <w:tblLook w:firstColumn="1" w:firstRow="1" w:lastColumn="0" w:lastRow="0" w:noHBand="0" w:noVBand="1" w:val="04A0"/>
-      </w:tblPr>
-      <w:tblGrid>
-        <w:gridCol w:w="3408"/>
-        <w:gridCol w:w="3408"/>
-        <w:gridCol w:w="3408"/>
-      </w:tblGrid>
-      <w:tr>
-        <w:tc>
-          <w:tcPr>
-            <w:tcW w:type="dxa" w:w="3408"/>
-            <w:shd w:fill="D9EDE3"/>
-          </w:tcPr>
-          <w:p>
-            <w:r>
-              <w:t>Card / action</w:t>
-            </w:r>
-          </w:p>
-        </w:tc>
-        <w:tc>
-          <w:tcPr>
-            <w:tcW w:type="dxa" w:w="3408"/>
-            <w:shd w:fill="D9EDE3"/>
-          </w:tcPr>
-          <w:p>
-            <w:r>
-              <w:t>Payload</w:t>
-            </w:r>
-          </w:p>
-        </w:tc>
-        <w:tc>
-          <w:tcPr>
-            <w:tcW w:type="dxa" w:w="3408"/>
-            <w:shd w:fill="D9EDE3"/>
-          </w:tcPr>
-          <w:p>
-            <w:r>
-              <w:t>Meaning</w:t>
-            </w:r>
-          </w:p>
-        </w:tc>
-      </w:tr>
-      <w:tr>
-        <w:tc>
-          <w:tcPr>
-            <w:tcW w:type="dxa" w:w="3408"/>
-          </w:tcPr>
-          <w:p>
-            <w:r>
-              <w:t>START</w:t>
-            </w:r>
-          </w:p>
-        </w:tc>
-        <w:tc>
-          <w:tcPr>
-            <w:tcW w:type="dxa" w:w="3408"/>
-          </w:tcPr>
-          <w:p>
-            <w:r>
-              <w:t>CVHS1:BATCH:START</w:t>
-            </w:r>
-          </w:p>
-        </w:tc>
-        <w:tc>
-          <w:tcPr>
-            <w:tcW w:type="dxa" w:w="3408"/>
-          </w:tcPr>
-          <w:p>
-            <w:r>
-              <w:t>Begins the batch.</w:t>
-            </w:r>
-          </w:p>
-        </w:tc>
-      </w:tr>
-      <w:tr>
-        <w:tc>
-          <w:tcPr>
-            <w:tcW w:type="dxa" w:w="3408"/>
-          </w:tcPr>
-          <w:p>
-            <w:r>
-              <w:t>LOCATION</w:t>
-            </w:r>
-          </w:p>
-        </w:tc>
-        <w:tc>
-          <w:tcPr>
-            <w:tcW w:type="dxa" w:w="3408"/>
-          </w:tcPr>
-          <w:p>
-            <w:r>
-              <w:t>CVHS1:LOC:A1 ... J10 or Q1</w:t>
-            </w:r>
-          </w:p>
-        </w:tc>
-        <w:tc>
-          <w:tcPr>
-            <w:tcW w:type="dxa" w:w="3408"/>
-          </w:tcPr>
-          <w:p>
-            <w:r>
-              <w:t>Applies shelf to following items.</w:t>
-            </w:r>
-          </w:p>
-        </w:tc>
-      </w:tr>
-      <w:tr>
-        <w:tc>
-          <w:tcPr>
-            <w:tcW w:type="dxa" w:w="3408"/>
-          </w:tcPr>
-          <w:p>
-            <w:r>
-              <w:t>PRODUCT</w:t>
-            </w:r>
-          </w:p>
-        </w:tc>
-        <w:tc>
-          <w:tcPr>
-            <w:tcW w:type="dxa" w:w="3408"/>
-          </w:tcPr>
-          <w:p>
-            <w:r>
-              <w:t>ordinary photos</w:t>
-            </w:r>
-          </w:p>
-        </w:tc>
-        <w:tc>
-          <w:tcPr>
-            <w:tcW w:type="dxa" w:w="3408"/>
-          </w:tcPr>
-          <w:p>
-            <w:r>
-              <w:t>First product photo is Front.</w:t>
-            </w:r>
-          </w:p>
-        </w:tc>
-      </w:tr>
-      <w:tr>
-        <w:tc>
-          <w:tcPr>
-            <w:tcW w:type="dxa" w:w="3408"/>
-          </w:tcPr>
-          <w:p>
-            <w:r>
-              <w:t>NEXT</w:t>
-            </w:r>
-          </w:p>
-        </w:tc>
-        <w:tc>
-          <w:tcPr>
-            <w:tcW w:type="dxa" w:w="3408"/>
-          </w:tcPr>
-          <w:p>
-            <w:r>
-              <w:t>CVHS1:ITEM:NEXT</w:t>
-            </w:r>
-          </w:p>
-        </w:tc>
-        <w:tc>
-          <w:tcPr>
-            <w:tcW w:type="dxa" w:w="3408"/>
-          </w:tcPr>
-          <w:p>
-            <w:r>
-              <w:t>Sole normal item boundary.</w:t>
-            </w:r>
-          </w:p>
-        </w:tc>
-      </w:tr>
-      <w:tr>
-        <w:tc>
-          <w:tcPr>
-            <w:tcW w:type="dxa" w:w="3408"/>
-          </w:tcPr>
-          <w:p>
-            <w:r>
-              <w:t>FLAGS</w:t>
-            </w:r>
-          </w:p>
-        </w:tc>
-        <w:tc>
-          <w:tcPr>
-            <w:tcW w:type="dxa" w:w="3408"/>
-          </w:tcPr>
-          <w:p>
-            <w:r>
-              <w:t>CVHS1:FLAG:RARE / REVIEW</w:t>
-            </w:r>
-          </w:p>
-        </w:tc>
-        <w:tc>
-          <w:tcPr>
-            <w:tcW w:type="dxa" w:w="3408"/>
-          </w:tcPr>
-          <w:p>
-            <w:r>
-              <w:t>Apply to next item, then reset.</w:t>
-            </w:r>
-          </w:p>
-        </w:tc>
-      </w:tr>
-      <w:tr>
-        <w:tc>
-          <w:tcPr>
-            <w:tcW w:type="dxa" w:w="3408"/>
-          </w:tcPr>
-          <w:p>
-            <w:r>
-              <w:t>END</w:t>
-            </w:r>
-          </w:p>
-        </w:tc>
-        <w:tc>
-          <w:tcPr>
-            <w:tcW w:type="dxa" w:w="3408"/>
-          </w:tcPr>
-          <w:p>
-            <w:r>
-              <w:t>CVHS1:BATCH:END</w:t>
-            </w:r>
-          </w:p>
-        </w:tc>
-        <w:tc>
-          <w:tcPr>
-            <w:tcW w:type="dxa" w:w="3408"/>
-          </w:tcPr>
-          <w:p>
-            <w:r>
-              <w:t>Closes final item and batch.</w:t>
-            </w:r>
-          </w:p>
-        </w:tc>
-      </w:tr>
-    </w:tbl>
     <w:p>
+      <w:pPr>
+        <w:spacing w:after="80"/>
+        <w:jc w:val="center"/>
+      </w:pPr>
       <w:r>
-        <w:t>Time gaps never split items. CONT is deprecated compatibility only. Command images are preserved for audit but never attached to products.</w:t>
+        <w:drawing>
+          <wp:inline xmlns:a="http://schemas.openxmlformats.org/drawingml/2006/main" xmlns:pic="http://schemas.openxmlformats.org/drawingml/2006/picture">
+            <wp:extent cx="6400800" cy="2449195"/>
+            <wp:docPr id="1" name="Picture 1"/>
+            <wp:cNvGraphicFramePr>
+              <a:graphicFrameLocks noChangeAspect="1"/>
+            </wp:cNvGraphicFramePr>
+            <a:graphic>
+              <a:graphicData uri="http://schemas.openxmlformats.org/drawingml/2006/picture">
+                <pic:pic>
+                  <pic:nvPicPr>
+                    <pic:cNvPr id="0" name="01-home-dashboard-part-01.png"/>
+                    <pic:cNvPicPr/>
+                  </pic:nvPicPr>
+                  <pic:blipFill>
+                    <a:blip r:embed="rId10"/>
+                    <a:stretch>
+                      <a:fillRect/>
+                    </a:stretch>
+                  </pic:blipFill>
+                  <pic:spPr>
+                    <a:xfrm>
+                      <a:off x="0" y="0"/>
+                      <a:ext cx="6400800" cy="2449195"/>
+                    </a:xfrm>
+                    <a:prstGeom prst="rect"/>
+                  </pic:spPr>
+                </pic:pic>
+              </a:graphicData>
+            </a:graphic>
+          </wp:inline>
+        </w:drawing>
+      </w:r>
+    </w:p>
+    <w:p>
+      <w:pPr>
+        <w:spacing w:after="160"/>
+        <w:jc w:val="center"/>
+      </w:pPr>
+      <w:r>
+        <w:rPr>
+          <w:i/>
+          <w:color w:val="6A6475"/>
+          <w:sz w:val="16"/>
+        </w:rPr>
+        <w:t>Home dashboard and batch actions - view 1 of 2</w:t>
       </w:r>
     </w:p>
     <w:p>
@@ -492,29 +402,14 @@
     </w:p>
     <w:p>
       <w:pPr>
-        <w:pStyle w:val="Title"/>
-      </w:pPr>
-      <w:r>
-        <w:t>Home</w:t>
-      </w:r>
-    </w:p>
-    <w:p>
-      <w:pPr>
-        <w:spacing w:after="160"/>
-      </w:pPr>
-      <w:r>
-        <w:t>Start here. Import a new camera roll or continue the active batch. The summary cards show current workload.</w:t>
-      </w:r>
-    </w:p>
-    <w:p>
-      <w:pPr>
+        <w:spacing w:after="80"/>
         <w:jc w:val="center"/>
       </w:pPr>
       <w:r>
         <w:drawing>
           <wp:inline xmlns:a="http://schemas.openxmlformats.org/drawingml/2006/main" xmlns:pic="http://schemas.openxmlformats.org/drawingml/2006/picture">
-            <wp:extent cx="5989320" cy="4159249"/>
-            <wp:docPr id="1" name="Picture 1"/>
+            <wp:extent cx="6400800" cy="2449195"/>
+            <wp:docPr id="2" name="Picture 2"/>
             <wp:cNvGraphicFramePr>
               <a:graphicFrameLocks noChangeAspect="1"/>
             </wp:cNvGraphicFramePr>
@@ -522,7 +417,7 @@
               <a:graphicData uri="http://schemas.openxmlformats.org/drawingml/2006/picture">
                 <pic:pic>
                   <pic:nvPicPr>
-                    <pic:cNvPr id="0" name="00-home.png"/>
+                    <pic:cNvPr id="0" name="01-home-dashboard-part-02.png"/>
                     <pic:cNvPicPr/>
                   </pic:nvPicPr>
                   <pic:blipFill>
@@ -534,7 +429,7 @@
                   <pic:spPr>
                     <a:xfrm>
                       <a:off x="0" y="0"/>
-                      <a:ext cx="5989320" cy="4159249"/>
+                      <a:ext cx="6400800" cy="2449195"/>
                     </a:xfrm>
                     <a:prstGeom prst="rect"/>
                   </pic:spPr>
@@ -547,11 +442,16 @@
     </w:p>
     <w:p>
       <w:pPr>
-        <w:pStyle w:val="Caption"/>
+        <w:spacing w:after="160"/>
         <w:jc w:val="center"/>
       </w:pPr>
       <w:r>
-        <w:t>00-home.png</w:t>
+        <w:rPr>
+          <w:i/>
+          <w:color w:val="6A6475"/>
+          <w:sz w:val="16"/>
+        </w:rPr>
+        <w:t>Home dashboard and batch actions - view 2 of 2</w:t>
       </w:r>
     </w:p>
     <w:p>
@@ -561,29 +461,102 @@
     </w:p>
     <w:p>
       <w:pPr>
-        <w:pStyle w:val="Title"/>
+        <w:pStyle w:val="Heading1"/>
       </w:pPr>
       <w:r>
-        <w:t>Import - first run</w:t>
+        <w:t>2. Import a Photo Folder</w:t>
       </w:r>
     </w:p>
     <w:p>
-      <w:pPr>
-        <w:spacing w:after="160"/>
-      </w:pPr>
       <w:r>
-        <w:t>Use Advanced once to choose the camera-roll folder. Save it as the incoming folder so routine later imports use the selector.</w:t>
+        <w:t>Normal import no longer requires repeatedly typing a Linux path. Browse Folder is the preferred path; configured and recent folders are one-click shortcuts.</w:t>
       </w:r>
     </w:p>
     <w:p>
       <w:pPr>
+        <w:ind w:left="173" w:hanging="173"/>
+      </w:pPr>
+      <w:r>
+        <w:rPr>
+          <w:b/>
+          <w:color w:val="8055D9"/>
+        </w:rPr>
+        <w:t xml:space="preserve">1. </w:t>
+      </w:r>
+      <w:r>
+        <w:t>Click Browse Folder and select the flat camera-export folder.</w:t>
+      </w:r>
+    </w:p>
+    <w:p>
+      <w:pPr>
+        <w:ind w:left="173" w:hanging="173"/>
+      </w:pPr>
+      <w:r>
+        <w:rPr>
+          <w:b/>
+          <w:color w:val="8055D9"/>
+        </w:rPr>
+        <w:t xml:space="preserve">2. </w:t>
+      </w:r>
+      <w:r>
+        <w:t>If the native chooser is unavailable, open Advanced Manual Path.</w:t>
+      </w:r>
+    </w:p>
+    <w:p>
+      <w:pPr>
+        <w:ind w:left="173" w:hanging="173"/>
+      </w:pPr>
+      <w:r>
+        <w:rPr>
+          <w:b/>
+          <w:color w:val="8055D9"/>
+        </w:rPr>
+        <w:t xml:space="preserve">3. </w:t>
+      </w:r>
+      <w:r>
+        <w:t>Click Preview. Preview does not create durable item identity.</w:t>
+      </w:r>
+    </w:p>
+    <w:p>
+      <w:pPr>
+        <w:ind w:left="173" w:hanging="173"/>
+      </w:pPr>
+      <w:r>
+        <w:rPr>
+          <w:b/>
+          <w:color w:val="8055D9"/>
+        </w:rPr>
+        <w:t xml:space="preserve">4. </w:t>
+      </w:r>
+      <w:r>
+        <w:t>Confirm the image count, QR events, item boundaries, and warnings.</w:t>
+      </w:r>
+    </w:p>
+    <w:p>
+      <w:pPr>
+        <w:ind w:left="173" w:hanging="173"/>
+      </w:pPr>
+      <w:r>
+        <w:rPr>
+          <w:b/>
+          <w:color w:val="8055D9"/>
+        </w:rPr>
+        <w:t xml:space="preserve">5. </w:t>
+      </w:r>
+      <w:r>
+        <w:t>Click Preserve and Import Batch once. Duplicate submission protection prevents accidental double import.</w:t>
+      </w:r>
+    </w:p>
+    <w:p>
+      <w:pPr>
+        <w:spacing w:after="80"/>
         <w:jc w:val="center"/>
       </w:pPr>
       <w:r>
         <w:drawing>
           <wp:inline xmlns:a="http://schemas.openxmlformats.org/drawingml/2006/main" xmlns:pic="http://schemas.openxmlformats.org/drawingml/2006/picture">
-            <wp:extent cx="5989320" cy="4159249"/>
-            <wp:docPr id="2" name="Picture 2"/>
+            <wp:extent cx="6400800" cy="2422525"/>
+            <wp:docPr id="3" name="Picture 3"/>
             <wp:cNvGraphicFramePr>
               <a:graphicFrameLocks noChangeAspect="1"/>
             </wp:cNvGraphicFramePr>
@@ -591,7 +564,7 @@
               <a:graphicData uri="http://schemas.openxmlformats.org/drawingml/2006/picture">
                 <pic:pic>
                   <pic:nvPicPr>
-                    <pic:cNvPr id="0" name="01-first-run-import.png"/>
+                    <pic:cNvPr id="0" name="03-native-folder-selected-part-01.png"/>
                     <pic:cNvPicPr/>
                   </pic:nvPicPr>
                   <pic:blipFill>
@@ -603,7 +576,7 @@
                   <pic:spPr>
                     <a:xfrm>
                       <a:off x="0" y="0"/>
-                      <a:ext cx="5989320" cy="4159249"/>
+                      <a:ext cx="6400800" cy="2422525"/>
                     </a:xfrm>
                     <a:prstGeom prst="rect"/>
                   </pic:spPr>
@@ -616,11 +589,16 @@
     </w:p>
     <w:p>
       <w:pPr>
-        <w:pStyle w:val="Caption"/>
+        <w:spacing w:after="160"/>
         <w:jc w:val="center"/>
       </w:pPr>
       <w:r>
-        <w:t>01-first-run-import.png</w:t>
+        <w:rPr>
+          <w:i/>
+          <w:color w:val="6A6475"/>
+          <w:sz w:val="16"/>
+        </w:rPr>
+        <w:t>Native folder selection on Import - view 1 of 2</w:t>
       </w:r>
     </w:p>
     <w:p>
@@ -630,29 +608,14 @@
     </w:p>
     <w:p>
       <w:pPr>
-        <w:pStyle w:val="Title"/>
-      </w:pPr>
-      <w:r>
-        <w:t>Preview - not imported yet</w:t>
-      </w:r>
-    </w:p>
-    <w:p>
-      <w:pPr>
-        <w:spacing w:after="160"/>
-      </w:pPr>
-      <w:r>
-        <w:t>Confirm item, product-photo, command, and warning counts. Preview is temporary and does not display a durable Batch ID.</w:t>
-      </w:r>
-    </w:p>
-    <w:p>
-      <w:pPr>
+        <w:spacing w:after="80"/>
         <w:jc w:val="center"/>
       </w:pPr>
       <w:r>
         <w:drawing>
           <wp:inline xmlns:a="http://schemas.openxmlformats.org/drawingml/2006/main" xmlns:pic="http://schemas.openxmlformats.org/drawingml/2006/picture">
-            <wp:extent cx="5989320" cy="4229957"/>
-            <wp:docPr id="3" name="Picture 3"/>
+            <wp:extent cx="6400800" cy="2422525"/>
+            <wp:docPr id="4" name="Picture 4"/>
             <wp:cNvGraphicFramePr>
               <a:graphicFrameLocks noChangeAspect="1"/>
             </wp:cNvGraphicFramePr>
@@ -660,7 +623,7 @@
               <a:graphicData uri="http://schemas.openxmlformats.org/drawingml/2006/picture">
                 <pic:pic>
                   <pic:nvPicPr>
-                    <pic:cNvPr id="0" name="02-preview-not-imported.png"/>
+                    <pic:cNvPr id="0" name="03-native-folder-selected-part-02.png"/>
                     <pic:cNvPicPr/>
                   </pic:nvPicPr>
                   <pic:blipFill>
@@ -672,7 +635,7 @@
                   <pic:spPr>
                     <a:xfrm>
                       <a:off x="0" y="0"/>
-                      <a:ext cx="5989320" cy="4229957"/>
+                      <a:ext cx="6400800" cy="2422525"/>
                     </a:xfrm>
                     <a:prstGeom prst="rect"/>
                   </pic:spPr>
@@ -685,11 +648,16 @@
     </w:p>
     <w:p>
       <w:pPr>
-        <w:pStyle w:val="Caption"/>
+        <w:spacing w:after="160"/>
         <w:jc w:val="center"/>
       </w:pPr>
       <w:r>
-        <w:t>02-preview-not-imported.png</w:t>
+        <w:rPr>
+          <w:i/>
+          <w:color w:val="6A6475"/>
+          <w:sz w:val="16"/>
+        </w:rPr>
+        <w:t>Native folder selection on Import - view 2 of 2</w:t>
       </w:r>
     </w:p>
     <w:p>
@@ -699,29 +667,87 @@
     </w:p>
     <w:p>
       <w:pPr>
-        <w:pStyle w:val="Title"/>
+        <w:pStyle w:val="Heading1"/>
       </w:pPr>
       <w:r>
-        <w:t>Preserve and import</w:t>
+        <w:t>3. Preview and Commit</w:t>
       </w:r>
     </w:p>
     <w:p>
-      <w:pPr>
-        <w:spacing w:after="160"/>
-      </w:pPr>
       <w:r>
-        <w:t>After grouping is correct, preserve/import. SnapIMS displays exactly one durable Batch ID and leaves source photographs untouched.</w:t>
+        <w:t>The preview is the last safe checkpoint before SnapIMS preserves originals, creates durable identities, and generates media derivatives.</w:t>
       </w:r>
     </w:p>
     <w:p>
       <w:pPr>
+        <w:ind w:left="173" w:hanging="173"/>
+      </w:pPr>
+      <w:r>
+        <w:rPr>
+          <w:b/>
+          <w:color w:val="8055D9"/>
+        </w:rPr>
+        <w:t xml:space="preserve">1. </w:t>
+      </w:r>
+      <w:r>
+        <w:t>Verify BATCH START and BATCH END were detected.</w:t>
+      </w:r>
+    </w:p>
+    <w:p>
+      <w:pPr>
+        <w:ind w:left="173" w:hanging="173"/>
+      </w:pPr>
+      <w:r>
+        <w:rPr>
+          <w:b/>
+          <w:color w:val="8055D9"/>
+        </w:rPr>
+        <w:t xml:space="preserve">2. </w:t>
+      </w:r>
+      <w:r>
+        <w:t>Verify every ITEM NEXT boundary created one intended tape.</w:t>
+      </w:r>
+    </w:p>
+    <w:p>
+      <w:pPr>
+        <w:ind w:left="173" w:hanging="173"/>
+      </w:pPr>
+      <w:r>
+        <w:rPr>
+          <w:b/>
+          <w:color w:val="8055D9"/>
+        </w:rPr>
+        <w:t xml:space="preserve">3. </w:t>
+      </w:r>
+      <w:r>
+        <w:t>Inspect warning messages before committing.</w:t>
+      </w:r>
+    </w:p>
+    <w:p>
+      <w:pPr>
+        <w:ind w:left="173" w:hanging="173"/>
+      </w:pPr>
+      <w:r>
+        <w:rPr>
+          <w:b/>
+          <w:color w:val="8055D9"/>
+        </w:rPr>
+        <w:t xml:space="preserve">4. </w:t>
+      </w:r>
+      <w:r>
+        <w:t>Commit the batch. SnapIMS preserves originals and generates fast browser and recognition copies.</w:t>
+      </w:r>
+    </w:p>
+    <w:p>
+      <w:pPr>
+        <w:spacing w:after="80"/>
         <w:jc w:val="center"/>
       </w:pPr>
       <w:r>
         <w:drawing>
           <wp:inline xmlns:a="http://schemas.openxmlformats.org/drawingml/2006/main" xmlns:pic="http://schemas.openxmlformats.org/drawingml/2006/picture">
-            <wp:extent cx="5989320" cy="4159249"/>
-            <wp:docPr id="4" name="Picture 4"/>
+            <wp:extent cx="6400800" cy="2787015"/>
+            <wp:docPr id="5" name="Picture 5"/>
             <wp:cNvGraphicFramePr>
               <a:graphicFrameLocks noChangeAspect="1"/>
             </wp:cNvGraphicFramePr>
@@ -729,7 +755,7 @@
               <a:graphicData uri="http://schemas.openxmlformats.org/drawingml/2006/picture">
                 <pic:pic>
                   <pic:nvPicPr>
-                    <pic:cNvPr id="0" name="02-imported-durable-id.png"/>
+                    <pic:cNvPr id="0" name="04-import-preview-part-01.png"/>
                     <pic:cNvPicPr/>
                   </pic:nvPicPr>
                   <pic:blipFill>
@@ -741,7 +767,7 @@
                   <pic:spPr>
                     <a:xfrm>
                       <a:off x="0" y="0"/>
-                      <a:ext cx="5989320" cy="4159249"/>
+                      <a:ext cx="6400800" cy="2787015"/>
                     </a:xfrm>
                     <a:prstGeom prst="rect"/>
                   </pic:spPr>
@@ -754,11 +780,16 @@
     </w:p>
     <w:p>
       <w:pPr>
-        <w:pStyle w:val="Caption"/>
+        <w:spacing w:after="160"/>
         <w:jc w:val="center"/>
       </w:pPr>
       <w:r>
-        <w:t>02-imported-durable-id.png</w:t>
+        <w:rPr>
+          <w:i/>
+          <w:color w:val="6A6475"/>
+          <w:sz w:val="16"/>
+        </w:rPr>
+        <w:t>Import preview with QR and item summary - view 1 of 2</w:t>
       </w:r>
     </w:p>
     <w:p>
@@ -768,29 +799,14 @@
     </w:p>
     <w:p>
       <w:pPr>
-        <w:pStyle w:val="Title"/>
-      </w:pPr>
-      <w:r>
-        <w:t>Review before identification</w:t>
-      </w:r>
-    </w:p>
-    <w:p>
-      <w:pPr>
-        <w:spacing w:after="160"/>
-      </w:pPr>
-      <w:r>
-        <w:t>The compact status explains the next action. Select a provider and choose Identify items once.</w:t>
-      </w:r>
-    </w:p>
-    <w:p>
-      <w:pPr>
+        <w:spacing w:after="80"/>
         <w:jc w:val="center"/>
       </w:pPr>
       <w:r>
         <w:drawing>
           <wp:inline xmlns:a="http://schemas.openxmlformats.org/drawingml/2006/main" xmlns:pic="http://schemas.openxmlformats.org/drawingml/2006/picture">
-            <wp:extent cx="5989320" cy="5606669"/>
-            <wp:docPr id="5" name="Picture 5"/>
+            <wp:extent cx="6400800" cy="2787015"/>
+            <wp:docPr id="6" name="Picture 6"/>
             <wp:cNvGraphicFramePr>
               <a:graphicFrameLocks noChangeAspect="1"/>
             </wp:cNvGraphicFramePr>
@@ -798,7 +814,7 @@
               <a:graphicData uri="http://schemas.openxmlformats.org/drawingml/2006/picture">
                 <pic:pic>
                   <pic:nvPicPr>
-                    <pic:cNvPr id="0" name="04-review-before-identification.png"/>
+                    <pic:cNvPr id="0" name="04-import-preview-part-02.png"/>
                     <pic:cNvPicPr/>
                   </pic:nvPicPr>
                   <pic:blipFill>
@@ -810,7 +826,7 @@
                   <pic:spPr>
                     <a:xfrm>
                       <a:off x="0" y="0"/>
-                      <a:ext cx="5989320" cy="5606669"/>
+                      <a:ext cx="6400800" cy="2787015"/>
                     </a:xfrm>
                     <a:prstGeom prst="rect"/>
                   </pic:spPr>
@@ -823,11 +839,16 @@
     </w:p>
     <w:p>
       <w:pPr>
-        <w:pStyle w:val="Caption"/>
+        <w:spacing w:after="160"/>
         <w:jc w:val="center"/>
       </w:pPr>
       <w:r>
-        <w:t>04-review-before-identification.png</w:t>
+        <w:rPr>
+          <w:i/>
+          <w:color w:val="6A6475"/>
+          <w:sz w:val="16"/>
+        </w:rPr>
+        <w:t>Import preview with QR and item summary - view 2 of 2</w:t>
       </w:r>
     </w:p>
     <w:p>
@@ -837,29 +858,102 @@
     </w:p>
     <w:p>
       <w:pPr>
-        <w:pStyle w:val="Title"/>
+        <w:pStyle w:val="Heading1"/>
       </w:pPr>
       <w:r>
-        <w:t>Recognition complete</w:t>
+        <w:t>4. Recognition and Failure Recovery</w:t>
       </w:r>
     </w:p>
     <w:p>
-      <w:pPr>
-        <w:spacing w:after="160"/>
-      </w:pPr>
       <w:r>
-        <w:t>The suggested title, Price, Discount, physical position, and primary action are visible together.</w:t>
+        <w:t>Recognition can use Mock for testing or a configured provider for live work. A provider failure never leaves a dead button or silent refresh.</w:t>
       </w:r>
     </w:p>
     <w:p>
       <w:pPr>
+        <w:ind w:left="173" w:hanging="173"/>
+      </w:pPr>
+      <w:r>
+        <w:rPr>
+          <w:b/>
+          <w:color w:val="8055D9"/>
+        </w:rPr>
+        <w:t xml:space="preserve">1. </w:t>
+      </w:r>
+      <w:r>
+        <w:t>Start identification from Review or the batch action.</w:t>
+      </w:r>
+    </w:p>
+    <w:p>
+      <w:pPr>
+        <w:ind w:left="173" w:hanging="173"/>
+      </w:pPr>
+      <w:r>
+        <w:rPr>
+          <w:b/>
+          <w:color w:val="8055D9"/>
+        </w:rPr>
+        <w:t xml:space="preserve">2. </w:t>
+      </w:r>
+      <w:r>
+        <w:t>When recognition fails, open Review Failure.</w:t>
+      </w:r>
+    </w:p>
+    <w:p>
+      <w:pPr>
+        <w:ind w:left="173" w:hanging="173"/>
+      </w:pPr>
+      <w:r>
+        <w:rPr>
+          <w:b/>
+          <w:color w:val="8055D9"/>
+        </w:rPr>
+        <w:t xml:space="preserve">3. </w:t>
+      </w:r>
+      <w:r>
+        <w:t>Read the human-readable reason, provider, timestamp, completed count, and remaining count.</w:t>
+      </w:r>
+    </w:p>
+    <w:p>
+      <w:pPr>
+        <w:ind w:left="173" w:hanging="173"/>
+      </w:pPr>
+      <w:r>
+        <w:rPr>
+          <w:b/>
+          <w:color w:val="8055D9"/>
+        </w:rPr>
+        <w:t xml:space="preserve">4. </w:t>
+      </w:r>
+      <w:r>
+        <w:t>Choose Retry Failed Items, another provider, Manual Review, Skip Recognition, or Diagnostics.</w:t>
+      </w:r>
+    </w:p>
+    <w:p>
+      <w:pPr>
+        <w:ind w:left="173" w:hanging="173"/>
+      </w:pPr>
+      <w:r>
+        <w:rPr>
+          <w:b/>
+          <w:color w:val="8055D9"/>
+        </w:rPr>
+        <w:t xml:space="preserve">5. </w:t>
+      </w:r>
+      <w:r>
+        <w:t>Manual Review leaves items unfinished and editable; it does not falsely mark them recognized.</w:t>
+      </w:r>
+    </w:p>
+    <w:p>
+      <w:pPr>
+        <w:spacing w:after="80"/>
         <w:jc w:val="center"/>
       </w:pPr>
       <w:r>
         <w:drawing>
           <wp:inline xmlns:a="http://schemas.openxmlformats.org/drawingml/2006/main" xmlns:pic="http://schemas.openxmlformats.org/drawingml/2006/picture">
-            <wp:extent cx="5989320" cy="5315521"/>
-            <wp:docPr id="6" name="Picture 6"/>
+            <wp:extent cx="6400800" cy="4142740"/>
+            <wp:docPr id="7" name="Picture 7"/>
             <wp:cNvGraphicFramePr>
               <a:graphicFrameLocks noChangeAspect="1"/>
             </wp:cNvGraphicFramePr>
@@ -867,7 +961,7 @@
               <a:graphicData uri="http://schemas.openxmlformats.org/drawingml/2006/picture">
                 <pic:pic>
                   <pic:nvPicPr>
-                    <pic:cNvPr id="0" name="05-recognition-complete.png"/>
+                    <pic:cNvPr id="0" name="06-recognition-failure-recovery-part-01.png"/>
                     <pic:cNvPicPr/>
                   </pic:nvPicPr>
                   <pic:blipFill>
@@ -879,7 +973,7 @@
                   <pic:spPr>
                     <a:xfrm>
                       <a:off x="0" y="0"/>
-                      <a:ext cx="5989320" cy="5315521"/>
+                      <a:ext cx="6400800" cy="4142740"/>
                     </a:xfrm>
                     <a:prstGeom prst="rect"/>
                   </pic:spPr>
@@ -892,11 +986,16 @@
     </w:p>
     <w:p>
       <w:pPr>
-        <w:pStyle w:val="Caption"/>
+        <w:spacing w:after="160"/>
         <w:jc w:val="center"/>
       </w:pPr>
       <w:r>
-        <w:t>05-recognition-complete.png</w:t>
+        <w:rPr>
+          <w:i/>
+          <w:color w:val="6A6475"/>
+          <w:sz w:val="16"/>
+        </w:rPr>
+        <w:t>Recognition failure recovery workspace - view 1 of 2</w:t>
       </w:r>
     </w:p>
     <w:p>
@@ -906,29 +1005,14 @@
     </w:p>
     <w:p>
       <w:pPr>
-        <w:pStyle w:val="Title"/>
-      </w:pPr>
-      <w:r>
-        <w:t>Quick edit - Price</w:t>
-      </w:r>
-    </w:p>
-    <w:p>
-      <w:pPr>
-        <w:spacing w:after="160"/>
-      </w:pPr>
-      <w:r>
-        <w:t>Enter a corrected CAD price directly in Review, then choose Approve &amp; Next. No separate Save is required.</w:t>
-      </w:r>
-    </w:p>
-    <w:p>
-      <w:pPr>
+        <w:spacing w:after="80"/>
         <w:jc w:val="center"/>
       </w:pPr>
       <w:r>
         <w:drawing>
           <wp:inline xmlns:a="http://schemas.openxmlformats.org/drawingml/2006/main" xmlns:pic="http://schemas.openxmlformats.org/drawingml/2006/picture">
-            <wp:extent cx="5989320" cy="5610828"/>
-            <wp:docPr id="7" name="Picture 7"/>
+            <wp:extent cx="6400800" cy="4142740"/>
+            <wp:docPr id="8" name="Picture 8"/>
             <wp:cNvGraphicFramePr>
               <a:graphicFrameLocks noChangeAspect="1"/>
             </wp:cNvGraphicFramePr>
@@ -936,7 +1020,7 @@
               <a:graphicData uri="http://schemas.openxmlformats.org/drawingml/2006/picture">
                 <pic:pic>
                   <pic:nvPicPr>
-                    <pic:cNvPr id="0" name="06-price-quick-edit.png"/>
+                    <pic:cNvPr id="0" name="06-recognition-failure-recovery-part-02.png"/>
                     <pic:cNvPicPr/>
                   </pic:nvPicPr>
                   <pic:blipFill>
@@ -948,7 +1032,7 @@
                   <pic:spPr>
                     <a:xfrm>
                       <a:off x="0" y="0"/>
-                      <a:ext cx="5989320" cy="5610828"/>
+                      <a:ext cx="6400800" cy="4142740"/>
                     </a:xfrm>
                     <a:prstGeom prst="rect"/>
                   </pic:spPr>
@@ -961,11 +1045,16 @@
     </w:p>
     <w:p>
       <w:pPr>
-        <w:pStyle w:val="Caption"/>
+        <w:spacing w:after="160"/>
         <w:jc w:val="center"/>
       </w:pPr>
       <w:r>
-        <w:t>06-price-quick-edit.png</w:t>
+        <w:rPr>
+          <w:i/>
+          <w:color w:val="6A6475"/>
+          <w:sz w:val="16"/>
+        </w:rPr>
+        <w:t>Recognition failure recovery workspace - view 2 of 2</w:t>
       </w:r>
     </w:p>
     <w:p>
@@ -975,29 +1064,117 @@
     </w:p>
     <w:p>
       <w:pPr>
-        <w:pStyle w:val="Title"/>
+        <w:pStyle w:val="Heading1"/>
       </w:pPr>
       <w:r>
-        <w:t>Quick edit - Discount</w:t>
+        <w:t>5. Fast Individual Review</w:t>
       </w:r>
     </w:p>
     <w:p>
-      <w:pPr>
-        <w:spacing w:after="160"/>
-      </w:pPr>
       <w:r>
-        <w:t>Enter the percentage directly in Review, then choose Approve &amp; Next once.</w:t>
+        <w:t>Review is optimized for the routine loop: look, confirm, optionally type a price, press Enter, and continue.</w:t>
       </w:r>
     </w:p>
     <w:p>
       <w:pPr>
+        <w:ind w:left="173" w:hanging="173"/>
+      </w:pPr>
+      <w:r>
+        <w:rPr>
+          <w:b/>
+          <w:color w:val="8055D9"/>
+        </w:rPr>
+        <w:t xml:space="preserve">1. </w:t>
+      </w:r>
+      <w:r>
+        <w:t>Confirm the displayed title. SnapIMS uses manual, saved, CSV, then AI values in that order.</w:t>
+      </w:r>
+    </w:p>
+    <w:p>
+      <w:pPr>
+        <w:ind w:left="173" w:hanging="173"/>
+      </w:pPr>
+      <w:r>
+        <w:rPr>
+          <w:b/>
+          <w:color w:val="8055D9"/>
+        </w:rPr>
+        <w:t xml:space="preserve">2. </w:t>
+      </w:r>
+      <w:r>
+        <w:t>The Price field is focused and selected when an unfinished tape opens.</w:t>
+      </w:r>
+    </w:p>
+    <w:p>
+      <w:pPr>
+        <w:ind w:left="173" w:hanging="173"/>
+      </w:pPr>
+      <w:r>
+        <w:rPr>
+          <w:b/>
+          <w:color w:val="8055D9"/>
+        </w:rPr>
+        <w:t xml:space="preserve">3. </w:t>
+      </w:r>
+      <w:r>
+        <w:t>Type a replacement price or leave the current value unchanged.</w:t>
+      </w:r>
+    </w:p>
+    <w:p>
+      <w:pPr>
+        <w:ind w:left="173" w:hanging="173"/>
+      </w:pPr>
+      <w:r>
+        <w:rPr>
+          <w:b/>
+          <w:color w:val="8055D9"/>
+        </w:rPr>
+        <w:t xml:space="preserve">4. </w:t>
+      </w:r>
+      <w:r>
+        <w:t>Press Enter to run Approve &amp; Next. The next unfinished tape opens with Price selected again.</w:t>
+      </w:r>
+    </w:p>
+    <w:p>
+      <w:pPr>
+        <w:ind w:left="173" w:hanging="173"/>
+      </w:pPr>
+      <w:r>
+        <w:rPr>
+          <w:b/>
+          <w:color w:val="8055D9"/>
+        </w:rPr>
+        <w:t xml:space="preserve">5. </w:t>
+      </w:r>
+      <w:r>
+        <w:t>Use Later to postpone the item without marking it complete.</w:t>
+      </w:r>
+    </w:p>
+    <w:p>
+      <w:pPr>
+        <w:ind w:left="173" w:hanging="173"/>
+      </w:pPr>
+      <w:r>
+        <w:rPr>
+          <w:b/>
+          <w:color w:val="8055D9"/>
+        </w:rPr>
+        <w:t xml:space="preserve">6. </w:t>
+      </w:r>
+      <w:r>
+        <w:t>Use full Edit only for deeper corrections or a genuinely missing title.</w:t>
+      </w:r>
+    </w:p>
+    <w:p>
+      <w:pPr>
+        <w:spacing w:after="80"/>
         <w:jc w:val="center"/>
       </w:pPr>
       <w:r>
         <w:drawing>
           <wp:inline xmlns:a="http://schemas.openxmlformats.org/drawingml/2006/main" xmlns:pic="http://schemas.openxmlformats.org/drawingml/2006/picture">
-            <wp:extent cx="5989320" cy="5610828"/>
-            <wp:docPr id="8" name="Picture 8"/>
+            <wp:extent cx="6400800" cy="3222625"/>
+            <wp:docPr id="9" name="Picture 9"/>
             <wp:cNvGraphicFramePr>
               <a:graphicFrameLocks noChangeAspect="1"/>
             </wp:cNvGraphicFramePr>
@@ -1005,7 +1182,7 @@
               <a:graphicData uri="http://schemas.openxmlformats.org/drawingml/2006/picture">
                 <pic:pic>
                   <pic:nvPicPr>
-                    <pic:cNvPr id="0" name="07-discount-quick-edit.png"/>
+                    <pic:cNvPr id="0" name="08-price-enter-next-part-01.png"/>
                     <pic:cNvPicPr/>
                   </pic:nvPicPr>
                   <pic:blipFill>
@@ -1017,7 +1194,7 @@
                   <pic:spPr>
                     <a:xfrm>
                       <a:off x="0" y="0"/>
-                      <a:ext cx="5989320" cy="5610828"/>
+                      <a:ext cx="6400800" cy="3222625"/>
                     </a:xfrm>
                     <a:prstGeom prst="rect"/>
                   </pic:spPr>
@@ -1030,11 +1207,16 @@
     </w:p>
     <w:p>
       <w:pPr>
-        <w:pStyle w:val="Caption"/>
+        <w:spacing w:after="160"/>
         <w:jc w:val="center"/>
       </w:pPr>
       <w:r>
-        <w:t>07-discount-quick-edit.png</w:t>
+        <w:rPr>
+          <w:i/>
+          <w:color w:val="6A6475"/>
+          <w:sz w:val="16"/>
+        </w:rPr>
+        <w:t>Price -&gt; Enter -&gt; next Price workflow - view 1 of 2</w:t>
       </w:r>
     </w:p>
     <w:p>
@@ -1044,29 +1226,14 @@
     </w:p>
     <w:p>
       <w:pPr>
-        <w:pStyle w:val="Title"/>
-      </w:pPr>
-      <w:r>
-        <w:t>Quick edit - Price and Discount</w:t>
-      </w:r>
-    </w:p>
-    <w:p>
-      <w:pPr>
-        <w:spacing w:after="160"/>
-      </w:pPr>
-      <w:r>
-        <w:t>Both fields can be changed before the same one-action approval.</w:t>
-      </w:r>
-    </w:p>
-    <w:p>
-      <w:pPr>
+        <w:spacing w:after="80"/>
         <w:jc w:val="center"/>
       </w:pPr>
       <w:r>
         <w:drawing>
           <wp:inline xmlns:a="http://schemas.openxmlformats.org/drawingml/2006/main" xmlns:pic="http://schemas.openxmlformats.org/drawingml/2006/picture">
-            <wp:extent cx="5989320" cy="5610828"/>
-            <wp:docPr id="9" name="Picture 9"/>
+            <wp:extent cx="6400800" cy="3222625"/>
+            <wp:docPr id="10" name="Picture 10"/>
             <wp:cNvGraphicFramePr>
               <a:graphicFrameLocks noChangeAspect="1"/>
             </wp:cNvGraphicFramePr>
@@ -1074,7 +1241,7 @@
               <a:graphicData uri="http://schemas.openxmlformats.org/drawingml/2006/picture">
                 <pic:pic>
                   <pic:nvPicPr>
-                    <pic:cNvPr id="0" name="08-price-discount-quick-edit.png"/>
+                    <pic:cNvPr id="0" name="08-price-enter-next-part-02.png"/>
                     <pic:cNvPicPr/>
                   </pic:nvPicPr>
                   <pic:blipFill>
@@ -1086,7 +1253,7 @@
                   <pic:spPr>
                     <a:xfrm>
                       <a:off x="0" y="0"/>
-                      <a:ext cx="5989320" cy="5610828"/>
+                      <a:ext cx="6400800" cy="3222625"/>
                     </a:xfrm>
                     <a:prstGeom prst="rect"/>
                   </pic:spPr>
@@ -1099,11 +1266,16 @@
     </w:p>
     <w:p>
       <w:pPr>
-        <w:pStyle w:val="Caption"/>
+        <w:spacing w:after="160"/>
         <w:jc w:val="center"/>
       </w:pPr>
       <w:r>
-        <w:t>08-price-discount-quick-edit.png</w:t>
+        <w:rPr>
+          <w:i/>
+          <w:color w:val="6A6475"/>
+          <w:sz w:val="16"/>
+        </w:rPr>
+        <w:t>Price -&gt; Enter -&gt; next Price workflow - view 2 of 2</w:t>
       </w:r>
     </w:p>
     <w:p>
@@ -1113,29 +1285,102 @@
     </w:p>
     <w:p>
       <w:pPr>
-        <w:pStyle w:val="Title"/>
+        <w:pStyle w:val="Heading1"/>
       </w:pPr>
       <w:r>
-        <w:t>Automatic advancement</w:t>
+        <w:t>6. Batch Editor</w:t>
       </w:r>
     </w:p>
     <w:p>
-      <w:pPr>
-        <w:spacing w:after="160"/>
-      </w:pPr>
       <w:r>
-        <w:t>Approve &amp; Next marks the current item Done, decrements unfinished count, and opens the next physical item exactly once.</w:t>
+        <w:t>Batch Editor is the bulk operator workstation. It edits the same authoritative working records used by Review and Publish.</w:t>
       </w:r>
     </w:p>
     <w:p>
       <w:pPr>
+        <w:ind w:left="173" w:hanging="173"/>
+      </w:pPr>
+      <w:r>
+        <w:rPr>
+          <w:b/>
+          <w:color w:val="8055D9"/>
+        </w:rPr>
+        <w:t xml:space="preserve">1. </w:t>
+      </w:r>
+      <w:r>
+        <w:t>Use search, status filters, confidence threshold, confidence buckets, and sorting to expose exceptions.</w:t>
+      </w:r>
+    </w:p>
+    <w:p>
+      <w:pPr>
+        <w:ind w:left="173" w:hanging="173"/>
+      </w:pPr>
+      <w:r>
+        <w:rPr>
+          <w:b/>
+          <w:color w:val="8055D9"/>
+        </w:rPr>
+        <w:t xml:space="preserve">2. </w:t>
+      </w:r>
+      <w:r>
+        <w:t>Edit Title, Price, Discount, Description, Location, flags, and other working fields directly.</w:t>
+      </w:r>
+    </w:p>
+    <w:p>
+      <w:pPr>
+        <w:ind w:left="173" w:hanging="173"/>
+      </w:pPr>
+      <w:r>
+        <w:rPr>
+          <w:b/>
+          <w:color w:val="8055D9"/>
+        </w:rPr>
+        <w:t xml:space="preserve">3. </w:t>
+      </w:r>
+      <w:r>
+        <w:t>Watch the save indicator. Failed edits remain visible instead of disappearing.</w:t>
+      </w:r>
+    </w:p>
+    <w:p>
+      <w:pPr>
+        <w:ind w:left="173" w:hanging="173"/>
+      </w:pPr>
+      <w:r>
+        <w:rPr>
+          <w:b/>
+          <w:color w:val="8055D9"/>
+        </w:rPr>
+        <w:t xml:space="preserve">4. </w:t>
+      </w:r>
+      <w:r>
+        <w:t>Use Ctrl+S to save pending work, Ctrl+F to focus search, Ctrl+A to select visible rows, and Ctrl+Z/Ctrl+Y to undo or redo local edits.</w:t>
+      </w:r>
+    </w:p>
+    <w:p>
+      <w:pPr>
+        <w:ind w:left="173" w:hanging="173"/>
+      </w:pPr>
+      <w:r>
+        <w:rPr>
+          <w:b/>
+          <w:color w:val="8055D9"/>
+        </w:rPr>
+        <w:t xml:space="preserve">5. </w:t>
+      </w:r>
+      <w:r>
+        <w:t>Click a thumbnail for the fast media viewer or confidence for stored recognition evidence.</w:t>
+      </w:r>
+    </w:p>
+    <w:p>
+      <w:pPr>
+        <w:spacing w:after="80"/>
         <w:jc w:val="center"/>
       </w:pPr>
       <w:r>
         <w:drawing>
           <wp:inline xmlns:a="http://schemas.openxmlformats.org/drawingml/2006/main" xmlns:pic="http://schemas.openxmlformats.org/drawingml/2006/picture">
-            <wp:extent cx="5989320" cy="5610828"/>
-            <wp:docPr id="10" name="Picture 10"/>
+            <wp:extent cx="6400800" cy="3364865"/>
+            <wp:docPr id="11" name="Picture 11"/>
             <wp:cNvGraphicFramePr>
               <a:graphicFrameLocks noChangeAspect="1"/>
             </wp:cNvGraphicFramePr>
@@ -1143,7 +1388,7 @@
               <a:graphicData uri="http://schemas.openxmlformats.org/drawingml/2006/picture">
                 <pic:pic>
                   <pic:nvPicPr>
-                    <pic:cNvPr id="0" name="09-next-item-opened.png"/>
+                    <pic:cNvPr id="0" name="09-batch-editor-bulk-price-part-01.png"/>
                     <pic:cNvPicPr/>
                   </pic:nvPicPr>
                   <pic:blipFill>
@@ -1155,7 +1400,7 @@
                   <pic:spPr>
                     <a:xfrm>
                       <a:off x="0" y="0"/>
-                      <a:ext cx="5989320" cy="5610828"/>
+                      <a:ext cx="6400800" cy="3364865"/>
                     </a:xfrm>
                     <a:prstGeom prst="rect"/>
                   </pic:spPr>
@@ -1168,11 +1413,16 @@
     </w:p>
     <w:p>
       <w:pPr>
-        <w:pStyle w:val="Caption"/>
+        <w:spacing w:after="160"/>
         <w:jc w:val="center"/>
       </w:pPr>
       <w:r>
-        <w:t>09-next-item-opened.png</w:t>
+        <w:rPr>
+          <w:i/>
+          <w:color w:val="6A6475"/>
+          <w:sz w:val="16"/>
+        </w:rPr>
+        <w:t>Batch Editor with health, confidence, and bulk controls - view 1 of 3</w:t>
       </w:r>
     </w:p>
     <w:p>
@@ -1182,29 +1432,14 @@
     </w:p>
     <w:p>
       <w:pPr>
-        <w:pStyle w:val="Title"/>
-      </w:pPr>
-      <w:r>
-        <w:t>Review complete</w:t>
-      </w:r>
-    </w:p>
-    <w:p>
-      <w:pPr>
-        <w:spacing w:after="160"/>
-      </w:pPr>
-      <w:r>
-        <w:t>When unfinished count reaches zero, the Review-complete message replaces normal recognition actions. Use Done to inspect records.</w:t>
-      </w:r>
-    </w:p>
-    <w:p>
-      <w:pPr>
+        <w:spacing w:after="80"/>
         <w:jc w:val="center"/>
       </w:pPr>
       <w:r>
         <w:drawing>
           <wp:inline xmlns:a="http://schemas.openxmlformats.org/drawingml/2006/main" xmlns:pic="http://schemas.openxmlformats.org/drawingml/2006/picture">
-            <wp:extent cx="5989320" cy="5610828"/>
-            <wp:docPr id="11" name="Picture 11"/>
+            <wp:extent cx="6400800" cy="3564890"/>
+            <wp:docPr id="12" name="Picture 12"/>
             <wp:cNvGraphicFramePr>
               <a:graphicFrameLocks noChangeAspect="1"/>
             </wp:cNvGraphicFramePr>
@@ -1212,7 +1447,7 @@
               <a:graphicData uri="http://schemas.openxmlformats.org/drawingml/2006/picture">
                 <pic:pic>
                   <pic:nvPicPr>
-                    <pic:cNvPr id="0" name="10-review-complete.png"/>
+                    <pic:cNvPr id="0" name="09-batch-editor-bulk-price-part-02.png"/>
                     <pic:cNvPicPr/>
                   </pic:nvPicPr>
                   <pic:blipFill>
@@ -1224,7 +1459,7 @@
                   <pic:spPr>
                     <a:xfrm>
                       <a:off x="0" y="0"/>
-                      <a:ext cx="5989320" cy="5610828"/>
+                      <a:ext cx="6400800" cy="3564890"/>
                     </a:xfrm>
                     <a:prstGeom prst="rect"/>
                   </pic:spPr>
@@ -1237,11 +1472,16 @@
     </w:p>
     <w:p>
       <w:pPr>
-        <w:pStyle w:val="Caption"/>
+        <w:spacing w:after="160"/>
         <w:jc w:val="center"/>
       </w:pPr>
       <w:r>
-        <w:t>10-review-complete.png</w:t>
+        <w:rPr>
+          <w:i/>
+          <w:color w:val="6A6475"/>
+          <w:sz w:val="16"/>
+        </w:rPr>
+        <w:t>Batch Editor with health, confidence, and bulk controls - view 2 of 3</w:t>
       </w:r>
     </w:p>
     <w:p>
@@ -1251,29 +1491,14 @@
     </w:p>
     <w:p>
       <w:pPr>
-        <w:pStyle w:val="Title"/>
-      </w:pPr>
-      <w:r>
-        <w:t>Correct a completed item</w:t>
-      </w:r>
-    </w:p>
-    <w:p>
-      <w:pPr>
-        <w:spacing w:after="160"/>
-      </w:pPr>
-      <w:r>
-        <w:t>Edit item opens saved data. Save changes stays on the same immutable Item ID.</w:t>
-      </w:r>
-    </w:p>
-    <w:p>
-      <w:pPr>
+        <w:spacing w:after="80"/>
         <w:jc w:val="center"/>
       </w:pPr>
       <w:r>
         <w:drawing>
           <wp:inline xmlns:a="http://schemas.openxmlformats.org/drawingml/2006/main" xmlns:pic="http://schemas.openxmlformats.org/drawingml/2006/picture">
-            <wp:extent cx="5989320" cy="5610828"/>
-            <wp:docPr id="12" name="Picture 12"/>
+            <wp:extent cx="6400800" cy="3364865"/>
+            <wp:docPr id="13" name="Picture 13"/>
             <wp:cNvGraphicFramePr>
               <a:graphicFrameLocks noChangeAspect="1"/>
             </wp:cNvGraphicFramePr>
@@ -1281,7 +1506,7 @@
               <a:graphicData uri="http://schemas.openxmlformats.org/drawingml/2006/picture">
                 <pic:pic>
                   <pic:nvPicPr>
-                    <pic:cNvPr id="0" name="11-completed-item-corrected.png"/>
+                    <pic:cNvPr id="0" name="09-batch-editor-bulk-price-part-03.png"/>
                     <pic:cNvPicPr/>
                   </pic:nvPicPr>
                   <pic:blipFill>
@@ -1293,7 +1518,7 @@
                   <pic:spPr>
                     <a:xfrm>
                       <a:off x="0" y="0"/>
-                      <a:ext cx="5989320" cy="5610828"/>
+                      <a:ext cx="6400800" cy="3364865"/>
                     </a:xfrm>
                     <a:prstGeom prst="rect"/>
                   </pic:spPr>
@@ -1306,11 +1531,16 @@
     </w:p>
     <w:p>
       <w:pPr>
-        <w:pStyle w:val="Caption"/>
+        <w:spacing w:after="160"/>
         <w:jc w:val="center"/>
       </w:pPr>
       <w:r>
-        <w:t>11-completed-item-corrected.png</w:t>
+        <w:rPr>
+          <w:i/>
+          <w:color w:val="6A6475"/>
+          <w:sz w:val="16"/>
+        </w:rPr>
+        <w:t>Batch Editor with health, confidence, and bulk controls - view 3 of 3</w:t>
       </w:r>
     </w:p>
     <w:p>
@@ -1320,29 +1550,102 @@
     </w:p>
     <w:p>
       <w:pPr>
-        <w:pStyle w:val="Title"/>
+        <w:pStyle w:val="Heading1"/>
       </w:pPr>
       <w:r>
-        <w:t>Validation blocks invalid changes</w:t>
+        <w:t>7. Command Palette and Bulk Operations</w:t>
       </w:r>
     </w:p>
     <w:p>
-      <w:pPr>
-        <w:spacing w:after="160"/>
-      </w:pPr>
       <w:r>
-        <w:t>Blank Title and zero Price are rejected atomically. The editor remains open with exact errors.</w:t>
+        <w:t>The command palette supplements visible controls and keeps frequent actions keyboard-accessible.</w:t>
       </w:r>
     </w:p>
     <w:p>
       <w:pPr>
+        <w:ind w:left="173" w:hanging="173"/>
+      </w:pPr>
+      <w:r>
+        <w:rPr>
+          <w:b/>
+          <w:color w:val="8055D9"/>
+        </w:rPr>
+        <w:t xml:space="preserve">1. </w:t>
+      </w:r>
+      <w:r>
+        <w:t>Press Ctrl+Shift+P to open the command palette.</w:t>
+      </w:r>
+    </w:p>
+    <w:p>
+      <w:pPr>
+        <w:ind w:left="173" w:hanging="173"/>
+      </w:pPr>
+      <w:r>
+        <w:rPr>
+          <w:b/>
+          <w:color w:val="8055D9"/>
+        </w:rPr>
+        <w:t xml:space="preserve">2. </w:t>
+      </w:r>
+      <w:r>
+        <w:t>Jump to Review, Batch Editor, Publish, Import, Diagnostics, CSV tools, or batch rollback.</w:t>
+      </w:r>
+    </w:p>
+    <w:p>
+      <w:pPr>
+        <w:ind w:left="173" w:hanging="173"/>
+      </w:pPr>
+      <w:r>
+        <w:rPr>
+          <w:b/>
+          <w:color w:val="8055D9"/>
+        </w:rPr>
+        <w:t xml:space="preserve">3. </w:t>
+      </w:r>
+      <w:r>
+        <w:t>Select rows and preview bulk operations before applying them.</w:t>
+      </w:r>
+    </w:p>
+    <w:p>
+      <w:pPr>
+        <w:ind w:left="173" w:hanging="173"/>
+      </w:pPr>
+      <w:r>
+        <w:rPr>
+          <w:b/>
+          <w:color w:val="8055D9"/>
+        </w:rPr>
+        <w:t xml:space="preserve">4. </w:t>
+      </w:r>
+      <w:r>
+        <w:t>For ToonieTape work, select the intended rows, choose Bulk Price, enter $4.00, inspect the affected count, then Apply.</w:t>
+      </w:r>
+    </w:p>
+    <w:p>
+      <w:pPr>
+        <w:ind w:left="173" w:hanging="173"/>
+      </w:pPr>
+      <w:r>
+        <w:rPr>
+          <w:b/>
+          <w:color w:val="8055D9"/>
+        </w:rPr>
+        <w:t xml:space="preserve">5. </w:t>
+      </w:r>
+      <w:r>
+        <w:t>SnapIMS creates a checkpoint before large destructive operations.</w:t>
+      </w:r>
+    </w:p>
+    <w:p>
+      <w:pPr>
+        <w:spacing w:after="80"/>
         <w:jc w:val="center"/>
       </w:pPr>
       <w:r>
         <w:drawing>
           <wp:inline xmlns:a="http://schemas.openxmlformats.org/drawingml/2006/main" xmlns:pic="http://schemas.openxmlformats.org/drawingml/2006/picture">
-            <wp:extent cx="3729381" cy="5806440"/>
-            <wp:docPr id="13" name="Picture 13"/>
+            <wp:extent cx="6400800" cy="3364865"/>
+            <wp:docPr id="14" name="Picture 14"/>
             <wp:cNvGraphicFramePr>
               <a:graphicFrameLocks noChangeAspect="1"/>
             </wp:cNvGraphicFramePr>
@@ -1350,7 +1653,66 @@
               <a:graphicData uri="http://schemas.openxmlformats.org/drawingml/2006/picture">
                 <pic:pic>
                   <pic:nvPicPr>
-                    <pic:cNvPr id="0" name="12-invalid-edit-blocked.png"/>
+                    <pic:cNvPr id="0" name="09-batch-editor-bulk-price-part-01.png"/>
+                    <pic:cNvPicPr/>
+                  </pic:nvPicPr>
+                  <pic:blipFill>
+                    <a:blip r:embed="rId20"/>
+                    <a:stretch>
+                      <a:fillRect/>
+                    </a:stretch>
+                  </pic:blipFill>
+                  <pic:spPr>
+                    <a:xfrm>
+                      <a:off x="0" y="0"/>
+                      <a:ext cx="6400800" cy="3364865"/>
+                    </a:xfrm>
+                    <a:prstGeom prst="rect"/>
+                  </pic:spPr>
+                </pic:pic>
+              </a:graphicData>
+            </a:graphic>
+          </wp:inline>
+        </w:drawing>
+      </w:r>
+    </w:p>
+    <w:p>
+      <w:pPr>
+        <w:spacing w:after="160"/>
+        <w:jc w:val="center"/>
+      </w:pPr>
+      <w:r>
+        <w:rPr>
+          <w:i/>
+          <w:color w:val="6A6475"/>
+          <w:sz w:val="16"/>
+        </w:rPr>
+        <w:t>Keyboard command palette - view 1 of 3</w:t>
+      </w:r>
+    </w:p>
+    <w:p>
+      <w:r>
+        <w:br w:type="page"/>
+      </w:r>
+    </w:p>
+    <w:p>
+      <w:pPr>
+        <w:spacing w:after="80"/>
+        <w:jc w:val="center"/>
+      </w:pPr>
+      <w:r>
+        <w:drawing>
+          <wp:inline xmlns:a="http://schemas.openxmlformats.org/drawingml/2006/main" xmlns:pic="http://schemas.openxmlformats.org/drawingml/2006/picture">
+            <wp:extent cx="6400800" cy="3564890"/>
+            <wp:docPr id="15" name="Picture 15"/>
+            <wp:cNvGraphicFramePr>
+              <a:graphicFrameLocks noChangeAspect="1"/>
+            </wp:cNvGraphicFramePr>
+            <a:graphic>
+              <a:graphicData uri="http://schemas.openxmlformats.org/drawingml/2006/picture">
+                <pic:pic>
+                  <pic:nvPicPr>
+                    <pic:cNvPr id="0" name="10-command-palette-part-02.png"/>
                     <pic:cNvPicPr/>
                   </pic:nvPicPr>
                   <pic:blipFill>
@@ -1362,7 +1724,7 @@
                   <pic:spPr>
                     <a:xfrm>
                       <a:off x="0" y="0"/>
-                      <a:ext cx="3729381" cy="5806440"/>
+                      <a:ext cx="6400800" cy="3564890"/>
                     </a:xfrm>
                     <a:prstGeom prst="rect"/>
                   </pic:spPr>
@@ -1375,11 +1737,16 @@
     </w:p>
     <w:p>
       <w:pPr>
-        <w:pStyle w:val="Caption"/>
+        <w:spacing w:after="160"/>
         <w:jc w:val="center"/>
       </w:pPr>
       <w:r>
-        <w:t>12-invalid-edit-blocked.png</w:t>
+        <w:rPr>
+          <w:i/>
+          <w:color w:val="6A6475"/>
+          <w:sz w:val="16"/>
+        </w:rPr>
+        <w:t>Keyboard command palette - view 2 of 3</w:t>
       </w:r>
     </w:p>
     <w:p>
@@ -1389,29 +1756,14 @@
     </w:p>
     <w:p>
       <w:pPr>
-        <w:pStyle w:val="Title"/>
-      </w:pPr>
-      <w:r>
-        <w:t>Cancel invalid changes</w:t>
-      </w:r>
-    </w:p>
-    <w:p>
-      <w:pPr>
-        <w:spacing w:after="160"/>
-      </w:pPr>
-      <w:r>
-        <w:t>Cancel changes restores the last valid saved record without altering the Item ID.</w:t>
-      </w:r>
-    </w:p>
-    <w:p>
-      <w:pPr>
+        <w:spacing w:after="80"/>
         <w:jc w:val="center"/>
       </w:pPr>
       <w:r>
         <w:drawing>
           <wp:inline xmlns:a="http://schemas.openxmlformats.org/drawingml/2006/main" xmlns:pic="http://schemas.openxmlformats.org/drawingml/2006/picture">
-            <wp:extent cx="5989320" cy="5315521"/>
-            <wp:docPr id="14" name="Picture 14"/>
+            <wp:extent cx="6400800" cy="3364865"/>
+            <wp:docPr id="16" name="Picture 16"/>
             <wp:cNvGraphicFramePr>
               <a:graphicFrameLocks noChangeAspect="1"/>
             </wp:cNvGraphicFramePr>
@@ -1419,7 +1771,7 @@
               <a:graphicData uri="http://schemas.openxmlformats.org/drawingml/2006/picture">
                 <pic:pic>
                   <pic:nvPicPr>
-                    <pic:cNvPr id="0" name="13-invalid-edit-cancelled.png"/>
+                    <pic:cNvPr id="0" name="10-command-palette-part-03.png"/>
                     <pic:cNvPicPr/>
                   </pic:nvPicPr>
                   <pic:blipFill>
@@ -1431,7 +1783,7 @@
                   <pic:spPr>
                     <a:xfrm>
                       <a:off x="0" y="0"/>
-                      <a:ext cx="5989320" cy="5315521"/>
+                      <a:ext cx="6400800" cy="3364865"/>
                     </a:xfrm>
                     <a:prstGeom prst="rect"/>
                   </pic:spPr>
@@ -1444,11 +1796,16 @@
     </w:p>
     <w:p>
       <w:pPr>
-        <w:pStyle w:val="Caption"/>
+        <w:spacing w:after="160"/>
         <w:jc w:val="center"/>
       </w:pPr>
       <w:r>
-        <w:t>13-invalid-edit-cancelled.png</w:t>
+        <w:rPr>
+          <w:i/>
+          <w:color w:val="6A6475"/>
+          <w:sz w:val="16"/>
+        </w:rPr>
+        <w:t>Keyboard command palette - view 3 of 3</w:t>
       </w:r>
     </w:p>
     <w:p>
@@ -1458,29 +1815,117 @@
     </w:p>
     <w:p>
       <w:pPr>
-        <w:pStyle w:val="Title"/>
+        <w:pStyle w:val="Heading1"/>
       </w:pPr>
       <w:r>
-        <w:t>Restart durability</w:t>
+        <w:t>8. CSV Round Trip and Difference Preview</w:t>
       </w:r>
     </w:p>
     <w:p>
-      <w:pPr>
-        <w:spacing w:after="160"/>
-      </w:pPr>
       <w:r>
-        <w:t>After a full application-process restart, saved metadata and Item ID remain available from SQLite.</w:t>
+        <w:t>CSV remains available for external spreadsheet work, but uploaded values are never applied blindly.</w:t>
       </w:r>
     </w:p>
     <w:p>
       <w:pPr>
+        <w:ind w:left="173" w:hanging="173"/>
+      </w:pPr>
+      <w:r>
+        <w:rPr>
+          <w:b/>
+          <w:color w:val="8055D9"/>
+        </w:rPr>
+        <w:t xml:space="preserve">1. </w:t>
+      </w:r>
+      <w:r>
+        <w:t>Download the current working CSV from Publish or Batch Tools.</w:t>
+      </w:r>
+    </w:p>
+    <w:p>
+      <w:pPr>
+        <w:ind w:left="173" w:hanging="173"/>
+      </w:pPr>
+      <w:r>
+        <w:rPr>
+          <w:b/>
+          <w:color w:val="8055D9"/>
+        </w:rPr>
+        <w:t xml:space="preserve">2. </w:t>
+      </w:r>
+      <w:r>
+        <w:t>Edit the file in Excel or LibreOffice without changing immutable Item IDs.</w:t>
+      </w:r>
+    </w:p>
+    <w:p>
+      <w:pPr>
+        <w:ind w:left="173" w:hanging="173"/>
+      </w:pPr>
+      <w:r>
+        <w:rPr>
+          <w:b/>
+          <w:color w:val="8055D9"/>
+        </w:rPr>
+        <w:t xml:space="preserve">3. </w:t>
+      </w:r>
+      <w:r>
+        <w:t>Upload the edited CSV. SnapIMS stages it instead of modifying the batch immediately.</w:t>
+      </w:r>
+    </w:p>
+    <w:p>
+      <w:pPr>
+        <w:ind w:left="173" w:hanging="173"/>
+      </w:pPr>
+      <w:r>
+        <w:rPr>
+          <w:b/>
+          <w:color w:val="8055D9"/>
+        </w:rPr>
+        <w:t xml:space="preserve">4. </w:t>
+      </w:r>
+      <w:r>
+        <w:t>Use the Difference Preview to inspect matched rows, missing items, validation errors, and field-level changes.</w:t>
+      </w:r>
+    </w:p>
+    <w:p>
+      <w:pPr>
+        <w:ind w:left="173" w:hanging="173"/>
+      </w:pPr>
+      <w:r>
+        <w:rPr>
+          <w:b/>
+          <w:color w:val="8055D9"/>
+        </w:rPr>
+        <w:t xml:space="preserve">5. </w:t>
+      </w:r>
+      <w:r>
+        <w:t>Cancel to prove no values changed, or confirm Apply Valid Changes after all blocking errors are resolved.</w:t>
+      </w:r>
+    </w:p>
+    <w:p>
+      <w:pPr>
+        <w:ind w:left="173" w:hanging="173"/>
+      </w:pPr>
+      <w:r>
+        <w:rPr>
+          <w:b/>
+          <w:color w:val="8055D9"/>
+        </w:rPr>
+        <w:t xml:space="preserve">6. </w:t>
+      </w:r>
+      <w:r>
+        <w:t>Use Undo CSV Import to restore the durable checkpoint.</w:t>
+      </w:r>
+    </w:p>
+    <w:p>
+      <w:pPr>
+        <w:spacing w:after="80"/>
         <w:jc w:val="center"/>
       </w:pPr>
       <w:r>
         <w:drawing>
           <wp:inline xmlns:a="http://schemas.openxmlformats.org/drawingml/2006/main" xmlns:pic="http://schemas.openxmlformats.org/drawingml/2006/picture">
-            <wp:extent cx="5989320" cy="5315521"/>
-            <wp:docPr id="15" name="Picture 15"/>
+            <wp:extent cx="6400800" cy="3769360"/>
+            <wp:docPr id="17" name="Picture 17"/>
             <wp:cNvGraphicFramePr>
               <a:graphicFrameLocks noChangeAspect="1"/>
             </wp:cNvGraphicFramePr>
@@ -1488,11 +1933,11 @@
               <a:graphicData uri="http://schemas.openxmlformats.org/drawingml/2006/picture">
                 <pic:pic>
                   <pic:nvPicPr>
-                    <pic:cNvPr id="0" name="13-invalid-edit-cancelled.png"/>
+                    <pic:cNvPr id="0" name="11-csv-difference-preview-part-01.png"/>
                     <pic:cNvPicPr/>
                   </pic:nvPicPr>
                   <pic:blipFill>
-                    <a:blip r:embed="rId24"/>
+                    <a:blip r:embed="rId25"/>
                     <a:stretch>
                       <a:fillRect/>
                     </a:stretch>
@@ -1500,7 +1945,7 @@
                   <pic:spPr>
                     <a:xfrm>
                       <a:off x="0" y="0"/>
-                      <a:ext cx="5989320" cy="5315521"/>
+                      <a:ext cx="6400800" cy="3769360"/>
                     </a:xfrm>
                     <a:prstGeom prst="rect"/>
                   </pic:spPr>
@@ -1513,11 +1958,16 @@
     </w:p>
     <w:p>
       <w:pPr>
-        <w:pStyle w:val="Caption"/>
+        <w:spacing w:after="160"/>
         <w:jc w:val="center"/>
       </w:pPr>
       <w:r>
-        <w:t>14-restart-durable-correction.png</w:t>
+        <w:rPr>
+          <w:i/>
+          <w:color w:val="6A6475"/>
+          <w:sz w:val="16"/>
+        </w:rPr>
+        <w:t>CSV difference preview before application - view 1 of 3</w:t>
       </w:r>
     </w:p>
     <w:p>
@@ -1527,29 +1977,14 @@
     </w:p>
     <w:p>
       <w:pPr>
-        <w:pStyle w:val="Title"/>
-      </w:pPr>
-      <w:r>
-        <w:t>Publish simulation</w:t>
-      </w:r>
-    </w:p>
-    <w:p>
-      <w:pPr>
-        <w:spacing w:after="160"/>
-      </w:pPr>
-      <w:r>
-        <w:t>Confirm Ready/Blocked counts and payload previews. Download the inventory CSV before any live-draft acceptance test.</w:t>
-      </w:r>
-    </w:p>
-    <w:p>
-      <w:pPr>
+        <w:spacing w:after="80"/>
         <w:jc w:val="center"/>
       </w:pPr>
       <w:r>
         <w:drawing>
           <wp:inline xmlns:a="http://schemas.openxmlformats.org/drawingml/2006/main" xmlns:pic="http://schemas.openxmlformats.org/drawingml/2006/picture">
-            <wp:extent cx="2484776" cy="5806440"/>
-            <wp:docPr id="16" name="Picture 16"/>
+            <wp:extent cx="6400800" cy="3969385"/>
+            <wp:docPr id="18" name="Picture 18"/>
             <wp:cNvGraphicFramePr>
               <a:graphicFrameLocks noChangeAspect="1"/>
             </wp:cNvGraphicFramePr>
@@ -1557,11 +1992,11 @@
               <a:graphicData uri="http://schemas.openxmlformats.org/drawingml/2006/picture">
                 <pic:pic>
                   <pic:nvPicPr>
-                    <pic:cNvPr id="0" name="15-publish-simulation.png"/>
+                    <pic:cNvPr id="0" name="11-csv-difference-preview-part-02.png"/>
                     <pic:cNvPicPr/>
                   </pic:nvPicPr>
                   <pic:blipFill>
-                    <a:blip r:embed="rId25"/>
+                    <a:blip r:embed="rId26"/>
                     <a:stretch>
                       <a:fillRect/>
                     </a:stretch>
@@ -1569,7 +2004,7 @@
                   <pic:spPr>
                     <a:xfrm>
                       <a:off x="0" y="0"/>
-                      <a:ext cx="2484776" cy="5806440"/>
+                      <a:ext cx="6400800" cy="3969385"/>
                     </a:xfrm>
                     <a:prstGeom prst="rect"/>
                   </pic:spPr>
@@ -1582,11 +2017,16 @@
     </w:p>
     <w:p>
       <w:pPr>
-        <w:pStyle w:val="Caption"/>
+        <w:spacing w:after="160"/>
         <w:jc w:val="center"/>
       </w:pPr>
       <w:r>
-        <w:t>15-publish-simulation.png</w:t>
+        <w:rPr>
+          <w:i/>
+          <w:color w:val="6A6475"/>
+          <w:sz w:val="16"/>
+        </w:rPr>
+        <w:t>CSV difference preview before application - view 2 of 3</w:t>
       </w:r>
     </w:p>
     <w:p>
@@ -1596,29 +2036,14 @@
     </w:p>
     <w:p>
       <w:pPr>
-        <w:pStyle w:val="Title"/>
-      </w:pPr>
-      <w:r>
-        <w:t>Routine second import - Preview</w:t>
-      </w:r>
-    </w:p>
-    <w:p>
-      <w:pPr>
-        <w:spacing w:after="160"/>
-      </w:pPr>
-      <w:r>
-        <w:t>Configured and recent folders avoid routine absolute-path typing.</w:t>
-      </w:r>
-    </w:p>
-    <w:p>
-      <w:pPr>
+        <w:spacing w:after="80"/>
         <w:jc w:val="center"/>
       </w:pPr>
       <w:r>
         <w:drawing>
           <wp:inline xmlns:a="http://schemas.openxmlformats.org/drawingml/2006/main" xmlns:pic="http://schemas.openxmlformats.org/drawingml/2006/picture">
-            <wp:extent cx="5989320" cy="4229957"/>
-            <wp:docPr id="17" name="Picture 17"/>
+            <wp:extent cx="6400800" cy="3764915"/>
+            <wp:docPr id="19" name="Picture 19"/>
             <wp:cNvGraphicFramePr>
               <a:graphicFrameLocks noChangeAspect="1"/>
             </wp:cNvGraphicFramePr>
@@ -1626,11 +2051,11 @@
               <a:graphicData uri="http://schemas.openxmlformats.org/drawingml/2006/picture">
                 <pic:pic>
                   <pic:nvPicPr>
-                    <pic:cNvPr id="0" name="16-preview-not-imported.png"/>
+                    <pic:cNvPr id="0" name="11-csv-difference-preview-part-03.png"/>
                     <pic:cNvPicPr/>
                   </pic:nvPicPr>
                   <pic:blipFill>
-                    <a:blip r:embed="rId26"/>
+                    <a:blip r:embed="rId27"/>
                     <a:stretch>
                       <a:fillRect/>
                     </a:stretch>
@@ -1638,7 +2063,7 @@
                   <pic:spPr>
                     <a:xfrm>
                       <a:off x="0" y="0"/>
-                      <a:ext cx="5989320" cy="4229957"/>
+                      <a:ext cx="6400800" cy="3764915"/>
                     </a:xfrm>
                     <a:prstGeom prst="rect"/>
                   </pic:spPr>
@@ -1651,11 +2076,16 @@
     </w:p>
     <w:p>
       <w:pPr>
-        <w:pStyle w:val="Caption"/>
+        <w:spacing w:after="160"/>
         <w:jc w:val="center"/>
       </w:pPr>
       <w:r>
-        <w:t>16-preview-not-imported.png</w:t>
+        <w:rPr>
+          <w:i/>
+          <w:color w:val="6A6475"/>
+          <w:sz w:val="16"/>
+        </w:rPr>
+        <w:t>CSV difference preview before application - view 3 of 3</w:t>
       </w:r>
     </w:p>
     <w:p>
@@ -1665,29 +2095,102 @@
     </w:p>
     <w:p>
       <w:pPr>
-        <w:pStyle w:val="Title"/>
+        <w:pStyle w:val="Heading1"/>
       </w:pPr>
       <w:r>
-        <w:t>Routine second import - durable ID</w:t>
+        <w:t>9. External Review</w:t>
       </w:r>
     </w:p>
     <w:p>
-      <w:pPr>
-        <w:spacing w:after="160"/>
-      </w:pPr>
       <w:r>
-        <w:t>A successful import is available immediately through Continue to Review.</w:t>
+        <w:t>A valid CSV can satisfy review for large intentionally uniform batches, but only after explicit operator confirmation.</w:t>
       </w:r>
     </w:p>
     <w:p>
       <w:pPr>
+        <w:ind w:left="173" w:hanging="173"/>
+      </w:pPr>
+      <w:r>
+        <w:rPr>
+          <w:b/>
+          <w:color w:val="8055D9"/>
+        </w:rPr>
+        <w:t xml:space="preserve">1. </w:t>
+      </w:r>
+      <w:r>
+        <w:t>Apply the validated CSV changes first.</w:t>
+      </w:r>
+    </w:p>
+    <w:p>
+      <w:pPr>
+        <w:ind w:left="173" w:hanging="173"/>
+      </w:pPr>
+      <w:r>
+        <w:rPr>
+          <w:b/>
+          <w:color w:val="8055D9"/>
+        </w:rPr>
+        <w:t xml:space="preserve">2. </w:t>
+      </w:r>
+      <w:r>
+        <w:t>Confirm that all required titles exist, SKUs are unique, and no blocking row remains.</w:t>
+      </w:r>
+    </w:p>
+    <w:p>
+      <w:pPr>
+        <w:ind w:left="173" w:hanging="173"/>
+      </w:pPr>
+      <w:r>
+        <w:rPr>
+          <w:b/>
+          <w:color w:val="8055D9"/>
+        </w:rPr>
+        <w:t xml:space="preserve">3. </w:t>
+      </w:r>
+      <w:r>
+        <w:t>Choose Mark Uploaded Batch as Externally Reviewed.</w:t>
+      </w:r>
+    </w:p>
+    <w:p>
+      <w:pPr>
+        <w:ind w:left="173" w:hanging="173"/>
+      </w:pPr>
+      <w:r>
+        <w:rPr>
+          <w:b/>
+          <w:color w:val="8055D9"/>
+        </w:rPr>
+        <w:t xml:space="preserve">4. </w:t>
+      </w:r>
+      <w:r>
+        <w:t>Accept the responsibility statement. SnapIMS records CSV_EXTERNAL_REVIEW as the review source.</w:t>
+      </w:r>
+    </w:p>
+    <w:p>
+      <w:pPr>
+        <w:ind w:left="173" w:hanging="173"/>
+      </w:pPr>
+      <w:r>
+        <w:rPr>
+          <w:b/>
+          <w:color w:val="8055D9"/>
+        </w:rPr>
+        <w:t xml:space="preserve">5. </w:t>
+      </w:r>
+      <w:r>
+        <w:t>Rows with unresolved errors remain unfinished.</w:t>
+      </w:r>
+    </w:p>
+    <w:p>
+      <w:pPr>
+        <w:spacing w:after="80"/>
         <w:jc w:val="center"/>
       </w:pPr>
       <w:r>
         <w:drawing>
           <wp:inline xmlns:a="http://schemas.openxmlformats.org/drawingml/2006/main" xmlns:pic="http://schemas.openxmlformats.org/drawingml/2006/picture">
-            <wp:extent cx="5989320" cy="4159249"/>
-            <wp:docPr id="18" name="Picture 18"/>
+            <wp:extent cx="6400800" cy="3453765"/>
+            <wp:docPr id="20" name="Picture 20"/>
             <wp:cNvGraphicFramePr>
               <a:graphicFrameLocks noChangeAspect="1"/>
             </wp:cNvGraphicFramePr>
@@ -1695,11 +2198,11 @@
               <a:graphicData uri="http://schemas.openxmlformats.org/drawingml/2006/picture">
                 <pic:pic>
                   <pic:nvPicPr>
-                    <pic:cNvPr id="0" name="16-imported-durable-id.png"/>
+                    <pic:cNvPr id="0" name="12-csv-applied-part-01.png"/>
                     <pic:cNvPicPr/>
                   </pic:nvPicPr>
                   <pic:blipFill>
-                    <a:blip r:embed="rId27"/>
+                    <a:blip r:embed="rId28"/>
                     <a:stretch>
                       <a:fillRect/>
                     </a:stretch>
@@ -1707,7 +2210,7 @@
                   <pic:spPr>
                     <a:xfrm>
                       <a:off x="0" y="0"/>
-                      <a:ext cx="5989320" cy="4159249"/>
+                      <a:ext cx="6400800" cy="3453765"/>
                     </a:xfrm>
                     <a:prstGeom prst="rect"/>
                   </pic:spPr>
@@ -1720,11 +2223,16 @@
     </w:p>
     <w:p>
       <w:pPr>
-        <w:pStyle w:val="Caption"/>
+        <w:spacing w:after="160"/>
         <w:jc w:val="center"/>
       </w:pPr>
       <w:r>
-        <w:t>16-imported-durable-id.png</w:t>
+        <w:rPr>
+          <w:i/>
+          <w:color w:val="6A6475"/>
+          <w:sz w:val="16"/>
+        </w:rPr>
+        <w:t>Applied CSV values in the authoritative working batch - view 1 of 2</w:t>
       </w:r>
     </w:p>
     <w:p>
@@ -1734,29 +2242,14 @@
     </w:p>
     <w:p>
       <w:pPr>
-        <w:pStyle w:val="Title"/>
-      </w:pPr>
-      <w:r>
-        <w:t>Postpone with Later</w:t>
-      </w:r>
-    </w:p>
-    <w:p>
-      <w:pPr>
-        <w:spacing w:after="160"/>
-      </w:pPr>
-      <w:r>
-        <w:t>Later does not finish the tape. The notice confirms it remains unfinished; return through Unresolved.</w:t>
-      </w:r>
-    </w:p>
-    <w:p>
-      <w:pPr>
+        <w:spacing w:after="80"/>
         <w:jc w:val="center"/>
       </w:pPr>
       <w:r>
         <w:drawing>
           <wp:inline xmlns:a="http://schemas.openxmlformats.org/drawingml/2006/main" xmlns:pic="http://schemas.openxmlformats.org/drawingml/2006/picture">
-            <wp:extent cx="5989320" cy="5610828"/>
-            <wp:docPr id="19" name="Picture 19"/>
+            <wp:extent cx="6400800" cy="3449320"/>
+            <wp:docPr id="21" name="Picture 21"/>
             <wp:cNvGraphicFramePr>
               <a:graphicFrameLocks noChangeAspect="1"/>
             </wp:cNvGraphicFramePr>
@@ -1764,11 +2257,11 @@
               <a:graphicData uri="http://schemas.openxmlformats.org/drawingml/2006/picture">
                 <pic:pic>
                   <pic:nvPicPr>
-                    <pic:cNvPr id="0" name="18-later-preserves-unfinished.png"/>
+                    <pic:cNvPr id="0" name="12-csv-applied-part-02.png"/>
                     <pic:cNvPicPr/>
                   </pic:nvPicPr>
                   <pic:blipFill>
-                    <a:blip r:embed="rId28"/>
+                    <a:blip r:embed="rId29"/>
                     <a:stretch>
                       <a:fillRect/>
                     </a:stretch>
@@ -1776,7 +2269,7 @@
                   <pic:spPr>
                     <a:xfrm>
                       <a:off x="0" y="0"/>
-                      <a:ext cx="5989320" cy="5610828"/>
+                      <a:ext cx="6400800" cy="3449320"/>
                     </a:xfrm>
                     <a:prstGeom prst="rect"/>
                   </pic:spPr>
@@ -1789,11 +2282,16 @@
     </w:p>
     <w:p>
       <w:pPr>
-        <w:pStyle w:val="Caption"/>
+        <w:spacing w:after="160"/>
         <w:jc w:val="center"/>
       </w:pPr>
       <w:r>
-        <w:t>18-later-preserves-unfinished.png</w:t>
+        <w:rPr>
+          <w:i/>
+          <w:color w:val="6A6475"/>
+          <w:sz w:val="16"/>
+        </w:rPr>
+        <w:t>Applied CSV values in the authoritative working batch - view 2 of 2</w:t>
       </w:r>
     </w:p>
     <w:p>
@@ -1803,29 +2301,102 @@
     </w:p>
     <w:p>
       <w:pPr>
-        <w:pStyle w:val="Title"/>
+        <w:pStyle w:val="Heading1"/>
       </w:pPr>
       <w:r>
-        <w:t>Missing incoming folder</w:t>
+        <w:t>10. Publish</w:t>
       </w:r>
     </w:p>
     <w:p>
-      <w:pPr>
-        <w:spacing w:after="160"/>
-      </w:pPr>
       <w:r>
-        <w:t>SnapIMS fails closed and does not scan another folder. Reconnect the device or use Advanced recovery.</w:t>
+        <w:t>Publish validates the authoritative working batch regardless of whether edits came from AI, Review, Batch Editor, or CSV.</w:t>
       </w:r>
     </w:p>
     <w:p>
       <w:pPr>
+        <w:ind w:left="173" w:hanging="173"/>
+      </w:pPr>
+      <w:r>
+        <w:rPr>
+          <w:b/>
+          <w:color w:val="8055D9"/>
+        </w:rPr>
+        <w:t xml:space="preserve">1. </w:t>
+      </w:r>
+      <w:r>
+        <w:t>Review all publish blockers and follow links back to the affected item or editor row.</w:t>
+      </w:r>
+    </w:p>
+    <w:p>
+      <w:pPr>
+        <w:ind w:left="173" w:hanging="173"/>
+      </w:pPr>
+      <w:r>
+        <w:rPr>
+          <w:b/>
+          <w:color w:val="8055D9"/>
+        </w:rPr>
+        <w:t xml:space="preserve">2. </w:t>
+      </w:r>
+      <w:r>
+        <w:t>Use Shopify simulation before any live publishing test.</w:t>
+      </w:r>
+    </w:p>
+    <w:p>
+      <w:pPr>
+        <w:ind w:left="173" w:hanging="173"/>
+      </w:pPr>
+      <w:r>
+        <w:rPr>
+          <w:b/>
+          <w:color w:val="8055D9"/>
+        </w:rPr>
+        <w:t xml:space="preserve">3. </w:t>
+      </w:r>
+      <w:r>
+        <w:t>Download the final CSV and reconcile it against the physical batch.</w:t>
+      </w:r>
+    </w:p>
+    <w:p>
+      <w:pPr>
+        <w:ind w:left="173" w:hanging="173"/>
+      </w:pPr>
+      <w:r>
+        <w:rPr>
+          <w:b/>
+          <w:color w:val="8055D9"/>
+        </w:rPr>
+        <w:t xml:space="preserve">4. </w:t>
+      </w:r>
+      <w:r>
+        <w:t>Live publishing must create drafts, use idempotency checkpoints, and never duplicate a product on retry.</w:t>
+      </w:r>
+    </w:p>
+    <w:p>
+      <w:pPr>
+        <w:ind w:left="173" w:hanging="173"/>
+      </w:pPr>
+      <w:r>
+        <w:rPr>
+          <w:b/>
+          <w:color w:val="8055D9"/>
+        </w:rPr>
+        <w:t xml:space="preserve">5. </w:t>
+      </w:r>
+      <w:r>
+        <w:t>A live Shopify draft remains a 1.0 acceptance requirement.</w:t>
+      </w:r>
+    </w:p>
+    <w:p>
+      <w:pPr>
+        <w:spacing w:after="80"/>
         <w:jc w:val="center"/>
       </w:pPr>
       <w:r>
         <w:drawing>
           <wp:inline xmlns:a="http://schemas.openxmlformats.org/drawingml/2006/main" xmlns:pic="http://schemas.openxmlformats.org/drawingml/2006/picture">
-            <wp:extent cx="5989320" cy="4159249"/>
-            <wp:docPr id="20" name="Picture 20"/>
+            <wp:extent cx="6400800" cy="3515995"/>
+            <wp:docPr id="22" name="Picture 22"/>
             <wp:cNvGraphicFramePr>
               <a:graphicFrameLocks noChangeAspect="1"/>
             </wp:cNvGraphicFramePr>
@@ -1833,11 +2404,11 @@
               <a:graphicData uri="http://schemas.openxmlformats.org/drawingml/2006/picture">
                 <pic:pic>
                   <pic:nvPicPr>
-                    <pic:cNvPr id="0" name="19-missing-folder-recovery.png"/>
+                    <pic:cNvPr id="0" name="13-publish-simulation-part-01.png"/>
                     <pic:cNvPicPr/>
                   </pic:nvPicPr>
                   <pic:blipFill>
-                    <a:blip r:embed="rId29"/>
+                    <a:blip r:embed="rId30"/>
                     <a:stretch>
                       <a:fillRect/>
                     </a:stretch>
@@ -1845,7 +2416,7 @@
                   <pic:spPr>
                     <a:xfrm>
                       <a:off x="0" y="0"/>
-                      <a:ext cx="5989320" cy="4159249"/>
+                      <a:ext cx="6400800" cy="3515995"/>
                     </a:xfrm>
                     <a:prstGeom prst="rect"/>
                   </pic:spPr>
@@ -1858,11 +2429,16 @@
     </w:p>
     <w:p>
       <w:pPr>
-        <w:pStyle w:val="Caption"/>
+        <w:spacing w:after="160"/>
         <w:jc w:val="center"/>
       </w:pPr>
       <w:r>
-        <w:t>19-missing-folder-recovery.png</w:t>
+        <w:rPr>
+          <w:i/>
+          <w:color w:val="6A6475"/>
+          <w:sz w:val="16"/>
+        </w:rPr>
+        <w:t>Publish validation and Shopify simulation - view 1 of 4</w:t>
       </w:r>
     </w:p>
     <w:p>
@@ -1872,29 +2448,14 @@
     </w:p>
     <w:p>
       <w:pPr>
-        <w:pStyle w:val="Title"/>
-      </w:pPr>
-      <w:r>
-        <w:t>Recognition failure fixture - Preview</w:t>
-      </w:r>
-    </w:p>
-    <w:p>
-      <w:pPr>
-        <w:spacing w:after="160"/>
-      </w:pPr>
-      <w:r>
-        <w:t>The normal Preview contract remains unchanged for a one-item failure test.</w:t>
-      </w:r>
-    </w:p>
-    <w:p>
-      <w:pPr>
+        <w:spacing w:after="80"/>
         <w:jc w:val="center"/>
       </w:pPr>
       <w:r>
         <w:drawing>
           <wp:inline xmlns:a="http://schemas.openxmlformats.org/drawingml/2006/main" xmlns:pic="http://schemas.openxmlformats.org/drawingml/2006/picture">
-            <wp:extent cx="5989320" cy="4229957"/>
-            <wp:docPr id="21" name="Picture 21"/>
+            <wp:extent cx="6400800" cy="3716020"/>
+            <wp:docPr id="23" name="Picture 23"/>
             <wp:cNvGraphicFramePr>
               <a:graphicFrameLocks noChangeAspect="1"/>
             </wp:cNvGraphicFramePr>
@@ -1902,11 +2463,11 @@
               <a:graphicData uri="http://schemas.openxmlformats.org/drawingml/2006/picture">
                 <pic:pic>
                   <pic:nvPicPr>
-                    <pic:cNvPr id="0" name="20-preview-not-imported.png"/>
+                    <pic:cNvPr id="0" name="13-publish-simulation-part-02.png"/>
                     <pic:cNvPicPr/>
                   </pic:nvPicPr>
                   <pic:blipFill>
-                    <a:blip r:embed="rId30"/>
+                    <a:blip r:embed="rId31"/>
                     <a:stretch>
                       <a:fillRect/>
                     </a:stretch>
@@ -1914,7 +2475,7 @@
                   <pic:spPr>
                     <a:xfrm>
                       <a:off x="0" y="0"/>
-                      <a:ext cx="5989320" cy="4229957"/>
+                      <a:ext cx="6400800" cy="3716020"/>
                     </a:xfrm>
                     <a:prstGeom prst="rect"/>
                   </pic:spPr>
@@ -1927,11 +2488,16 @@
     </w:p>
     <w:p>
       <w:pPr>
-        <w:pStyle w:val="Caption"/>
+        <w:spacing w:after="160"/>
         <w:jc w:val="center"/>
       </w:pPr>
       <w:r>
-        <w:t>20-preview-not-imported.png</w:t>
+        <w:rPr>
+          <w:i/>
+          <w:color w:val="6A6475"/>
+          <w:sz w:val="16"/>
+        </w:rPr>
+        <w:t>Publish validation and Shopify simulation - view 2 of 4</w:t>
       </w:r>
     </w:p>
     <w:p>
@@ -1941,29 +2507,14 @@
     </w:p>
     <w:p>
       <w:pPr>
-        <w:pStyle w:val="Title"/>
-      </w:pPr>
-      <w:r>
-        <w:t>Recognition failure fixture - Import</w:t>
-      </w:r>
-    </w:p>
-    <w:p>
-      <w:pPr>
-        <w:spacing w:after="160"/>
-      </w:pPr>
-      <w:r>
-        <w:t>The failed provider attempt remains attached to this same durable item.</w:t>
-      </w:r>
-    </w:p>
-    <w:p>
-      <w:pPr>
+        <w:spacing w:after="80"/>
         <w:jc w:val="center"/>
       </w:pPr>
       <w:r>
         <w:drawing>
           <wp:inline xmlns:a="http://schemas.openxmlformats.org/drawingml/2006/main" xmlns:pic="http://schemas.openxmlformats.org/drawingml/2006/picture">
-            <wp:extent cx="5989320" cy="4159249"/>
-            <wp:docPr id="22" name="Picture 22"/>
+            <wp:extent cx="6400800" cy="3716020"/>
+            <wp:docPr id="24" name="Picture 24"/>
             <wp:cNvGraphicFramePr>
               <a:graphicFrameLocks noChangeAspect="1"/>
             </wp:cNvGraphicFramePr>
@@ -1971,11 +2522,11 @@
               <a:graphicData uri="http://schemas.openxmlformats.org/drawingml/2006/picture">
                 <pic:pic>
                   <pic:nvPicPr>
-                    <pic:cNvPr id="0" name="20-imported-durable-id.png"/>
+                    <pic:cNvPr id="0" name="13-publish-simulation-part-03.png"/>
                     <pic:cNvPicPr/>
                   </pic:nvPicPr>
                   <pic:blipFill>
-                    <a:blip r:embed="rId31"/>
+                    <a:blip r:embed="rId32"/>
                     <a:stretch>
                       <a:fillRect/>
                     </a:stretch>
@@ -1983,7 +2534,7 @@
                   <pic:spPr>
                     <a:xfrm>
                       <a:off x="0" y="0"/>
-                      <a:ext cx="5989320" cy="4159249"/>
+                      <a:ext cx="6400800" cy="3716020"/>
                     </a:xfrm>
                     <a:prstGeom prst="rect"/>
                   </pic:spPr>
@@ -1996,11 +2547,16 @@
     </w:p>
     <w:p>
       <w:pPr>
-        <w:pStyle w:val="Caption"/>
+        <w:spacing w:after="160"/>
         <w:jc w:val="center"/>
       </w:pPr>
       <w:r>
-        <w:t>20-imported-durable-id.png</w:t>
+        <w:rPr>
+          <w:i/>
+          <w:color w:val="6A6475"/>
+          <w:sz w:val="16"/>
+        </w:rPr>
+        <w:t>Publish validation and Shopify simulation - view 3 of 4</w:t>
       </w:r>
     </w:p>
     <w:p>
@@ -2010,29 +2566,14 @@
     </w:p>
     <w:p>
       <w:pPr>
-        <w:pStyle w:val="Title"/>
-      </w:pPr>
-      <w:r>
-        <w:t>Recognition failure</w:t>
-      </w:r>
-    </w:p>
-    <w:p>
-      <w:pPr>
-        <w:spacing w:after="160"/>
-      </w:pPr>
-      <w:r>
-        <w:t>Open the Failed queue, read the provider error, choose a working provider, and Retry.</w:t>
-      </w:r>
-    </w:p>
-    <w:p>
-      <w:pPr>
+        <w:spacing w:after="80"/>
         <w:jc w:val="center"/>
       </w:pPr>
       <w:r>
         <w:drawing>
           <wp:inline xmlns:a="http://schemas.openxmlformats.org/drawingml/2006/main" xmlns:pic="http://schemas.openxmlformats.org/drawingml/2006/picture">
-            <wp:extent cx="5989320" cy="5315521"/>
-            <wp:docPr id="23" name="Picture 23"/>
+            <wp:extent cx="6400800" cy="3502660"/>
+            <wp:docPr id="25" name="Picture 25"/>
             <wp:cNvGraphicFramePr>
               <a:graphicFrameLocks noChangeAspect="1"/>
             </wp:cNvGraphicFramePr>
@@ -2040,11 +2581,11 @@
               <a:graphicData uri="http://schemas.openxmlformats.org/drawingml/2006/picture">
                 <pic:pic>
                   <pic:nvPicPr>
-                    <pic:cNvPr id="0" name="22-recognition-failure.png"/>
+                    <pic:cNvPr id="0" name="13-publish-simulation-part-04.png"/>
                     <pic:cNvPicPr/>
                   </pic:nvPicPr>
                   <pic:blipFill>
-                    <a:blip r:embed="rId32"/>
+                    <a:blip r:embed="rId33"/>
                     <a:stretch>
                       <a:fillRect/>
                     </a:stretch>
@@ -2052,7 +2593,7 @@
                   <pic:spPr>
                     <a:xfrm>
                       <a:off x="0" y="0"/>
-                      <a:ext cx="5989320" cy="5315521"/>
+                      <a:ext cx="6400800" cy="3502660"/>
                     </a:xfrm>
                     <a:prstGeom prst="rect"/>
                   </pic:spPr>
@@ -2065,11 +2606,16 @@
     </w:p>
     <w:p>
       <w:pPr>
-        <w:pStyle w:val="Caption"/>
+        <w:spacing w:after="160"/>
         <w:jc w:val="center"/>
       </w:pPr>
       <w:r>
-        <w:t>22-recognition-failure.png</w:t>
+        <w:rPr>
+          <w:i/>
+          <w:color w:val="6A6475"/>
+          <w:sz w:val="16"/>
+        </w:rPr>
+        <w:t>Publish validation and Shopify simulation - view 4 of 4</w:t>
       </w:r>
     </w:p>
     <w:p>
@@ -2079,29 +2625,117 @@
     </w:p>
     <w:p>
       <w:pPr>
-        <w:pStyle w:val="Title"/>
+        <w:pStyle w:val="Heading1"/>
       </w:pPr>
       <w:r>
-        <w:t>Recognition recovered</w:t>
+        <w:t>11. Diagnostics and Recovery</w:t>
       </w:r>
     </w:p>
     <w:p>
-      <w:pPr>
-        <w:spacing w:after="160"/>
-      </w:pPr>
       <w:r>
-        <w:t>Retry restores a reviewable suggestion without creating another item or changing physical position.</w:t>
+        <w:t>Diagnostics remains deliberately compact but exposes the information required to recover failures without leaking secrets.</w:t>
       </w:r>
     </w:p>
     <w:p>
       <w:pPr>
+        <w:ind w:left="173" w:hanging="173"/>
+      </w:pPr>
+      <w:r>
+        <w:rPr>
+          <w:b/>
+          <w:color w:val="8055D9"/>
+        </w:rPr>
+        <w:t xml:space="preserve">1. </w:t>
+      </w:r>
+      <w:r>
+        <w:t>Confirm application version, database path, schema version, and integrity status.</w:t>
+      </w:r>
+    </w:p>
+    <w:p>
+      <w:pPr>
+        <w:ind w:left="173" w:hanging="173"/>
+      </w:pPr>
+      <w:r>
+        <w:rPr>
+          <w:b/>
+          <w:color w:val="8055D9"/>
+        </w:rPr>
+        <w:t xml:space="preserve">2. </w:t>
+      </w:r>
+      <w:r>
+        <w:t>Check provider configuration state without displaying API keys.</w:t>
+      </w:r>
+    </w:p>
+    <w:p>
+      <w:pPr>
+        <w:ind w:left="173" w:hanging="173"/>
+      </w:pPr>
+      <w:r>
+        <w:rPr>
+          <w:b/>
+          <w:color w:val="8055D9"/>
+        </w:rPr>
+        <w:t xml:space="preserve">3. </w:t>
+      </w:r>
+      <w:r>
+        <w:t>Inspect recognition job states and the latest failure.</w:t>
+      </w:r>
+    </w:p>
+    <w:p>
+      <w:pPr>
+        <w:ind w:left="173" w:hanging="173"/>
+      </w:pPr>
+      <w:r>
+        <w:rPr>
+          <w:b/>
+          <w:color w:val="8055D9"/>
+        </w:rPr>
+        <w:t xml:space="preserve">4. </w:t>
+      </w:r>
+      <w:r>
+        <w:t>Compare original media bytes with preview and recognition upload bytes.</w:t>
+      </w:r>
+    </w:p>
+    <w:p>
+      <w:pPr>
+        <w:ind w:left="173" w:hanging="173"/>
+      </w:pPr>
+      <w:r>
+        <w:rPr>
+          <w:b/>
+          <w:color w:val="8055D9"/>
+        </w:rPr>
+        <w:t xml:space="preserve">5. </w:t>
+      </w:r>
+      <w:r>
+        <w:t>Use Copy Diagnostic Summary when reporting a problem.</w:t>
+      </w:r>
+    </w:p>
+    <w:p>
+      <w:pPr>
+        <w:ind w:left="173" w:hanging="173"/>
+      </w:pPr>
+      <w:r>
+        <w:rPr>
+          <w:b/>
+          <w:color w:val="8055D9"/>
+        </w:rPr>
+        <w:t xml:space="preserve">6. </w:t>
+      </w:r>
+      <w:r>
+        <w:t>Restart SnapIMS and confirm the active batch, filters, queue, current item, and durable edits were restored.</w:t>
+      </w:r>
+    </w:p>
+    <w:p>
+      <w:pPr>
+        <w:spacing w:after="80"/>
         <w:jc w:val="center"/>
       </w:pPr>
       <w:r>
         <w:drawing>
           <wp:inline xmlns:a="http://schemas.openxmlformats.org/drawingml/2006/main" xmlns:pic="http://schemas.openxmlformats.org/drawingml/2006/picture">
-            <wp:extent cx="5989320" cy="5610828"/>
-            <wp:docPr id="24" name="Picture 24"/>
+            <wp:extent cx="6400800" cy="4209415"/>
+            <wp:docPr id="26" name="Picture 26"/>
             <wp:cNvGraphicFramePr>
               <a:graphicFrameLocks noChangeAspect="1"/>
             </wp:cNvGraphicFramePr>
@@ -2109,11 +2743,11 @@
               <a:graphicData uri="http://schemas.openxmlformats.org/drawingml/2006/picture">
                 <pic:pic>
                   <pic:nvPicPr>
-                    <pic:cNvPr id="0" name="23-recognition-failure-recovered.png"/>
+                    <pic:cNvPr id="0" name="15-diagnostics-part-01.png"/>
                     <pic:cNvPicPr/>
                   </pic:nvPicPr>
                   <pic:blipFill>
-                    <a:blip r:embed="rId33"/>
+                    <a:blip r:embed="rId34"/>
                     <a:stretch>
                       <a:fillRect/>
                     </a:stretch>
@@ -2121,7 +2755,7 @@
                   <pic:spPr>
                     <a:xfrm>
                       <a:off x="0" y="0"/>
-                      <a:ext cx="5989320" cy="5610828"/>
+                      <a:ext cx="6400800" cy="4209415"/>
                     </a:xfrm>
                     <a:prstGeom prst="rect"/>
                   </pic:spPr>
@@ -2134,11 +2768,16 @@
     </w:p>
     <w:p>
       <w:pPr>
-        <w:pStyle w:val="Caption"/>
+        <w:spacing w:after="160"/>
         <w:jc w:val="center"/>
       </w:pPr>
       <w:r>
-        <w:t>23-recognition-failure-recovered.png</w:t>
+        <w:rPr>
+          <w:i/>
+          <w:color w:val="6A6475"/>
+          <w:sz w:val="16"/>
+        </w:rPr>
+        <w:t>Diagnostics and recovery information - view 1 of 2</w:t>
       </w:r>
     </w:p>
     <w:p>
@@ -2148,29 +2787,14 @@
     </w:p>
     <w:p>
       <w:pPr>
-        <w:pStyle w:val="Title"/>
-      </w:pPr>
-      <w:r>
-        <w:t>Interruption fixture - Preview</w:t>
-      </w:r>
-    </w:p>
-    <w:p>
-      <w:pPr>
-        <w:spacing w:after="160"/>
-      </w:pPr>
-      <w:r>
-        <w:t>A large deterministic batch keeps recognition visibly active long enough to test process interruption.</w:t>
-      </w:r>
-    </w:p>
-    <w:p>
-      <w:pPr>
+        <w:spacing w:after="80"/>
         <w:jc w:val="center"/>
       </w:pPr>
       <w:r>
         <w:drawing>
           <wp:inline xmlns:a="http://schemas.openxmlformats.org/drawingml/2006/main" xmlns:pic="http://schemas.openxmlformats.org/drawingml/2006/picture">
-            <wp:extent cx="5989320" cy="4229957"/>
-            <wp:docPr id="25" name="Picture 25"/>
+            <wp:extent cx="6400800" cy="4204970"/>
+            <wp:docPr id="27" name="Picture 27"/>
             <wp:cNvGraphicFramePr>
               <a:graphicFrameLocks noChangeAspect="1"/>
             </wp:cNvGraphicFramePr>
@@ -2178,11 +2802,11 @@
               <a:graphicData uri="http://schemas.openxmlformats.org/drawingml/2006/picture">
                 <pic:pic>
                   <pic:nvPicPr>
-                    <pic:cNvPr id="0" name="24-preview-not-imported.png"/>
+                    <pic:cNvPr id="0" name="15-diagnostics-part-02.png"/>
                     <pic:cNvPicPr/>
                   </pic:nvPicPr>
                   <pic:blipFill>
-                    <a:blip r:embed="rId34"/>
+                    <a:blip r:embed="rId35"/>
                     <a:stretch>
                       <a:fillRect/>
                     </a:stretch>
@@ -2190,7 +2814,7 @@
                   <pic:spPr>
                     <a:xfrm>
                       <a:off x="0" y="0"/>
-                      <a:ext cx="5989320" cy="4229957"/>
+                      <a:ext cx="6400800" cy="4204970"/>
                     </a:xfrm>
                     <a:prstGeom prst="rect"/>
                   </pic:spPr>
@@ -2203,11 +2827,16 @@
     </w:p>
     <w:p>
       <w:pPr>
-        <w:pStyle w:val="Caption"/>
+        <w:spacing w:after="160"/>
         <w:jc w:val="center"/>
       </w:pPr>
       <w:r>
-        <w:t>24-preview-not-imported.png</w:t>
+        <w:rPr>
+          <w:i/>
+          <w:color w:val="6A6475"/>
+          <w:sz w:val="16"/>
+        </w:rPr>
+        <w:t>Diagnostics and recovery information - view 2 of 2</w:t>
       </w:r>
     </w:p>
     <w:p>
@@ -2217,489 +2846,191 @@
     </w:p>
     <w:p>
       <w:pPr>
-        <w:pStyle w:val="Title"/>
+        <w:pStyle w:val="Heading1"/>
       </w:pPr>
       <w:r>
-        <w:t>Interruption fixture - Import</w:t>
+        <w:t>12. End-of-Batch Checklist</w:t>
       </w:r>
     </w:p>
     <w:p>
       <w:pPr>
-        <w:spacing w:after="160"/>
+        <w:ind w:left="173" w:hanging="173"/>
       </w:pPr>
       <w:r>
-        <w:t>The 40-item batch receives one durable identity before recognition starts.</w:t>
+        <w:rPr>
+          <w:b/>
+          <w:color w:val="8055D9"/>
+        </w:rPr>
+        <w:t xml:space="preserve">1. </w:t>
+      </w:r>
+      <w:r>
+        <w:t>Unfinished count is zero, or every remaining item is intentionally postponed and understood.</w:t>
       </w:r>
     </w:p>
     <w:p>
       <w:pPr>
-        <w:jc w:val="center"/>
+        <w:ind w:left="173" w:hanging="173"/>
       </w:pPr>
       <w:r>
-        <w:drawing>
-          <wp:inline xmlns:a="http://schemas.openxmlformats.org/drawingml/2006/main" xmlns:pic="http://schemas.openxmlformats.org/drawingml/2006/picture">
-            <wp:extent cx="5989320" cy="4159249"/>
-            <wp:docPr id="26" name="Picture 26"/>
-            <wp:cNvGraphicFramePr>
-              <a:graphicFrameLocks noChangeAspect="1"/>
-            </wp:cNvGraphicFramePr>
-            <a:graphic>
-              <a:graphicData uri="http://schemas.openxmlformats.org/drawingml/2006/picture">
-                <pic:pic>
-                  <pic:nvPicPr>
-                    <pic:cNvPr id="0" name="24-imported-durable-id.png"/>
-                    <pic:cNvPicPr/>
-                  </pic:nvPicPr>
-                  <pic:blipFill>
-                    <a:blip r:embed="rId35"/>
-                    <a:stretch>
-                      <a:fillRect/>
-                    </a:stretch>
-                  </pic:blipFill>
-                  <pic:spPr>
-                    <a:xfrm>
-                      <a:off x="0" y="0"/>
-                      <a:ext cx="5989320" cy="4159249"/>
-                    </a:xfrm>
-                    <a:prstGeom prst="rect"/>
-                  </pic:spPr>
-                </pic:pic>
-              </a:graphicData>
-            </a:graphic>
-          </wp:inline>
-        </w:drawing>
+        <w:rPr>
+          <w:b/>
+          <w:color w:val="8055D9"/>
+        </w:rPr>
+        <w:t xml:space="preserve">2. </w:t>
+      </w:r>
+      <w:r>
+        <w:t>No failed recognition state lacks an operator decision.</w:t>
       </w:r>
     </w:p>
     <w:p>
       <w:pPr>
-        <w:pStyle w:val="Caption"/>
-        <w:jc w:val="center"/>
+        <w:ind w:left="173" w:hanging="173"/>
       </w:pPr>
       <w:r>
-        <w:t>24-imported-durable-id.png</w:t>
+        <w:rPr>
+          <w:b/>
+          <w:color w:val="8055D9"/>
+        </w:rPr>
+        <w:t xml:space="preserve">3. </w:t>
+      </w:r>
+      <w:r>
+        <w:t>Required titles, prices, quantities, locations, and SKUs pass validation.</w:t>
       </w:r>
     </w:p>
     <w:p>
+      <w:pPr>
+        <w:ind w:left="173" w:hanging="173"/>
+      </w:pPr>
       <w:r>
-        <w:br w:type="page"/>
+        <w:rPr>
+          <w:b/>
+          <w:color w:val="8055D9"/>
+        </w:rPr>
+        <w:t xml:space="preserve">4. </w:t>
+      </w:r>
+      <w:r>
+        <w:t>Low-confidence and flagged items were reviewed using stored evidence or the original photographs.</w:t>
       </w:r>
     </w:p>
     <w:p>
       <w:pPr>
-        <w:pStyle w:val="Title"/>
+        <w:ind w:left="173" w:hanging="173"/>
       </w:pPr>
       <w:r>
-        <w:t>Recognition running</w:t>
+        <w:rPr>
+          <w:b/>
+          <w:color w:val="8055D9"/>
+        </w:rPr>
+        <w:t xml:space="preserve">5. </w:t>
+      </w:r>
+      <w:r>
+        <w:t>Bulk edits and CSV replacements were checkpointed and verified.</w:t>
       </w:r>
     </w:p>
     <w:p>
       <w:pPr>
-        <w:spacing w:after="160"/>
+        <w:ind w:left="173" w:hanging="173"/>
       </w:pPr>
       <w:r>
-        <w:t>The browser shows committed progress before the application process is terminated.</w:t>
+        <w:rPr>
+          <w:b/>
+          <w:color w:val="8055D9"/>
+        </w:rPr>
+        <w:t xml:space="preserve">6. </w:t>
+      </w:r>
+      <w:r>
+        <w:t>Shopify simulation completed without duplicate or idempotency warnings.</w:t>
       </w:r>
     </w:p>
     <w:p>
       <w:pPr>
-        <w:jc w:val="center"/>
+        <w:ind w:left="173" w:hanging="173"/>
       </w:pPr>
       <w:r>
-        <w:drawing>
-          <wp:inline xmlns:a="http://schemas.openxmlformats.org/drawingml/2006/main" xmlns:pic="http://schemas.openxmlformats.org/drawingml/2006/picture">
-            <wp:extent cx="5989320" cy="5315521"/>
-            <wp:docPr id="27" name="Picture 27"/>
-            <wp:cNvGraphicFramePr>
-              <a:graphicFrameLocks noChangeAspect="1"/>
-            </wp:cNvGraphicFramePr>
-            <a:graphic>
-              <a:graphicData uri="http://schemas.openxmlformats.org/drawingml/2006/picture">
-                <pic:pic>
-                  <pic:nvPicPr>
-                    <pic:cNvPr id="0" name="26-recognition-running-before-kill.png"/>
-                    <pic:cNvPicPr/>
-                  </pic:nvPicPr>
-                  <pic:blipFill>
-                    <a:blip r:embed="rId36"/>
-                    <a:stretch>
-                      <a:fillRect/>
-                    </a:stretch>
-                  </pic:blipFill>
-                  <pic:spPr>
-                    <a:xfrm>
-                      <a:off x="0" y="0"/>
-                      <a:ext cx="5989320" cy="5315521"/>
-                    </a:xfrm>
-                    <a:prstGeom prst="rect"/>
-                  </pic:spPr>
-                </pic:pic>
-              </a:graphicData>
-            </a:graphic>
-          </wp:inline>
-        </w:drawing>
+        <w:rPr>
+          <w:b/>
+          <w:color w:val="8055D9"/>
+        </w:rPr>
+        <w:t xml:space="preserve">7. </w:t>
+      </w:r>
+      <w:r>
+        <w:t>The final CSV was downloaded and reconciled against the physical batch.</w:t>
       </w:r>
     </w:p>
     <w:p>
       <w:pPr>
-        <w:pStyle w:val="Caption"/>
-        <w:jc w:val="center"/>
+        <w:ind w:left="173" w:hanging="173"/>
       </w:pPr>
       <w:r>
-        <w:t>26-recognition-running-before-kill.png</w:t>
+        <w:rPr>
+          <w:b/>
+          <w:color w:val="8055D9"/>
+        </w:rPr>
+        <w:t xml:space="preserve">8. </w:t>
+      </w:r>
+      <w:r>
+        <w:t>SnapIMS was restarted once and the current batch state remained correct.</w:t>
       </w:r>
     </w:p>
     <w:p>
+      <w:pPr>
+        <w:ind w:left="173" w:hanging="173"/>
+      </w:pPr>
       <w:r>
-        <w:br w:type="page"/>
+        <w:rPr>
+          <w:b/>
+          <w:color w:val="8055D9"/>
+        </w:rPr>
+        <w:t xml:space="preserve">9. </w:t>
+      </w:r>
+      <w:r>
+        <w:t>Do not label the project 1.0 until the real 20-tape Pixel pilot, live AI, live Shopify draft, CSV reconciliation, restart durability, final guide walkthrough, and browser verification all pass.</w:t>
       </w:r>
     </w:p>
-    <w:p>
-      <w:pPr>
-        <w:pStyle w:val="Title"/>
-      </w:pPr>
-      <w:r>
-        <w:t>Recognition paused after restart</w:t>
-      </w:r>
-    </w:p>
-    <w:p>
-      <w:pPr>
-        <w:spacing w:after="160"/>
-      </w:pPr>
-      <w:r>
-        <w:t>Startup converts the orphaned Running job to Paused with exact completed/remaining counts and one Continue action.</w:t>
-      </w:r>
-    </w:p>
-    <w:p>
-      <w:pPr>
-        <w:jc w:val="center"/>
-      </w:pPr>
-      <w:r>
-        <w:drawing>
-          <wp:inline xmlns:a="http://schemas.openxmlformats.org/drawingml/2006/main" xmlns:pic="http://schemas.openxmlformats.org/drawingml/2006/picture">
-            <wp:extent cx="5989320" cy="5606669"/>
-            <wp:docPr id="28" name="Picture 28"/>
-            <wp:cNvGraphicFramePr>
-              <a:graphicFrameLocks noChangeAspect="1"/>
-            </wp:cNvGraphicFramePr>
-            <a:graphic>
-              <a:graphicData uri="http://schemas.openxmlformats.org/drawingml/2006/picture">
-                <pic:pic>
-                  <pic:nvPicPr>
-                    <pic:cNvPr id="0" name="27-recognition-paused-after-restart.png"/>
-                    <pic:cNvPicPr/>
-                  </pic:nvPicPr>
-                  <pic:blipFill>
-                    <a:blip r:embed="rId37"/>
-                    <a:stretch>
-                      <a:fillRect/>
-                    </a:stretch>
-                  </pic:blipFill>
-                  <pic:spPr>
-                    <a:xfrm>
-                      <a:off x="0" y="0"/>
-                      <a:ext cx="5989320" cy="5606669"/>
-                    </a:xfrm>
-                    <a:prstGeom prst="rect"/>
-                  </pic:spPr>
-                </pic:pic>
-              </a:graphicData>
-            </a:graphic>
-          </wp:inline>
-        </w:drawing>
-      </w:r>
-    </w:p>
-    <w:p>
-      <w:pPr>
-        <w:pStyle w:val="Caption"/>
-        <w:jc w:val="center"/>
-      </w:pPr>
-      <w:r>
-        <w:t>27-recognition-paused-after-restart.png</w:t>
-      </w:r>
-    </w:p>
-    <w:p>
-      <w:r>
-        <w:br w:type="page"/>
-      </w:r>
-    </w:p>
-    <w:p>
-      <w:pPr>
-        <w:pStyle w:val="Title"/>
-      </w:pPr>
-      <w:r>
-        <w:t>Continue interrupted identification</w:t>
-      </w:r>
-    </w:p>
-    <w:p>
-      <w:pPr>
-        <w:spacing w:after="160"/>
-      </w:pPr>
-      <w:r>
-        <w:t>Continue resumes from committed boundaries and completes without duplicate recognition attempts.</w:t>
-      </w:r>
-    </w:p>
-    <w:p>
-      <w:pPr>
-        <w:jc w:val="center"/>
-      </w:pPr>
-      <w:r>
-        <w:drawing>
-          <wp:inline xmlns:a="http://schemas.openxmlformats.org/drawingml/2006/main" xmlns:pic="http://schemas.openxmlformats.org/drawingml/2006/picture">
-            <wp:extent cx="5989320" cy="5315521"/>
-            <wp:docPr id="29" name="Picture 29"/>
-            <wp:cNvGraphicFramePr>
-              <a:graphicFrameLocks noChangeAspect="1"/>
-            </wp:cNvGraphicFramePr>
-            <a:graphic>
-              <a:graphicData uri="http://schemas.openxmlformats.org/drawingml/2006/picture">
-                <pic:pic>
-                  <pic:nvPicPr>
-                    <pic:cNvPr id="0" name="28-recognition-resumed-complete.png"/>
-                    <pic:cNvPicPr/>
-                  </pic:nvPicPr>
-                  <pic:blipFill>
-                    <a:blip r:embed="rId38"/>
-                    <a:stretch>
-                      <a:fillRect/>
-                    </a:stretch>
-                  </pic:blipFill>
-                  <pic:spPr>
-                    <a:xfrm>
-                      <a:off x="0" y="0"/>
-                      <a:ext cx="5989320" cy="5315521"/>
-                    </a:xfrm>
-                    <a:prstGeom prst="rect"/>
-                  </pic:spPr>
-                </pic:pic>
-              </a:graphicData>
-            </a:graphic>
-          </wp:inline>
-        </w:drawing>
-      </w:r>
-    </w:p>
-    <w:p>
-      <w:pPr>
-        <w:pStyle w:val="Caption"/>
-        <w:jc w:val="center"/>
-      </w:pPr>
-      <w:r>
-        <w:t>28-recognition-resumed-complete.png</w:t>
-      </w:r>
-    </w:p>
-    <w:p>
-      <w:r>
-        <w:br w:type="page"/>
-      </w:r>
-    </w:p>
-    <w:p>
-      <w:pPr>
-        <w:pStyle w:val="Title"/>
-      </w:pPr>
-      <w:r>
-        <w:t>Settings</w:t>
-      </w:r>
-    </w:p>
-    <w:p>
-      <w:pPr>
-        <w:spacing w:after="160"/>
-      </w:pPr>
-      <w:r>
-        <w:t>Set the normal incoming folder, inspect recent folders, and confirm provider availability before a real pilot.</w:t>
-      </w:r>
-    </w:p>
-    <w:p>
-      <w:pPr>
-        <w:jc w:val="center"/>
-      </w:pPr>
-      <w:r>
-        <w:drawing>
-          <wp:inline xmlns:a="http://schemas.openxmlformats.org/drawingml/2006/main" xmlns:pic="http://schemas.openxmlformats.org/drawingml/2006/picture">
-            <wp:extent cx="5989320" cy="4159249"/>
-            <wp:docPr id="30" name="Picture 30"/>
-            <wp:cNvGraphicFramePr>
-              <a:graphicFrameLocks noChangeAspect="1"/>
-            </wp:cNvGraphicFramePr>
-            <a:graphic>
-              <a:graphicData uri="http://schemas.openxmlformats.org/drawingml/2006/picture">
-                <pic:pic>
-                  <pic:nvPicPr>
-                    <pic:cNvPr id="0" name="29-settings.png"/>
-                    <pic:cNvPicPr/>
-                  </pic:nvPicPr>
-                  <pic:blipFill>
-                    <a:blip r:embed="rId39"/>
-                    <a:stretch>
-                      <a:fillRect/>
-                    </a:stretch>
-                  </pic:blipFill>
-                  <pic:spPr>
-                    <a:xfrm>
-                      <a:off x="0" y="0"/>
-                      <a:ext cx="5989320" cy="4159249"/>
-                    </a:xfrm>
-                    <a:prstGeom prst="rect"/>
-                  </pic:spPr>
-                </pic:pic>
-              </a:graphicData>
-            </a:graphic>
-          </wp:inline>
-        </w:drawing>
-      </w:r>
-    </w:p>
-    <w:p>
-      <w:pPr>
-        <w:pStyle w:val="Caption"/>
-        <w:jc w:val="center"/>
-      </w:pPr>
-      <w:r>
-        <w:t>29-settings.png</w:t>
-      </w:r>
-    </w:p>
-    <w:p>
-      <w:r>
-        <w:br w:type="page"/>
-      </w:r>
-    </w:p>
-    <w:p>
-      <w:pPr>
-        <w:pStyle w:val="Title"/>
-      </w:pPr>
-      <w:r>
-        <w:t>Diagnostics</w:t>
-      </w:r>
-    </w:p>
-    <w:p>
-      <w:pPr>
-        <w:spacing w:after="160"/>
-      </w:pPr>
-      <w:r>
-        <w:t>SQLite integrity must be ok, foreign-key violations zero, and schema version 5 before operation or restore.</w:t>
-      </w:r>
-    </w:p>
-    <w:p>
-      <w:pPr>
-        <w:jc w:val="center"/>
-      </w:pPr>
-      <w:r>
-        <w:drawing>
-          <wp:inline xmlns:a="http://schemas.openxmlformats.org/drawingml/2006/main" xmlns:pic="http://schemas.openxmlformats.org/drawingml/2006/picture">
-            <wp:extent cx="5989320" cy="4159249"/>
-            <wp:docPr id="31" name="Picture 31"/>
-            <wp:cNvGraphicFramePr>
-              <a:graphicFrameLocks noChangeAspect="1"/>
-            </wp:cNvGraphicFramePr>
-            <a:graphic>
-              <a:graphicData uri="http://schemas.openxmlformats.org/drawingml/2006/picture">
-                <pic:pic>
-                  <pic:nvPicPr>
-                    <pic:cNvPr id="0" name="30-diagnostics.png"/>
-                    <pic:cNvPicPr/>
-                  </pic:nvPicPr>
-                  <pic:blipFill>
-                    <a:blip r:embed="rId40"/>
-                    <a:stretch>
-                      <a:fillRect/>
-                    </a:stretch>
-                  </pic:blipFill>
-                  <pic:spPr>
-                    <a:xfrm>
-                      <a:off x="0" y="0"/>
-                      <a:ext cx="5989320" cy="4159249"/>
-                    </a:xfrm>
-                    <a:prstGeom prst="rect"/>
-                  </pic:spPr>
-                </pic:pic>
-              </a:graphicData>
-            </a:graphic>
-          </wp:inline>
-        </w:drawing>
-      </w:r>
-    </w:p>
-    <w:p>
-      <w:pPr>
-        <w:pStyle w:val="Caption"/>
-        <w:jc w:val="center"/>
-      </w:pPr>
-      <w:r>
-        <w:t>30-diagnostics.png</w:t>
-      </w:r>
-    </w:p>
-    <w:p>
-      <w:r>
-        <w:br w:type="page"/>
-      </w:r>
-    </w:p>
-    <w:p>
-      <w:pPr>
-        <w:pStyle w:val="Heading1"/>
-      </w:pPr>
-      <w:r>
-        <w:t>End-of-batch checklist</w:t>
-      </w:r>
-    </w:p>
-    <w:p>
-      <w:r>
-        <w:t>☐ Unfinished count is zero and Review shows Review complete.</w:t>
-      </w:r>
-    </w:p>
-    <w:p>
-      <w:r>
-        <w:t>☐ Every title matches the photograph.</w:t>
-      </w:r>
-    </w:p>
-    <w:p>
-      <w:r>
-        <w:t>☐ Quick-edited Price and Discount values are intentional.</w:t>
-      </w:r>
-    </w:p>
-    <w:p>
-      <w:r>
-        <w:t>☐ Shelf and Rare / Physical Review flags match the physical tape.</w:t>
-      </w:r>
-    </w:p>
-    <w:p>
-      <w:r>
-        <w:t>☐ Completed corrections retain the original Item ID.</w:t>
-      </w:r>
-    </w:p>
-    <w:p>
-      <w:r>
-        <w:t>☐ Publish simulation shows expected Ready and Blocked counts.</w:t>
-      </w:r>
-    </w:p>
-    <w:p>
-      <w:r>
-        <w:t>☐ The browser-downloaded CSV contains the same Item IDs and saved titles.</w:t>
-      </w:r>
-    </w:p>
-    <w:p>
-      <w:r>
-        <w:t>☐ During the first real pilot, keep Shopify in simulation until physical CSV reconciliation passes.</w:t>
-      </w:r>
-    </w:p>
-    <w:p>
-      <w:r>
-        <w:t>☐ For the live-draft acceptance test, create exactly one draft and inspect it in Shopify.</w:t>
-      </w:r>
-    </w:p>
-    <w:p>
-      <w:pPr>
-        <w:pStyle w:val="Heading2"/>
-      </w:pPr>
-      <w:r>
-        <w:t>1.0 acceptance gate</w:t>
-      </w:r>
-    </w:p>
-    <w:p>
-      <w:r>
-        <w:t>Version 1.0.0 is forbidden until the real 20-tape Pixel pilot, live AI, one live Shopify draft, physical CSV verification, restart durability, independent guide walkthrough, browser verification, and blocker review all pass.</w:t>
-      </w:r>
-    </w:p>
+    <w:tbl>
+      <w:tblPr>
+        <w:tblW w:type="auto" w:w="0"/>
+        <w:tblLayout w:type="autofit"/>
+        <w:tblLook w:firstColumn="1" w:firstRow="1" w:lastColumn="0" w:lastRow="0" w:noHBand="0" w:noVBand="1" w:val="04A0"/>
+      </w:tblPr>
+      <w:tblGrid>
+        <w:gridCol w:w="10224"/>
+      </w:tblGrid>
+      <w:tr>
+        <w:tc>
+          <w:tcPr>
+            <w:tcW w:type="dxa" w:w="10224"/>
+            <w:shd w:fill="FCE8EC"/>
+            <w:vAlign w:val="center"/>
+          </w:tcPr>
+          <w:p>
+            <w:pPr>
+              <w:spacing w:after="60"/>
+            </w:pPr>
+            <w:r>
+              <w:rPr>
+                <w:b/>
+                <w:color w:val="A9364D"/>
+              </w:rPr>
+              <w:t>Operator rule</w:t>
+            </w:r>
+          </w:p>
+          <w:p>
+            <w:pPr>
+              <w:spacing w:after="0"/>
+            </w:pPr>
+            <w:r>
+              <w:t>When SnapIMS reports an error, do not delete the database or originals. Preserve the traceback, copy Diagnostics, and recover from the last checkpoint or backup.</w:t>
+            </w:r>
+          </w:p>
+        </w:tc>
+      </w:tr>
+    </w:tbl>
+    <w:p/>
     <w:sectPr>
-      <w:headerReference w:type="default" r:id="rId9"/>
-      <w:footerReference w:type="default" r:id="rId10"/>
+      <w:footerReference w:type="default" r:id="rId9"/>
       <w:pgSz w:w="12240" w:h="15840"/>
-      <w:pgMar w:top="792" w:right="1008" w:bottom="792" w:left="1008" w:header="720" w:footer="720" w:gutter="0"/>
+      <w:pgMar w:top="864" w:right="1008" w:bottom="792" w:left="1008" w:header="288" w:footer="360" w:gutter="0"/>
       <w:cols w:space="720"/>
       <w:docGrid w:linePitch="360"/>
     </w:sectPr>
@@ -2716,35 +3047,18 @@
     </w:pPr>
     <w:r>
       <w:rPr>
+        <w:color w:val="6A6475"/>
         <w:sz w:val="16"/>
       </w:rPr>
-      <w:t xml:space="preserve">SnapIMS 0.5.1 Operator Guide  |  Page </w:t>
-    </w:r>
-    <w:r>
+      <w:t xml:space="preserve">SnapIMS Operator Guide v0.6.0  |  </w:t>
       <w:fldChar w:fldCharType="begin"/>
-      <w:instrText xml:space="preserve">PAGE</w:instrText>
+      <w:instrText xml:space="preserve"> PAGE </w:instrText>
       <w:fldChar w:fldCharType="separate"/>
+      <w:t>1</w:t>
       <w:fldChar w:fldCharType="end"/>
     </w:r>
   </w:p>
 </w:ftr>
-</file>
-
-<file path=word/header1.xml><?xml version="1.0" encoding="utf-8"?>
-<w:hdr xmlns:m="http://schemas.openxmlformats.org/officeDocument/2006/math" xmlns:mc="http://schemas.openxmlformats.org/markup-compatibility/2006" xmlns:mo="http://schemas.microsoft.com/office/mac/office/2008/main" xmlns:mv="urn:schemas-microsoft-com:mac:vml" xmlns:o="urn:schemas-microsoft-com:office:office" xmlns:r="http://schemas.openxmlformats.org/officeDocument/2006/relationships" xmlns:v="urn:schemas-microsoft-com:vml" xmlns:w10="urn:schemas-microsoft-com:office:word" xmlns:w14="http://schemas.microsoft.com/office/word/2010/wordml" xmlns:w="http://schemas.openxmlformats.org/wordprocessingml/2006/main" xmlns:wne="http://schemas.microsoft.com/office/word/2006/wordml" xmlns:wp14="http://schemas.microsoft.com/office/word/2010/wordprocessingDrawing" xmlns:wp="http://schemas.openxmlformats.org/drawingml/2006/wordprocessingDrawing" xmlns:wpc="http://schemas.microsoft.com/office/word/2010/wordprocessingCanvas" xmlns:wpg="http://schemas.microsoft.com/office/word/2010/wordprocessingGroup" xmlns:wpi="http://schemas.microsoft.com/office/word/2010/wordprocessingInk" xmlns:wps="http://schemas.microsoft.com/office/word/2010/wordprocessingShape" mc:Ignorable="w14 wp14">
-  <w:p>
-    <w:pPr>
-      <w:pStyle w:val="Header"/>
-      <w:jc w:val="right"/>
-    </w:pPr>
-    <w:r>
-      <w:rPr>
-        <w:sz w:val="16"/>
-      </w:rPr>
-      <w:t>SnapIMS 0.5.1 Operator Guide</w:t>
-    </w:r>
-  </w:p>
-</w:hdr>
 </file>
 
 <file path=word/numbering.xml><?xml version="1.0" encoding="utf-8"?>
@@ -3110,9 +3424,13 @@
     <w:name w:val="Normal"/>
     <w:qFormat/>
     <w:rsid w:val="00FC693F"/>
+    <w:pPr>
+      <w:spacing w:after="120" w:line="259" w:lineRule="auto"/>
+    </w:pPr>
     <w:rPr>
       <w:rFonts w:ascii="Liberation Sans" w:hAnsi="Liberation Sans"/>
-      <w:sz w:val="21"/>
+      <w:color w:val="211C2D"/>
+      <w:sz w:val="20"/>
     </w:rPr>
   </w:style>
   <w:style w:type="paragraph" w:styleId="Header">
@@ -3177,8 +3495,8 @@
       <w:rFonts w:asciiTheme="majorHAnsi" w:eastAsiaTheme="majorEastAsia" w:hAnsiTheme="majorHAnsi" w:cstheme="majorBidi" w:ascii="Liberation Sans" w:hAnsi="Liberation Sans"/>
       <w:b/>
       <w:bCs/>
-      <w:color w:val="1B774F"/>
-      <w:sz w:val="28"/>
+      <w:color w:val="8055D9"/>
+      <w:sz w:val="40"/>
       <w:szCs w:val="28"/>
     </w:rPr>
   </w:style>
@@ -3201,8 +3519,8 @@
       <w:rFonts w:asciiTheme="majorHAnsi" w:eastAsiaTheme="majorEastAsia" w:hAnsiTheme="majorHAnsi" w:cstheme="majorBidi" w:ascii="Liberation Sans" w:hAnsi="Liberation Sans"/>
       <w:b/>
       <w:bCs/>
-      <w:color w:val="1B774F"/>
-      <w:sz w:val="26"/>
+      <w:color w:val="211C2D"/>
+      <w:sz w:val="28"/>
       <w:szCs w:val="26"/>
     </w:rPr>
   </w:style>
@@ -3222,10 +3540,11 @@
       <w:outlineLvl w:val="2"/>
     </w:pPr>
     <w:rPr>
-      <w:rFonts w:asciiTheme="majorHAnsi" w:eastAsiaTheme="majorEastAsia" w:hAnsiTheme="majorHAnsi" w:cstheme="majorBidi"/>
+      <w:rFonts w:asciiTheme="majorHAnsi" w:eastAsiaTheme="majorEastAsia" w:hAnsiTheme="majorHAnsi" w:cstheme="majorBidi" w:ascii="Liberation Sans" w:hAnsi="Liberation Sans"/>
       <w:b/>
       <w:bCs/>
-      <w:color w:val="4F81BD" w:themeColor="accent1"/>
+      <w:color w:val="8055D9"/>
+      <w:sz w:val="22"/>
     </w:rPr>
   </w:style>
   <w:style w:type="paragraph" w:styleId="Heading4">
@@ -3465,10 +3784,10 @@
     <w:rPr>
       <w:rFonts w:asciiTheme="majorHAnsi" w:eastAsiaTheme="majorEastAsia" w:hAnsiTheme="majorHAnsi" w:cstheme="majorBidi" w:ascii="Liberation Sans" w:hAnsi="Liberation Sans"/>
       <w:b/>
-      <w:color w:val="1B774F"/>
+      <w:color w:val="211C2D"/>
       <w:spacing w:val="5"/>
       <w:kern w:val="28"/>
-      <w:sz w:val="48"/>
+      <w:sz w:val="60"/>
       <w:szCs w:val="52"/>
     </w:rPr>
   </w:style>
@@ -3501,12 +3820,13 @@
       </w:numPr>
     </w:pPr>
     <w:rPr>
-      <w:rFonts w:asciiTheme="majorHAnsi" w:eastAsiaTheme="majorEastAsia" w:hAnsiTheme="majorHAnsi" w:cstheme="majorBidi"/>
+      <w:rFonts w:asciiTheme="majorHAnsi" w:eastAsiaTheme="majorEastAsia" w:hAnsiTheme="majorHAnsi" w:cstheme="majorBidi" w:ascii="Liberation Sans" w:hAnsi="Liberation Sans"/>
+      <w:b w:val="0"/>
       <w:i/>
       <w:iCs/>
-      <w:color w:val="4F81BD" w:themeColor="accent1"/>
+      <w:color w:val="6A6475"/>
       <w:spacing w:val="15"/>
-      <w:sz w:val="24"/>
+      <w:sz w:val="26"/>
       <w:szCs w:val="24"/>
     </w:rPr>
   </w:style>
@@ -3906,11 +4226,10 @@
       <w:spacing w:line="240" w:lineRule="auto"/>
     </w:pPr>
     <w:rPr>
-      <w:rFonts w:ascii="Liberation Sans" w:hAnsi="Liberation Sans"/>
       <w:b/>
       <w:bCs/>
       <w:color w:val="4F81BD" w:themeColor="accent1"/>
-      <w:sz w:val="16"/>
+      <w:sz w:val="18"/>
       <w:szCs w:val="18"/>
     </w:rPr>
   </w:style>

</xml_diff>

<commit_message>
feat: deliver SnapIMS v0.6.0 operator workstation
</commit_message>
<xml_diff>
--- a/SnapIMS_Operator_Guide.docx
+++ b/SnapIMS_Operator_Guide.docx
@@ -4,118 +4,123 @@
   <w:body>
     <w:p>
       <w:pPr>
-        <w:spacing w:before="1200"/>
+        <w:pStyle w:val="Title"/>
+        <w:jc w:val="center"/>
+      </w:pPr>
+      <w:r>
+        <w:t>SnapIMS Operator Guide</w:t>
+      </w:r>
+    </w:p>
+    <w:p>
+      <w:pPr>
         <w:jc w:val="center"/>
       </w:pPr>
       <w:r>
         <w:rPr>
-          <w:rFonts w:ascii="Liberation Sans" w:hAnsi="Liberation Sans"/>
           <w:b/>
-          <w:color w:val="8055D9"/>
-          <w:sz w:val="84"/>
         </w:rPr>
-        <w:t>SnapIMS</w:t>
+        <w:t>Version 0.6.0</w:t>
+        <w:br/>
+        <w:t>Photo-first inventory workstation</w:t>
       </w:r>
     </w:p>
     <w:p>
       <w:pPr>
-        <w:pStyle w:val="Title"/>
-        <w:jc w:val="center"/>
+        <w:pStyle w:val="Heading1"/>
       </w:pPr>
       <w:r>
-        <w:t>Operator Guide</w:t>
+        <w:rPr>
+          <w:b w:val="0"/>
+        </w:rPr>
+        <w:t>Purpose</w:t>
+      </w:r>
+    </w:p>
+    <w:p>
+      <w:r>
+        <w:rPr>
+          <w:b w:val="0"/>
+        </w:rPr>
+        <w:t>SnapIMS converts chronologically captured photos and QR events into durable inventory records, AI suggestions, a fast Review queue, a bulk Batch Editor, CSV round trips, and publish-ready outputs.</w:t>
       </w:r>
     </w:p>
     <w:p>
       <w:pPr>
-        <w:pStyle w:val="Subtitle"/>
-        <w:jc w:val="center"/>
+        <w:pStyle w:val="Heading1"/>
       </w:pPr>
       <w:r>
-        <w:t>Version 0.6.0 - Operator Workstation Release</w:t>
+        <w:rPr>
+          <w:b w:val="0"/>
+        </w:rPr>
+        <w:t>Routine operator path</w:t>
       </w:r>
     </w:p>
-    <w:p/>
-    <w:tbl>
-      <w:tblPr>
-        <w:tblW w:type="auto" w:w="0"/>
-        <w:tblLayout w:type="autofit"/>
-        <w:tblLook w:firstColumn="1" w:firstRow="1" w:lastColumn="0" w:lastRow="0" w:noHBand="0" w:noVBand="1" w:val="04A0"/>
-      </w:tblPr>
-      <w:tblGrid>
-        <w:gridCol w:w="10224"/>
-      </w:tblGrid>
-      <w:tr>
-        <w:tc>
-          <w:tcPr>
-            <w:tcW w:type="dxa" w:w="10224"/>
-            <w:shd w:fill="F4F0FA"/>
-            <w:vAlign w:val="center"/>
-          </w:tcPr>
-          <w:p>
-            <w:pPr>
-              <w:spacing w:after="60"/>
-            </w:pPr>
-            <w:r>
-              <w:rPr>
-                <w:b/>
-                <w:color w:val="8055D9"/>
-              </w:rPr>
-              <w:t>Purpose</w:t>
-            </w:r>
-          </w:p>
-          <w:p>
-            <w:pPr>
-              <w:spacing w:after="0"/>
-            </w:pPr>
-            <w:r>
-              <w:t>SnapIMS converts an ordered photo stream into durable inventory records, routes uncertainty to an operator, supports fast individual or batch-wide correction, and prepares validated CSV or Shopify output.</w:t>
-            </w:r>
-          </w:p>
-        </w:tc>
-      </w:tr>
-    </w:tbl>
-    <w:p/>
-    <w:tbl>
-      <w:tblPr>
-        <w:tblW w:type="auto" w:w="0"/>
-        <w:tblLayout w:type="autofit"/>
-        <w:tblLook w:firstColumn="1" w:firstRow="1" w:lastColumn="0" w:lastRow="0" w:noHBand="0" w:noVBand="1" w:val="04A0"/>
-      </w:tblPr>
-      <w:tblGrid>
-        <w:gridCol w:w="10224"/>
-      </w:tblGrid>
-      <w:tr>
-        <w:tc>
-          <w:tcPr>
-            <w:tcW w:type="dxa" w:w="10224"/>
-            <w:shd w:fill="FFF4DB"/>
-            <w:vAlign w:val="center"/>
-          </w:tcPr>
-          <w:p>
-            <w:pPr>
-              <w:spacing w:after="60"/>
-            </w:pPr>
-            <w:r>
-              <w:rPr>
-                <w:b/>
-                <w:color w:val="8A5A00"/>
-              </w:rPr>
-              <w:t>Release status</w:t>
-            </w:r>
-          </w:p>
-          <w:p>
-            <w:pPr>
-              <w:spacing w:after="0"/>
-            </w:pPr>
-            <w:r>
-              <w:t>Version 0.6.0 is a production-pilot candidate, not 1.0. Live AI, a real Pixel batch, one live Shopify draft, physical CSV reconciliation, and final independent acceptance remain required.</w:t>
-            </w:r>
-          </w:p>
-        </w:tc>
-      </w:tr>
-    </w:tbl>
-    <w:p/>
+    <w:p>
+      <w:r>
+        <w:rPr>
+          <w:b w:val="0"/>
+        </w:rPr>
+        <w:t>1. Photograph tapes with SnapIMS QR cards.</w:t>
+      </w:r>
+    </w:p>
+    <w:p>
+      <w:r>
+        <w:rPr>
+          <w:b w:val="0"/>
+        </w:rPr>
+        <w:t>2. Import and preview the folder.</w:t>
+      </w:r>
+    </w:p>
+    <w:p>
+      <w:r>
+        <w:rPr>
+          <w:b w:val="0"/>
+        </w:rPr>
+        <w:t>3. Run recognition or continue manually.</w:t>
+      </w:r>
+    </w:p>
+    <w:p>
+      <w:r>
+        <w:rPr>
+          <w:b w:val="0"/>
+        </w:rPr>
+        <w:t>4. Review one tape at a time or use Batch Editor.</w:t>
+      </w:r>
+    </w:p>
+    <w:p>
+      <w:r>
+        <w:rPr>
+          <w:b w:val="0"/>
+        </w:rPr>
+        <w:t>5. Validate, simulate, export CSV, or publish.</w:t>
+      </w:r>
+    </w:p>
+    <w:p>
+      <w:pPr>
+        <w:pStyle w:val="Heading1"/>
+      </w:pPr>
+      <w:r>
+        <w:rPr>
+          <w:b w:val="0"/>
+        </w:rPr>
+        <w:t>Launch command</w:t>
+      </w:r>
+    </w:p>
+    <w:p>
+      <w:r>
+        <w:rPr>
+          <w:b/>
+        </w:rPr>
+        <w:t>cd ~/Projects/SnapIMS-v0.6.0 &amp;&amp; source .venv/bin/activate &amp;&amp; snapims --data-dir ~/SnapIMS-data serve</w:t>
+      </w:r>
+    </w:p>
+    <w:p>
+      <w:r>
+        <w:rPr>
+          <w:b w:val="0"/>
+        </w:rPr>
+        <w:t>Open http://127.0.0.1:8767. Leave the terminal running. Ctrl+C stops SnapIMS.</w:t>
+      </w:r>
+    </w:p>
     <w:p>
       <w:r>
         <w:br w:type="page"/>
@@ -123,144 +128,53 @@
     </w:p>
     <w:p>
       <w:pPr>
-        <w:pStyle w:val="Heading1"/>
+        <w:jc w:val="center"/>
       </w:pPr>
       <w:r>
-        <w:t>Fast Start</w:t>
-      </w:r>
-    </w:p>
-    <w:p>
-      <w:r>
-        <w:t>Launch SnapIMS from the repository virtual environment:</w:t>
-      </w:r>
-    </w:p>
-    <w:p>
-      <w:pPr/>
-      <w:r>
-        <w:rPr>
-          <w:rFonts w:ascii="Liberation Mono" w:hAnsi="Liberation Mono"/>
-          <w:sz w:val="18"/>
-        </w:rPr>
-        <w:t>cd ~/Projects/SnapIMS-v0.6.0</w:t>
-        <w:br/>
-        <w:t>source .venv/bin/activate</w:t>
-        <w:br/>
-        <w:t>snapims --data-dir ~/SnapIMS-data serve</w:t>
-      </w:r>
-    </w:p>
-    <w:tbl>
-      <w:tblPr>
-        <w:tblW w:type="auto" w:w="0"/>
-        <w:tblLayout w:type="autofit"/>
-        <w:tblLook w:firstColumn="1" w:firstRow="1" w:lastColumn="0" w:lastRow="0" w:noHBand="0" w:noVBand="1" w:val="04A0"/>
-      </w:tblPr>
-      <w:tblGrid>
-        <w:gridCol w:w="10224"/>
-      </w:tblGrid>
-      <w:tr>
-        <w:tc>
-          <w:tcPr>
-            <w:tcW w:type="dxa" w:w="10224"/>
-            <w:shd w:fill="EAF6F0"/>
-            <w:vAlign w:val="center"/>
-          </w:tcPr>
-          <w:p>
-            <w:pPr>
-              <w:spacing w:after="60"/>
-            </w:pPr>
-            <w:r>
-              <w:rPr>
-                <w:b/>
-                <w:color w:val="2F7D5A"/>
-              </w:rPr>
-              <w:t>Browser address</w:t>
-            </w:r>
-          </w:p>
-          <w:p>
-            <w:pPr>
-              <w:spacing w:after="0"/>
-            </w:pPr>
-            <w:r>
-              <w:t>Open http://127.0.0.1:8767. Keep the terminal running. Ctrl+C stops the server.</w:t>
-            </w:r>
-          </w:p>
-        </w:tc>
-      </w:tr>
-    </w:tbl>
-    <w:p/>
-    <w:p>
-      <w:pPr>
-        <w:ind w:left="173" w:hanging="173"/>
-      </w:pPr>
-      <w:r>
-        <w:rPr>
-          <w:b/>
-          <w:color w:val="8055D9"/>
-        </w:rPr>
-        <w:t xml:space="preserve">1. </w:t>
-      </w:r>
-      <w:r>
-        <w:t>Import a folder containing the chronological camera photo stream.</w:t>
+        <w:drawing>
+          <wp:inline xmlns:a="http://schemas.openxmlformats.org/drawingml/2006/main" xmlns:pic="http://schemas.openxmlformats.org/drawingml/2006/picture">
+            <wp:extent cx="5577840" cy="3919982"/>
+            <wp:docPr id="1" name="Picture 1"/>
+            <wp:cNvGraphicFramePr>
+              <a:graphicFrameLocks noChangeAspect="1"/>
+            </wp:cNvGraphicFramePr>
+            <a:graphic>
+              <a:graphicData uri="http://schemas.openxmlformats.org/drawingml/2006/picture">
+                <pic:pic>
+                  <pic:nvPicPr>
+                    <pic:cNvPr id="0" name="01-home-dashboard.png"/>
+                    <pic:cNvPicPr/>
+                  </pic:nvPicPr>
+                  <pic:blipFill>
+                    <a:blip r:embed="rId9"/>
+                    <a:stretch>
+                      <a:fillRect/>
+                    </a:stretch>
+                  </pic:blipFill>
+                  <pic:spPr>
+                    <a:xfrm>
+                      <a:off x="0" y="0"/>
+                      <a:ext cx="5577840" cy="3919982"/>
+                    </a:xfrm>
+                    <a:prstGeom prst="rect"/>
+                  </pic:spPr>
+                </pic:pic>
+              </a:graphicData>
+            </a:graphic>
+          </wp:inline>
+        </w:drawing>
       </w:r>
     </w:p>
     <w:p>
       <w:pPr>
-        <w:ind w:left="173" w:hanging="173"/>
+        <w:jc w:val="center"/>
       </w:pPr>
       <w:r>
         <w:rPr>
-          <w:b/>
-          <w:color w:val="8055D9"/>
+          <w:i/>
+          <w:sz w:val="16"/>
         </w:rPr>
-        <w:t xml:space="preserve">2. </w:t>
-      </w:r>
-      <w:r>
-        <w:t>Run recognition, or continue with manual review when a provider is unavailable.</w:t>
-      </w:r>
-    </w:p>
-    <w:p>
-      <w:pPr>
-        <w:ind w:left="173" w:hanging="173"/>
-      </w:pPr>
-      <w:r>
-        <w:rPr>
-          <w:b/>
-          <w:color w:val="8055D9"/>
-        </w:rPr>
-        <w:t xml:space="preserve">3. </w:t>
-      </w:r>
-      <w:r>
-        <w:t>Resolve items one at a time in Review or work across the batch in Batch Editor.</w:t>
-      </w:r>
-    </w:p>
-    <w:p>
-      <w:pPr>
-        <w:ind w:left="173" w:hanging="173"/>
-      </w:pPr>
-      <w:r>
-        <w:rPr>
-          <w:b/>
-          <w:color w:val="8055D9"/>
-        </w:rPr>
-        <w:t xml:space="preserve">4. </w:t>
-      </w:r>
-      <w:r>
-        <w:t>Use CSV download/upload only when an external spreadsheet is useful.</w:t>
-      </w:r>
-    </w:p>
-    <w:p>
-      <w:pPr>
-        <w:ind w:left="173" w:hanging="173"/>
-      </w:pPr>
-      <w:r>
-        <w:rPr>
-          <w:b/>
-          <w:color w:val="8055D9"/>
-        </w:rPr>
-        <w:t xml:space="preserve">5. </w:t>
-      </w:r>
-      <w:r>
-        <w:t>Validate the current working batch in Publish, then simulate or create the requested output.</w:t>
+        <w:t>Home dashboard and batch health summary</w:t>
       </w:r>
     </w:p>
     <w:p>
@@ -273,84 +187,42 @@
         <w:pStyle w:val="Heading1"/>
       </w:pPr>
       <w:r>
-        <w:t>1. Home Dashboard</w:t>
+        <w:rPr>
+          <w:b w:val="0"/>
+        </w:rPr>
+        <w:t>1. Import a photo batch</w:t>
       </w:r>
     </w:p>
     <w:p>
       <w:r>
-        <w:t>Home shows the active batches, recognition state, unfinished work, and the next logical actions.</w:t>
+        <w:rPr>
+          <w:b w:val="0"/>
+        </w:rPr>
+        <w:t>Open Import. Normal operation uses Browse Folder, the configured incoming folder, or a recent folder. Manual path entry is under Advanced.</w:t>
+      </w:r>
+    </w:p>
+    <w:p>
+      <w:r>
+        <w:rPr>
+          <w:b w:val="0"/>
+        </w:rPr>
+        <w:t>A blank Use This Folder action is disabled. Invalid or unreadable folders return a normal SnapIMS message instead of raw API JSON.</w:t>
+      </w:r>
+    </w:p>
+    <w:p>
+      <w:r>
+        <w:br w:type="page"/>
       </w:r>
     </w:p>
     <w:p>
       <w:pPr>
-        <w:ind w:left="173" w:hanging="173"/>
-      </w:pPr>
-      <w:r>
-        <w:rPr>
-          <w:b/>
-          <w:color w:val="8055D9"/>
-        </w:rPr>
-        <w:t xml:space="preserve">1. </w:t>
-      </w:r>
-      <w:r>
-        <w:t>Choose Import to create a new batch.</w:t>
-      </w:r>
-    </w:p>
-    <w:p>
-      <w:pPr>
-        <w:ind w:left="173" w:hanging="173"/>
-      </w:pPr>
-      <w:r>
-        <w:rPr>
-          <w:b/>
-          <w:color w:val="8055D9"/>
-        </w:rPr>
-        <w:t xml:space="preserve">2. </w:t>
-      </w:r>
-      <w:r>
-        <w:t>Open Review for the one-tape workstation.</w:t>
-      </w:r>
-    </w:p>
-    <w:p>
-      <w:pPr>
-        <w:ind w:left="173" w:hanging="173"/>
-      </w:pPr>
-      <w:r>
-        <w:rPr>
-          <w:b/>
-          <w:color w:val="8055D9"/>
-        </w:rPr>
-        <w:t xml:space="preserve">3. </w:t>
-      </w:r>
-      <w:r>
-        <w:t>Open Batch Editor for bulk changes and low-confidence triage.</w:t>
-      </w:r>
-    </w:p>
-    <w:p>
-      <w:pPr>
-        <w:ind w:left="173" w:hanging="173"/>
-      </w:pPr>
-      <w:r>
-        <w:rPr>
-          <w:b/>
-          <w:color w:val="8055D9"/>
-        </w:rPr>
-        <w:t xml:space="preserve">4. </w:t>
-      </w:r>
-      <w:r>
-        <w:t>Open Publish only after the working batch has no blockers.</w:t>
-      </w:r>
-    </w:p>
-    <w:p>
-      <w:pPr>
-        <w:spacing w:after="80"/>
         <w:jc w:val="center"/>
       </w:pPr>
       <w:r>
         <w:drawing>
           <wp:inline xmlns:a="http://schemas.openxmlformats.org/drawingml/2006/main" xmlns:pic="http://schemas.openxmlformats.org/drawingml/2006/picture">
-            <wp:extent cx="6400800" cy="2449195"/>
-            <wp:docPr id="1" name="Picture 1"/>
+            <wp:extent cx="5577840" cy="3873500"/>
+            <wp:docPr id="2" name="Picture 2"/>
             <wp:cNvGraphicFramePr>
               <a:graphicFrameLocks noChangeAspect="1"/>
             </wp:cNvGraphicFramePr>
@@ -358,7 +230,7 @@
               <a:graphicData uri="http://schemas.openxmlformats.org/drawingml/2006/picture">
                 <pic:pic>
                   <pic:nvPicPr>
-                    <pic:cNvPr id="0" name="01-home-dashboard-part-01.png"/>
+                    <pic:cNvPr id="0" name="02-import-empty-safe.png"/>
                     <pic:cNvPicPr/>
                   </pic:nvPicPr>
                   <pic:blipFill>
@@ -370,7 +242,7 @@
                   <pic:spPr>
                     <a:xfrm>
                       <a:off x="0" y="0"/>
-                      <a:ext cx="6400800" cy="2449195"/>
+                      <a:ext cx="5577840" cy="3873500"/>
                     </a:xfrm>
                     <a:prstGeom prst="rect"/>
                   </pic:spPr>
@@ -383,16 +255,14 @@
     </w:p>
     <w:p>
       <w:pPr>
-        <w:spacing w:after="160"/>
         <w:jc w:val="center"/>
       </w:pPr>
       <w:r>
         <w:rPr>
           <w:i/>
-          <w:color w:val="6A6475"/>
           <w:sz w:val="16"/>
         </w:rPr>
-        <w:t>Home dashboard and batch actions - view 1 of 2</w:t>
+        <w:t>Import safely handles an empty folder selection</w:t>
       </w:r>
     </w:p>
     <w:p>
@@ -402,14 +272,13 @@
     </w:p>
     <w:p>
       <w:pPr>
-        <w:spacing w:after="80"/>
         <w:jc w:val="center"/>
       </w:pPr>
       <w:r>
         <w:drawing>
           <wp:inline xmlns:a="http://schemas.openxmlformats.org/drawingml/2006/main" xmlns:pic="http://schemas.openxmlformats.org/drawingml/2006/picture">
-            <wp:extent cx="6400800" cy="2449195"/>
-            <wp:docPr id="2" name="Picture 2"/>
+            <wp:extent cx="5577840" cy="3873500"/>
+            <wp:docPr id="3" name="Picture 3"/>
             <wp:cNvGraphicFramePr>
               <a:graphicFrameLocks noChangeAspect="1"/>
             </wp:cNvGraphicFramePr>
@@ -417,7 +286,7 @@
               <a:graphicData uri="http://schemas.openxmlformats.org/drawingml/2006/picture">
                 <pic:pic>
                   <pic:nvPicPr>
-                    <pic:cNvPr id="0" name="01-home-dashboard-part-02.png"/>
+                    <pic:cNvPr id="0" name="03-native-folder-selected.png"/>
                     <pic:cNvPicPr/>
                   </pic:nvPicPr>
                   <pic:blipFill>
@@ -429,7 +298,7 @@
                   <pic:spPr>
                     <a:xfrm>
                       <a:off x="0" y="0"/>
-                      <a:ext cx="6400800" cy="2449195"/>
+                      <a:ext cx="5577840" cy="3873500"/>
                     </a:xfrm>
                     <a:prstGeom prst="rect"/>
                   </pic:spPr>
@@ -442,16 +311,142 @@
     </w:p>
     <w:p>
       <w:pPr>
-        <w:spacing w:after="160"/>
         <w:jc w:val="center"/>
       </w:pPr>
       <w:r>
         <w:rPr>
           <w:i/>
-          <w:color w:val="6A6475"/>
           <w:sz w:val="16"/>
         </w:rPr>
-        <w:t>Home dashboard and batch actions - view 2 of 2</w:t>
+        <w:t>A local folder selected through the native folder workflow</w:t>
+      </w:r>
+    </w:p>
+    <w:p>
+      <w:r>
+        <w:rPr>
+          <w:b w:val="0"/>
+        </w:rPr>
+        <w:t>Select Preview before importing. Preview shows photo count, expected item boundaries, QR events, warnings, and duplicate detection. Preview does not create durable inventory identity.</w:t>
+      </w:r>
+    </w:p>
+    <w:p>
+      <w:r>
+        <w:br w:type="page"/>
+      </w:r>
+    </w:p>
+    <w:p>
+      <w:pPr>
+        <w:jc w:val="center"/>
+      </w:pPr>
+      <w:r>
+        <w:drawing>
+          <wp:inline xmlns:a="http://schemas.openxmlformats.org/drawingml/2006/main" xmlns:pic="http://schemas.openxmlformats.org/drawingml/2006/picture">
+            <wp:extent cx="5577840" cy="4508754"/>
+            <wp:docPr id="4" name="Picture 4"/>
+            <wp:cNvGraphicFramePr>
+              <a:graphicFrameLocks noChangeAspect="1"/>
+            </wp:cNvGraphicFramePr>
+            <a:graphic>
+              <a:graphicData uri="http://schemas.openxmlformats.org/drawingml/2006/picture">
+                <pic:pic>
+                  <pic:nvPicPr>
+                    <pic:cNvPr id="0" name="04-import-preview.png"/>
+                    <pic:cNvPicPr/>
+                  </pic:nvPicPr>
+                  <pic:blipFill>
+                    <a:blip r:embed="rId12"/>
+                    <a:stretch>
+                      <a:fillRect/>
+                    </a:stretch>
+                  </pic:blipFill>
+                  <pic:spPr>
+                    <a:xfrm>
+                      <a:off x="0" y="0"/>
+                      <a:ext cx="5577840" cy="4508754"/>
+                    </a:xfrm>
+                    <a:prstGeom prst="rect"/>
+                  </pic:spPr>
+                </pic:pic>
+              </a:graphicData>
+            </a:graphic>
+          </wp:inline>
+        </w:drawing>
+      </w:r>
+    </w:p>
+    <w:p>
+      <w:pPr>
+        <w:jc w:val="center"/>
+      </w:pPr>
+      <w:r>
+        <w:rPr>
+          <w:i/>
+          <w:sz w:val="16"/>
+        </w:rPr>
+        <w:t>Import preview before durable preservation</w:t>
+      </w:r>
+    </w:p>
+    <w:p>
+      <w:r>
+        <w:rPr>
+          <w:b w:val="0"/>
+        </w:rPr>
+        <w:t>Choose Preserve and Import Batch once the preview is correct. SnapIMS prevents duplicate commits and preserves originals before creating working records.</w:t>
+      </w:r>
+    </w:p>
+    <w:p>
+      <w:r>
+        <w:br w:type="page"/>
+      </w:r>
+    </w:p>
+    <w:p>
+      <w:pPr>
+        <w:jc w:val="center"/>
+      </w:pPr>
+      <w:r>
+        <w:drawing>
+          <wp:inline xmlns:a="http://schemas.openxmlformats.org/drawingml/2006/main" xmlns:pic="http://schemas.openxmlformats.org/drawingml/2006/picture">
+            <wp:extent cx="5577840" cy="4690808"/>
+            <wp:docPr id="5" name="Picture 5"/>
+            <wp:cNvGraphicFramePr>
+              <a:graphicFrameLocks noChangeAspect="1"/>
+            </wp:cNvGraphicFramePr>
+            <a:graphic>
+              <a:graphicData uri="http://schemas.openxmlformats.org/drawingml/2006/picture">
+                <pic:pic>
+                  <pic:nvPicPr>
+                    <pic:cNvPr id="0" name="05-import-complete.png"/>
+                    <pic:cNvPicPr/>
+                  </pic:nvPicPr>
+                  <pic:blipFill>
+                    <a:blip r:embed="rId13"/>
+                    <a:stretch>
+                      <a:fillRect/>
+                    </a:stretch>
+                  </pic:blipFill>
+                  <pic:spPr>
+                    <a:xfrm>
+                      <a:off x="0" y="0"/>
+                      <a:ext cx="5577840" cy="4690808"/>
+                    </a:xfrm>
+                    <a:prstGeom prst="rect"/>
+                  </pic:spPr>
+                </pic:pic>
+              </a:graphicData>
+            </a:graphic>
+          </wp:inline>
+        </w:drawing>
+      </w:r>
+    </w:p>
+    <w:p>
+      <w:pPr>
+        <w:jc w:val="center"/>
+      </w:pPr>
+      <w:r>
+        <w:rPr>
+          <w:i/>
+          <w:sz w:val="16"/>
+        </w:rPr>
+        <w:t>Durable batch created after preservation</w:t>
       </w:r>
     </w:p>
     <w:p>
@@ -464,99 +459,42 @@
         <w:pStyle w:val="Heading1"/>
       </w:pPr>
       <w:r>
-        <w:t>2. Import a Photo Folder</w:t>
+        <w:rPr>
+          <w:b w:val="0"/>
+        </w:rPr>
+        <w:t>2. Recognition and failure recovery</w:t>
       </w:r>
     </w:p>
     <w:p>
       <w:r>
-        <w:t>Normal import no longer requires repeatedly typing a Linux path. Browse Folder is the preferred path; configured and recent folders are one-click shortcuts.</w:t>
+        <w:rPr>
+          <w:b w:val="0"/>
+        </w:rPr>
+        <w:t>Run recognition from Review. Provider status is visible. If OpenAI is selected without a key, SnapIMS shows an actionable recovery view instead of silently refreshing.</w:t>
+      </w:r>
+    </w:p>
+    <w:p>
+      <w:r>
+        <w:rPr>
+          <w:b w:val="0"/>
+        </w:rPr>
+        <w:t>Available recovery actions include Retry, Retry Failed Items Only, Retry With Different Provider, Continue With Manual Review, Skip Recognition, Open Diagnostics, and Return to Import.</w:t>
+      </w:r>
+    </w:p>
+    <w:p>
+      <w:r>
+        <w:br w:type="page"/>
       </w:r>
     </w:p>
     <w:p>
       <w:pPr>
-        <w:ind w:left="173" w:hanging="173"/>
-      </w:pPr>
-      <w:r>
-        <w:rPr>
-          <w:b/>
-          <w:color w:val="8055D9"/>
-        </w:rPr>
-        <w:t xml:space="preserve">1. </w:t>
-      </w:r>
-      <w:r>
-        <w:t>Click Browse Folder and select the flat camera-export folder.</w:t>
-      </w:r>
-    </w:p>
-    <w:p>
-      <w:pPr>
-        <w:ind w:left="173" w:hanging="173"/>
-      </w:pPr>
-      <w:r>
-        <w:rPr>
-          <w:b/>
-          <w:color w:val="8055D9"/>
-        </w:rPr>
-        <w:t xml:space="preserve">2. </w:t>
-      </w:r>
-      <w:r>
-        <w:t>If the native chooser is unavailable, open Advanced Manual Path.</w:t>
-      </w:r>
-    </w:p>
-    <w:p>
-      <w:pPr>
-        <w:ind w:left="173" w:hanging="173"/>
-      </w:pPr>
-      <w:r>
-        <w:rPr>
-          <w:b/>
-          <w:color w:val="8055D9"/>
-        </w:rPr>
-        <w:t xml:space="preserve">3. </w:t>
-      </w:r>
-      <w:r>
-        <w:t>Click Preview. Preview does not create durable item identity.</w:t>
-      </w:r>
-    </w:p>
-    <w:p>
-      <w:pPr>
-        <w:ind w:left="173" w:hanging="173"/>
-      </w:pPr>
-      <w:r>
-        <w:rPr>
-          <w:b/>
-          <w:color w:val="8055D9"/>
-        </w:rPr>
-        <w:t xml:space="preserve">4. </w:t>
-      </w:r>
-      <w:r>
-        <w:t>Confirm the image count, QR events, item boundaries, and warnings.</w:t>
-      </w:r>
-    </w:p>
-    <w:p>
-      <w:pPr>
-        <w:ind w:left="173" w:hanging="173"/>
-      </w:pPr>
-      <w:r>
-        <w:rPr>
-          <w:b/>
-          <w:color w:val="8055D9"/>
-        </w:rPr>
-        <w:t xml:space="preserve">5. </w:t>
-      </w:r>
-      <w:r>
-        <w:t>Click Preserve and Import Batch once. Duplicate submission protection prevents accidental double import.</w:t>
-      </w:r>
-    </w:p>
-    <w:p>
-      <w:pPr>
-        <w:spacing w:after="80"/>
         <w:jc w:val="center"/>
       </w:pPr>
       <w:r>
         <w:drawing>
           <wp:inline xmlns:a="http://schemas.openxmlformats.org/drawingml/2006/main" xmlns:pic="http://schemas.openxmlformats.org/drawingml/2006/picture">
-            <wp:extent cx="6400800" cy="2422525"/>
-            <wp:docPr id="3" name="Picture 3"/>
+            <wp:extent cx="5577840" cy="6871589"/>
+            <wp:docPr id="6" name="Picture 6"/>
             <wp:cNvGraphicFramePr>
               <a:graphicFrameLocks noChangeAspect="1"/>
             </wp:cNvGraphicFramePr>
@@ -564,11 +502,11 @@
               <a:graphicData uri="http://schemas.openxmlformats.org/drawingml/2006/picture">
                 <pic:pic>
                   <pic:nvPicPr>
-                    <pic:cNvPr id="0" name="03-native-folder-selected-part-01.png"/>
+                    <pic:cNvPr id="0" name="06-recognition-failure-recovery.png"/>
                     <pic:cNvPicPr/>
                   </pic:nvPicPr>
                   <pic:blipFill>
-                    <a:blip r:embed="rId12"/>
+                    <a:blip r:embed="rId14"/>
                     <a:stretch>
                       <a:fillRect/>
                     </a:stretch>
@@ -576,7 +514,7 @@
                   <pic:spPr>
                     <a:xfrm>
                       <a:off x="0" y="0"/>
-                      <a:ext cx="6400800" cy="2422525"/>
+                      <a:ext cx="5577840" cy="6871589"/>
                     </a:xfrm>
                     <a:prstGeom prst="rect"/>
                   </pic:spPr>
@@ -589,16 +527,22 @@
     </w:p>
     <w:p>
       <w:pPr>
-        <w:spacing w:after="160"/>
         <w:jc w:val="center"/>
       </w:pPr>
       <w:r>
         <w:rPr>
           <w:i/>
-          <w:color w:val="6A6475"/>
           <w:sz w:val="16"/>
         </w:rPr>
-        <w:t>Native folder selection on Import - view 1 of 2</w:t>
+        <w:t>Recognition failure with reason and recovery actions</w:t>
+      </w:r>
+    </w:p>
+    <w:p>
+      <w:r>
+        <w:rPr>
+          <w:b w:val="0"/>
+        </w:rPr>
+        <w:t>Recognition states are durable: READY, IDENTIFYING, PAUSED, COMPLETE, FAILED, and REVIEW COMPLETE. An interrupted job becomes recoverable after restart.</w:t>
       </w:r>
     </w:p>
     <w:p>
@@ -608,14 +552,13 @@
     </w:p>
     <w:p>
       <w:pPr>
-        <w:spacing w:after="80"/>
         <w:jc w:val="center"/>
       </w:pPr>
       <w:r>
         <w:drawing>
           <wp:inline xmlns:a="http://schemas.openxmlformats.org/drawingml/2006/main" xmlns:pic="http://schemas.openxmlformats.org/drawingml/2006/picture">
-            <wp:extent cx="6400800" cy="2422525"/>
-            <wp:docPr id="4" name="Picture 4"/>
+            <wp:extent cx="5577840" cy="5267960"/>
+            <wp:docPr id="7" name="Picture 7"/>
             <wp:cNvGraphicFramePr>
               <a:graphicFrameLocks noChangeAspect="1"/>
             </wp:cNvGraphicFramePr>
@@ -623,11 +566,11 @@
               <a:graphicData uri="http://schemas.openxmlformats.org/drawingml/2006/picture">
                 <pic:pic>
                   <pic:nvPicPr>
-                    <pic:cNvPr id="0" name="03-native-folder-selected-part-02.png"/>
+                    <pic:cNvPr id="0" name="07-recognition-complete.png"/>
                     <pic:cNvPicPr/>
                   </pic:nvPicPr>
                   <pic:blipFill>
-                    <a:blip r:embed="rId13"/>
+                    <a:blip r:embed="rId15"/>
                     <a:stretch>
                       <a:fillRect/>
                     </a:stretch>
@@ -635,7 +578,7 @@
                   <pic:spPr>
                     <a:xfrm>
                       <a:off x="0" y="0"/>
-                      <a:ext cx="6400800" cy="2422525"/>
+                      <a:ext cx="5577840" cy="5267960"/>
                     </a:xfrm>
                     <a:prstGeom prst="rect"/>
                   </pic:spPr>
@@ -648,16 +591,14 @@
     </w:p>
     <w:p>
       <w:pPr>
-        <w:spacing w:after="160"/>
         <w:jc w:val="center"/>
       </w:pPr>
       <w:r>
         <w:rPr>
           <w:i/>
-          <w:color w:val="6A6475"/>
           <w:sz w:val="16"/>
         </w:rPr>
-        <w:t>Native folder selection on Import - view 2 of 2</w:t>
+        <w:t>Completed recognition ready for operator review</w:t>
       </w:r>
     </w:p>
     <w:p>
@@ -670,84 +611,50 @@
         <w:pStyle w:val="Heading1"/>
       </w:pPr>
       <w:r>
-        <w:t>3. Preview and Commit</w:t>
+        <w:rPr>
+          <w:b w:val="0"/>
+        </w:rPr>
+        <w:t>3. Fast Review workstation</w:t>
       </w:r>
     </w:p>
     <w:p>
       <w:r>
-        <w:t>The preview is the last safe checkpoint before SnapIMS preserves originals, creates durable identities, and generates media derivatives.</w:t>
+        <w:rPr>
+          <w:b w:val="0"/>
+        </w:rPr>
+        <w:t>Routine workflow: inspect the photo, confirm the title, optionally type a price or discount, then approve. Edit mode is for exceptions only.</w:t>
+      </w:r>
+    </w:p>
+    <w:p>
+      <w:r>
+        <w:rPr>
+          <w:b w:val="0"/>
+        </w:rPr>
+        <w:t>The Price field opens focused with its current value selected. Type a replacement price and press Enter. SnapIMS saves the working values, approves the tape, opens the next unfinished tape, and focuses the next Price field.</w:t>
+      </w:r>
+    </w:p>
+    <w:p>
+      <w:r>
+        <w:rPr>
+          <w:b w:val="0"/>
+        </w:rPr>
+        <w:t>When the shown AI title is valid, Approve &amp; Next accepts it. A truly blank title opens manual editing with a clear explanation.</w:t>
+      </w:r>
+    </w:p>
+    <w:p>
+      <w:r>
+        <w:br w:type="page"/>
       </w:r>
     </w:p>
     <w:p>
       <w:pPr>
-        <w:ind w:left="173" w:hanging="173"/>
-      </w:pPr>
-      <w:r>
-        <w:rPr>
-          <w:b/>
-          <w:color w:val="8055D9"/>
-        </w:rPr>
-        <w:t xml:space="preserve">1. </w:t>
-      </w:r>
-      <w:r>
-        <w:t>Verify BATCH START and BATCH END were detected.</w:t>
-      </w:r>
-    </w:p>
-    <w:p>
-      <w:pPr>
-        <w:ind w:left="173" w:hanging="173"/>
-      </w:pPr>
-      <w:r>
-        <w:rPr>
-          <w:b/>
-          <w:color w:val="8055D9"/>
-        </w:rPr>
-        <w:t xml:space="preserve">2. </w:t>
-      </w:r>
-      <w:r>
-        <w:t>Verify every ITEM NEXT boundary created one intended tape.</w:t>
-      </w:r>
-    </w:p>
-    <w:p>
-      <w:pPr>
-        <w:ind w:left="173" w:hanging="173"/>
-      </w:pPr>
-      <w:r>
-        <w:rPr>
-          <w:b/>
-          <w:color w:val="8055D9"/>
-        </w:rPr>
-        <w:t xml:space="preserve">3. </w:t>
-      </w:r>
-      <w:r>
-        <w:t>Inspect warning messages before committing.</w:t>
-      </w:r>
-    </w:p>
-    <w:p>
-      <w:pPr>
-        <w:ind w:left="173" w:hanging="173"/>
-      </w:pPr>
-      <w:r>
-        <w:rPr>
-          <w:b/>
-          <w:color w:val="8055D9"/>
-        </w:rPr>
-        <w:t xml:space="preserve">4. </w:t>
-      </w:r>
-      <w:r>
-        <w:t>Commit the batch. SnapIMS preserves originals and generates fast browser and recognition copies.</w:t>
-      </w:r>
-    </w:p>
-    <w:p>
-      <w:pPr>
-        <w:spacing w:after="80"/>
         <w:jc w:val="center"/>
       </w:pPr>
       <w:r>
         <w:drawing>
           <wp:inline xmlns:a="http://schemas.openxmlformats.org/drawingml/2006/main" xmlns:pic="http://schemas.openxmlformats.org/drawingml/2006/picture">
-            <wp:extent cx="6400800" cy="2787015"/>
-            <wp:docPr id="5" name="Picture 5"/>
+            <wp:extent cx="5577840" cy="5267960"/>
+            <wp:docPr id="8" name="Picture 8"/>
             <wp:cNvGraphicFramePr>
               <a:graphicFrameLocks noChangeAspect="1"/>
             </wp:cNvGraphicFramePr>
@@ -755,11 +662,11 @@
               <a:graphicData uri="http://schemas.openxmlformats.org/drawingml/2006/picture">
                 <pic:pic>
                   <pic:nvPicPr>
-                    <pic:cNvPr id="0" name="04-import-preview-part-01.png"/>
+                    <pic:cNvPr id="0" name="08-price-enter-next.png"/>
                     <pic:cNvPicPr/>
                   </pic:nvPicPr>
                   <pic:blipFill>
-                    <a:blip r:embed="rId14"/>
+                    <a:blip r:embed="rId16"/>
                     <a:stretch>
                       <a:fillRect/>
                     </a:stretch>
@@ -767,7 +674,7 @@
                   <pic:spPr>
                     <a:xfrm>
                       <a:off x="0" y="0"/>
-                      <a:ext cx="6400800" cy="2787015"/>
+                      <a:ext cx="5577840" cy="5267960"/>
                     </a:xfrm>
                     <a:prstGeom prst="rect"/>
                   </pic:spPr>
@@ -780,16 +687,22 @@
     </w:p>
     <w:p>
       <w:pPr>
-        <w:spacing w:after="160"/>
         <w:jc w:val="center"/>
       </w:pPr>
       <w:r>
         <w:rPr>
           <w:i/>
-          <w:color w:val="6A6475"/>
           <w:sz w:val="16"/>
         </w:rPr>
-        <w:t>Import preview with QR and item summary - view 1 of 2</w:t>
+        <w:t>Price -&gt; Enter -&gt; next tape keyboard workflow</w:t>
+      </w:r>
+    </w:p>
+    <w:p>
+      <w:r>
+        <w:rPr>
+          <w:b w:val="0"/>
+        </w:rPr>
+        <w:t>Later leaves the tape unfinished. Completed items can be reopened and corrected without changing their immutable Item ID.</w:t>
       </w:r>
     </w:p>
     <w:p>
@@ -799,14 +712,61 @@
     </w:p>
     <w:p>
       <w:pPr>
-        <w:spacing w:after="80"/>
+        <w:pStyle w:val="Heading1"/>
+      </w:pPr>
+      <w:r>
+        <w:rPr>
+          <w:b w:val="0"/>
+        </w:rPr>
+        <w:t>4. Batch Editor</w:t>
+      </w:r>
+    </w:p>
+    <w:p>
+      <w:r>
+        <w:rPr>
+          <w:b w:val="0"/>
+        </w:rPr>
+        <w:t>Batch Editor is the fast bulk-work workstation. Title, price, discount, description, location, flags, confidence, and status remain visible without horizontal scrolling at the standard workstation size.</w:t>
+      </w:r>
+    </w:p>
+    <w:p>
+      <w:r>
+        <w:rPr>
+          <w:b w:val="0"/>
+        </w:rPr>
+        <w:t>Use filters for unresolved, failed, low confidence, missing title, CSV changes, price thresholds, flags, and recent edits. Sort by physical order, confidence, title, price, location, status, or modification time.</w:t>
+      </w:r>
+    </w:p>
+    <w:p>
+      <w:r>
+        <w:rPr>
+          <w:b w:val="0"/>
+        </w:rPr>
+        <w:t>Inline edits save to the same authoritative working batch used by Review and Publish. Dirty, saving, saved, and failed states are visible. Stale revisions are rejected instead of silently overwriting newer work.</w:t>
+      </w:r>
+    </w:p>
+    <w:p>
+      <w:r>
+        <w:rPr>
+          <w:b w:val="0"/>
+        </w:rPr>
+        <w:t>Select rows for bulk price, discount, location, tags, rare/review flags, and approval. Large changes create rollback checkpoints.</w:t>
+      </w:r>
+    </w:p>
+    <w:p>
+      <w:r>
+        <w:br w:type="page"/>
+      </w:r>
+    </w:p>
+    <w:p>
+      <w:pPr>
         <w:jc w:val="center"/>
       </w:pPr>
       <w:r>
         <w:drawing>
           <wp:inline xmlns:a="http://schemas.openxmlformats.org/drawingml/2006/main" xmlns:pic="http://schemas.openxmlformats.org/drawingml/2006/picture">
-            <wp:extent cx="6400800" cy="2787015"/>
-            <wp:docPr id="6" name="Picture 6"/>
+            <wp:extent cx="5577840" cy="8273796"/>
+            <wp:docPr id="9" name="Picture 9"/>
             <wp:cNvGraphicFramePr>
               <a:graphicFrameLocks noChangeAspect="1"/>
             </wp:cNvGraphicFramePr>
@@ -814,11 +774,11 @@
               <a:graphicData uri="http://schemas.openxmlformats.org/drawingml/2006/picture">
                 <pic:pic>
                   <pic:nvPicPr>
-                    <pic:cNvPr id="0" name="04-import-preview-part-02.png"/>
+                    <pic:cNvPr id="0" name="09-batch-editor-bulk-price.png"/>
                     <pic:cNvPicPr/>
                   </pic:nvPicPr>
                   <pic:blipFill>
-                    <a:blip r:embed="rId15"/>
+                    <a:blip r:embed="rId17"/>
                     <a:stretch>
                       <a:fillRect/>
                     </a:stretch>
@@ -826,7 +786,7 @@
                   <pic:spPr>
                     <a:xfrm>
                       <a:off x="0" y="0"/>
-                      <a:ext cx="6400800" cy="2787015"/>
+                      <a:ext cx="5577840" cy="8273796"/>
                     </a:xfrm>
                     <a:prstGeom prst="rect"/>
                   </pic:spPr>
@@ -839,16 +799,78 @@
     </w:p>
     <w:p>
       <w:pPr>
-        <w:spacing w:after="160"/>
         <w:jc w:val="center"/>
       </w:pPr>
       <w:r>
         <w:rPr>
           <w:i/>
-          <w:color w:val="6A6475"/>
           <w:sz w:val="16"/>
         </w:rPr>
-        <w:t>Import preview with QR and item summary - view 2 of 2</w:t>
+        <w:t>Twenty-row bulk price operation in Batch Editor</w:t>
+      </w:r>
+    </w:p>
+    <w:p>
+      <w:r>
+        <w:rPr>
+          <w:b w:val="0"/>
+        </w:rPr>
+        <w:t>Ctrl+Shift+P opens the command palette for common navigation and batch actions.</w:t>
+      </w:r>
+    </w:p>
+    <w:p>
+      <w:r>
+        <w:br w:type="page"/>
+      </w:r>
+    </w:p>
+    <w:p>
+      <w:pPr>
+        <w:jc w:val="center"/>
+      </w:pPr>
+      <w:r>
+        <w:drawing>
+          <wp:inline xmlns:a="http://schemas.openxmlformats.org/drawingml/2006/main" xmlns:pic="http://schemas.openxmlformats.org/drawingml/2006/picture">
+            <wp:extent cx="5577840" cy="8273796"/>
+            <wp:docPr id="10" name="Picture 10"/>
+            <wp:cNvGraphicFramePr>
+              <a:graphicFrameLocks noChangeAspect="1"/>
+            </wp:cNvGraphicFramePr>
+            <a:graphic>
+              <a:graphicData uri="http://schemas.openxmlformats.org/drawingml/2006/picture">
+                <pic:pic>
+                  <pic:nvPicPr>
+                    <pic:cNvPr id="0" name="10-command-palette.png"/>
+                    <pic:cNvPicPr/>
+                  </pic:nvPicPr>
+                  <pic:blipFill>
+                    <a:blip r:embed="rId18"/>
+                    <a:stretch>
+                      <a:fillRect/>
+                    </a:stretch>
+                  </pic:blipFill>
+                  <pic:spPr>
+                    <a:xfrm>
+                      <a:off x="0" y="0"/>
+                      <a:ext cx="5577840" cy="8273796"/>
+                    </a:xfrm>
+                    <a:prstGeom prst="rect"/>
+                  </pic:spPr>
+                </pic:pic>
+              </a:graphicData>
+            </a:graphic>
+          </wp:inline>
+        </w:drawing>
+      </w:r>
+    </w:p>
+    <w:p>
+      <w:pPr>
+        <w:jc w:val="center"/>
+      </w:pPr>
+      <w:r>
+        <w:rPr>
+          <w:i/>
+          <w:sz w:val="16"/>
+        </w:rPr>
+        <w:t>Keyboard command palette</w:t>
       </w:r>
     </w:p>
     <w:p>
@@ -861,99 +883,42 @@
         <w:pStyle w:val="Heading1"/>
       </w:pPr>
       <w:r>
-        <w:t>4. Recognition and Failure Recovery</w:t>
+        <w:rPr>
+          <w:b w:val="0"/>
+        </w:rPr>
+        <w:t>5. CSV round trip and difference preview</w:t>
       </w:r>
     </w:p>
     <w:p>
       <w:r>
-        <w:t>Recognition can use Mock for testing or a configured provider for live work. A provider failure never leaves a dead button or silent refresh.</w:t>
+        <w:rPr>
+          <w:b w:val="0"/>
+        </w:rPr>
+        <w:t>Download CSV from Publish for external editing. Upload the edited CSV back to SnapIMS. The upload is staged and cannot alter the working batch until the difference preview is confirmed.</w:t>
+      </w:r>
+    </w:p>
+    <w:p>
+      <w:r>
+        <w:rPr>
+          <w:b w:val="0"/>
+        </w:rPr>
+        <w:t>The preview summarizes matched, changed, unchanged, missing, unmatched, and invalid rows. Changed fields show current and uploaded values. Blocking errors must be resolved before application.</w:t>
+      </w:r>
+    </w:p>
+    <w:p>
+      <w:r>
+        <w:br w:type="page"/>
       </w:r>
     </w:p>
     <w:p>
       <w:pPr>
-        <w:ind w:left="173" w:hanging="173"/>
-      </w:pPr>
-      <w:r>
-        <w:rPr>
-          <w:b/>
-          <w:color w:val="8055D9"/>
-        </w:rPr>
-        <w:t xml:space="preserve">1. </w:t>
-      </w:r>
-      <w:r>
-        <w:t>Start identification from Review or the batch action.</w:t>
-      </w:r>
-    </w:p>
-    <w:p>
-      <w:pPr>
-        <w:ind w:left="173" w:hanging="173"/>
-      </w:pPr>
-      <w:r>
-        <w:rPr>
-          <w:b/>
-          <w:color w:val="8055D9"/>
-        </w:rPr>
-        <w:t xml:space="preserve">2. </w:t>
-      </w:r>
-      <w:r>
-        <w:t>When recognition fails, open Review Failure.</w:t>
-      </w:r>
-    </w:p>
-    <w:p>
-      <w:pPr>
-        <w:ind w:left="173" w:hanging="173"/>
-      </w:pPr>
-      <w:r>
-        <w:rPr>
-          <w:b/>
-          <w:color w:val="8055D9"/>
-        </w:rPr>
-        <w:t xml:space="preserve">3. </w:t>
-      </w:r>
-      <w:r>
-        <w:t>Read the human-readable reason, provider, timestamp, completed count, and remaining count.</w:t>
-      </w:r>
-    </w:p>
-    <w:p>
-      <w:pPr>
-        <w:ind w:left="173" w:hanging="173"/>
-      </w:pPr>
-      <w:r>
-        <w:rPr>
-          <w:b/>
-          <w:color w:val="8055D9"/>
-        </w:rPr>
-        <w:t xml:space="preserve">4. </w:t>
-      </w:r>
-      <w:r>
-        <w:t>Choose Retry Failed Items, another provider, Manual Review, Skip Recognition, or Diagnostics.</w:t>
-      </w:r>
-    </w:p>
-    <w:p>
-      <w:pPr>
-        <w:ind w:left="173" w:hanging="173"/>
-      </w:pPr>
-      <w:r>
-        <w:rPr>
-          <w:b/>
-          <w:color w:val="8055D9"/>
-        </w:rPr>
-        <w:t xml:space="preserve">5. </w:t>
-      </w:r>
-      <w:r>
-        <w:t>Manual Review leaves items unfinished and editable; it does not falsely mark them recognized.</w:t>
-      </w:r>
-    </w:p>
-    <w:p>
-      <w:pPr>
-        <w:spacing w:after="80"/>
         <w:jc w:val="center"/>
       </w:pPr>
       <w:r>
         <w:drawing>
           <wp:inline xmlns:a="http://schemas.openxmlformats.org/drawingml/2006/main" xmlns:pic="http://schemas.openxmlformats.org/drawingml/2006/picture">
-            <wp:extent cx="6400800" cy="4142740"/>
-            <wp:docPr id="7" name="Picture 7"/>
+            <wp:extent cx="5577840" cy="9327388"/>
+            <wp:docPr id="11" name="Picture 11"/>
             <wp:cNvGraphicFramePr>
               <a:graphicFrameLocks noChangeAspect="1"/>
             </wp:cNvGraphicFramePr>
@@ -961,11 +926,11 @@
               <a:graphicData uri="http://schemas.openxmlformats.org/drawingml/2006/picture">
                 <pic:pic>
                   <pic:nvPicPr>
-                    <pic:cNvPr id="0" name="06-recognition-failure-recovery-part-01.png"/>
+                    <pic:cNvPr id="0" name="11-csv-difference-preview.png"/>
                     <pic:cNvPicPr/>
                   </pic:nvPicPr>
                   <pic:blipFill>
-                    <a:blip r:embed="rId16"/>
+                    <a:blip r:embed="rId19"/>
                     <a:stretch>
                       <a:fillRect/>
                     </a:stretch>
@@ -973,7 +938,7 @@
                   <pic:spPr>
                     <a:xfrm>
                       <a:off x="0" y="0"/>
-                      <a:ext cx="6400800" cy="4142740"/>
+                      <a:ext cx="5577840" cy="9327388"/>
                     </a:xfrm>
                     <a:prstGeom prst="rect"/>
                   </pic:spPr>
@@ -986,16 +951,22 @@
     </w:p>
     <w:p>
       <w:pPr>
-        <w:spacing w:after="160"/>
         <w:jc w:val="center"/>
       </w:pPr>
       <w:r>
         <w:rPr>
           <w:i/>
-          <w:color w:val="6A6475"/>
           <w:sz w:val="16"/>
         </w:rPr>
-        <w:t>Recognition failure recovery workspace - view 1 of 2</w:t>
+        <w:t>CSV difference preview before applying values</w:t>
+      </w:r>
+    </w:p>
+    <w:p>
+      <w:r>
+        <w:rPr>
+          <w:b w:val="0"/>
+        </w:rPr>
+        <w:t>Applying a CSV creates a durable rollback checkpoint. Immutable Item IDs remain unchanged. Review, Batch Editor, CSV export, and Publish immediately use the applied working values.</w:t>
       </w:r>
     </w:p>
     <w:p>
@@ -1005,14 +976,13 @@
     </w:p>
     <w:p>
       <w:pPr>
-        <w:spacing w:after="80"/>
         <w:jc w:val="center"/>
       </w:pPr>
       <w:r>
         <w:drawing>
           <wp:inline xmlns:a="http://schemas.openxmlformats.org/drawingml/2006/main" xmlns:pic="http://schemas.openxmlformats.org/drawingml/2006/picture">
-            <wp:extent cx="6400800" cy="4142740"/>
-            <wp:docPr id="8" name="Picture 8"/>
+            <wp:extent cx="5577840" cy="5666930"/>
+            <wp:docPr id="12" name="Picture 12"/>
             <wp:cNvGraphicFramePr>
               <a:graphicFrameLocks noChangeAspect="1"/>
             </wp:cNvGraphicFramePr>
@@ -1020,11 +990,11 @@
               <a:graphicData uri="http://schemas.openxmlformats.org/drawingml/2006/picture">
                 <pic:pic>
                   <pic:nvPicPr>
-                    <pic:cNvPr id="0" name="06-recognition-failure-recovery-part-02.png"/>
+                    <pic:cNvPr id="0" name="12-csv-applied.png"/>
                     <pic:cNvPicPr/>
                   </pic:nvPicPr>
                   <pic:blipFill>
-                    <a:blip r:embed="rId17"/>
+                    <a:blip r:embed="rId20"/>
                     <a:stretch>
                       <a:fillRect/>
                     </a:stretch>
@@ -1032,7 +1002,7 @@
                   <pic:spPr>
                     <a:xfrm>
                       <a:off x="0" y="0"/>
-                      <a:ext cx="6400800" cy="4142740"/>
+                      <a:ext cx="5577840" cy="5666930"/>
                     </a:xfrm>
                     <a:prstGeom prst="rect"/>
                   </pic:spPr>
@@ -1045,16 +1015,22 @@
     </w:p>
     <w:p>
       <w:pPr>
-        <w:spacing w:after="160"/>
         <w:jc w:val="center"/>
       </w:pPr>
       <w:r>
         <w:rPr>
           <w:i/>
-          <w:color w:val="6A6475"/>
           <w:sz w:val="16"/>
         </w:rPr>
-        <w:t>Recognition failure recovery workspace - view 2 of 2</w:t>
+        <w:t>CSV values applied to the authoritative working batch</w:t>
+      </w:r>
+    </w:p>
+    <w:p>
+      <w:r>
+        <w:rPr>
+          <w:b w:val="0"/>
+        </w:rPr>
+        <w:t>Mark Uploaded Batch as Externally Reviewed is available only after validation succeeds and the operator explicitly accepts responsibility. Unresolved rows remain unfinished.</w:t>
       </w:r>
     </w:p>
     <w:p>
@@ -1067,114 +1043,42 @@
         <w:pStyle w:val="Heading1"/>
       </w:pPr>
       <w:r>
-        <w:t>5. Fast Individual Review</w:t>
+        <w:rPr>
+          <w:b w:val="0"/>
+        </w:rPr>
+        <w:t>6. Publish and export</w:t>
       </w:r>
     </w:p>
     <w:p>
       <w:r>
-        <w:t>Review is optimized for the routine loop: look, confirm, optionally type a price, press Enter, and continue.</w:t>
+        <w:rPr>
+          <w:b w:val="0"/>
+        </w:rPr>
+        <w:t>Publish validates the current authoritative working batch regardless of whether values came from AI, Review, Batch Editor, or CSV. Blockers link back to the item that needs correction.</w:t>
+      </w:r>
+    </w:p>
+    <w:p>
+      <w:r>
+        <w:rPr>
+          <w:b w:val="0"/>
+        </w:rPr>
+        <w:t>Use Shopify Simulation before a live publish. Download the current CSV at any time. Live Shopify publishing remains subject to correct credentials, explicit confirmation, and production acceptance testing.</w:t>
+      </w:r>
+    </w:p>
+    <w:p>
+      <w:r>
+        <w:br w:type="page"/>
       </w:r>
     </w:p>
     <w:p>
       <w:pPr>
-        <w:ind w:left="173" w:hanging="173"/>
-      </w:pPr>
-      <w:r>
-        <w:rPr>
-          <w:b/>
-          <w:color w:val="8055D9"/>
-        </w:rPr>
-        <w:t xml:space="preserve">1. </w:t>
-      </w:r>
-      <w:r>
-        <w:t>Confirm the displayed title. SnapIMS uses manual, saved, CSV, then AI values in that order.</w:t>
-      </w:r>
-    </w:p>
-    <w:p>
-      <w:pPr>
-        <w:ind w:left="173" w:hanging="173"/>
-      </w:pPr>
-      <w:r>
-        <w:rPr>
-          <w:b/>
-          <w:color w:val="8055D9"/>
-        </w:rPr>
-        <w:t xml:space="preserve">2. </w:t>
-      </w:r>
-      <w:r>
-        <w:t>The Price field is focused and selected when an unfinished tape opens.</w:t>
-      </w:r>
-    </w:p>
-    <w:p>
-      <w:pPr>
-        <w:ind w:left="173" w:hanging="173"/>
-      </w:pPr>
-      <w:r>
-        <w:rPr>
-          <w:b/>
-          <w:color w:val="8055D9"/>
-        </w:rPr>
-        <w:t xml:space="preserve">3. </w:t>
-      </w:r>
-      <w:r>
-        <w:t>Type a replacement price or leave the current value unchanged.</w:t>
-      </w:r>
-    </w:p>
-    <w:p>
-      <w:pPr>
-        <w:ind w:left="173" w:hanging="173"/>
-      </w:pPr>
-      <w:r>
-        <w:rPr>
-          <w:b/>
-          <w:color w:val="8055D9"/>
-        </w:rPr>
-        <w:t xml:space="preserve">4. </w:t>
-      </w:r>
-      <w:r>
-        <w:t>Press Enter to run Approve &amp; Next. The next unfinished tape opens with Price selected again.</w:t>
-      </w:r>
-    </w:p>
-    <w:p>
-      <w:pPr>
-        <w:ind w:left="173" w:hanging="173"/>
-      </w:pPr>
-      <w:r>
-        <w:rPr>
-          <w:b/>
-          <w:color w:val="8055D9"/>
-        </w:rPr>
-        <w:t xml:space="preserve">5. </w:t>
-      </w:r>
-      <w:r>
-        <w:t>Use Later to postpone the item without marking it complete.</w:t>
-      </w:r>
-    </w:p>
-    <w:p>
-      <w:pPr>
-        <w:ind w:left="173" w:hanging="173"/>
-      </w:pPr>
-      <w:r>
-        <w:rPr>
-          <w:b/>
-          <w:color w:val="8055D9"/>
-        </w:rPr>
-        <w:t xml:space="preserve">6. </w:t>
-      </w:r>
-      <w:r>
-        <w:t>Use full Edit only for deeper corrections or a genuinely missing title.</w:t>
-      </w:r>
-    </w:p>
-    <w:p>
-      <w:pPr>
-        <w:spacing w:after="80"/>
         <w:jc w:val="center"/>
       </w:pPr>
       <w:r>
         <w:drawing>
           <wp:inline xmlns:a="http://schemas.openxmlformats.org/drawingml/2006/main" xmlns:pic="http://schemas.openxmlformats.org/drawingml/2006/picture">
-            <wp:extent cx="6400800" cy="3222625"/>
-            <wp:docPr id="9" name="Picture 9"/>
+            <wp:extent cx="5577840" cy="11546904"/>
+            <wp:docPr id="13" name="Picture 13"/>
             <wp:cNvGraphicFramePr>
               <a:graphicFrameLocks noChangeAspect="1"/>
             </wp:cNvGraphicFramePr>
@@ -1182,11 +1086,11 @@
               <a:graphicData uri="http://schemas.openxmlformats.org/drawingml/2006/picture">
                 <pic:pic>
                   <pic:nvPicPr>
-                    <pic:cNvPr id="0" name="08-price-enter-next-part-01.png"/>
+                    <pic:cNvPr id="0" name="13-publish-simulation.png"/>
                     <pic:cNvPicPr/>
                   </pic:nvPicPr>
                   <pic:blipFill>
-                    <a:blip r:embed="rId18"/>
+                    <a:blip r:embed="rId21"/>
                     <a:stretch>
                       <a:fillRect/>
                     </a:stretch>
@@ -1194,7 +1098,7 @@
                   <pic:spPr>
                     <a:xfrm>
                       <a:off x="0" y="0"/>
-                      <a:ext cx="6400800" cy="3222625"/>
+                      <a:ext cx="5577840" cy="11546904"/>
                     </a:xfrm>
                     <a:prstGeom prst="rect"/>
                   </pic:spPr>
@@ -1207,16 +1111,14 @@
     </w:p>
     <w:p>
       <w:pPr>
-        <w:spacing w:after="160"/>
         <w:jc w:val="center"/>
       </w:pPr>
       <w:r>
         <w:rPr>
           <w:i/>
-          <w:color w:val="6A6475"/>
           <w:sz w:val="16"/>
         </w:rPr>
-        <w:t>Price -&gt; Enter -&gt; next Price workflow - view 1 of 2</w:t>
+        <w:t>Publish simulation using current working values</w:t>
       </w:r>
     </w:p>
     <w:p>
@@ -1226,14 +1128,37 @@
     </w:p>
     <w:p>
       <w:pPr>
-        <w:spacing w:after="80"/>
+        <w:pStyle w:val="Heading1"/>
+      </w:pPr>
+      <w:r>
+        <w:rPr>
+          <w:b w:val="0"/>
+        </w:rPr>
+        <w:t>7. Restart and recovery</w:t>
+      </w:r>
+    </w:p>
+    <w:p>
+      <w:r>
+        <w:rPr>
+          <w:b w:val="0"/>
+        </w:rPr>
+        <w:t>SnapIMS restores durable batch state, review cursor, recognition state, applied CSV values, Batch Editor values, and checkpoints after restart. A dead recognition worker is not left displayed as active forever.</w:t>
+      </w:r>
+    </w:p>
+    <w:p>
+      <w:r>
+        <w:br w:type="page"/>
+      </w:r>
+    </w:p>
+    <w:p>
+      <w:pPr>
         <w:jc w:val="center"/>
       </w:pPr>
       <w:r>
         <w:drawing>
           <wp:inline xmlns:a="http://schemas.openxmlformats.org/drawingml/2006/main" xmlns:pic="http://schemas.openxmlformats.org/drawingml/2006/picture">
-            <wp:extent cx="6400800" cy="3222625"/>
-            <wp:docPr id="10" name="Picture 10"/>
+            <wp:extent cx="5577840" cy="8940038"/>
+            <wp:docPr id="14" name="Picture 14"/>
             <wp:cNvGraphicFramePr>
               <a:graphicFrameLocks noChangeAspect="1"/>
             </wp:cNvGraphicFramePr>
@@ -1241,11 +1166,11 @@
               <a:graphicData uri="http://schemas.openxmlformats.org/drawingml/2006/picture">
                 <pic:pic>
                   <pic:nvPicPr>
-                    <pic:cNvPr id="0" name="08-price-enter-next-part-02.png"/>
+                    <pic:cNvPr id="0" name="14-restart-durable.png"/>
                     <pic:cNvPicPr/>
                   </pic:nvPicPr>
                   <pic:blipFill>
-                    <a:blip r:embed="rId19"/>
+                    <a:blip r:embed="rId22"/>
                     <a:stretch>
                       <a:fillRect/>
                     </a:stretch>
@@ -1253,7 +1178,7 @@
                   <pic:spPr>
                     <a:xfrm>
                       <a:off x="0" y="0"/>
-                      <a:ext cx="6400800" cy="3222625"/>
+                      <a:ext cx="5577840" cy="8940038"/>
                     </a:xfrm>
                     <a:prstGeom prst="rect"/>
                   </pic:spPr>
@@ -1266,16 +1191,22 @@
     </w:p>
     <w:p>
       <w:pPr>
-        <w:spacing w:after="160"/>
         <w:jc w:val="center"/>
       </w:pPr>
       <w:r>
         <w:rPr>
           <w:i/>
-          <w:color w:val="6A6475"/>
           <w:sz w:val="16"/>
         </w:rPr>
-        <w:t>Price -&gt; Enter -&gt; next Price workflow - view 2 of 2</w:t>
+        <w:t>Working values preserved across restart</w:t>
+      </w:r>
+    </w:p>
+    <w:p>
+      <w:r>
+        <w:rPr>
+          <w:b w:val="0"/>
+        </w:rPr>
+        <w:t>Use a checkpoint restore after a mistaken CSV import or large bulk operation. Restore is transactional and records the rollback in item history.</w:t>
       </w:r>
     </w:p>
     <w:p>
@@ -1288,99 +1219,42 @@
         <w:pStyle w:val="Heading1"/>
       </w:pPr>
       <w:r>
-        <w:t>6. Batch Editor</w:t>
+        <w:rPr>
+          <w:b w:val="0"/>
+        </w:rPr>
+        <w:t>8. Diagnostics</w:t>
       </w:r>
     </w:p>
     <w:p>
       <w:r>
-        <w:t>Batch Editor is the bulk operator workstation. It edits the same authoritative working records used by Review and Publish.</w:t>
+        <w:rPr>
+          <w:b w:val="0"/>
+        </w:rPr>
+        <w:t>Diagnostics shows application version, database path, schema version, integrity state, provider configuration without secrets, recent recognition jobs, media derivative totals, and recent CSV validation failures.</w:t>
+      </w:r>
+    </w:p>
+    <w:p>
+      <w:r>
+        <w:rPr>
+          <w:b w:val="0"/>
+        </w:rPr>
+        <w:t>Copy Diagnostic Summary provides a safe block for technical support. Never paste API keys into reports or screenshots.</w:t>
+      </w:r>
+    </w:p>
+    <w:p>
+      <w:r>
+        <w:br w:type="page"/>
       </w:r>
     </w:p>
     <w:p>
       <w:pPr>
-        <w:ind w:left="173" w:hanging="173"/>
-      </w:pPr>
-      <w:r>
-        <w:rPr>
-          <w:b/>
-          <w:color w:val="8055D9"/>
-        </w:rPr>
-        <w:t xml:space="preserve">1. </w:t>
-      </w:r>
-      <w:r>
-        <w:t>Use search, status filters, confidence threshold, confidence buckets, and sorting to expose exceptions.</w:t>
-      </w:r>
-    </w:p>
-    <w:p>
-      <w:pPr>
-        <w:ind w:left="173" w:hanging="173"/>
-      </w:pPr>
-      <w:r>
-        <w:rPr>
-          <w:b/>
-          <w:color w:val="8055D9"/>
-        </w:rPr>
-        <w:t xml:space="preserve">2. </w:t>
-      </w:r>
-      <w:r>
-        <w:t>Edit Title, Price, Discount, Description, Location, flags, and other working fields directly.</w:t>
-      </w:r>
-    </w:p>
-    <w:p>
-      <w:pPr>
-        <w:ind w:left="173" w:hanging="173"/>
-      </w:pPr>
-      <w:r>
-        <w:rPr>
-          <w:b/>
-          <w:color w:val="8055D9"/>
-        </w:rPr>
-        <w:t xml:space="preserve">3. </w:t>
-      </w:r>
-      <w:r>
-        <w:t>Watch the save indicator. Failed edits remain visible instead of disappearing.</w:t>
-      </w:r>
-    </w:p>
-    <w:p>
-      <w:pPr>
-        <w:ind w:left="173" w:hanging="173"/>
-      </w:pPr>
-      <w:r>
-        <w:rPr>
-          <w:b/>
-          <w:color w:val="8055D9"/>
-        </w:rPr>
-        <w:t xml:space="preserve">4. </w:t>
-      </w:r>
-      <w:r>
-        <w:t>Use Ctrl+S to save pending work, Ctrl+F to focus search, Ctrl+A to select visible rows, and Ctrl+Z/Ctrl+Y to undo or redo local edits.</w:t>
-      </w:r>
-    </w:p>
-    <w:p>
-      <w:pPr>
-        <w:ind w:left="173" w:hanging="173"/>
-      </w:pPr>
-      <w:r>
-        <w:rPr>
-          <w:b/>
-          <w:color w:val="8055D9"/>
-        </w:rPr>
-        <w:t xml:space="preserve">5. </w:t>
-      </w:r>
-      <w:r>
-        <w:t>Click a thumbnail for the fast media viewer or confidence for stored recognition evidence.</w:t>
-      </w:r>
-    </w:p>
-    <w:p>
-      <w:pPr>
-        <w:spacing w:after="80"/>
         <w:jc w:val="center"/>
       </w:pPr>
       <w:r>
         <w:drawing>
           <wp:inline xmlns:a="http://schemas.openxmlformats.org/drawingml/2006/main" xmlns:pic="http://schemas.openxmlformats.org/drawingml/2006/picture">
-            <wp:extent cx="6400800" cy="3364865"/>
-            <wp:docPr id="11" name="Picture 11"/>
+            <wp:extent cx="5577840" cy="6983920"/>
+            <wp:docPr id="15" name="Picture 15"/>
             <wp:cNvGraphicFramePr>
               <a:graphicFrameLocks noChangeAspect="1"/>
             </wp:cNvGraphicFramePr>
@@ -1388,11 +1262,11 @@
               <a:graphicData uri="http://schemas.openxmlformats.org/drawingml/2006/picture">
                 <pic:pic>
                   <pic:nvPicPr>
-                    <pic:cNvPr id="0" name="09-batch-editor-bulk-price-part-01.png"/>
+                    <pic:cNvPr id="0" name="15-diagnostics.png"/>
                     <pic:cNvPicPr/>
                   </pic:nvPicPr>
                   <pic:blipFill>
-                    <a:blip r:embed="rId20"/>
+                    <a:blip r:embed="rId23"/>
                     <a:stretch>
                       <a:fillRect/>
                     </a:stretch>
@@ -1400,7 +1274,7 @@
                   <pic:spPr>
                     <a:xfrm>
                       <a:off x="0" y="0"/>
-                      <a:ext cx="6400800" cy="3364865"/>
+                      <a:ext cx="5577840" cy="6983920"/>
                     </a:xfrm>
                     <a:prstGeom prst="rect"/>
                   </pic:spPr>
@@ -1413,134 +1287,14 @@
     </w:p>
     <w:p>
       <w:pPr>
-        <w:spacing w:after="160"/>
         <w:jc w:val="center"/>
       </w:pPr>
       <w:r>
         <w:rPr>
           <w:i/>
-          <w:color w:val="6A6475"/>
           <w:sz w:val="16"/>
         </w:rPr>
-        <w:t>Batch Editor with health, confidence, and bulk controls - view 1 of 3</w:t>
-      </w:r>
-    </w:p>
-    <w:p>
-      <w:r>
-        <w:br w:type="page"/>
-      </w:r>
-    </w:p>
-    <w:p>
-      <w:pPr>
-        <w:spacing w:after="80"/>
-        <w:jc w:val="center"/>
-      </w:pPr>
-      <w:r>
-        <w:drawing>
-          <wp:inline xmlns:a="http://schemas.openxmlformats.org/drawingml/2006/main" xmlns:pic="http://schemas.openxmlformats.org/drawingml/2006/picture">
-            <wp:extent cx="6400800" cy="3564890"/>
-            <wp:docPr id="12" name="Picture 12"/>
-            <wp:cNvGraphicFramePr>
-              <a:graphicFrameLocks noChangeAspect="1"/>
-            </wp:cNvGraphicFramePr>
-            <a:graphic>
-              <a:graphicData uri="http://schemas.openxmlformats.org/drawingml/2006/picture">
-                <pic:pic>
-                  <pic:nvPicPr>
-                    <pic:cNvPr id="0" name="09-batch-editor-bulk-price-part-02.png"/>
-                    <pic:cNvPicPr/>
-                  </pic:nvPicPr>
-                  <pic:blipFill>
-                    <a:blip r:embed="rId21"/>
-                    <a:stretch>
-                      <a:fillRect/>
-                    </a:stretch>
-                  </pic:blipFill>
-                  <pic:spPr>
-                    <a:xfrm>
-                      <a:off x="0" y="0"/>
-                      <a:ext cx="6400800" cy="3564890"/>
-                    </a:xfrm>
-                    <a:prstGeom prst="rect"/>
-                  </pic:spPr>
-                </pic:pic>
-              </a:graphicData>
-            </a:graphic>
-          </wp:inline>
-        </w:drawing>
-      </w:r>
-    </w:p>
-    <w:p>
-      <w:pPr>
-        <w:spacing w:after="160"/>
-        <w:jc w:val="center"/>
-      </w:pPr>
-      <w:r>
-        <w:rPr>
-          <w:i/>
-          <w:color w:val="6A6475"/>
-          <w:sz w:val="16"/>
-        </w:rPr>
-        <w:t>Batch Editor with health, confidence, and bulk controls - view 2 of 3</w:t>
-      </w:r>
-    </w:p>
-    <w:p>
-      <w:r>
-        <w:br w:type="page"/>
-      </w:r>
-    </w:p>
-    <w:p>
-      <w:pPr>
-        <w:spacing w:after="80"/>
-        <w:jc w:val="center"/>
-      </w:pPr>
-      <w:r>
-        <w:drawing>
-          <wp:inline xmlns:a="http://schemas.openxmlformats.org/drawingml/2006/main" xmlns:pic="http://schemas.openxmlformats.org/drawingml/2006/picture">
-            <wp:extent cx="6400800" cy="3364865"/>
-            <wp:docPr id="13" name="Picture 13"/>
-            <wp:cNvGraphicFramePr>
-              <a:graphicFrameLocks noChangeAspect="1"/>
-            </wp:cNvGraphicFramePr>
-            <a:graphic>
-              <a:graphicData uri="http://schemas.openxmlformats.org/drawingml/2006/picture">
-                <pic:pic>
-                  <pic:nvPicPr>
-                    <pic:cNvPr id="0" name="09-batch-editor-bulk-price-part-03.png"/>
-                    <pic:cNvPicPr/>
-                  </pic:nvPicPr>
-                  <pic:blipFill>
-                    <a:blip r:embed="rId22"/>
-                    <a:stretch>
-                      <a:fillRect/>
-                    </a:stretch>
-                  </pic:blipFill>
-                  <pic:spPr>
-                    <a:xfrm>
-                      <a:off x="0" y="0"/>
-                      <a:ext cx="6400800" cy="3364865"/>
-                    </a:xfrm>
-                    <a:prstGeom prst="rect"/>
-                  </pic:spPr>
-                </pic:pic>
-              </a:graphicData>
-            </a:graphic>
-          </wp:inline>
-        </w:drawing>
-      </w:r>
-    </w:p>
-    <w:p>
-      <w:pPr>
-        <w:spacing w:after="160"/>
-        <w:jc w:val="center"/>
-      </w:pPr>
-      <w:r>
-        <w:rPr>
-          <w:i/>
-          <w:color w:val="6A6475"/>
-          <w:sz w:val="16"/>
-        </w:rPr>
-        <w:t>Batch Editor with health, confidence, and bulk controls - view 3 of 3</w:t>
+        <w:t>Diagnostics for schema, providers, jobs, and media use</w:t>
       </w:r>
     </w:p>
     <w:p>
@@ -1553,264 +1307,90 @@
         <w:pStyle w:val="Heading1"/>
       </w:pPr>
       <w:r>
-        <w:t>7. Command Palette and Bulk Operations</w:t>
+        <w:rPr>
+          <w:b w:val="0"/>
+        </w:rPr>
+        <w:t>9. End-of-batch checklist</w:t>
       </w:r>
     </w:p>
     <w:p>
       <w:r>
-        <w:t>The command palette supplements visible controls and keeps frequent actions keyboard-accessible.</w:t>
-      </w:r>
-    </w:p>
-    <w:p>
-      <w:pPr>
-        <w:ind w:left="173" w:hanging="173"/>
-      </w:pPr>
-      <w:r>
         <w:rPr>
-          <w:b/>
-          <w:color w:val="8055D9"/>
+          <w:b w:val="0"/>
         </w:rPr>
-        <w:t xml:space="preserve">1. </w:t>
-      </w:r>
-      <w:r>
-        <w:t>Press Ctrl+Shift+P to open the command palette.</w:t>
-      </w:r>
-    </w:p>
-    <w:p>
-      <w:pPr>
-        <w:ind w:left="173" w:hanging="173"/>
-      </w:pPr>
-      <w:r>
-        <w:rPr>
-          <w:b/>
-          <w:color w:val="8055D9"/>
-        </w:rPr>
-        <w:t xml:space="preserve">2. </w:t>
-      </w:r>
-      <w:r>
-        <w:t>Jump to Review, Batch Editor, Publish, Import, Diagnostics, CSV tools, or batch rollback.</w:t>
-      </w:r>
-    </w:p>
-    <w:p>
-      <w:pPr>
-        <w:ind w:left="173" w:hanging="173"/>
-      </w:pPr>
-      <w:r>
-        <w:rPr>
-          <w:b/>
-          <w:color w:val="8055D9"/>
-        </w:rPr>
-        <w:t xml:space="preserve">3. </w:t>
-      </w:r>
-      <w:r>
-        <w:t>Select rows and preview bulk operations before applying them.</w:t>
-      </w:r>
-    </w:p>
-    <w:p>
-      <w:pPr>
-        <w:ind w:left="173" w:hanging="173"/>
-      </w:pPr>
-      <w:r>
-        <w:rPr>
-          <w:b/>
-          <w:color w:val="8055D9"/>
-        </w:rPr>
-        <w:t xml:space="preserve">4. </w:t>
-      </w:r>
-      <w:r>
-        <w:t>For ToonieTape work, select the intended rows, choose Bulk Price, enter $4.00, inspect the affected count, then Apply.</w:t>
-      </w:r>
-    </w:p>
-    <w:p>
-      <w:pPr>
-        <w:ind w:left="173" w:hanging="173"/>
-      </w:pPr>
-      <w:r>
-        <w:rPr>
-          <w:b/>
-          <w:color w:val="8055D9"/>
-        </w:rPr>
-        <w:t xml:space="preserve">5. </w:t>
-      </w:r>
-      <w:r>
-        <w:t>SnapIMS creates a checkpoint before large destructive operations.</w:t>
-      </w:r>
-    </w:p>
-    <w:p>
-      <w:pPr>
-        <w:spacing w:after="80"/>
-        <w:jc w:val="center"/>
-      </w:pPr>
-      <w:r>
-        <w:drawing>
-          <wp:inline xmlns:a="http://schemas.openxmlformats.org/drawingml/2006/main" xmlns:pic="http://schemas.openxmlformats.org/drawingml/2006/picture">
-            <wp:extent cx="6400800" cy="3364865"/>
-            <wp:docPr id="14" name="Picture 14"/>
-            <wp:cNvGraphicFramePr>
-              <a:graphicFrameLocks noChangeAspect="1"/>
-            </wp:cNvGraphicFramePr>
-            <a:graphic>
-              <a:graphicData uri="http://schemas.openxmlformats.org/drawingml/2006/picture">
-                <pic:pic>
-                  <pic:nvPicPr>
-                    <pic:cNvPr id="0" name="09-batch-editor-bulk-price-part-01.png"/>
-                    <pic:cNvPicPr/>
-                  </pic:nvPicPr>
-                  <pic:blipFill>
-                    <a:blip r:embed="rId20"/>
-                    <a:stretch>
-                      <a:fillRect/>
-                    </a:stretch>
-                  </pic:blipFill>
-                  <pic:spPr>
-                    <a:xfrm>
-                      <a:off x="0" y="0"/>
-                      <a:ext cx="6400800" cy="3364865"/>
-                    </a:xfrm>
-                    <a:prstGeom prst="rect"/>
-                  </pic:spPr>
-                </pic:pic>
-              </a:graphicData>
-            </a:graphic>
-          </wp:inline>
-        </w:drawing>
-      </w:r>
-    </w:p>
-    <w:p>
-      <w:pPr>
-        <w:spacing w:after="160"/>
-        <w:jc w:val="center"/>
-      </w:pPr>
-      <w:r>
-        <w:rPr>
-          <w:i/>
-          <w:color w:val="6A6475"/>
-          <w:sz w:val="16"/>
-        </w:rPr>
-        <w:t>Keyboard command palette - view 1 of 3</w:t>
+        <w:t>☐ Import preview matched the physical batch.</w:t>
       </w:r>
     </w:p>
     <w:p>
       <w:r>
-        <w:br w:type="page"/>
-      </w:r>
-    </w:p>
-    <w:p>
-      <w:pPr>
-        <w:spacing w:after="80"/>
-        <w:jc w:val="center"/>
-      </w:pPr>
-      <w:r>
-        <w:drawing>
-          <wp:inline xmlns:a="http://schemas.openxmlformats.org/drawingml/2006/main" xmlns:pic="http://schemas.openxmlformats.org/drawingml/2006/picture">
-            <wp:extent cx="6400800" cy="3564890"/>
-            <wp:docPr id="15" name="Picture 15"/>
-            <wp:cNvGraphicFramePr>
-              <a:graphicFrameLocks noChangeAspect="1"/>
-            </wp:cNvGraphicFramePr>
-            <a:graphic>
-              <a:graphicData uri="http://schemas.openxmlformats.org/drawingml/2006/picture">
-                <pic:pic>
-                  <pic:nvPicPr>
-                    <pic:cNvPr id="0" name="10-command-palette-part-02.png"/>
-                    <pic:cNvPicPr/>
-                  </pic:nvPicPr>
-                  <pic:blipFill>
-                    <a:blip r:embed="rId23"/>
-                    <a:stretch>
-                      <a:fillRect/>
-                    </a:stretch>
-                  </pic:blipFill>
-                  <pic:spPr>
-                    <a:xfrm>
-                      <a:off x="0" y="0"/>
-                      <a:ext cx="6400800" cy="3564890"/>
-                    </a:xfrm>
-                    <a:prstGeom prst="rect"/>
-                  </pic:spPr>
-                </pic:pic>
-              </a:graphicData>
-            </a:graphic>
-          </wp:inline>
-        </w:drawing>
-      </w:r>
-    </w:p>
-    <w:p>
-      <w:pPr>
-        <w:spacing w:after="160"/>
-        <w:jc w:val="center"/>
-      </w:pPr>
-      <w:r>
         <w:rPr>
-          <w:i/>
-          <w:color w:val="6A6475"/>
-          <w:sz w:val="16"/>
+          <w:b w:val="0"/>
         </w:rPr>
-        <w:t>Keyboard command palette - view 2 of 3</w:t>
+        <w:t>☐ Recognition failures were retried, skipped, or manually reviewed.</w:t>
       </w:r>
     </w:p>
     <w:p>
       <w:r>
-        <w:br w:type="page"/>
-      </w:r>
-    </w:p>
-    <w:p>
-      <w:pPr>
-        <w:spacing w:after="80"/>
-        <w:jc w:val="center"/>
-      </w:pPr>
-      <w:r>
-        <w:drawing>
-          <wp:inline xmlns:a="http://schemas.openxmlformats.org/drawingml/2006/main" xmlns:pic="http://schemas.openxmlformats.org/drawingml/2006/picture">
-            <wp:extent cx="6400800" cy="3364865"/>
-            <wp:docPr id="16" name="Picture 16"/>
-            <wp:cNvGraphicFramePr>
-              <a:graphicFrameLocks noChangeAspect="1"/>
-            </wp:cNvGraphicFramePr>
-            <a:graphic>
-              <a:graphicData uri="http://schemas.openxmlformats.org/drawingml/2006/picture">
-                <pic:pic>
-                  <pic:nvPicPr>
-                    <pic:cNvPr id="0" name="10-command-palette-part-03.png"/>
-                    <pic:cNvPicPr/>
-                  </pic:nvPicPr>
-                  <pic:blipFill>
-                    <a:blip r:embed="rId24"/>
-                    <a:stretch>
-                      <a:fillRect/>
-                    </a:stretch>
-                  </pic:blipFill>
-                  <pic:spPr>
-                    <a:xfrm>
-                      <a:off x="0" y="0"/>
-                      <a:ext cx="6400800" cy="3364865"/>
-                    </a:xfrm>
-                    <a:prstGeom prst="rect"/>
-                  </pic:spPr>
-                </pic:pic>
-              </a:graphicData>
-            </a:graphic>
-          </wp:inline>
-        </w:drawing>
-      </w:r>
-    </w:p>
-    <w:p>
-      <w:pPr>
-        <w:spacing w:after="160"/>
-        <w:jc w:val="center"/>
-      </w:pPr>
-      <w:r>
         <w:rPr>
-          <w:i/>
-          <w:color w:val="6A6475"/>
-          <w:sz w:val="16"/>
+          <w:b w:val="0"/>
         </w:rPr>
-        <w:t>Keyboard command palette - view 3 of 3</w:t>
+        <w:t>☐ No required title is blank.</w:t>
       </w:r>
     </w:p>
     <w:p>
       <w:r>
-        <w:br w:type="page"/>
+        <w:rPr>
+          <w:b w:val="0"/>
+        </w:rPr>
+        <w:t>☐ Prices, discounts, quantities, locations, and SKUs validate.</w:t>
+      </w:r>
+    </w:p>
+    <w:p>
+      <w:r>
+        <w:rPr>
+          <w:b w:val="0"/>
+        </w:rPr>
+        <w:t>☐ Low-confidence and flagged records were reviewed.</w:t>
+      </w:r>
+    </w:p>
+    <w:p>
+      <w:r>
+        <w:rPr>
+          <w:b w:val="0"/>
+        </w:rPr>
+        <w:t>☐ CSV differences, if used, were inspected before application.</w:t>
+      </w:r>
+    </w:p>
+    <w:p>
+      <w:r>
+        <w:rPr>
+          <w:b w:val="0"/>
+        </w:rPr>
+        <w:t>☐ A rollback checkpoint exists before large bulk changes.</w:t>
+      </w:r>
+    </w:p>
+    <w:p>
+      <w:r>
+        <w:rPr>
+          <w:b w:val="0"/>
+        </w:rPr>
+        <w:t>☐ Publish simulation passed.</w:t>
+      </w:r>
+    </w:p>
+    <w:p>
+      <w:r>
+        <w:rPr>
+          <w:b w:val="0"/>
+        </w:rPr>
+        <w:t>☐ Final CSV was downloaded and checked.</w:t>
+      </w:r>
+    </w:p>
+    <w:p>
+      <w:r>
+        <w:rPr>
+          <w:b w:val="0"/>
+        </w:rPr>
+        <w:t>☐ SnapIMS was restarted once and the working batch remained intact.</w:t>
       </w:r>
     </w:p>
     <w:p>
@@ -1818,1247 +1398,28 @@
         <w:pStyle w:val="Heading1"/>
       </w:pPr>
       <w:r>
-        <w:t>8. CSV Round Trip and Difference Preview</w:t>
+        <w:rPr>
+          <w:b w:val="0"/>
+        </w:rPr>
+        <w:t>Production status</w:t>
       </w:r>
     </w:p>
     <w:p>
       <w:r>
-        <w:t>CSV remains available for external spreadsheet work, but uploaded values are never applied blindly.</w:t>
+        <w:rPr>
+          <w:b w:val="0"/>
+        </w:rPr>
+        <w:t>Version 0.6.0 is a minor operator-workstation release. It is not SnapIMS 1.0. The real 20-tape Pixel pilot, live AI test, one live Shopify draft, physical CSV reconciliation, final restart durability test, independent guide walkthrough, and absence of production blockers remain required before 1.0.0.</w:t>
       </w:r>
     </w:p>
-    <w:p>
-      <w:pPr>
-        <w:ind w:left="173" w:hanging="173"/>
-      </w:pPr>
-      <w:r>
-        <w:rPr>
-          <w:b/>
-          <w:color w:val="8055D9"/>
-        </w:rPr>
-        <w:t xml:space="preserve">1. </w:t>
-      </w:r>
-      <w:r>
-        <w:t>Download the current working CSV from Publish or Batch Tools.</w:t>
-      </w:r>
-    </w:p>
-    <w:p>
-      <w:pPr>
-        <w:ind w:left="173" w:hanging="173"/>
-      </w:pPr>
-      <w:r>
-        <w:rPr>
-          <w:b/>
-          <w:color w:val="8055D9"/>
-        </w:rPr>
-        <w:t xml:space="preserve">2. </w:t>
-      </w:r>
-      <w:r>
-        <w:t>Edit the file in Excel or LibreOffice without changing immutable Item IDs.</w:t>
-      </w:r>
-    </w:p>
-    <w:p>
-      <w:pPr>
-        <w:ind w:left="173" w:hanging="173"/>
-      </w:pPr>
-      <w:r>
-        <w:rPr>
-          <w:b/>
-          <w:color w:val="8055D9"/>
-        </w:rPr>
-        <w:t xml:space="preserve">3. </w:t>
-      </w:r>
-      <w:r>
-        <w:t>Upload the edited CSV. SnapIMS stages it instead of modifying the batch immediately.</w:t>
-      </w:r>
-    </w:p>
-    <w:p>
-      <w:pPr>
-        <w:ind w:left="173" w:hanging="173"/>
-      </w:pPr>
-      <w:r>
-        <w:rPr>
-          <w:b/>
-          <w:color w:val="8055D9"/>
-        </w:rPr>
-        <w:t xml:space="preserve">4. </w:t>
-      </w:r>
-      <w:r>
-        <w:t>Use the Difference Preview to inspect matched rows, missing items, validation errors, and field-level changes.</w:t>
-      </w:r>
-    </w:p>
-    <w:p>
-      <w:pPr>
-        <w:ind w:left="173" w:hanging="173"/>
-      </w:pPr>
-      <w:r>
-        <w:rPr>
-          <w:b/>
-          <w:color w:val="8055D9"/>
-        </w:rPr>
-        <w:t xml:space="preserve">5. </w:t>
-      </w:r>
-      <w:r>
-        <w:t>Cancel to prove no values changed, or confirm Apply Valid Changes after all blocking errors are resolved.</w:t>
-      </w:r>
-    </w:p>
-    <w:p>
-      <w:pPr>
-        <w:ind w:left="173" w:hanging="173"/>
-      </w:pPr>
-      <w:r>
-        <w:rPr>
-          <w:b/>
-          <w:color w:val="8055D9"/>
-        </w:rPr>
-        <w:t xml:space="preserve">6. </w:t>
-      </w:r>
-      <w:r>
-        <w:t>Use Undo CSV Import to restore the durable checkpoint.</w:t>
-      </w:r>
-    </w:p>
-    <w:p>
-      <w:pPr>
-        <w:spacing w:after="80"/>
-        <w:jc w:val="center"/>
-      </w:pPr>
-      <w:r>
-        <w:drawing>
-          <wp:inline xmlns:a="http://schemas.openxmlformats.org/drawingml/2006/main" xmlns:pic="http://schemas.openxmlformats.org/drawingml/2006/picture">
-            <wp:extent cx="6400800" cy="3769360"/>
-            <wp:docPr id="17" name="Picture 17"/>
-            <wp:cNvGraphicFramePr>
-              <a:graphicFrameLocks noChangeAspect="1"/>
-            </wp:cNvGraphicFramePr>
-            <a:graphic>
-              <a:graphicData uri="http://schemas.openxmlformats.org/drawingml/2006/picture">
-                <pic:pic>
-                  <pic:nvPicPr>
-                    <pic:cNvPr id="0" name="11-csv-difference-preview-part-01.png"/>
-                    <pic:cNvPicPr/>
-                  </pic:nvPicPr>
-                  <pic:blipFill>
-                    <a:blip r:embed="rId25"/>
-                    <a:stretch>
-                      <a:fillRect/>
-                    </a:stretch>
-                  </pic:blipFill>
-                  <pic:spPr>
-                    <a:xfrm>
-                      <a:off x="0" y="0"/>
-                      <a:ext cx="6400800" cy="3769360"/>
-                    </a:xfrm>
-                    <a:prstGeom prst="rect"/>
-                  </pic:spPr>
-                </pic:pic>
-              </a:graphicData>
-            </a:graphic>
-          </wp:inline>
-        </w:drawing>
-      </w:r>
-    </w:p>
-    <w:p>
-      <w:pPr>
-        <w:spacing w:after="160"/>
-        <w:jc w:val="center"/>
-      </w:pPr>
-      <w:r>
-        <w:rPr>
-          <w:i/>
-          <w:color w:val="6A6475"/>
-          <w:sz w:val="16"/>
-        </w:rPr>
-        <w:t>CSV difference preview before application - view 1 of 3</w:t>
-      </w:r>
-    </w:p>
-    <w:p>
-      <w:r>
-        <w:br w:type="page"/>
-      </w:r>
-    </w:p>
-    <w:p>
-      <w:pPr>
-        <w:spacing w:after="80"/>
-        <w:jc w:val="center"/>
-      </w:pPr>
-      <w:r>
-        <w:drawing>
-          <wp:inline xmlns:a="http://schemas.openxmlformats.org/drawingml/2006/main" xmlns:pic="http://schemas.openxmlformats.org/drawingml/2006/picture">
-            <wp:extent cx="6400800" cy="3969385"/>
-            <wp:docPr id="18" name="Picture 18"/>
-            <wp:cNvGraphicFramePr>
-              <a:graphicFrameLocks noChangeAspect="1"/>
-            </wp:cNvGraphicFramePr>
-            <a:graphic>
-              <a:graphicData uri="http://schemas.openxmlformats.org/drawingml/2006/picture">
-                <pic:pic>
-                  <pic:nvPicPr>
-                    <pic:cNvPr id="0" name="11-csv-difference-preview-part-02.png"/>
-                    <pic:cNvPicPr/>
-                  </pic:nvPicPr>
-                  <pic:blipFill>
-                    <a:blip r:embed="rId26"/>
-                    <a:stretch>
-                      <a:fillRect/>
-                    </a:stretch>
-                  </pic:blipFill>
-                  <pic:spPr>
-                    <a:xfrm>
-                      <a:off x="0" y="0"/>
-                      <a:ext cx="6400800" cy="3969385"/>
-                    </a:xfrm>
-                    <a:prstGeom prst="rect"/>
-                  </pic:spPr>
-                </pic:pic>
-              </a:graphicData>
-            </a:graphic>
-          </wp:inline>
-        </w:drawing>
-      </w:r>
-    </w:p>
-    <w:p>
-      <w:pPr>
-        <w:spacing w:after="160"/>
-        <w:jc w:val="center"/>
-      </w:pPr>
-      <w:r>
-        <w:rPr>
-          <w:i/>
-          <w:color w:val="6A6475"/>
-          <w:sz w:val="16"/>
-        </w:rPr>
-        <w:t>CSV difference preview before application - view 2 of 3</w:t>
-      </w:r>
-    </w:p>
-    <w:p>
-      <w:r>
-        <w:br w:type="page"/>
-      </w:r>
-    </w:p>
-    <w:p>
-      <w:pPr>
-        <w:spacing w:after="80"/>
-        <w:jc w:val="center"/>
-      </w:pPr>
-      <w:r>
-        <w:drawing>
-          <wp:inline xmlns:a="http://schemas.openxmlformats.org/drawingml/2006/main" xmlns:pic="http://schemas.openxmlformats.org/drawingml/2006/picture">
-            <wp:extent cx="6400800" cy="3764915"/>
-            <wp:docPr id="19" name="Picture 19"/>
-            <wp:cNvGraphicFramePr>
-              <a:graphicFrameLocks noChangeAspect="1"/>
-            </wp:cNvGraphicFramePr>
-            <a:graphic>
-              <a:graphicData uri="http://schemas.openxmlformats.org/drawingml/2006/picture">
-                <pic:pic>
-                  <pic:nvPicPr>
-                    <pic:cNvPr id="0" name="11-csv-difference-preview-part-03.png"/>
-                    <pic:cNvPicPr/>
-                  </pic:nvPicPr>
-                  <pic:blipFill>
-                    <a:blip r:embed="rId27"/>
-                    <a:stretch>
-                      <a:fillRect/>
-                    </a:stretch>
-                  </pic:blipFill>
-                  <pic:spPr>
-                    <a:xfrm>
-                      <a:off x="0" y="0"/>
-                      <a:ext cx="6400800" cy="3764915"/>
-                    </a:xfrm>
-                    <a:prstGeom prst="rect"/>
-                  </pic:spPr>
-                </pic:pic>
-              </a:graphicData>
-            </a:graphic>
-          </wp:inline>
-        </w:drawing>
-      </w:r>
-    </w:p>
-    <w:p>
-      <w:pPr>
-        <w:spacing w:after="160"/>
-        <w:jc w:val="center"/>
-      </w:pPr>
-      <w:r>
-        <w:rPr>
-          <w:i/>
-          <w:color w:val="6A6475"/>
-          <w:sz w:val="16"/>
-        </w:rPr>
-        <w:t>CSV difference preview before application - view 3 of 3</w:t>
-      </w:r>
-    </w:p>
-    <w:p>
-      <w:r>
-        <w:br w:type="page"/>
-      </w:r>
-    </w:p>
-    <w:p>
-      <w:pPr>
-        <w:pStyle w:val="Heading1"/>
-      </w:pPr>
-      <w:r>
-        <w:t>9. External Review</w:t>
-      </w:r>
-    </w:p>
-    <w:p>
-      <w:r>
-        <w:t>A valid CSV can satisfy review for large intentionally uniform batches, but only after explicit operator confirmation.</w:t>
-      </w:r>
-    </w:p>
-    <w:p>
-      <w:pPr>
-        <w:ind w:left="173" w:hanging="173"/>
-      </w:pPr>
-      <w:r>
-        <w:rPr>
-          <w:b/>
-          <w:color w:val="8055D9"/>
-        </w:rPr>
-        <w:t xml:space="preserve">1. </w:t>
-      </w:r>
-      <w:r>
-        <w:t>Apply the validated CSV changes first.</w:t>
-      </w:r>
-    </w:p>
-    <w:p>
-      <w:pPr>
-        <w:ind w:left="173" w:hanging="173"/>
-      </w:pPr>
-      <w:r>
-        <w:rPr>
-          <w:b/>
-          <w:color w:val="8055D9"/>
-        </w:rPr>
-        <w:t xml:space="preserve">2. </w:t>
-      </w:r>
-      <w:r>
-        <w:t>Confirm that all required titles exist, SKUs are unique, and no blocking row remains.</w:t>
-      </w:r>
-    </w:p>
-    <w:p>
-      <w:pPr>
-        <w:ind w:left="173" w:hanging="173"/>
-      </w:pPr>
-      <w:r>
-        <w:rPr>
-          <w:b/>
-          <w:color w:val="8055D9"/>
-        </w:rPr>
-        <w:t xml:space="preserve">3. </w:t>
-      </w:r>
-      <w:r>
-        <w:t>Choose Mark Uploaded Batch as Externally Reviewed.</w:t>
-      </w:r>
-    </w:p>
-    <w:p>
-      <w:pPr>
-        <w:ind w:left="173" w:hanging="173"/>
-      </w:pPr>
-      <w:r>
-        <w:rPr>
-          <w:b/>
-          <w:color w:val="8055D9"/>
-        </w:rPr>
-        <w:t xml:space="preserve">4. </w:t>
-      </w:r>
-      <w:r>
-        <w:t>Accept the responsibility statement. SnapIMS records CSV_EXTERNAL_REVIEW as the review source.</w:t>
-      </w:r>
-    </w:p>
-    <w:p>
-      <w:pPr>
-        <w:ind w:left="173" w:hanging="173"/>
-      </w:pPr>
-      <w:r>
-        <w:rPr>
-          <w:b/>
-          <w:color w:val="8055D9"/>
-        </w:rPr>
-        <w:t xml:space="preserve">5. </w:t>
-      </w:r>
-      <w:r>
-        <w:t>Rows with unresolved errors remain unfinished.</w:t>
-      </w:r>
-    </w:p>
-    <w:p>
-      <w:pPr>
-        <w:spacing w:after="80"/>
-        <w:jc w:val="center"/>
-      </w:pPr>
-      <w:r>
-        <w:drawing>
-          <wp:inline xmlns:a="http://schemas.openxmlformats.org/drawingml/2006/main" xmlns:pic="http://schemas.openxmlformats.org/drawingml/2006/picture">
-            <wp:extent cx="6400800" cy="3453765"/>
-            <wp:docPr id="20" name="Picture 20"/>
-            <wp:cNvGraphicFramePr>
-              <a:graphicFrameLocks noChangeAspect="1"/>
-            </wp:cNvGraphicFramePr>
-            <a:graphic>
-              <a:graphicData uri="http://schemas.openxmlformats.org/drawingml/2006/picture">
-                <pic:pic>
-                  <pic:nvPicPr>
-                    <pic:cNvPr id="0" name="12-csv-applied-part-01.png"/>
-                    <pic:cNvPicPr/>
-                  </pic:nvPicPr>
-                  <pic:blipFill>
-                    <a:blip r:embed="rId28"/>
-                    <a:stretch>
-                      <a:fillRect/>
-                    </a:stretch>
-                  </pic:blipFill>
-                  <pic:spPr>
-                    <a:xfrm>
-                      <a:off x="0" y="0"/>
-                      <a:ext cx="6400800" cy="3453765"/>
-                    </a:xfrm>
-                    <a:prstGeom prst="rect"/>
-                  </pic:spPr>
-                </pic:pic>
-              </a:graphicData>
-            </a:graphic>
-          </wp:inline>
-        </w:drawing>
-      </w:r>
-    </w:p>
-    <w:p>
-      <w:pPr>
-        <w:spacing w:after="160"/>
-        <w:jc w:val="center"/>
-      </w:pPr>
-      <w:r>
-        <w:rPr>
-          <w:i/>
-          <w:color w:val="6A6475"/>
-          <w:sz w:val="16"/>
-        </w:rPr>
-        <w:t>Applied CSV values in the authoritative working batch - view 1 of 2</w:t>
-      </w:r>
-    </w:p>
-    <w:p>
-      <w:r>
-        <w:br w:type="page"/>
-      </w:r>
-    </w:p>
-    <w:p>
-      <w:pPr>
-        <w:spacing w:after="80"/>
-        <w:jc w:val="center"/>
-      </w:pPr>
-      <w:r>
-        <w:drawing>
-          <wp:inline xmlns:a="http://schemas.openxmlformats.org/drawingml/2006/main" xmlns:pic="http://schemas.openxmlformats.org/drawingml/2006/picture">
-            <wp:extent cx="6400800" cy="3449320"/>
-            <wp:docPr id="21" name="Picture 21"/>
-            <wp:cNvGraphicFramePr>
-              <a:graphicFrameLocks noChangeAspect="1"/>
-            </wp:cNvGraphicFramePr>
-            <a:graphic>
-              <a:graphicData uri="http://schemas.openxmlformats.org/drawingml/2006/picture">
-                <pic:pic>
-                  <pic:nvPicPr>
-                    <pic:cNvPr id="0" name="12-csv-applied-part-02.png"/>
-                    <pic:cNvPicPr/>
-                  </pic:nvPicPr>
-                  <pic:blipFill>
-                    <a:blip r:embed="rId29"/>
-                    <a:stretch>
-                      <a:fillRect/>
-                    </a:stretch>
-                  </pic:blipFill>
-                  <pic:spPr>
-                    <a:xfrm>
-                      <a:off x="0" y="0"/>
-                      <a:ext cx="6400800" cy="3449320"/>
-                    </a:xfrm>
-                    <a:prstGeom prst="rect"/>
-                  </pic:spPr>
-                </pic:pic>
-              </a:graphicData>
-            </a:graphic>
-          </wp:inline>
-        </w:drawing>
-      </w:r>
-    </w:p>
-    <w:p>
-      <w:pPr>
-        <w:spacing w:after="160"/>
-        <w:jc w:val="center"/>
-      </w:pPr>
-      <w:r>
-        <w:rPr>
-          <w:i/>
-          <w:color w:val="6A6475"/>
-          <w:sz w:val="16"/>
-        </w:rPr>
-        <w:t>Applied CSV values in the authoritative working batch - view 2 of 2</w:t>
-      </w:r>
-    </w:p>
-    <w:p>
-      <w:r>
-        <w:br w:type="page"/>
-      </w:r>
-    </w:p>
-    <w:p>
-      <w:pPr>
-        <w:pStyle w:val="Heading1"/>
-      </w:pPr>
-      <w:r>
-        <w:t>10. Publish</w:t>
-      </w:r>
-    </w:p>
-    <w:p>
-      <w:r>
-        <w:t>Publish validates the authoritative working batch regardless of whether edits came from AI, Review, Batch Editor, or CSV.</w:t>
-      </w:r>
-    </w:p>
-    <w:p>
-      <w:pPr>
-        <w:ind w:left="173" w:hanging="173"/>
-      </w:pPr>
-      <w:r>
-        <w:rPr>
-          <w:b/>
-          <w:color w:val="8055D9"/>
-        </w:rPr>
-        <w:t xml:space="preserve">1. </w:t>
-      </w:r>
-      <w:r>
-        <w:t>Review all publish blockers and follow links back to the affected item or editor row.</w:t>
-      </w:r>
-    </w:p>
-    <w:p>
-      <w:pPr>
-        <w:ind w:left="173" w:hanging="173"/>
-      </w:pPr>
-      <w:r>
-        <w:rPr>
-          <w:b/>
-          <w:color w:val="8055D9"/>
-        </w:rPr>
-        <w:t xml:space="preserve">2. </w:t>
-      </w:r>
-      <w:r>
-        <w:t>Use Shopify simulation before any live publishing test.</w:t>
-      </w:r>
-    </w:p>
-    <w:p>
-      <w:pPr>
-        <w:ind w:left="173" w:hanging="173"/>
-      </w:pPr>
-      <w:r>
-        <w:rPr>
-          <w:b/>
-          <w:color w:val="8055D9"/>
-        </w:rPr>
-        <w:t xml:space="preserve">3. </w:t>
-      </w:r>
-      <w:r>
-        <w:t>Download the final CSV and reconcile it against the physical batch.</w:t>
-      </w:r>
-    </w:p>
-    <w:p>
-      <w:pPr>
-        <w:ind w:left="173" w:hanging="173"/>
-      </w:pPr>
-      <w:r>
-        <w:rPr>
-          <w:b/>
-          <w:color w:val="8055D9"/>
-        </w:rPr>
-        <w:t xml:space="preserve">4. </w:t>
-      </w:r>
-      <w:r>
-        <w:t>Live publishing must create drafts, use idempotency checkpoints, and never duplicate a product on retry.</w:t>
-      </w:r>
-    </w:p>
-    <w:p>
-      <w:pPr>
-        <w:ind w:left="173" w:hanging="173"/>
-      </w:pPr>
-      <w:r>
-        <w:rPr>
-          <w:b/>
-          <w:color w:val="8055D9"/>
-        </w:rPr>
-        <w:t xml:space="preserve">5. </w:t>
-      </w:r>
-      <w:r>
-        <w:t>A live Shopify draft remains a 1.0 acceptance requirement.</w:t>
-      </w:r>
-    </w:p>
-    <w:p>
-      <w:pPr>
-        <w:spacing w:after="80"/>
-        <w:jc w:val="center"/>
-      </w:pPr>
-      <w:r>
-        <w:drawing>
-          <wp:inline xmlns:a="http://schemas.openxmlformats.org/drawingml/2006/main" xmlns:pic="http://schemas.openxmlformats.org/drawingml/2006/picture">
-            <wp:extent cx="6400800" cy="3515995"/>
-            <wp:docPr id="22" name="Picture 22"/>
-            <wp:cNvGraphicFramePr>
-              <a:graphicFrameLocks noChangeAspect="1"/>
-            </wp:cNvGraphicFramePr>
-            <a:graphic>
-              <a:graphicData uri="http://schemas.openxmlformats.org/drawingml/2006/picture">
-                <pic:pic>
-                  <pic:nvPicPr>
-                    <pic:cNvPr id="0" name="13-publish-simulation-part-01.png"/>
-                    <pic:cNvPicPr/>
-                  </pic:nvPicPr>
-                  <pic:blipFill>
-                    <a:blip r:embed="rId30"/>
-                    <a:stretch>
-                      <a:fillRect/>
-                    </a:stretch>
-                  </pic:blipFill>
-                  <pic:spPr>
-                    <a:xfrm>
-                      <a:off x="0" y="0"/>
-                      <a:ext cx="6400800" cy="3515995"/>
-                    </a:xfrm>
-                    <a:prstGeom prst="rect"/>
-                  </pic:spPr>
-                </pic:pic>
-              </a:graphicData>
-            </a:graphic>
-          </wp:inline>
-        </w:drawing>
-      </w:r>
-    </w:p>
-    <w:p>
-      <w:pPr>
-        <w:spacing w:after="160"/>
-        <w:jc w:val="center"/>
-      </w:pPr>
-      <w:r>
-        <w:rPr>
-          <w:i/>
-          <w:color w:val="6A6475"/>
-          <w:sz w:val="16"/>
-        </w:rPr>
-        <w:t>Publish validation and Shopify simulation - view 1 of 4</w:t>
-      </w:r>
-    </w:p>
-    <w:p>
-      <w:r>
-        <w:br w:type="page"/>
-      </w:r>
-    </w:p>
-    <w:p>
-      <w:pPr>
-        <w:spacing w:after="80"/>
-        <w:jc w:val="center"/>
-      </w:pPr>
-      <w:r>
-        <w:drawing>
-          <wp:inline xmlns:a="http://schemas.openxmlformats.org/drawingml/2006/main" xmlns:pic="http://schemas.openxmlformats.org/drawingml/2006/picture">
-            <wp:extent cx="6400800" cy="3716020"/>
-            <wp:docPr id="23" name="Picture 23"/>
-            <wp:cNvGraphicFramePr>
-              <a:graphicFrameLocks noChangeAspect="1"/>
-            </wp:cNvGraphicFramePr>
-            <a:graphic>
-              <a:graphicData uri="http://schemas.openxmlformats.org/drawingml/2006/picture">
-                <pic:pic>
-                  <pic:nvPicPr>
-                    <pic:cNvPr id="0" name="13-publish-simulation-part-02.png"/>
-                    <pic:cNvPicPr/>
-                  </pic:nvPicPr>
-                  <pic:blipFill>
-                    <a:blip r:embed="rId31"/>
-                    <a:stretch>
-                      <a:fillRect/>
-                    </a:stretch>
-                  </pic:blipFill>
-                  <pic:spPr>
-                    <a:xfrm>
-                      <a:off x="0" y="0"/>
-                      <a:ext cx="6400800" cy="3716020"/>
-                    </a:xfrm>
-                    <a:prstGeom prst="rect"/>
-                  </pic:spPr>
-                </pic:pic>
-              </a:graphicData>
-            </a:graphic>
-          </wp:inline>
-        </w:drawing>
-      </w:r>
-    </w:p>
-    <w:p>
-      <w:pPr>
-        <w:spacing w:after="160"/>
-        <w:jc w:val="center"/>
-      </w:pPr>
-      <w:r>
-        <w:rPr>
-          <w:i/>
-          <w:color w:val="6A6475"/>
-          <w:sz w:val="16"/>
-        </w:rPr>
-        <w:t>Publish validation and Shopify simulation - view 2 of 4</w:t>
-      </w:r>
-    </w:p>
-    <w:p>
-      <w:r>
-        <w:br w:type="page"/>
-      </w:r>
-    </w:p>
-    <w:p>
-      <w:pPr>
-        <w:spacing w:after="80"/>
-        <w:jc w:val="center"/>
-      </w:pPr>
-      <w:r>
-        <w:drawing>
-          <wp:inline xmlns:a="http://schemas.openxmlformats.org/drawingml/2006/main" xmlns:pic="http://schemas.openxmlformats.org/drawingml/2006/picture">
-            <wp:extent cx="6400800" cy="3716020"/>
-            <wp:docPr id="24" name="Picture 24"/>
-            <wp:cNvGraphicFramePr>
-              <a:graphicFrameLocks noChangeAspect="1"/>
-            </wp:cNvGraphicFramePr>
-            <a:graphic>
-              <a:graphicData uri="http://schemas.openxmlformats.org/drawingml/2006/picture">
-                <pic:pic>
-                  <pic:nvPicPr>
-                    <pic:cNvPr id="0" name="13-publish-simulation-part-03.png"/>
-                    <pic:cNvPicPr/>
-                  </pic:nvPicPr>
-                  <pic:blipFill>
-                    <a:blip r:embed="rId32"/>
-                    <a:stretch>
-                      <a:fillRect/>
-                    </a:stretch>
-                  </pic:blipFill>
-                  <pic:spPr>
-                    <a:xfrm>
-                      <a:off x="0" y="0"/>
-                      <a:ext cx="6400800" cy="3716020"/>
-                    </a:xfrm>
-                    <a:prstGeom prst="rect"/>
-                  </pic:spPr>
-                </pic:pic>
-              </a:graphicData>
-            </a:graphic>
-          </wp:inline>
-        </w:drawing>
-      </w:r>
-    </w:p>
-    <w:p>
-      <w:pPr>
-        <w:spacing w:after="160"/>
-        <w:jc w:val="center"/>
-      </w:pPr>
-      <w:r>
-        <w:rPr>
-          <w:i/>
-          <w:color w:val="6A6475"/>
-          <w:sz w:val="16"/>
-        </w:rPr>
-        <w:t>Publish validation and Shopify simulation - view 3 of 4</w:t>
-      </w:r>
-    </w:p>
-    <w:p>
-      <w:r>
-        <w:br w:type="page"/>
-      </w:r>
-    </w:p>
-    <w:p>
-      <w:pPr>
-        <w:spacing w:after="80"/>
-        <w:jc w:val="center"/>
-      </w:pPr>
-      <w:r>
-        <w:drawing>
-          <wp:inline xmlns:a="http://schemas.openxmlformats.org/drawingml/2006/main" xmlns:pic="http://schemas.openxmlformats.org/drawingml/2006/picture">
-            <wp:extent cx="6400800" cy="3502660"/>
-            <wp:docPr id="25" name="Picture 25"/>
-            <wp:cNvGraphicFramePr>
-              <a:graphicFrameLocks noChangeAspect="1"/>
-            </wp:cNvGraphicFramePr>
-            <a:graphic>
-              <a:graphicData uri="http://schemas.openxmlformats.org/drawingml/2006/picture">
-                <pic:pic>
-                  <pic:nvPicPr>
-                    <pic:cNvPr id="0" name="13-publish-simulation-part-04.png"/>
-                    <pic:cNvPicPr/>
-                  </pic:nvPicPr>
-                  <pic:blipFill>
-                    <a:blip r:embed="rId33"/>
-                    <a:stretch>
-                      <a:fillRect/>
-                    </a:stretch>
-                  </pic:blipFill>
-                  <pic:spPr>
-                    <a:xfrm>
-                      <a:off x="0" y="0"/>
-                      <a:ext cx="6400800" cy="3502660"/>
-                    </a:xfrm>
-                    <a:prstGeom prst="rect"/>
-                  </pic:spPr>
-                </pic:pic>
-              </a:graphicData>
-            </a:graphic>
-          </wp:inline>
-        </w:drawing>
-      </w:r>
-    </w:p>
-    <w:p>
-      <w:pPr>
-        <w:spacing w:after="160"/>
-        <w:jc w:val="center"/>
-      </w:pPr>
-      <w:r>
-        <w:rPr>
-          <w:i/>
-          <w:color w:val="6A6475"/>
-          <w:sz w:val="16"/>
-        </w:rPr>
-        <w:t>Publish validation and Shopify simulation - view 4 of 4</w:t>
-      </w:r>
-    </w:p>
-    <w:p>
-      <w:r>
-        <w:br w:type="page"/>
-      </w:r>
-    </w:p>
-    <w:p>
-      <w:pPr>
-        <w:pStyle w:val="Heading1"/>
-      </w:pPr>
-      <w:r>
-        <w:t>11. Diagnostics and Recovery</w:t>
-      </w:r>
-    </w:p>
-    <w:p>
-      <w:r>
-        <w:t>Diagnostics remains deliberately compact but exposes the information required to recover failures without leaking secrets.</w:t>
-      </w:r>
-    </w:p>
-    <w:p>
-      <w:pPr>
-        <w:ind w:left="173" w:hanging="173"/>
-      </w:pPr>
-      <w:r>
-        <w:rPr>
-          <w:b/>
-          <w:color w:val="8055D9"/>
-        </w:rPr>
-        <w:t xml:space="preserve">1. </w:t>
-      </w:r>
-      <w:r>
-        <w:t>Confirm application version, database path, schema version, and integrity status.</w:t>
-      </w:r>
-    </w:p>
-    <w:p>
-      <w:pPr>
-        <w:ind w:left="173" w:hanging="173"/>
-      </w:pPr>
-      <w:r>
-        <w:rPr>
-          <w:b/>
-          <w:color w:val="8055D9"/>
-        </w:rPr>
-        <w:t xml:space="preserve">2. </w:t>
-      </w:r>
-      <w:r>
-        <w:t>Check provider configuration state without displaying API keys.</w:t>
-      </w:r>
-    </w:p>
-    <w:p>
-      <w:pPr>
-        <w:ind w:left="173" w:hanging="173"/>
-      </w:pPr>
-      <w:r>
-        <w:rPr>
-          <w:b/>
-          <w:color w:val="8055D9"/>
-        </w:rPr>
-        <w:t xml:space="preserve">3. </w:t>
-      </w:r>
-      <w:r>
-        <w:t>Inspect recognition job states and the latest failure.</w:t>
-      </w:r>
-    </w:p>
-    <w:p>
-      <w:pPr>
-        <w:ind w:left="173" w:hanging="173"/>
-      </w:pPr>
-      <w:r>
-        <w:rPr>
-          <w:b/>
-          <w:color w:val="8055D9"/>
-        </w:rPr>
-        <w:t xml:space="preserve">4. </w:t>
-      </w:r>
-      <w:r>
-        <w:t>Compare original media bytes with preview and recognition upload bytes.</w:t>
-      </w:r>
-    </w:p>
-    <w:p>
-      <w:pPr>
-        <w:ind w:left="173" w:hanging="173"/>
-      </w:pPr>
-      <w:r>
-        <w:rPr>
-          <w:b/>
-          <w:color w:val="8055D9"/>
-        </w:rPr>
-        <w:t xml:space="preserve">5. </w:t>
-      </w:r>
-      <w:r>
-        <w:t>Use Copy Diagnostic Summary when reporting a problem.</w:t>
-      </w:r>
-    </w:p>
-    <w:p>
-      <w:pPr>
-        <w:ind w:left="173" w:hanging="173"/>
-      </w:pPr>
-      <w:r>
-        <w:rPr>
-          <w:b/>
-          <w:color w:val="8055D9"/>
-        </w:rPr>
-        <w:t xml:space="preserve">6. </w:t>
-      </w:r>
-      <w:r>
-        <w:t>Restart SnapIMS and confirm the active batch, filters, queue, current item, and durable edits were restored.</w:t>
-      </w:r>
-    </w:p>
-    <w:p>
-      <w:pPr>
-        <w:spacing w:after="80"/>
-        <w:jc w:val="center"/>
-      </w:pPr>
-      <w:r>
-        <w:drawing>
-          <wp:inline xmlns:a="http://schemas.openxmlformats.org/drawingml/2006/main" xmlns:pic="http://schemas.openxmlformats.org/drawingml/2006/picture">
-            <wp:extent cx="6400800" cy="4209415"/>
-            <wp:docPr id="26" name="Picture 26"/>
-            <wp:cNvGraphicFramePr>
-              <a:graphicFrameLocks noChangeAspect="1"/>
-            </wp:cNvGraphicFramePr>
-            <a:graphic>
-              <a:graphicData uri="http://schemas.openxmlformats.org/drawingml/2006/picture">
-                <pic:pic>
-                  <pic:nvPicPr>
-                    <pic:cNvPr id="0" name="15-diagnostics-part-01.png"/>
-                    <pic:cNvPicPr/>
-                  </pic:nvPicPr>
-                  <pic:blipFill>
-                    <a:blip r:embed="rId34"/>
-                    <a:stretch>
-                      <a:fillRect/>
-                    </a:stretch>
-                  </pic:blipFill>
-                  <pic:spPr>
-                    <a:xfrm>
-                      <a:off x="0" y="0"/>
-                      <a:ext cx="6400800" cy="4209415"/>
-                    </a:xfrm>
-                    <a:prstGeom prst="rect"/>
-                  </pic:spPr>
-                </pic:pic>
-              </a:graphicData>
-            </a:graphic>
-          </wp:inline>
-        </w:drawing>
-      </w:r>
-    </w:p>
-    <w:p>
-      <w:pPr>
-        <w:spacing w:after="160"/>
-        <w:jc w:val="center"/>
-      </w:pPr>
-      <w:r>
-        <w:rPr>
-          <w:i/>
-          <w:color w:val="6A6475"/>
-          <w:sz w:val="16"/>
-        </w:rPr>
-        <w:t>Diagnostics and recovery information - view 1 of 2</w:t>
-      </w:r>
-    </w:p>
-    <w:p>
-      <w:r>
-        <w:br w:type="page"/>
-      </w:r>
-    </w:p>
-    <w:p>
-      <w:pPr>
-        <w:spacing w:after="80"/>
-        <w:jc w:val="center"/>
-      </w:pPr>
-      <w:r>
-        <w:drawing>
-          <wp:inline xmlns:a="http://schemas.openxmlformats.org/drawingml/2006/main" xmlns:pic="http://schemas.openxmlformats.org/drawingml/2006/picture">
-            <wp:extent cx="6400800" cy="4204970"/>
-            <wp:docPr id="27" name="Picture 27"/>
-            <wp:cNvGraphicFramePr>
-              <a:graphicFrameLocks noChangeAspect="1"/>
-            </wp:cNvGraphicFramePr>
-            <a:graphic>
-              <a:graphicData uri="http://schemas.openxmlformats.org/drawingml/2006/picture">
-                <pic:pic>
-                  <pic:nvPicPr>
-                    <pic:cNvPr id="0" name="15-diagnostics-part-02.png"/>
-                    <pic:cNvPicPr/>
-                  </pic:nvPicPr>
-                  <pic:blipFill>
-                    <a:blip r:embed="rId35"/>
-                    <a:stretch>
-                      <a:fillRect/>
-                    </a:stretch>
-                  </pic:blipFill>
-                  <pic:spPr>
-                    <a:xfrm>
-                      <a:off x="0" y="0"/>
-                      <a:ext cx="6400800" cy="4204970"/>
-                    </a:xfrm>
-                    <a:prstGeom prst="rect"/>
-                  </pic:spPr>
-                </pic:pic>
-              </a:graphicData>
-            </a:graphic>
-          </wp:inline>
-        </w:drawing>
-      </w:r>
-    </w:p>
-    <w:p>
-      <w:pPr>
-        <w:spacing w:after="160"/>
-        <w:jc w:val="center"/>
-      </w:pPr>
-      <w:r>
-        <w:rPr>
-          <w:i/>
-          <w:color w:val="6A6475"/>
-          <w:sz w:val="16"/>
-        </w:rPr>
-        <w:t>Diagnostics and recovery information - view 2 of 2</w:t>
-      </w:r>
-    </w:p>
-    <w:p>
-      <w:r>
-        <w:br w:type="page"/>
-      </w:r>
-    </w:p>
-    <w:p>
-      <w:pPr>
-        <w:pStyle w:val="Heading1"/>
-      </w:pPr>
-      <w:r>
-        <w:t>12. End-of-Batch Checklist</w:t>
-      </w:r>
-    </w:p>
-    <w:p>
-      <w:pPr>
-        <w:ind w:left="173" w:hanging="173"/>
-      </w:pPr>
-      <w:r>
-        <w:rPr>
-          <w:b/>
-          <w:color w:val="8055D9"/>
-        </w:rPr>
-        <w:t xml:space="preserve">1. </w:t>
-      </w:r>
-      <w:r>
-        <w:t>Unfinished count is zero, or every remaining item is intentionally postponed and understood.</w:t>
-      </w:r>
-    </w:p>
-    <w:p>
-      <w:pPr>
-        <w:ind w:left="173" w:hanging="173"/>
-      </w:pPr>
-      <w:r>
-        <w:rPr>
-          <w:b/>
-          <w:color w:val="8055D9"/>
-        </w:rPr>
-        <w:t xml:space="preserve">2. </w:t>
-      </w:r>
-      <w:r>
-        <w:t>No failed recognition state lacks an operator decision.</w:t>
-      </w:r>
-    </w:p>
-    <w:p>
-      <w:pPr>
-        <w:ind w:left="173" w:hanging="173"/>
-      </w:pPr>
-      <w:r>
-        <w:rPr>
-          <w:b/>
-          <w:color w:val="8055D9"/>
-        </w:rPr>
-        <w:t xml:space="preserve">3. </w:t>
-      </w:r>
-      <w:r>
-        <w:t>Required titles, prices, quantities, locations, and SKUs pass validation.</w:t>
-      </w:r>
-    </w:p>
-    <w:p>
-      <w:pPr>
-        <w:ind w:left="173" w:hanging="173"/>
-      </w:pPr>
-      <w:r>
-        <w:rPr>
-          <w:b/>
-          <w:color w:val="8055D9"/>
-        </w:rPr>
-        <w:t xml:space="preserve">4. </w:t>
-      </w:r>
-      <w:r>
-        <w:t>Low-confidence and flagged items were reviewed using stored evidence or the original photographs.</w:t>
-      </w:r>
-    </w:p>
-    <w:p>
-      <w:pPr>
-        <w:ind w:left="173" w:hanging="173"/>
-      </w:pPr>
-      <w:r>
-        <w:rPr>
-          <w:b/>
-          <w:color w:val="8055D9"/>
-        </w:rPr>
-        <w:t xml:space="preserve">5. </w:t>
-      </w:r>
-      <w:r>
-        <w:t>Bulk edits and CSV replacements were checkpointed and verified.</w:t>
-      </w:r>
-    </w:p>
-    <w:p>
-      <w:pPr>
-        <w:ind w:left="173" w:hanging="173"/>
-      </w:pPr>
-      <w:r>
-        <w:rPr>
-          <w:b/>
-          <w:color w:val="8055D9"/>
-        </w:rPr>
-        <w:t xml:space="preserve">6. </w:t>
-      </w:r>
-      <w:r>
-        <w:t>Shopify simulation completed without duplicate or idempotency warnings.</w:t>
-      </w:r>
-    </w:p>
-    <w:p>
-      <w:pPr>
-        <w:ind w:left="173" w:hanging="173"/>
-      </w:pPr>
-      <w:r>
-        <w:rPr>
-          <w:b/>
-          <w:color w:val="8055D9"/>
-        </w:rPr>
-        <w:t xml:space="preserve">7. </w:t>
-      </w:r>
-      <w:r>
-        <w:t>The final CSV was downloaded and reconciled against the physical batch.</w:t>
-      </w:r>
-    </w:p>
-    <w:p>
-      <w:pPr>
-        <w:ind w:left="173" w:hanging="173"/>
-      </w:pPr>
-      <w:r>
-        <w:rPr>
-          <w:b/>
-          <w:color w:val="8055D9"/>
-        </w:rPr>
-        <w:t xml:space="preserve">8. </w:t>
-      </w:r>
-      <w:r>
-        <w:t>SnapIMS was restarted once and the current batch state remained correct.</w:t>
-      </w:r>
-    </w:p>
-    <w:p>
-      <w:pPr>
-        <w:ind w:left="173" w:hanging="173"/>
-      </w:pPr>
-      <w:r>
-        <w:rPr>
-          <w:b/>
-          <w:color w:val="8055D9"/>
-        </w:rPr>
-        <w:t xml:space="preserve">9. </w:t>
-      </w:r>
-      <w:r>
-        <w:t>Do not label the project 1.0 until the real 20-tape Pixel pilot, live AI, live Shopify draft, CSV reconciliation, restart durability, final guide walkthrough, and browser verification all pass.</w:t>
-      </w:r>
-    </w:p>
-    <w:tbl>
-      <w:tblPr>
-        <w:tblW w:type="auto" w:w="0"/>
-        <w:tblLayout w:type="autofit"/>
-        <w:tblLook w:firstColumn="1" w:firstRow="1" w:lastColumn="0" w:lastRow="0" w:noHBand="0" w:noVBand="1" w:val="04A0"/>
-      </w:tblPr>
-      <w:tblGrid>
-        <w:gridCol w:w="10224"/>
-      </w:tblGrid>
-      <w:tr>
-        <w:tc>
-          <w:tcPr>
-            <w:tcW w:type="dxa" w:w="10224"/>
-            <w:shd w:fill="FCE8EC"/>
-            <w:vAlign w:val="center"/>
-          </w:tcPr>
-          <w:p>
-            <w:pPr>
-              <w:spacing w:after="60"/>
-            </w:pPr>
-            <w:r>
-              <w:rPr>
-                <w:b/>
-                <w:color w:val="A9364D"/>
-              </w:rPr>
-              <w:t>Operator rule</w:t>
-            </w:r>
-          </w:p>
-          <w:p>
-            <w:pPr>
-              <w:spacing w:after="0"/>
-            </w:pPr>
-            <w:r>
-              <w:t>When SnapIMS reports an error, do not delete the database or originals. Preserve the traceback, copy Diagnostics, and recover from the last checkpoint or backup.</w:t>
-            </w:r>
-          </w:p>
-        </w:tc>
-      </w:tr>
-    </w:tbl>
-    <w:p/>
     <w:sectPr>
-      <w:footerReference w:type="default" r:id="rId9"/>
       <w:pgSz w:w="12240" w:h="15840"/>
-      <w:pgMar w:top="864" w:right="1008" w:bottom="792" w:left="1008" w:header="288" w:footer="360" w:gutter="0"/>
+      <w:pgMar w:top="792" w:right="936" w:bottom="792" w:left="936" w:header="720" w:footer="720" w:gutter="0"/>
       <w:cols w:space="720"/>
       <w:docGrid w:linePitch="360"/>
     </w:sectPr>
   </w:body>
 </w:document>
-</file>
-
-<file path=word/footer1.xml><?xml version="1.0" encoding="utf-8"?>
-<w:ftr xmlns:m="http://schemas.openxmlformats.org/officeDocument/2006/math" xmlns:mc="http://schemas.openxmlformats.org/markup-compatibility/2006" xmlns:mo="http://schemas.microsoft.com/office/mac/office/2008/main" xmlns:mv="urn:schemas-microsoft-com:mac:vml" xmlns:o="urn:schemas-microsoft-com:office:office" xmlns:r="http://schemas.openxmlformats.org/officeDocument/2006/relationships" xmlns:v="urn:schemas-microsoft-com:vml" xmlns:w10="urn:schemas-microsoft-com:office:word" xmlns:w14="http://schemas.microsoft.com/office/word/2010/wordml" xmlns:w="http://schemas.openxmlformats.org/wordprocessingml/2006/main" xmlns:wne="http://schemas.microsoft.com/office/word/2006/wordml" xmlns:wp14="http://schemas.microsoft.com/office/word/2010/wordprocessingDrawing" xmlns:wp="http://schemas.openxmlformats.org/drawingml/2006/wordprocessingDrawing" xmlns:wpc="http://schemas.microsoft.com/office/word/2010/wordprocessingCanvas" xmlns:wpg="http://schemas.microsoft.com/office/word/2010/wordprocessingGroup" xmlns:wpi="http://schemas.microsoft.com/office/word/2010/wordprocessingInk" xmlns:wps="http://schemas.microsoft.com/office/word/2010/wordprocessingShape" mc:Ignorable="w14 wp14">
-  <w:p>
-    <w:pPr>
-      <w:pStyle w:val="Footer"/>
-      <w:jc w:val="center"/>
-    </w:pPr>
-    <w:r>
-      <w:rPr>
-        <w:color w:val="6A6475"/>
-        <w:sz w:val="16"/>
-      </w:rPr>
-      <w:t xml:space="preserve">SnapIMS Operator Guide v0.6.0  |  </w:t>
-      <w:fldChar w:fldCharType="begin"/>
-      <w:instrText xml:space="preserve"> PAGE </w:instrText>
-      <w:fldChar w:fldCharType="separate"/>
-      <w:t>1</w:t>
-      <w:fldChar w:fldCharType="end"/>
-    </w:r>
-  </w:p>
-</w:ftr>
 </file>
 
 <file path=word/numbering.xml><?xml version="1.0" encoding="utf-8"?>
@@ -3424,12 +1785,8 @@
     <w:name w:val="Normal"/>
     <w:qFormat/>
     <w:rsid w:val="00FC693F"/>
-    <w:pPr>
-      <w:spacing w:after="120" w:line="259" w:lineRule="auto"/>
-    </w:pPr>
     <w:rPr>
-      <w:rFonts w:ascii="Liberation Sans" w:hAnsi="Liberation Sans"/>
-      <w:color w:val="211C2D"/>
+      <w:rFonts w:ascii="Arial" w:hAnsi="Arial"/>
       <w:sz w:val="20"/>
     </w:rPr>
   </w:style>
@@ -3492,11 +1849,11 @@
       <w:outlineLvl w:val="0"/>
     </w:pPr>
     <w:rPr>
-      <w:rFonts w:asciiTheme="majorHAnsi" w:eastAsiaTheme="majorEastAsia" w:hAnsiTheme="majorHAnsi" w:cstheme="majorBidi" w:ascii="Liberation Sans" w:hAnsi="Liberation Sans"/>
+      <w:rFonts w:asciiTheme="majorHAnsi" w:eastAsiaTheme="majorEastAsia" w:hAnsiTheme="majorHAnsi" w:cstheme="majorBidi" w:ascii="Arial" w:hAnsi="Arial"/>
       <w:b/>
       <w:bCs/>
-      <w:color w:val="8055D9"/>
-      <w:sz w:val="40"/>
+      <w:color w:val="365F91" w:themeColor="accent1" w:themeShade="BF"/>
+      <w:sz w:val="38"/>
       <w:szCs w:val="28"/>
     </w:rPr>
   </w:style>
@@ -3516,10 +1873,10 @@
       <w:outlineLvl w:val="1"/>
     </w:pPr>
     <w:rPr>
-      <w:rFonts w:asciiTheme="majorHAnsi" w:eastAsiaTheme="majorEastAsia" w:hAnsiTheme="majorHAnsi" w:cstheme="majorBidi" w:ascii="Liberation Sans" w:hAnsi="Liberation Sans"/>
+      <w:rFonts w:asciiTheme="majorHAnsi" w:eastAsiaTheme="majorEastAsia" w:hAnsiTheme="majorHAnsi" w:cstheme="majorBidi" w:ascii="Arial" w:hAnsi="Arial"/>
       <w:b/>
       <w:bCs/>
-      <w:color w:val="211C2D"/>
+      <w:color w:val="4F81BD" w:themeColor="accent1"/>
       <w:sz w:val="28"/>
       <w:szCs w:val="26"/>
     </w:rPr>
@@ -3540,11 +1897,10 @@
       <w:outlineLvl w:val="2"/>
     </w:pPr>
     <w:rPr>
-      <w:rFonts w:asciiTheme="majorHAnsi" w:eastAsiaTheme="majorEastAsia" w:hAnsiTheme="majorHAnsi" w:cstheme="majorBidi" w:ascii="Liberation Sans" w:hAnsi="Liberation Sans"/>
+      <w:rFonts w:asciiTheme="majorHAnsi" w:eastAsiaTheme="majorEastAsia" w:hAnsiTheme="majorHAnsi" w:cstheme="majorBidi"/>
       <w:b/>
       <w:bCs/>
-      <w:color w:val="8055D9"/>
-      <w:sz w:val="22"/>
+      <w:color w:val="4F81BD" w:themeColor="accent1"/>
     </w:rPr>
   </w:style>
   <w:style w:type="paragraph" w:styleId="Heading4">
@@ -3782,12 +2138,11 @@
       <w:contextualSpacing/>
     </w:pPr>
     <w:rPr>
-      <w:rFonts w:asciiTheme="majorHAnsi" w:eastAsiaTheme="majorEastAsia" w:hAnsiTheme="majorHAnsi" w:cstheme="majorBidi" w:ascii="Liberation Sans" w:hAnsi="Liberation Sans"/>
-      <w:b/>
-      <w:color w:val="211C2D"/>
+      <w:rFonts w:asciiTheme="majorHAnsi" w:eastAsiaTheme="majorEastAsia" w:hAnsiTheme="majorHAnsi" w:cstheme="majorBidi" w:ascii="Arial" w:hAnsi="Arial"/>
+      <w:color w:val="17365D" w:themeColor="text2" w:themeShade="BF"/>
       <w:spacing w:val="5"/>
       <w:kern w:val="28"/>
-      <w:sz w:val="60"/>
+      <w:sz w:val="56"/>
       <w:szCs w:val="52"/>
     </w:rPr>
   </w:style>
@@ -3820,13 +2175,12 @@
       </w:numPr>
     </w:pPr>
     <w:rPr>
-      <w:rFonts w:asciiTheme="majorHAnsi" w:eastAsiaTheme="majorEastAsia" w:hAnsiTheme="majorHAnsi" w:cstheme="majorBidi" w:ascii="Liberation Sans" w:hAnsi="Liberation Sans"/>
-      <w:b w:val="0"/>
+      <w:rFonts w:asciiTheme="majorHAnsi" w:eastAsiaTheme="majorEastAsia" w:hAnsiTheme="majorHAnsi" w:cstheme="majorBidi"/>
       <w:i/>
       <w:iCs/>
-      <w:color w:val="6A6475"/>
+      <w:color w:val="4F81BD" w:themeColor="accent1"/>
       <w:spacing w:val="15"/>
-      <w:sz w:val="26"/>
+      <w:sz w:val="24"/>
       <w:szCs w:val="24"/>
     </w:rPr>
   </w:style>

</xml_diff>

<commit_message>
docs(slmc): add integration guide and verification evidence
</commit_message>
<xml_diff>
--- a/SnapIMS_Operator_Guide.docx
+++ b/SnapIMS_Operator_Guide.docx
@@ -4,136 +4,352 @@
   <w:body>
     <w:p>
       <w:pPr>
+        <w:spacing w:before="1200"/>
+        <w:jc w:val="center"/>
+      </w:pPr>
+      <w:r>
+        <w:rPr>
+          <w:rFonts w:ascii="Liberation Sans" w:hAnsi="Liberation Sans"/>
+          <w:b/>
+          <w:color w:val="8055D9"/>
+          <w:sz w:val="84"/>
+        </w:rPr>
+        <w:t>SnapIMS</w:t>
+      </w:r>
+    </w:p>
+    <w:p>
+      <w:pPr>
         <w:pStyle w:val="Title"/>
         <w:jc w:val="center"/>
       </w:pPr>
       <w:r>
-        <w:t>SnapIMS Operator Guide</w:t>
+        <w:t>Operator Guide</w:t>
       </w:r>
     </w:p>
     <w:p>
       <w:pPr>
+        <w:pStyle w:val="Subtitle"/>
         <w:jc w:val="center"/>
+      </w:pPr>
+      <w:r>
+        <w:t>Application 0.6.0 · SLMC-0.1.0 Integration Build</w:t>
+      </w:r>
+    </w:p>
+    <w:p/>
+    <w:tbl>
+      <w:tblPr>
+        <w:tblW w:type="auto" w:w="0"/>
+        <w:tblLayout w:type="autofit"/>
+        <w:tblLook w:firstColumn="1" w:firstRow="1" w:lastColumn="0" w:lastRow="0" w:noHBand="0" w:noVBand="1" w:val="04A0"/>
+      </w:tblPr>
+      <w:tblGrid>
+        <w:gridCol w:w="10224"/>
+      </w:tblGrid>
+      <w:tr>
+        <w:tc>
+          <w:tcPr>
+            <w:tcW w:type="dxa" w:w="10224"/>
+            <w:shd w:fill="F4F0FA"/>
+            <w:vAlign w:val="center"/>
+          </w:tcPr>
+          <w:p>
+            <w:pPr>
+              <w:spacing w:after="60"/>
+            </w:pPr>
+            <w:r>
+              <w:rPr>
+                <w:b/>
+                <w:color w:val="8055D9"/>
+              </w:rPr>
+              <w:t>Purpose</w:t>
+            </w:r>
+          </w:p>
+          <w:p>
+            <w:pPr>
+              <w:spacing w:after="0"/>
+            </w:pPr>
+            <w:r>
+              <w:t>SnapIMS converts an ordered photo stream into durable inventory records. The SLMC integration adds a permanent local Movie catalog, local-first matching, bounded Wikipedia discovery on genuine misses, and structured CSV/Shopify simulation fields without slowing the one-action Review workflow.</w:t>
+            </w:r>
+          </w:p>
+        </w:tc>
+      </w:tr>
+    </w:tbl>
+    <w:p/>
+    <w:tbl>
+      <w:tblPr>
+        <w:tblW w:type="auto" w:w="0"/>
+        <w:tblLayout w:type="autofit"/>
+        <w:tblLook w:firstColumn="1" w:firstRow="1" w:lastColumn="0" w:lastRow="0" w:noHBand="0" w:noVBand="1" w:val="04A0"/>
+      </w:tblPr>
+      <w:tblGrid>
+        <w:gridCol w:w="10224"/>
+      </w:tblGrid>
+      <w:tr>
+        <w:tc>
+          <w:tcPr>
+            <w:tcW w:type="dxa" w:w="10224"/>
+            <w:shd w:fill="FFF4DB"/>
+            <w:vAlign w:val="center"/>
+          </w:tcPr>
+          <w:p>
+            <w:pPr>
+              <w:spacing w:after="60"/>
+            </w:pPr>
+            <w:r>
+              <w:rPr>
+                <w:b/>
+                <w:color w:val="8A5A00"/>
+              </w:rPr>
+              <w:t>Integration status</w:t>
+            </w:r>
+          </w:p>
+          <w:p>
+            <w:pPr>
+              <w:spacing w:after="0"/>
+            </w:pPr>
+            <w:r>
+              <w:t>The application remains SnapIMS 0.6.0. SLMC-0.1.0 is an isolated integration package, not a final SnapIMS release and not 1.0. Live AI, live Wikipedia, a real Pixel batch, one live Shopify draft, physical CSV reconciliation, and final independent acceptance remain required.</w:t>
+            </w:r>
+          </w:p>
+        </w:tc>
+      </w:tr>
+    </w:tbl>
+    <w:p/>
+    <w:p>
+      <w:r>
+        <w:br w:type="page"/>
+      </w:r>
+    </w:p>
+    <w:p>
+      <w:pPr>
+        <w:pStyle w:val="Heading1"/>
+      </w:pPr>
+      <w:r>
+        <w:t>Fast Start</w:t>
+      </w:r>
+    </w:p>
+    <w:p>
+      <w:r>
+        <w:t>Launch SnapIMS from the repository virtual environment:</w:t>
+      </w:r>
+    </w:p>
+    <w:p>
+      <w:pPr/>
+      <w:r>
+        <w:rPr>
+          <w:rFonts w:ascii="Liberation Mono" w:hAnsi="Liberation Mono"/>
+          <w:sz w:val="18"/>
+        </w:rPr>
+        <w:t>cd ~/Projects/SnapIMS-v0.6.0</w:t>
+        <w:br/>
+        <w:t>source .venv/bin/activate</w:t>
+        <w:br/>
+        <w:t>snapims --data-dir ~/SnapIMS-data serve</w:t>
+      </w:r>
+    </w:p>
+    <w:tbl>
+      <w:tblPr>
+        <w:tblW w:type="auto" w:w="0"/>
+        <w:tblLayout w:type="autofit"/>
+        <w:tblLook w:firstColumn="1" w:firstRow="1" w:lastColumn="0" w:lastRow="0" w:noHBand="0" w:noVBand="1" w:val="04A0"/>
+      </w:tblPr>
+      <w:tblGrid>
+        <w:gridCol w:w="10224"/>
+      </w:tblGrid>
+      <w:tr>
+        <w:tc>
+          <w:tcPr>
+            <w:tcW w:type="dxa" w:w="10224"/>
+            <w:shd w:fill="EAF6F0"/>
+            <w:vAlign w:val="center"/>
+          </w:tcPr>
+          <w:p>
+            <w:pPr>
+              <w:spacing w:after="60"/>
+            </w:pPr>
+            <w:r>
+              <w:rPr>
+                <w:b/>
+                <w:color w:val="2F7D5A"/>
+              </w:rPr>
+              <w:t>Browser address</w:t>
+            </w:r>
+          </w:p>
+          <w:p>
+            <w:pPr>
+              <w:spacing w:after="0"/>
+            </w:pPr>
+            <w:r>
+              <w:t>Open http://127.0.0.1:8767. Keep the terminal running. Ctrl+C stops the server.</w:t>
+            </w:r>
+          </w:p>
+        </w:tc>
+      </w:tr>
+    </w:tbl>
+    <w:p/>
+    <w:p>
+      <w:pPr>
+        <w:ind w:left="173" w:hanging="173"/>
       </w:pPr>
       <w:r>
         <w:rPr>
           <w:b/>
+          <w:color w:val="8055D9"/>
         </w:rPr>
-        <w:t>Version 0.6.0</w:t>
-        <w:br/>
-        <w:t>Photo-first inventory workstation</w:t>
+        <w:t xml:space="preserve">1. </w:t>
+      </w:r>
+      <w:r>
+        <w:t>Import a folder containing the chronological camera photo stream.</w:t>
       </w:r>
     </w:p>
     <w:p>
       <w:pPr>
-        <w:pStyle w:val="Heading1"/>
+        <w:ind w:left="173" w:hanging="173"/>
       </w:pPr>
       <w:r>
         <w:rPr>
-          <w:b w:val="0"/>
+          <w:b/>
+          <w:color w:val="8055D9"/>
         </w:rPr>
-        <w:t>Purpose</w:t>
+        <w:t xml:space="preserve">2. </w:t>
+      </w:r>
+      <w:r>
+        <w:t>Run recognition. After each successful recognition result is committed, SnapIMS searches the permanent local Movie catalog before any Wikipedia request.</w:t>
       </w:r>
     </w:p>
     <w:p>
+      <w:pPr>
+        <w:ind w:left="173" w:hanging="173"/>
+      </w:pPr>
       <w:r>
         <w:rPr>
-          <w:b w:val="0"/>
+          <w:b/>
+          <w:color w:val="8055D9"/>
         </w:rPr>
-        <w:t>SnapIMS converts chronologically captured photos and QR events into durable inventory records, AI suggestions, a fast Review queue, a bulk Batch Editor, CSV round trips, and publish-ready outputs.</w:t>
+        <w:t xml:space="preserve">3. </w:t>
+      </w:r>
+      <w:r>
+        <w:t>Resolve items one at a time in Review. Normal unique catalog matches require no extra confirmation click.</w:t>
       </w:r>
     </w:p>
     <w:p>
       <w:pPr>
-        <w:pStyle w:val="Heading1"/>
+        <w:ind w:left="173" w:hanging="173"/>
       </w:pPr>
       <w:r>
         <w:rPr>
-          <w:b w:val="0"/>
+          <w:b/>
+          <w:color w:val="8055D9"/>
         </w:rPr>
-        <w:t>Routine operator path</w:t>
+        <w:t xml:space="preserve">4. </w:t>
+      </w:r>
+      <w:r>
+        <w:t>Use CSV download/upload only when an external spreadsheet is useful.</w:t>
       </w:r>
     </w:p>
     <w:p>
+      <w:pPr>
+        <w:ind w:left="173" w:hanging="173"/>
+      </w:pPr>
       <w:r>
         <w:rPr>
-          <w:b w:val="0"/>
+          <w:b/>
+          <w:color w:val="8055D9"/>
         </w:rPr>
-        <w:t>1. Photograph tapes with SnapIMS QR cards.</w:t>
+        <w:t xml:space="preserve">5. </w:t>
+      </w:r>
+      <w:r>
+        <w:t>Validate the current working batch in Publish, then simulate or create the requested output.</w:t>
       </w:r>
     </w:p>
     <w:p>
       <w:r>
-        <w:rPr>
-          <w:b w:val="0"/>
-        </w:rPr>
-        <w:t>2. Import and preview the folder.</w:t>
+        <w:br w:type="page"/>
       </w:r>
     </w:p>
     <w:p>
-      <w:r>
-        <w:rPr>
-          <w:b w:val="0"/>
-        </w:rPr>
-        <w:t>3. Run recognition or continue manually.</w:t>
+      <w:pPr>
+        <w:pStyle w:val="Heading1"/>
+      </w:pPr>
+      <w:r>
+        <w:t>1. Home Dashboard</w:t>
       </w:r>
     </w:p>
     <w:p>
       <w:r>
-        <w:rPr>
-          <w:b w:val="0"/>
-        </w:rPr>
-        <w:t>4. Review one tape at a time or use Batch Editor.</w:t>
+        <w:t>Home shows the active batches, recognition state, unfinished work, and the next logical actions.</w:t>
       </w:r>
     </w:p>
     <w:p>
+      <w:pPr>
+        <w:ind w:left="173" w:hanging="173"/>
+      </w:pPr>
       <w:r>
         <w:rPr>
-          <w:b w:val="0"/>
+          <w:b/>
+          <w:color w:val="8055D9"/>
         </w:rPr>
-        <w:t>5. Validate, simulate, export CSV, or publish.</w:t>
+        <w:t xml:space="preserve">1. </w:t>
+      </w:r>
+      <w:r>
+        <w:t>Choose Import to create a new batch.</w:t>
       </w:r>
     </w:p>
     <w:p>
       <w:pPr>
-        <w:pStyle w:val="Heading1"/>
+        <w:ind w:left="173" w:hanging="173"/>
       </w:pPr>
       <w:r>
         <w:rPr>
-          <w:b w:val="0"/>
+          <w:b/>
+          <w:color w:val="8055D9"/>
         </w:rPr>
-        <w:t>Launch command</w:t>
+        <w:t xml:space="preserve">2. </w:t>
+      </w:r>
+      <w:r>
+        <w:t>Open Review for the one-tape workstation.</w:t>
       </w:r>
     </w:p>
     <w:p>
+      <w:pPr>
+        <w:ind w:left="173" w:hanging="173"/>
+      </w:pPr>
       <w:r>
         <w:rPr>
           <w:b/>
+          <w:color w:val="8055D9"/>
         </w:rPr>
-        <w:t>cd ~/Projects/SnapIMS-v0.6.0 &amp;&amp; source .venv/bin/activate &amp;&amp; snapims --data-dir ~/SnapIMS-data serve</w:t>
+        <w:t xml:space="preserve">3. </w:t>
+      </w:r>
+      <w:r>
+        <w:t>Open Batch Editor for bulk changes and low-confidence triage.</w:t>
       </w:r>
     </w:p>
     <w:p>
+      <w:pPr>
+        <w:ind w:left="173" w:hanging="173"/>
+      </w:pPr>
       <w:r>
         <w:rPr>
-          <w:b w:val="0"/>
+          <w:b/>
+          <w:color w:val="8055D9"/>
         </w:rPr>
-        <w:t>Open http://127.0.0.1:8767. Leave the terminal running. Ctrl+C stops SnapIMS.</w:t>
+        <w:t xml:space="preserve">4. </w:t>
+      </w:r>
+      <w:r>
+        <w:t>Open Publish only after the working batch has no blockers.</w:t>
       </w:r>
     </w:p>
     <w:p>
-      <w:r>
-        <w:br w:type="page"/>
-      </w:r>
-    </w:p>
-    <w:p>
-      <w:pPr>
+      <w:pPr>
+        <w:spacing w:after="80"/>
         <w:jc w:val="center"/>
       </w:pPr>
       <w:r>
         <w:drawing>
           <wp:inline xmlns:a="http://schemas.openxmlformats.org/drawingml/2006/main" xmlns:pic="http://schemas.openxmlformats.org/drawingml/2006/picture">
-            <wp:extent cx="5577840" cy="3919982"/>
+            <wp:extent cx="6400800" cy="2449195"/>
             <wp:docPr id="1" name="Picture 1"/>
             <wp:cNvGraphicFramePr>
               <a:graphicFrameLocks noChangeAspect="1"/>
@@ -142,95 +358,7 @@
               <a:graphicData uri="http://schemas.openxmlformats.org/drawingml/2006/picture">
                 <pic:pic>
                   <pic:nvPicPr>
-                    <pic:cNvPr id="0" name="01-home-dashboard.png"/>
-                    <pic:cNvPicPr/>
-                  </pic:nvPicPr>
-                  <pic:blipFill>
-                    <a:blip r:embed="rId9"/>
-                    <a:stretch>
-                      <a:fillRect/>
-                    </a:stretch>
-                  </pic:blipFill>
-                  <pic:spPr>
-                    <a:xfrm>
-                      <a:off x="0" y="0"/>
-                      <a:ext cx="5577840" cy="3919982"/>
-                    </a:xfrm>
-                    <a:prstGeom prst="rect"/>
-                  </pic:spPr>
-                </pic:pic>
-              </a:graphicData>
-            </a:graphic>
-          </wp:inline>
-        </w:drawing>
-      </w:r>
-    </w:p>
-    <w:p>
-      <w:pPr>
-        <w:jc w:val="center"/>
-      </w:pPr>
-      <w:r>
-        <w:rPr>
-          <w:i/>
-          <w:sz w:val="16"/>
-        </w:rPr>
-        <w:t>Home dashboard and batch health summary</w:t>
-      </w:r>
-    </w:p>
-    <w:p>
-      <w:r>
-        <w:br w:type="page"/>
-      </w:r>
-    </w:p>
-    <w:p>
-      <w:pPr>
-        <w:pStyle w:val="Heading1"/>
-      </w:pPr>
-      <w:r>
-        <w:rPr>
-          <w:b w:val="0"/>
-        </w:rPr>
-        <w:t>1. Import a photo batch</w:t>
-      </w:r>
-    </w:p>
-    <w:p>
-      <w:r>
-        <w:rPr>
-          <w:b w:val="0"/>
-        </w:rPr>
-        <w:t>Open Import. Normal operation uses Browse Folder, the configured incoming folder, or a recent folder. Manual path entry is under Advanced.</w:t>
-      </w:r>
-    </w:p>
-    <w:p>
-      <w:r>
-        <w:rPr>
-          <w:b w:val="0"/>
-        </w:rPr>
-        <w:t>A blank Use This Folder action is disabled. Invalid or unreadable folders return a normal SnapIMS message instead of raw API JSON.</w:t>
-      </w:r>
-    </w:p>
-    <w:p>
-      <w:r>
-        <w:br w:type="page"/>
-      </w:r>
-    </w:p>
-    <w:p>
-      <w:pPr>
-        <w:jc w:val="center"/>
-      </w:pPr>
-      <w:r>
-        <w:drawing>
-          <wp:inline xmlns:a="http://schemas.openxmlformats.org/drawingml/2006/main" xmlns:pic="http://schemas.openxmlformats.org/drawingml/2006/picture">
-            <wp:extent cx="5577840" cy="3873500"/>
-            <wp:docPr id="2" name="Picture 2"/>
-            <wp:cNvGraphicFramePr>
-              <a:graphicFrameLocks noChangeAspect="1"/>
-            </wp:cNvGraphicFramePr>
-            <a:graphic>
-              <a:graphicData uri="http://schemas.openxmlformats.org/drawingml/2006/picture">
-                <pic:pic>
-                  <pic:nvPicPr>
-                    <pic:cNvPr id="0" name="02-import-empty-safe.png"/>
+                    <pic:cNvPr id="0" name="01-home-dashboard-part-01.png"/>
                     <pic:cNvPicPr/>
                   </pic:nvPicPr>
                   <pic:blipFill>
@@ -242,7 +370,7 @@
                   <pic:spPr>
                     <a:xfrm>
                       <a:off x="0" y="0"/>
-                      <a:ext cx="5577840" cy="3873500"/>
+                      <a:ext cx="6400800" cy="2449195"/>
                     </a:xfrm>
                     <a:prstGeom prst="rect"/>
                   </pic:spPr>
@@ -255,14 +383,16 @@
     </w:p>
     <w:p>
       <w:pPr>
+        <w:spacing w:after="160"/>
         <w:jc w:val="center"/>
       </w:pPr>
       <w:r>
         <w:rPr>
           <w:i/>
+          <w:color w:val="6A6475"/>
           <w:sz w:val="16"/>
         </w:rPr>
-        <w:t>Import safely handles an empty folder selection</w:t>
+        <w:t>Home dashboard and batch actions - view 1 of 2</w:t>
       </w:r>
     </w:p>
     <w:p>
@@ -272,13 +402,14 @@
     </w:p>
     <w:p>
       <w:pPr>
+        <w:spacing w:after="80"/>
         <w:jc w:val="center"/>
       </w:pPr>
       <w:r>
         <w:drawing>
           <wp:inline xmlns:a="http://schemas.openxmlformats.org/drawingml/2006/main" xmlns:pic="http://schemas.openxmlformats.org/drawingml/2006/picture">
-            <wp:extent cx="5577840" cy="3873500"/>
-            <wp:docPr id="3" name="Picture 3"/>
+            <wp:extent cx="6400800" cy="2449195"/>
+            <wp:docPr id="2" name="Picture 2"/>
             <wp:cNvGraphicFramePr>
               <a:graphicFrameLocks noChangeAspect="1"/>
             </wp:cNvGraphicFramePr>
@@ -286,7 +417,7 @@
               <a:graphicData uri="http://schemas.openxmlformats.org/drawingml/2006/picture">
                 <pic:pic>
                   <pic:nvPicPr>
-                    <pic:cNvPr id="0" name="03-native-folder-selected.png"/>
+                    <pic:cNvPr id="0" name="01-home-dashboard-part-02.png"/>
                     <pic:cNvPicPr/>
                   </pic:nvPicPr>
                   <pic:blipFill>
@@ -298,7 +429,7 @@
                   <pic:spPr>
                     <a:xfrm>
                       <a:off x="0" y="0"/>
-                      <a:ext cx="5577840" cy="3873500"/>
+                      <a:ext cx="6400800" cy="2449195"/>
                     </a:xfrm>
                     <a:prstGeom prst="rect"/>
                   </pic:spPr>
@@ -311,38 +442,121 @@
     </w:p>
     <w:p>
       <w:pPr>
+        <w:spacing w:after="160"/>
         <w:jc w:val="center"/>
       </w:pPr>
       <w:r>
         <w:rPr>
           <w:i/>
+          <w:color w:val="6A6475"/>
           <w:sz w:val="16"/>
         </w:rPr>
-        <w:t>A local folder selected through the native folder workflow</w:t>
+        <w:t>Home dashboard and batch actions - view 2 of 2</w:t>
       </w:r>
     </w:p>
     <w:p>
       <w:r>
-        <w:rPr>
-          <w:b w:val="0"/>
-        </w:rPr>
-        <w:t>Select Preview before importing. Preview shows photo count, expected item boundaries, QR events, warnings, and duplicate detection. Preview does not create durable inventory identity.</w:t>
+        <w:br w:type="page"/>
       </w:r>
     </w:p>
     <w:p>
-      <w:r>
-        <w:br w:type="page"/>
+      <w:pPr>
+        <w:pStyle w:val="Heading1"/>
+      </w:pPr>
+      <w:r>
+        <w:t>2. Import a Photo Folder</w:t>
       </w:r>
     </w:p>
     <w:p>
-      <w:pPr>
+      <w:r>
+        <w:t>Normal import no longer requires repeatedly typing a Linux path. Browse Folder is the preferred path; configured and recent folders are one-click shortcuts.</w:t>
+      </w:r>
+    </w:p>
+    <w:p>
+      <w:pPr>
+        <w:ind w:left="173" w:hanging="173"/>
+      </w:pPr>
+      <w:r>
+        <w:rPr>
+          <w:b/>
+          <w:color w:val="8055D9"/>
+        </w:rPr>
+        <w:t xml:space="preserve">1. </w:t>
+      </w:r>
+      <w:r>
+        <w:t>Click Browse Folder and select the flat camera-export folder.</w:t>
+      </w:r>
+    </w:p>
+    <w:p>
+      <w:pPr>
+        <w:ind w:left="173" w:hanging="173"/>
+      </w:pPr>
+      <w:r>
+        <w:rPr>
+          <w:b/>
+          <w:color w:val="8055D9"/>
+        </w:rPr>
+        <w:t xml:space="preserve">2. </w:t>
+      </w:r>
+      <w:r>
+        <w:t>If the native chooser is unavailable, open Advanced Manual Path.</w:t>
+      </w:r>
+    </w:p>
+    <w:p>
+      <w:pPr>
+        <w:ind w:left="173" w:hanging="173"/>
+      </w:pPr>
+      <w:r>
+        <w:rPr>
+          <w:b/>
+          <w:color w:val="8055D9"/>
+        </w:rPr>
+        <w:t xml:space="preserve">3. </w:t>
+      </w:r>
+      <w:r>
+        <w:t>Click Preview. Preview does not create durable item identity.</w:t>
+      </w:r>
+    </w:p>
+    <w:p>
+      <w:pPr>
+        <w:ind w:left="173" w:hanging="173"/>
+      </w:pPr>
+      <w:r>
+        <w:rPr>
+          <w:b/>
+          <w:color w:val="8055D9"/>
+        </w:rPr>
+        <w:t xml:space="preserve">4. </w:t>
+      </w:r>
+      <w:r>
+        <w:t>Confirm the image count, QR events, item boundaries, and warnings.</w:t>
+      </w:r>
+    </w:p>
+    <w:p>
+      <w:pPr>
+        <w:ind w:left="173" w:hanging="173"/>
+      </w:pPr>
+      <w:r>
+        <w:rPr>
+          <w:b/>
+          <w:color w:val="8055D9"/>
+        </w:rPr>
+        <w:t xml:space="preserve">5. </w:t>
+      </w:r>
+      <w:r>
+        <w:t>Click Preserve and Import Batch once. Duplicate submission protection prevents accidental double import.</w:t>
+      </w:r>
+    </w:p>
+    <w:p>
+      <w:pPr>
+        <w:spacing w:after="80"/>
         <w:jc w:val="center"/>
       </w:pPr>
       <w:r>
         <w:drawing>
           <wp:inline xmlns:a="http://schemas.openxmlformats.org/drawingml/2006/main" xmlns:pic="http://schemas.openxmlformats.org/drawingml/2006/picture">
-            <wp:extent cx="5577840" cy="4508754"/>
-            <wp:docPr id="4" name="Picture 4"/>
+            <wp:extent cx="6400800" cy="2422525"/>
+            <wp:docPr id="3" name="Picture 3"/>
             <wp:cNvGraphicFramePr>
               <a:graphicFrameLocks noChangeAspect="1"/>
             </wp:cNvGraphicFramePr>
@@ -350,7 +564,7 @@
               <a:graphicData uri="http://schemas.openxmlformats.org/drawingml/2006/picture">
                 <pic:pic>
                   <pic:nvPicPr>
-                    <pic:cNvPr id="0" name="04-import-preview.png"/>
+                    <pic:cNvPr id="0" name="03-native-folder-selected-part-01.png"/>
                     <pic:cNvPicPr/>
                   </pic:nvPicPr>
                   <pic:blipFill>
@@ -362,7 +576,7 @@
                   <pic:spPr>
                     <a:xfrm>
                       <a:off x="0" y="0"/>
-                      <a:ext cx="5577840" cy="4508754"/>
+                      <a:ext cx="6400800" cy="2422525"/>
                     </a:xfrm>
                     <a:prstGeom prst="rect"/>
                   </pic:spPr>
@@ -375,38 +589,33 @@
     </w:p>
     <w:p>
       <w:pPr>
+        <w:spacing w:after="160"/>
         <w:jc w:val="center"/>
       </w:pPr>
       <w:r>
         <w:rPr>
           <w:i/>
+          <w:color w:val="6A6475"/>
           <w:sz w:val="16"/>
         </w:rPr>
-        <w:t>Import preview before durable preservation</w:t>
+        <w:t>Native folder selection on Import - view 1 of 2</w:t>
       </w:r>
     </w:p>
     <w:p>
       <w:r>
-        <w:rPr>
-          <w:b w:val="0"/>
-        </w:rPr>
-        <w:t>Choose Preserve and Import Batch once the preview is correct. SnapIMS prevents duplicate commits and preserves originals before creating working records.</w:t>
+        <w:br w:type="page"/>
       </w:r>
     </w:p>
     <w:p>
-      <w:r>
-        <w:br w:type="page"/>
-      </w:r>
-    </w:p>
-    <w:p>
-      <w:pPr>
+      <w:pPr>
+        <w:spacing w:after="80"/>
         <w:jc w:val="center"/>
       </w:pPr>
       <w:r>
         <w:drawing>
           <wp:inline xmlns:a="http://schemas.openxmlformats.org/drawingml/2006/main" xmlns:pic="http://schemas.openxmlformats.org/drawingml/2006/picture">
-            <wp:extent cx="5577840" cy="4690808"/>
-            <wp:docPr id="5" name="Picture 5"/>
+            <wp:extent cx="6400800" cy="2422525"/>
+            <wp:docPr id="4" name="Picture 4"/>
             <wp:cNvGraphicFramePr>
               <a:graphicFrameLocks noChangeAspect="1"/>
             </wp:cNvGraphicFramePr>
@@ -414,7 +623,7 @@
               <a:graphicData uri="http://schemas.openxmlformats.org/drawingml/2006/picture">
                 <pic:pic>
                   <pic:nvPicPr>
-                    <pic:cNvPr id="0" name="05-import-complete.png"/>
+                    <pic:cNvPr id="0" name="03-native-folder-selected-part-02.png"/>
                     <pic:cNvPicPr/>
                   </pic:nvPicPr>
                   <pic:blipFill>
@@ -426,7 +635,7 @@
                   <pic:spPr>
                     <a:xfrm>
                       <a:off x="0" y="0"/>
-                      <a:ext cx="5577840" cy="4690808"/>
+                      <a:ext cx="6400800" cy="2422525"/>
                     </a:xfrm>
                     <a:prstGeom prst="rect"/>
                   </pic:spPr>
@@ -439,14 +648,16 @@
     </w:p>
     <w:p>
       <w:pPr>
+        <w:spacing w:after="160"/>
         <w:jc w:val="center"/>
       </w:pPr>
       <w:r>
         <w:rPr>
           <w:i/>
+          <w:color w:val="6A6475"/>
           <w:sz w:val="16"/>
         </w:rPr>
-        <w:t>Durable batch created after preservation</w:t>
+        <w:t>Native folder selection on Import - view 2 of 2</w:t>
       </w:r>
     </w:p>
     <w:p>
@@ -459,42 +670,84 @@
         <w:pStyle w:val="Heading1"/>
       </w:pPr>
       <w:r>
-        <w:rPr>
-          <w:b w:val="0"/>
-        </w:rPr>
-        <w:t>2. Recognition and failure recovery</w:t>
+        <w:t>3. Preview and Commit</w:t>
       </w:r>
     </w:p>
     <w:p>
       <w:r>
-        <w:rPr>
-          <w:b w:val="0"/>
-        </w:rPr>
-        <w:t>Run recognition from Review. Provider status is visible. If OpenAI is selected without a key, SnapIMS shows an actionable recovery view instead of silently refreshing.</w:t>
+        <w:t>The preview is the last safe checkpoint before SnapIMS preserves originals, creates durable identities, and generates media derivatives.</w:t>
       </w:r>
     </w:p>
     <w:p>
+      <w:pPr>
+        <w:ind w:left="173" w:hanging="173"/>
+      </w:pPr>
       <w:r>
         <w:rPr>
-          <w:b w:val="0"/>
+          <w:b/>
+          <w:color w:val="8055D9"/>
         </w:rPr>
-        <w:t>Available recovery actions include Retry, Retry Failed Items Only, Retry With Different Provider, Continue With Manual Review, Skip Recognition, Open Diagnostics, and Return to Import.</w:t>
+        <w:t xml:space="preserve">1. </w:t>
+      </w:r>
+      <w:r>
+        <w:t>Verify BATCH START and BATCH END were detected.</w:t>
       </w:r>
     </w:p>
     <w:p>
-      <w:r>
-        <w:br w:type="page"/>
+      <w:pPr>
+        <w:ind w:left="173" w:hanging="173"/>
+      </w:pPr>
+      <w:r>
+        <w:rPr>
+          <w:b/>
+          <w:color w:val="8055D9"/>
+        </w:rPr>
+        <w:t xml:space="preserve">2. </w:t>
+      </w:r>
+      <w:r>
+        <w:t>Verify every ITEM NEXT boundary created one intended tape.</w:t>
       </w:r>
     </w:p>
     <w:p>
       <w:pPr>
+        <w:ind w:left="173" w:hanging="173"/>
+      </w:pPr>
+      <w:r>
+        <w:rPr>
+          <w:b/>
+          <w:color w:val="8055D9"/>
+        </w:rPr>
+        <w:t xml:space="preserve">3. </w:t>
+      </w:r>
+      <w:r>
+        <w:t>Inspect warning messages before committing.</w:t>
+      </w:r>
+    </w:p>
+    <w:p>
+      <w:pPr>
+        <w:ind w:left="173" w:hanging="173"/>
+      </w:pPr>
+      <w:r>
+        <w:rPr>
+          <w:b/>
+          <w:color w:val="8055D9"/>
+        </w:rPr>
+        <w:t xml:space="preserve">4. </w:t>
+      </w:r>
+      <w:r>
+        <w:t>Commit the batch. SnapIMS preserves originals and generates fast browser and recognition copies.</w:t>
+      </w:r>
+    </w:p>
+    <w:p>
+      <w:pPr>
+        <w:spacing w:after="80"/>
         <w:jc w:val="center"/>
       </w:pPr>
       <w:r>
         <w:drawing>
           <wp:inline xmlns:a="http://schemas.openxmlformats.org/drawingml/2006/main" xmlns:pic="http://schemas.openxmlformats.org/drawingml/2006/picture">
-            <wp:extent cx="5577840" cy="6871589"/>
-            <wp:docPr id="6" name="Picture 6"/>
+            <wp:extent cx="6400800" cy="2787015"/>
+            <wp:docPr id="5" name="Picture 5"/>
             <wp:cNvGraphicFramePr>
               <a:graphicFrameLocks noChangeAspect="1"/>
             </wp:cNvGraphicFramePr>
@@ -502,7 +755,7 @@
               <a:graphicData uri="http://schemas.openxmlformats.org/drawingml/2006/picture">
                 <pic:pic>
                   <pic:nvPicPr>
-                    <pic:cNvPr id="0" name="06-recognition-failure-recovery.png"/>
+                    <pic:cNvPr id="0" name="04-import-preview-part-01.png"/>
                     <pic:cNvPicPr/>
                   </pic:nvPicPr>
                   <pic:blipFill>
@@ -514,7 +767,7 @@
                   <pic:spPr>
                     <a:xfrm>
                       <a:off x="0" y="0"/>
-                      <a:ext cx="5577840" cy="6871589"/>
+                      <a:ext cx="6400800" cy="2787015"/>
                     </a:xfrm>
                     <a:prstGeom prst="rect"/>
                   </pic:spPr>
@@ -527,38 +780,33 @@
     </w:p>
     <w:p>
       <w:pPr>
+        <w:spacing w:after="160"/>
         <w:jc w:val="center"/>
       </w:pPr>
       <w:r>
         <w:rPr>
           <w:i/>
+          <w:color w:val="6A6475"/>
           <w:sz w:val="16"/>
         </w:rPr>
-        <w:t>Recognition failure with reason and recovery actions</w:t>
+        <w:t>Import preview with QR and item summary - view 1 of 2</w:t>
       </w:r>
     </w:p>
     <w:p>
       <w:r>
-        <w:rPr>
-          <w:b w:val="0"/>
-        </w:rPr>
-        <w:t>Recognition states are durable: READY, IDENTIFYING, PAUSED, COMPLETE, FAILED, and REVIEW COMPLETE. An interrupted job becomes recoverable after restart.</w:t>
+        <w:br w:type="page"/>
       </w:r>
     </w:p>
     <w:p>
-      <w:r>
-        <w:br w:type="page"/>
-      </w:r>
-    </w:p>
-    <w:p>
-      <w:pPr>
+      <w:pPr>
+        <w:spacing w:after="80"/>
         <w:jc w:val="center"/>
       </w:pPr>
       <w:r>
         <w:drawing>
           <wp:inline xmlns:a="http://schemas.openxmlformats.org/drawingml/2006/main" xmlns:pic="http://schemas.openxmlformats.org/drawingml/2006/picture">
-            <wp:extent cx="5577840" cy="5267960"/>
-            <wp:docPr id="7" name="Picture 7"/>
+            <wp:extent cx="6400800" cy="2787015"/>
+            <wp:docPr id="6" name="Picture 6"/>
             <wp:cNvGraphicFramePr>
               <a:graphicFrameLocks noChangeAspect="1"/>
             </wp:cNvGraphicFramePr>
@@ -566,7 +814,7 @@
               <a:graphicData uri="http://schemas.openxmlformats.org/drawingml/2006/picture">
                 <pic:pic>
                   <pic:nvPicPr>
-                    <pic:cNvPr id="0" name="07-recognition-complete.png"/>
+                    <pic:cNvPr id="0" name="04-import-preview-part-02.png"/>
                     <pic:cNvPicPr/>
                   </pic:nvPicPr>
                   <pic:blipFill>
@@ -578,7 +826,7 @@
                   <pic:spPr>
                     <a:xfrm>
                       <a:off x="0" y="0"/>
-                      <a:ext cx="5577840" cy="5267960"/>
+                      <a:ext cx="6400800" cy="2787015"/>
                     </a:xfrm>
                     <a:prstGeom prst="rect"/>
                   </pic:spPr>
@@ -591,14 +839,16 @@
     </w:p>
     <w:p>
       <w:pPr>
+        <w:spacing w:after="160"/>
         <w:jc w:val="center"/>
       </w:pPr>
       <w:r>
         <w:rPr>
           <w:i/>
+          <w:color w:val="6A6475"/>
           <w:sz w:val="16"/>
         </w:rPr>
-        <w:t>Completed recognition ready for operator review</w:t>
+        <w:t>Import preview with QR and item summary - view 2 of 2</w:t>
       </w:r>
     </w:p>
     <w:p>
@@ -611,50 +861,99 @@
         <w:pStyle w:val="Heading1"/>
       </w:pPr>
       <w:r>
-        <w:rPr>
-          <w:b w:val="0"/>
-        </w:rPr>
-        <w:t>3. Fast Review workstation</w:t>
+        <w:t>4. Recognition and Failure Recovery</w:t>
       </w:r>
     </w:p>
     <w:p>
       <w:r>
-        <w:rPr>
-          <w:b w:val="0"/>
-        </w:rPr>
-        <w:t>Routine workflow: inspect the photo, confirm the title, optionally type a price or discount, then approve. Edit mode is for exceptions only.</w:t>
+        <w:t>Recognition can use Mock for testing or a configured provider for live work. A provider failure never leaves a dead button or silent refresh.</w:t>
       </w:r>
     </w:p>
     <w:p>
+      <w:pPr>
+        <w:ind w:left="173" w:hanging="173"/>
+      </w:pPr>
       <w:r>
         <w:rPr>
-          <w:b w:val="0"/>
+          <w:b/>
+          <w:color w:val="8055D9"/>
         </w:rPr>
-        <w:t>The Price field opens focused with its current value selected. Type a replacement price and press Enter. SnapIMS saves the working values, approves the tape, opens the next unfinished tape, and focuses the next Price field.</w:t>
+        <w:t xml:space="preserve">1. </w:t>
+      </w:r>
+      <w:r>
+        <w:t>Start identification from Review or the batch action.</w:t>
       </w:r>
     </w:p>
     <w:p>
+      <w:pPr>
+        <w:ind w:left="173" w:hanging="173"/>
+      </w:pPr>
       <w:r>
         <w:rPr>
-          <w:b w:val="0"/>
+          <w:b/>
+          <w:color w:val="8055D9"/>
         </w:rPr>
-        <w:t>When the shown AI title is valid, Approve &amp; Next accepts it. A truly blank title opens manual editing with a clear explanation.</w:t>
+        <w:t xml:space="preserve">2. </w:t>
+      </w:r>
+      <w:r>
+        <w:t>When recognition fails, open Review Failure.</w:t>
       </w:r>
     </w:p>
     <w:p>
-      <w:r>
-        <w:br w:type="page"/>
+      <w:pPr>
+        <w:ind w:left="173" w:hanging="173"/>
+      </w:pPr>
+      <w:r>
+        <w:rPr>
+          <w:b/>
+          <w:color w:val="8055D9"/>
+        </w:rPr>
+        <w:t xml:space="preserve">3. </w:t>
+      </w:r>
+      <w:r>
+        <w:t>Read the human-readable reason, provider, timestamp, completed count, and remaining count.</w:t>
       </w:r>
     </w:p>
     <w:p>
       <w:pPr>
+        <w:ind w:left="173" w:hanging="173"/>
+      </w:pPr>
+      <w:r>
+        <w:rPr>
+          <w:b/>
+          <w:color w:val="8055D9"/>
+        </w:rPr>
+        <w:t xml:space="preserve">4. </w:t>
+      </w:r>
+      <w:r>
+        <w:t>Choose Retry Failed Items, another provider, Manual Review, Skip Recognition, or Diagnostics.</w:t>
+      </w:r>
+    </w:p>
+    <w:p>
+      <w:pPr>
+        <w:ind w:left="173" w:hanging="173"/>
+      </w:pPr>
+      <w:r>
+        <w:rPr>
+          <w:b/>
+          <w:color w:val="8055D9"/>
+        </w:rPr>
+        <w:t xml:space="preserve">5. </w:t>
+      </w:r>
+      <w:r>
+        <w:t>Manual Review leaves items unfinished and editable; it does not falsely mark them recognized.</w:t>
+      </w:r>
+    </w:p>
+    <w:p>
+      <w:pPr>
+        <w:spacing w:after="80"/>
         <w:jc w:val="center"/>
       </w:pPr>
       <w:r>
         <w:drawing>
           <wp:inline xmlns:a="http://schemas.openxmlformats.org/drawingml/2006/main" xmlns:pic="http://schemas.openxmlformats.org/drawingml/2006/picture">
-            <wp:extent cx="5577840" cy="5267960"/>
-            <wp:docPr id="8" name="Picture 8"/>
+            <wp:extent cx="6400800" cy="4142740"/>
+            <wp:docPr id="7" name="Picture 7"/>
             <wp:cNvGraphicFramePr>
               <a:graphicFrameLocks noChangeAspect="1"/>
             </wp:cNvGraphicFramePr>
@@ -662,7 +961,7 @@
               <a:graphicData uri="http://schemas.openxmlformats.org/drawingml/2006/picture">
                 <pic:pic>
                   <pic:nvPicPr>
-                    <pic:cNvPr id="0" name="08-price-enter-next.png"/>
+                    <pic:cNvPr id="0" name="06-recognition-failure-recovery-part-01.png"/>
                     <pic:cNvPicPr/>
                   </pic:nvPicPr>
                   <pic:blipFill>
@@ -674,7 +973,7 @@
                   <pic:spPr>
                     <a:xfrm>
                       <a:off x="0" y="0"/>
-                      <a:ext cx="5577840" cy="5267960"/>
+                      <a:ext cx="6400800" cy="4142740"/>
                     </a:xfrm>
                     <a:prstGeom prst="rect"/>
                   </pic:spPr>
@@ -687,86 +986,33 @@
     </w:p>
     <w:p>
       <w:pPr>
+        <w:spacing w:after="160"/>
         <w:jc w:val="center"/>
       </w:pPr>
       <w:r>
         <w:rPr>
           <w:i/>
+          <w:color w:val="6A6475"/>
           <w:sz w:val="16"/>
         </w:rPr>
-        <w:t>Price -&gt; Enter -&gt; next tape keyboard workflow</w:t>
+        <w:t>Recognition failure recovery workspace - view 1 of 2</w:t>
       </w:r>
     </w:p>
     <w:p>
       <w:r>
-        <w:rPr>
-          <w:b w:val="0"/>
-        </w:rPr>
-        <w:t>Later leaves the tape unfinished. Completed items can be reopened and corrected without changing their immutable Item ID.</w:t>
+        <w:br w:type="page"/>
       </w:r>
     </w:p>
     <w:p>
-      <w:r>
-        <w:br w:type="page"/>
-      </w:r>
-    </w:p>
-    <w:p>
-      <w:pPr>
-        <w:pStyle w:val="Heading1"/>
-      </w:pPr>
-      <w:r>
-        <w:rPr>
-          <w:b w:val="0"/>
-        </w:rPr>
-        <w:t>4. Batch Editor</w:t>
-      </w:r>
-    </w:p>
-    <w:p>
-      <w:r>
-        <w:rPr>
-          <w:b w:val="0"/>
-        </w:rPr>
-        <w:t>Batch Editor is the fast bulk-work workstation. Title, price, discount, description, location, flags, confidence, and status remain visible without horizontal scrolling at the standard workstation size.</w:t>
-      </w:r>
-    </w:p>
-    <w:p>
-      <w:r>
-        <w:rPr>
-          <w:b w:val="0"/>
-        </w:rPr>
-        <w:t>Use filters for unresolved, failed, low confidence, missing title, CSV changes, price thresholds, flags, and recent edits. Sort by physical order, confidence, title, price, location, status, or modification time.</w:t>
-      </w:r>
-    </w:p>
-    <w:p>
-      <w:r>
-        <w:rPr>
-          <w:b w:val="0"/>
-        </w:rPr>
-        <w:t>Inline edits save to the same authoritative working batch used by Review and Publish. Dirty, saving, saved, and failed states are visible. Stale revisions are rejected instead of silently overwriting newer work.</w:t>
-      </w:r>
-    </w:p>
-    <w:p>
-      <w:r>
-        <w:rPr>
-          <w:b w:val="0"/>
-        </w:rPr>
-        <w:t>Select rows for bulk price, discount, location, tags, rare/review flags, and approval. Large changes create rollback checkpoints.</w:t>
-      </w:r>
-    </w:p>
-    <w:p>
-      <w:r>
-        <w:br w:type="page"/>
-      </w:r>
-    </w:p>
-    <w:p>
-      <w:pPr>
+      <w:pPr>
+        <w:spacing w:after="80"/>
         <w:jc w:val="center"/>
       </w:pPr>
       <w:r>
         <w:drawing>
           <wp:inline xmlns:a="http://schemas.openxmlformats.org/drawingml/2006/main" xmlns:pic="http://schemas.openxmlformats.org/drawingml/2006/picture">
-            <wp:extent cx="5577840" cy="8273796"/>
-            <wp:docPr id="9" name="Picture 9"/>
+            <wp:extent cx="6400800" cy="4142740"/>
+            <wp:docPr id="8" name="Picture 8"/>
             <wp:cNvGraphicFramePr>
               <a:graphicFrameLocks noChangeAspect="1"/>
             </wp:cNvGraphicFramePr>
@@ -774,7 +1020,7 @@
               <a:graphicData uri="http://schemas.openxmlformats.org/drawingml/2006/picture">
                 <pic:pic>
                   <pic:nvPicPr>
-                    <pic:cNvPr id="0" name="09-batch-editor-bulk-price.png"/>
+                    <pic:cNvPr id="0" name="06-recognition-failure-recovery-part-02.png"/>
                     <pic:cNvPicPr/>
                   </pic:nvPicPr>
                   <pic:blipFill>
@@ -786,7 +1032,7 @@
                   <pic:spPr>
                     <a:xfrm>
                       <a:off x="0" y="0"/>
-                      <a:ext cx="5577840" cy="8273796"/>
+                      <a:ext cx="6400800" cy="4142740"/>
                     </a:xfrm>
                     <a:prstGeom prst="rect"/>
                   </pic:spPr>
@@ -799,38 +1045,136 @@
     </w:p>
     <w:p>
       <w:pPr>
+        <w:spacing w:after="160"/>
         <w:jc w:val="center"/>
       </w:pPr>
       <w:r>
         <w:rPr>
           <w:i/>
+          <w:color w:val="6A6475"/>
           <w:sz w:val="16"/>
         </w:rPr>
-        <w:t>Twenty-row bulk price operation in Batch Editor</w:t>
+        <w:t>Recognition failure recovery workspace - view 2 of 2</w:t>
       </w:r>
     </w:p>
     <w:p>
       <w:r>
-        <w:rPr>
-          <w:b w:val="0"/>
-        </w:rPr>
-        <w:t>Ctrl+Shift+P opens the command palette for common navigation and batch actions.</w:t>
+        <w:br w:type="page"/>
       </w:r>
     </w:p>
     <w:p>
-      <w:r>
-        <w:br w:type="page"/>
+      <w:pPr>
+        <w:pStyle w:val="Heading1"/>
+      </w:pPr>
+      <w:r>
+        <w:t>5. Fast Individual Review</w:t>
       </w:r>
     </w:p>
     <w:p>
-      <w:pPr>
+      <w:r>
+        <w:t>Review is optimized for the routine loop: look, confirm, optionally type a price, press Enter, and continue.</w:t>
+      </w:r>
+    </w:p>
+    <w:p>
+      <w:pPr>
+        <w:ind w:left="173" w:hanging="173"/>
+      </w:pPr>
+      <w:r>
+        <w:rPr>
+          <w:b/>
+          <w:color w:val="8055D9"/>
+        </w:rPr>
+        <w:t xml:space="preserve">1. </w:t>
+      </w:r>
+      <w:r>
+        <w:t>Confirm the displayed title. SnapIMS uses manual, saved, CSV, then AI values in that order.</w:t>
+      </w:r>
+    </w:p>
+    <w:p>
+      <w:pPr>
+        <w:ind w:left="173" w:hanging="173"/>
+      </w:pPr>
+      <w:r>
+        <w:rPr>
+          <w:b/>
+          <w:color w:val="8055D9"/>
+        </w:rPr>
+        <w:t xml:space="preserve">2. </w:t>
+      </w:r>
+      <w:r>
+        <w:t>The Price field is focused and selected when an unfinished tape opens.</w:t>
+      </w:r>
+    </w:p>
+    <w:p>
+      <w:pPr>
+        <w:ind w:left="173" w:hanging="173"/>
+      </w:pPr>
+      <w:r>
+        <w:rPr>
+          <w:b/>
+          <w:color w:val="8055D9"/>
+        </w:rPr>
+        <w:t xml:space="preserve">3. </w:t>
+      </w:r>
+      <w:r>
+        <w:t>Type a replacement price or leave the current value unchanged.</w:t>
+      </w:r>
+    </w:p>
+    <w:p>
+      <w:pPr>
+        <w:ind w:left="173" w:hanging="173"/>
+      </w:pPr>
+      <w:r>
+        <w:rPr>
+          <w:b/>
+          <w:color w:val="8055D9"/>
+        </w:rPr>
+        <w:t xml:space="preserve">4. </w:t>
+      </w:r>
+      <w:r>
+        <w:t>Press Enter to run Approve &amp; Next. The next unfinished tape opens with Price selected again.</w:t>
+      </w:r>
+    </w:p>
+    <w:p>
+      <w:pPr>
+        <w:ind w:left="173" w:hanging="173"/>
+      </w:pPr>
+      <w:r>
+        <w:rPr>
+          <w:b/>
+          <w:color w:val="8055D9"/>
+        </w:rPr>
+        <w:t xml:space="preserve">5. </w:t>
+      </w:r>
+      <w:r>
+        <w:t>Use Later to postpone the item without marking it complete.</w:t>
+      </w:r>
+    </w:p>
+    <w:p>
+      <w:pPr>
+        <w:ind w:left="173" w:hanging="173"/>
+      </w:pPr>
+      <w:r>
+        <w:rPr>
+          <w:b/>
+          <w:color w:val="8055D9"/>
+        </w:rPr>
+        <w:t xml:space="preserve">6. </w:t>
+      </w:r>
+      <w:r>
+        <w:t>Use full Edit only for deeper corrections or a genuinely missing title.</w:t>
+      </w:r>
+    </w:p>
+    <w:p>
+      <w:pPr>
+        <w:spacing w:after="80"/>
         <w:jc w:val="center"/>
       </w:pPr>
       <w:r>
         <w:drawing>
           <wp:inline xmlns:a="http://schemas.openxmlformats.org/drawingml/2006/main" xmlns:pic="http://schemas.openxmlformats.org/drawingml/2006/picture">
-            <wp:extent cx="5577840" cy="8273796"/>
-            <wp:docPr id="10" name="Picture 10"/>
+            <wp:extent cx="6400800" cy="3222625"/>
+            <wp:docPr id="9" name="Picture 9"/>
             <wp:cNvGraphicFramePr>
               <a:graphicFrameLocks noChangeAspect="1"/>
             </wp:cNvGraphicFramePr>
@@ -838,7 +1182,7 @@
               <a:graphicData uri="http://schemas.openxmlformats.org/drawingml/2006/picture">
                 <pic:pic>
                   <pic:nvPicPr>
-                    <pic:cNvPr id="0" name="10-command-palette.png"/>
+                    <pic:cNvPr id="0" name="08-price-enter-next-part-01.png"/>
                     <pic:cNvPicPr/>
                   </pic:nvPicPr>
                   <pic:blipFill>
@@ -850,7 +1194,7 @@
                   <pic:spPr>
                     <a:xfrm>
                       <a:off x="0" y="0"/>
-                      <a:ext cx="5577840" cy="8273796"/>
+                      <a:ext cx="6400800" cy="3222625"/>
                     </a:xfrm>
                     <a:prstGeom prst="rect"/>
                   </pic:spPr>
@@ -863,14 +1207,16 @@
     </w:p>
     <w:p>
       <w:pPr>
+        <w:spacing w:after="160"/>
         <w:jc w:val="center"/>
       </w:pPr>
       <w:r>
         <w:rPr>
           <w:i/>
+          <w:color w:val="6A6475"/>
           <w:sz w:val="16"/>
         </w:rPr>
-        <w:t>Keyboard command palette</w:t>
+        <w:t>Price -&gt; Enter -&gt; next Price workflow - view 1 of 2</w:t>
       </w:r>
     </w:p>
     <w:p>
@@ -880,45 +1226,14 @@
     </w:p>
     <w:p>
       <w:pPr>
-        <w:pStyle w:val="Heading1"/>
-      </w:pPr>
-      <w:r>
-        <w:rPr>
-          <w:b w:val="0"/>
-        </w:rPr>
-        <w:t>5. CSV round trip and difference preview</w:t>
-      </w:r>
-    </w:p>
-    <w:p>
-      <w:r>
-        <w:rPr>
-          <w:b w:val="0"/>
-        </w:rPr>
-        <w:t>Download CSV from Publish for external editing. Upload the edited CSV back to SnapIMS. The upload is staged and cannot alter the working batch until the difference preview is confirmed.</w:t>
-      </w:r>
-    </w:p>
-    <w:p>
-      <w:r>
-        <w:rPr>
-          <w:b w:val="0"/>
-        </w:rPr>
-        <w:t>The preview summarizes matched, changed, unchanged, missing, unmatched, and invalid rows. Changed fields show current and uploaded values. Blocking errors must be resolved before application.</w:t>
-      </w:r>
-    </w:p>
-    <w:p>
-      <w:r>
-        <w:br w:type="page"/>
-      </w:r>
-    </w:p>
-    <w:p>
-      <w:pPr>
+        <w:spacing w:after="80"/>
         <w:jc w:val="center"/>
       </w:pPr>
       <w:r>
         <w:drawing>
           <wp:inline xmlns:a="http://schemas.openxmlformats.org/drawingml/2006/main" xmlns:pic="http://schemas.openxmlformats.org/drawingml/2006/picture">
-            <wp:extent cx="5577840" cy="9327388"/>
-            <wp:docPr id="11" name="Picture 11"/>
+            <wp:extent cx="6400800" cy="3222625"/>
+            <wp:docPr id="10" name="Picture 10"/>
             <wp:cNvGraphicFramePr>
               <a:graphicFrameLocks noChangeAspect="1"/>
             </wp:cNvGraphicFramePr>
@@ -926,7 +1241,7 @@
               <a:graphicData uri="http://schemas.openxmlformats.org/drawingml/2006/picture">
                 <pic:pic>
                   <pic:nvPicPr>
-                    <pic:cNvPr id="0" name="11-csv-difference-preview.png"/>
+                    <pic:cNvPr id="0" name="08-price-enter-next-part-02.png"/>
                     <pic:cNvPicPr/>
                   </pic:nvPicPr>
                   <pic:blipFill>
@@ -938,7 +1253,7 @@
                   <pic:spPr>
                     <a:xfrm>
                       <a:off x="0" y="0"/>
-                      <a:ext cx="5577840" cy="9327388"/>
+                      <a:ext cx="6400800" cy="3222625"/>
                     </a:xfrm>
                     <a:prstGeom prst="rect"/>
                   </pic:spPr>
@@ -951,38 +1266,136 @@
     </w:p>
     <w:p>
       <w:pPr>
+        <w:spacing w:after="160"/>
         <w:jc w:val="center"/>
       </w:pPr>
       <w:r>
         <w:rPr>
           <w:i/>
+          <w:color w:val="6A6475"/>
           <w:sz w:val="16"/>
         </w:rPr>
-        <w:t>CSV difference preview before applying values</w:t>
+        <w:t>Price -&gt; Enter -&gt; next Price workflow - view 2 of 2</w:t>
       </w:r>
     </w:p>
     <w:p>
       <w:r>
-        <w:rPr>
-          <w:b w:val="0"/>
-        </w:rPr>
-        <w:t>Applying a CSV creates a durable rollback checkpoint. Immutable Item IDs remain unchanged. Review, Batch Editor, CSV export, and Publish immediately use the applied working values.</w:t>
+        <w:br w:type="page"/>
       </w:r>
     </w:p>
     <w:p>
-      <w:r>
-        <w:br w:type="page"/>
+      <w:pPr>
+        <w:pStyle w:val="Heading1"/>
+      </w:pPr>
+      <w:r>
+        <w:t>6. Catalog Match States</w:t>
       </w:r>
     </w:p>
     <w:p>
-      <w:pPr>
+      <w:r>
+        <w:t>The compact catalog strip is evidence, not a second approval workflow. The photograph remains authority and Approve &amp; Next remains the routine action.</w:t>
+      </w:r>
+    </w:p>
+    <w:p>
+      <w:pPr>
+        <w:ind w:left="173" w:hanging="173"/>
+      </w:pPr>
+      <w:r>
+        <w:rPr>
+          <w:b/>
+          <w:color w:val="8055D9"/>
+        </w:rPr>
+        <w:t xml:space="preserve">1. </w:t>
+      </w:r>
+      <w:r>
+        <w:t>Local Match means the recognized title reused an existing permanent Movie record and made no Wikipedia request.</w:t>
+      </w:r>
+    </w:p>
+    <w:p>
+      <w:pPr>
+        <w:ind w:left="173" w:hanging="173"/>
+      </w:pPr>
+      <w:r>
+        <w:rPr>
+          <w:b/>
+          <w:color w:val="8055D9"/>
+        </w:rPr>
+        <w:t xml:space="preserve">2. </w:t>
+      </w:r>
+      <w:r>
+        <w:t>New Catalog Record means a bounded Wikipedia miss flow created one permanent Movie record with source provenance.</w:t>
+      </w:r>
+    </w:p>
+    <w:p>
+      <w:pPr>
+        <w:ind w:left="173" w:hanging="173"/>
+      </w:pPr>
+      <w:r>
+        <w:rPr>
+          <w:b/>
+          <w:color w:val="8055D9"/>
+        </w:rPr>
+        <w:t xml:space="preserve">3. </w:t>
+      </w:r>
+      <w:r>
+        <w:t>Searching means the background external lookup is still running; Review remains usable.</w:t>
+      </w:r>
+    </w:p>
+    <w:p>
+      <w:pPr>
+        <w:ind w:left="173" w:hanging="173"/>
+      </w:pPr>
+      <w:r>
+        <w:rPr>
+          <w:b/>
+          <w:color w:val="8055D9"/>
+        </w:rPr>
+        <w:t xml:space="preserve">4. </w:t>
+      </w:r>
+      <w:r>
+        <w:t>Ambiguous means two or more credible films remain. Open the candidate panel or Edit details before approval.</w:t>
+      </w:r>
+    </w:p>
+    <w:p>
+      <w:pPr>
+        <w:ind w:left="173" w:hanging="173"/>
+      </w:pPr>
+      <w:r>
+        <w:rPr>
+          <w:b/>
+          <w:color w:val="8055D9"/>
+        </w:rPr>
+        <w:t xml:space="preserve">5. </w:t>
+      </w:r>
+      <w:r>
+        <w:t>Not Found, Failed, Needs Review, or Catalog Unavailable leave the original AI suggestion visible and do not destroy the physical Item.</w:t>
+      </w:r>
+    </w:p>
+    <w:p>
+      <w:pPr>
+        <w:ind w:left="173" w:hanging="173"/>
+      </w:pPr>
+      <w:r>
+        <w:rPr>
+          <w:b/>
+          <w:color w:val="8055D9"/>
+        </w:rPr>
+        <w:t xml:space="preserve">6. </w:t>
+      </w:r>
+      <w:r>
+        <w:t>The displayed title precedence is operator-saved title, unique catalog title, AI suggestion, then manual Untitled state.</w:t>
+      </w:r>
+    </w:p>
+    <w:p>
+      <w:pPr>
+        <w:spacing w:after="80"/>
         <w:jc w:val="center"/>
       </w:pPr>
       <w:r>
         <w:drawing>
           <wp:inline xmlns:a="http://schemas.openxmlformats.org/drawingml/2006/main" xmlns:pic="http://schemas.openxmlformats.org/drawingml/2006/picture">
-            <wp:extent cx="5577840" cy="5666930"/>
-            <wp:docPr id="12" name="Picture 12"/>
+            <wp:extent cx="6400800" cy="3133725"/>
+            <wp:docPr id="11" name="Picture 11"/>
             <wp:cNvGraphicFramePr>
               <a:graphicFrameLocks noChangeAspect="1"/>
             </wp:cNvGraphicFramePr>
@@ -990,7 +1403,7 @@
               <a:graphicData uri="http://schemas.openxmlformats.org/drawingml/2006/picture">
                 <pic:pic>
                   <pic:nvPicPr>
-                    <pic:cNvPr id="0" name="12-csv-applied.png"/>
+                    <pic:cNvPr id="0" name="03-local-match-review-part-01.png"/>
                     <pic:cNvPicPr/>
                   </pic:nvPicPr>
                   <pic:blipFill>
@@ -1002,7 +1415,7 @@
                   <pic:spPr>
                     <a:xfrm>
                       <a:off x="0" y="0"/>
-                      <a:ext cx="5577840" cy="5666930"/>
+                      <a:ext cx="6400800" cy="3133725"/>
                     </a:xfrm>
                     <a:prstGeom prst="rect"/>
                   </pic:spPr>
@@ -1015,70 +1428,33 @@
     </w:p>
     <w:p>
       <w:pPr>
+        <w:spacing w:after="160"/>
         <w:jc w:val="center"/>
       </w:pPr>
       <w:r>
         <w:rPr>
           <w:i/>
+          <w:color w:val="6A6475"/>
           <w:sz w:val="16"/>
         </w:rPr>
-        <w:t>CSV values applied to the authoritative working batch</w:t>
+        <w:t>Compact local catalog match in the normal Review workstation - view 1 of 2</w:t>
       </w:r>
     </w:p>
     <w:p>
       <w:r>
-        <w:rPr>
-          <w:b w:val="0"/>
-        </w:rPr>
-        <w:t>Mark Uploaded Batch as Externally Reviewed is available only after validation succeeds and the operator explicitly accepts responsibility. Unresolved rows remain unfinished.</w:t>
+        <w:br w:type="page"/>
       </w:r>
     </w:p>
     <w:p>
-      <w:r>
-        <w:br w:type="page"/>
-      </w:r>
-    </w:p>
-    <w:p>
-      <w:pPr>
-        <w:pStyle w:val="Heading1"/>
-      </w:pPr>
-      <w:r>
-        <w:rPr>
-          <w:b w:val="0"/>
-        </w:rPr>
-        <w:t>6. Publish and export</w:t>
-      </w:r>
-    </w:p>
-    <w:p>
-      <w:r>
-        <w:rPr>
-          <w:b w:val="0"/>
-        </w:rPr>
-        <w:t>Publish validates the current authoritative working batch regardless of whether values came from AI, Review, Batch Editor, or CSV. Blockers link back to the item that needs correction.</w:t>
-      </w:r>
-    </w:p>
-    <w:p>
-      <w:r>
-        <w:rPr>
-          <w:b w:val="0"/>
-        </w:rPr>
-        <w:t>Use Shopify Simulation before a live publish. Download the current CSV at any time. Live Shopify publishing remains subject to correct credentials, explicit confirmation, and production acceptance testing.</w:t>
-      </w:r>
-    </w:p>
-    <w:p>
-      <w:r>
-        <w:br w:type="page"/>
-      </w:r>
-    </w:p>
-    <w:p>
-      <w:pPr>
+      <w:pPr>
+        <w:spacing w:after="80"/>
         <w:jc w:val="center"/>
       </w:pPr>
       <w:r>
         <w:drawing>
           <wp:inline xmlns:a="http://schemas.openxmlformats.org/drawingml/2006/main" xmlns:pic="http://schemas.openxmlformats.org/drawingml/2006/picture">
-            <wp:extent cx="5577840" cy="11546904"/>
-            <wp:docPr id="13" name="Picture 13"/>
+            <wp:extent cx="6400800" cy="3133725"/>
+            <wp:docPr id="12" name="Picture 12"/>
             <wp:cNvGraphicFramePr>
               <a:graphicFrameLocks noChangeAspect="1"/>
             </wp:cNvGraphicFramePr>
@@ -1086,7 +1462,7 @@
               <a:graphicData uri="http://schemas.openxmlformats.org/drawingml/2006/picture">
                 <pic:pic>
                   <pic:nvPicPr>
-                    <pic:cNvPr id="0" name="13-publish-simulation.png"/>
+                    <pic:cNvPr id="0" name="03-local-match-review-part-02.png"/>
                     <pic:cNvPicPr/>
                   </pic:nvPicPr>
                   <pic:blipFill>
@@ -1098,7 +1474,7 @@
                   <pic:spPr>
                     <a:xfrm>
                       <a:off x="0" y="0"/>
-                      <a:ext cx="5577840" cy="11546904"/>
+                      <a:ext cx="6400800" cy="3133725"/>
                     </a:xfrm>
                     <a:prstGeom prst="rect"/>
                   </pic:spPr>
@@ -1111,14 +1487,16 @@
     </w:p>
     <w:p>
       <w:pPr>
+        <w:spacing w:after="160"/>
         <w:jc w:val="center"/>
       </w:pPr>
       <w:r>
         <w:rPr>
           <w:i/>
+          <w:color w:val="6A6475"/>
           <w:sz w:val="16"/>
         </w:rPr>
-        <w:t>Publish simulation using current working values</w:t>
+        <w:t>Compact local catalog match in the normal Review workstation - view 2 of 2</w:t>
       </w:r>
     </w:p>
     <w:p>
@@ -1131,34 +1509,99 @@
         <w:pStyle w:val="Heading1"/>
       </w:pPr>
       <w:r>
-        <w:rPr>
-          <w:b w:val="0"/>
-        </w:rPr>
-        <w:t>7. Restart and recovery</w:t>
+        <w:t>7. First Miss and Permanent Reuse</w:t>
       </w:r>
     </w:p>
     <w:p>
       <w:r>
-        <w:rPr>
-          <w:b w:val="0"/>
-        </w:rPr>
-        <w:t>SnapIMS restores durable batch state, review cursor, recognition state, applied CSV values, Batch Editor values, and checkpoints after restart. A dead recognition worker is not left displayed as active forever.</w:t>
+        <w:t>Wikipedia is an external discovery source only. SnapIMS stores normalized Movie facts permanently in movie_catalog.sqlite3 and searches that database first on every future recognition.</w:t>
       </w:r>
     </w:p>
     <w:p>
-      <w:r>
-        <w:br w:type="page"/>
+      <w:pPr>
+        <w:ind w:left="173" w:hanging="173"/>
+      </w:pPr>
+      <w:r>
+        <w:rPr>
+          <w:b/>
+          <w:color w:val="8055D9"/>
+        </w:rPr>
+        <w:t xml:space="preserve">1. </w:t>
+      </w:r>
+      <w:r>
+        <w:t>A genuine local miss queues a bounded English Wikipedia lookup through the official MediaWiki endpoint.</w:t>
       </w:r>
     </w:p>
     <w:p>
       <w:pPr>
+        <w:ind w:left="173" w:hanging="173"/>
+      </w:pPr>
+      <w:r>
+        <w:rPr>
+          <w:b/>
+          <w:color w:val="8055D9"/>
+        </w:rPr>
+        <w:t xml:space="preserve">2. </w:t>
+      </w:r>
+      <w:r>
+        <w:t>SnapIMS normally inspects no more than five candidates and rejects obvious songs, albums, books, people, companies, and unrelated episodes.</w:t>
+      </w:r>
+    </w:p>
+    <w:p>
+      <w:pPr>
+        <w:ind w:left="173" w:hanging="173"/>
+      </w:pPr>
+      <w:r>
+        <w:rPr>
+          <w:b/>
+          <w:color w:val="8055D9"/>
+        </w:rPr>
+        <w:t xml:space="preserve">3. </w:t>
+      </w:r>
+      <w:r>
+        <w:t>A materially unique film creates one permanent Movie, aliases, source provenance, and an Item link.</w:t>
+      </w:r>
+    </w:p>
+    <w:p>
+      <w:pPr>
+        <w:ind w:left="173" w:hanging="173"/>
+      </w:pPr>
+      <w:r>
+        <w:rPr>
+          <w:b/>
+          <w:color w:val="8055D9"/>
+        </w:rPr>
+        <w:t xml:space="preserve">4. </w:t>
+      </w:r>
+      <w:r>
+        <w:t>A later copy of the same movie reuses that Movie ID with zero new Wikipedia request.</w:t>
+      </w:r>
+    </w:p>
+    <w:p>
+      <w:pPr>
+        <w:ind w:left="173" w:hanging="173"/>
+      </w:pPr>
+      <w:r>
+        <w:rPr>
+          <w:b/>
+          <w:color w:val="8055D9"/>
+        </w:rPr>
+        <w:t xml:space="preserve">5. </w:t>
+      </w:r>
+      <w:r>
+        <w:t>Wikipedia can establish film-level facts; it cannot establish exact VHS distributor, UPC, Canadian edition, cover variant, condition, shelf, price, discount, or quantity.</w:t>
+      </w:r>
+    </w:p>
+    <w:p>
+      <w:pPr>
+        <w:spacing w:after="80"/>
         <w:jc w:val="center"/>
       </w:pPr>
       <w:r>
         <w:drawing>
           <wp:inline xmlns:a="http://schemas.openxmlformats.org/drawingml/2006/main" xmlns:pic="http://schemas.openxmlformats.org/drawingml/2006/picture">
-            <wp:extent cx="5577840" cy="8940038"/>
-            <wp:docPr id="14" name="Picture 14"/>
+            <wp:extent cx="6400800" cy="3284855"/>
+            <wp:docPr id="13" name="Picture 13"/>
             <wp:cNvGraphicFramePr>
               <a:graphicFrameLocks noChangeAspect="1"/>
             </wp:cNvGraphicFramePr>
@@ -1166,7 +1609,7 @@
               <a:graphicData uri="http://schemas.openxmlformats.org/drawingml/2006/picture">
                 <pic:pic>
                   <pic:nvPicPr>
-                    <pic:cNvPr id="0" name="14-restart-durable.png"/>
+                    <pic:cNvPr id="0" name="04-new-wikipedia-record-and-next-part-01.png"/>
                     <pic:cNvPicPr/>
                   </pic:nvPicPr>
                   <pic:blipFill>
@@ -1178,7 +1621,7 @@
                   <pic:spPr>
                     <a:xfrm>
                       <a:off x="0" y="0"/>
-                      <a:ext cx="5577840" cy="8940038"/>
+                      <a:ext cx="6400800" cy="3284855"/>
                     </a:xfrm>
                     <a:prstGeom prst="rect"/>
                   </pic:spPr>
@@ -1191,70 +1634,33 @@
     </w:p>
     <w:p>
       <w:pPr>
+        <w:spacing w:after="160"/>
         <w:jc w:val="center"/>
       </w:pPr>
       <w:r>
         <w:rPr>
           <w:i/>
+          <w:color w:val="6A6475"/>
           <w:sz w:val="16"/>
         </w:rPr>
-        <w:t>Working values preserved across restart</w:t>
+        <w:t>New catalog record created after one bounded Wikipedia fixture lookup - view 1 of 2</w:t>
       </w:r>
     </w:p>
     <w:p>
       <w:r>
-        <w:rPr>
-          <w:b w:val="0"/>
-        </w:rPr>
-        <w:t>Use a checkpoint restore after a mistaken CSV import or large bulk operation. Restore is transactional and records the rollback in item history.</w:t>
+        <w:br w:type="page"/>
       </w:r>
     </w:p>
     <w:p>
-      <w:r>
-        <w:br w:type="page"/>
-      </w:r>
-    </w:p>
-    <w:p>
-      <w:pPr>
-        <w:pStyle w:val="Heading1"/>
-      </w:pPr>
-      <w:r>
-        <w:rPr>
-          <w:b w:val="0"/>
-        </w:rPr>
-        <w:t>8. Diagnostics</w:t>
-      </w:r>
-    </w:p>
-    <w:p>
-      <w:r>
-        <w:rPr>
-          <w:b w:val="0"/>
-        </w:rPr>
-        <w:t>Diagnostics shows application version, database path, schema version, integrity state, provider configuration without secrets, recent recognition jobs, media derivative totals, and recent CSV validation failures.</w:t>
-      </w:r>
-    </w:p>
-    <w:p>
-      <w:r>
-        <w:rPr>
-          <w:b w:val="0"/>
-        </w:rPr>
-        <w:t>Copy Diagnostic Summary provides a safe block for technical support. Never paste API keys into reports or screenshots.</w:t>
-      </w:r>
-    </w:p>
-    <w:p>
-      <w:r>
-        <w:br w:type="page"/>
-      </w:r>
-    </w:p>
-    <w:p>
-      <w:pPr>
+      <w:pPr>
+        <w:spacing w:after="80"/>
         <w:jc w:val="center"/>
       </w:pPr>
       <w:r>
         <w:drawing>
           <wp:inline xmlns:a="http://schemas.openxmlformats.org/drawingml/2006/main" xmlns:pic="http://schemas.openxmlformats.org/drawingml/2006/picture">
-            <wp:extent cx="5577840" cy="6983920"/>
-            <wp:docPr id="15" name="Picture 15"/>
+            <wp:extent cx="6400800" cy="3284855"/>
+            <wp:docPr id="14" name="Picture 14"/>
             <wp:cNvGraphicFramePr>
               <a:graphicFrameLocks noChangeAspect="1"/>
             </wp:cNvGraphicFramePr>
@@ -1262,7 +1668,7 @@
               <a:graphicData uri="http://schemas.openxmlformats.org/drawingml/2006/picture">
                 <pic:pic>
                   <pic:nvPicPr>
-                    <pic:cNvPr id="0" name="15-diagnostics.png"/>
+                    <pic:cNvPr id="0" name="04-new-wikipedia-record-and-next-part-02.png"/>
                     <pic:cNvPicPr/>
                   </pic:nvPicPr>
                   <pic:blipFill>
@@ -1274,7 +1680,7 @@
                   <pic:spPr>
                     <a:xfrm>
                       <a:off x="0" y="0"/>
-                      <a:ext cx="5577840" cy="6983920"/>
+                      <a:ext cx="6400800" cy="3284855"/>
                     </a:xfrm>
                     <a:prstGeom prst="rect"/>
                   </pic:spPr>
@@ -1287,14 +1693,16 @@
     </w:p>
     <w:p>
       <w:pPr>
+        <w:spacing w:after="160"/>
         <w:jc w:val="center"/>
       </w:pPr>
       <w:r>
         <w:rPr>
           <w:i/>
+          <w:color w:val="6A6475"/>
           <w:sz w:val="16"/>
         </w:rPr>
-        <w:t>Diagnostics for schema, providers, jobs, and media use</w:t>
+        <w:t>New catalog record created after one bounded Wikipedia fixture lookup - view 2 of 2</w:t>
       </w:r>
     </w:p>
     <w:p>
@@ -1307,119 +1715,2146 @@
         <w:pStyle w:val="Heading1"/>
       </w:pPr>
       <w:r>
-        <w:rPr>
-          <w:b w:val="0"/>
-        </w:rPr>
-        <w:t>9. End-of-batch checklist</w:t>
+        <w:t>8. Repeated Copies</w:t>
       </w:r>
     </w:p>
     <w:p>
       <w:r>
-        <w:rPr>
-          <w:b w:val="0"/>
-        </w:rPr>
-        <w:t>☐ Import preview matched the physical batch.</w:t>
+        <w:t>Repeated tapes remain separate physical Items even when they share one Movie record.</w:t>
       </w:r>
     </w:p>
     <w:p>
+      <w:pPr>
+        <w:ind w:left="173" w:hanging="173"/>
+      </w:pPr>
       <w:r>
         <w:rPr>
-          <w:b w:val="0"/>
+          <w:b/>
+          <w:color w:val="8055D9"/>
         </w:rPr>
-        <w:t>☐ Recognition failures were retried, skipped, or manually reviewed.</w:t>
+        <w:t xml:space="preserve">1. </w:t>
+      </w:r>
+      <w:r>
+        <w:t>Confirm that each tape keeps its own immutable Item ID, Batch ID, images, shelf, condition, price, discount, quantity, Review history, and Shopify state.</w:t>
       </w:r>
     </w:p>
     <w:p>
+      <w:pPr>
+        <w:ind w:left="173" w:hanging="173"/>
+      </w:pPr>
       <w:r>
         <w:rPr>
-          <w:b w:val="0"/>
+          <w:b/>
+          <w:color w:val="8055D9"/>
         </w:rPr>
-        <w:t>☐ No required title is blank.</w:t>
+        <w:t xml:space="preserve">2. </w:t>
+      </w:r>
+      <w:r>
+        <w:t>The shared Movie ID supplies reusable canonical title and factual metadata only.</w:t>
       </w:r>
     </w:p>
     <w:p>
+      <w:pPr>
+        <w:ind w:left="173" w:hanging="173"/>
+      </w:pPr>
       <w:r>
         <w:rPr>
-          <w:b w:val="0"/>
+          <w:b/>
+          <w:color w:val="8055D9"/>
         </w:rPr>
-        <w:t>☐ Prices, discounts, quantities, locations, and SKUs validate.</w:t>
+        <w:t xml:space="preserve">3. </w:t>
+      </w:r>
+      <w:r>
+        <w:t>Do not pool copies or infer a shared VHS Edition from the Movie match.</w:t>
       </w:r>
     </w:p>
     <w:p>
+      <w:pPr>
+        <w:ind w:left="173" w:hanging="173"/>
+      </w:pPr>
       <w:r>
         <w:rPr>
-          <w:b w:val="0"/>
+          <w:b/>
+          <w:color w:val="8055D9"/>
         </w:rPr>
-        <w:t>☐ Low-confidence and flagged records were reviewed.</w:t>
+        <w:t xml:space="preserve">4. </w:t>
+      </w:r>
+      <w:r>
+        <w:t>A corrected title marks the prior link stale, preserves link history, and starts a new local-first lookup.</w:t>
       </w:r>
     </w:p>
     <w:p>
-      <w:r>
-        <w:rPr>
-          <w:b w:val="0"/>
-        </w:rPr>
-        <w:t>☐ CSV differences, if used, were inspected before application.</w:t>
+      <w:pPr>
+        <w:spacing w:after="80"/>
+        <w:jc w:val="center"/>
+      </w:pPr>
+      <w:r>
+        <w:drawing>
+          <wp:inline xmlns:a="http://schemas.openxmlformats.org/drawingml/2006/main" xmlns:pic="http://schemas.openxmlformats.org/drawingml/2006/picture">
+            <wp:extent cx="6400800" cy="3133725"/>
+            <wp:docPr id="15" name="Picture 15"/>
+            <wp:cNvGraphicFramePr>
+              <a:graphicFrameLocks noChangeAspect="1"/>
+            </wp:cNvGraphicFramePr>
+            <a:graphic>
+              <a:graphicData uri="http://schemas.openxmlformats.org/drawingml/2006/picture">
+                <pic:pic>
+                  <pic:nvPicPr>
+                    <pic:cNvPr id="0" name="06-second-copy-local-reuse-part-01.png"/>
+                    <pic:cNvPicPr/>
+                  </pic:nvPicPr>
+                  <pic:blipFill>
+                    <a:blip r:embed="rId24"/>
+                    <a:stretch>
+                      <a:fillRect/>
+                    </a:stretch>
+                  </pic:blipFill>
+                  <pic:spPr>
+                    <a:xfrm>
+                      <a:off x="0" y="0"/>
+                      <a:ext cx="6400800" cy="3133725"/>
+                    </a:xfrm>
+                    <a:prstGeom prst="rect"/>
+                  </pic:spPr>
+                </pic:pic>
+              </a:graphicData>
+            </a:graphic>
+          </wp:inline>
+        </w:drawing>
       </w:r>
     </w:p>
     <w:p>
+      <w:pPr>
+        <w:spacing w:after="160"/>
+        <w:jc w:val="center"/>
+      </w:pPr>
       <w:r>
         <w:rPr>
-          <w:b w:val="0"/>
+          <w:i/>
+          <w:color w:val="6A6475"/>
+          <w:sz w:val="16"/>
         </w:rPr>
-        <w:t>☐ A rollback checkpoint exists before large bulk changes.</w:t>
+        <w:t>Second physical copy reusing the permanent local Movie record - view 1 of 2</w:t>
       </w:r>
     </w:p>
     <w:p>
       <w:r>
-        <w:rPr>
-          <w:b w:val="0"/>
-        </w:rPr>
-        <w:t>☐ Publish simulation passed.</w:t>
+        <w:br w:type="page"/>
       </w:r>
     </w:p>
     <w:p>
-      <w:r>
-        <w:rPr>
-          <w:b w:val="0"/>
-        </w:rPr>
-        <w:t>☐ Final CSV was downloaded and checked.</w:t>
+      <w:pPr>
+        <w:spacing w:after="80"/>
+        <w:jc w:val="center"/>
+      </w:pPr>
+      <w:r>
+        <w:drawing>
+          <wp:inline xmlns:a="http://schemas.openxmlformats.org/drawingml/2006/main" xmlns:pic="http://schemas.openxmlformats.org/drawingml/2006/picture">
+            <wp:extent cx="6400800" cy="3133725"/>
+            <wp:docPr id="16" name="Picture 16"/>
+            <wp:cNvGraphicFramePr>
+              <a:graphicFrameLocks noChangeAspect="1"/>
+            </wp:cNvGraphicFramePr>
+            <a:graphic>
+              <a:graphicData uri="http://schemas.openxmlformats.org/drawingml/2006/picture">
+                <pic:pic>
+                  <pic:nvPicPr>
+                    <pic:cNvPr id="0" name="06-second-copy-local-reuse-part-02.png"/>
+                    <pic:cNvPicPr/>
+                  </pic:nvPicPr>
+                  <pic:blipFill>
+                    <a:blip r:embed="rId25"/>
+                    <a:stretch>
+                      <a:fillRect/>
+                    </a:stretch>
+                  </pic:blipFill>
+                  <pic:spPr>
+                    <a:xfrm>
+                      <a:off x="0" y="0"/>
+                      <a:ext cx="6400800" cy="3133725"/>
+                    </a:xfrm>
+                    <a:prstGeom prst="rect"/>
+                  </pic:spPr>
+                </pic:pic>
+              </a:graphicData>
+            </a:graphic>
+          </wp:inline>
+        </w:drawing>
       </w:r>
     </w:p>
     <w:p>
+      <w:pPr>
+        <w:spacing w:after="160"/>
+        <w:jc w:val="center"/>
+      </w:pPr>
       <w:r>
         <w:rPr>
-          <w:b w:val="0"/>
+          <w:i/>
+          <w:color w:val="6A6475"/>
+          <w:sz w:val="16"/>
         </w:rPr>
-        <w:t>☐ SnapIMS was restarted once and the working batch remained intact.</w:t>
+        <w:t>Second physical copy reusing the permanent local Movie record - view 2 of 2</w:t>
       </w:r>
     </w:p>
     <w:p>
-      <w:pPr>
-        <w:pStyle w:val="Heading1"/>
-      </w:pPr>
-      <w:r>
-        <w:rPr>
-          <w:b w:val="0"/>
-        </w:rPr>
-        <w:t>Production status</w:t>
+      <w:r>
+        <w:br w:type="page"/>
       </w:r>
     </w:p>
     <w:p>
+      <w:pPr>
+        <w:pStyle w:val="Heading1"/>
+      </w:pPr>
+      <w:r>
+        <w:t>9. Batch Editor</w:t>
+      </w:r>
+    </w:p>
+    <w:p>
+      <w:r>
+        <w:t>Batch Editor is the bulk operator workstation. It edits the same authoritative working records used by Review and Publish.</w:t>
+      </w:r>
+    </w:p>
+    <w:p>
+      <w:pPr>
+        <w:ind w:left="173" w:hanging="173"/>
+      </w:pPr>
       <w:r>
         <w:rPr>
-          <w:b w:val="0"/>
+          <w:b/>
+          <w:color w:val="8055D9"/>
         </w:rPr>
-        <w:t>Version 0.6.0 is a minor operator-workstation release. It is not SnapIMS 1.0. The real 20-tape Pixel pilot, live AI test, one live Shopify draft, physical CSV reconciliation, final restart durability test, independent guide walkthrough, and absence of production blockers remain required before 1.0.0.</w:t>
+        <w:t xml:space="preserve">1. </w:t>
+      </w:r>
+      <w:r>
+        <w:t>Use search, status filters, confidence threshold, confidence buckets, and sorting to expose exceptions.</w:t>
       </w:r>
     </w:p>
+    <w:p>
+      <w:pPr>
+        <w:ind w:left="173" w:hanging="173"/>
+      </w:pPr>
+      <w:r>
+        <w:rPr>
+          <w:b/>
+          <w:color w:val="8055D9"/>
+        </w:rPr>
+        <w:t xml:space="preserve">2. </w:t>
+      </w:r>
+      <w:r>
+        <w:t>Edit Title, Price, Discount, Description, Location, flags, and other working fields directly.</w:t>
+      </w:r>
+    </w:p>
+    <w:p>
+      <w:pPr>
+        <w:ind w:left="173" w:hanging="173"/>
+      </w:pPr>
+      <w:r>
+        <w:rPr>
+          <w:b/>
+          <w:color w:val="8055D9"/>
+        </w:rPr>
+        <w:t xml:space="preserve">3. </w:t>
+      </w:r>
+      <w:r>
+        <w:t>Watch the save indicator. Failed edits remain visible instead of disappearing.</w:t>
+      </w:r>
+    </w:p>
+    <w:p>
+      <w:pPr>
+        <w:ind w:left="173" w:hanging="173"/>
+      </w:pPr>
+      <w:r>
+        <w:rPr>
+          <w:b/>
+          <w:color w:val="8055D9"/>
+        </w:rPr>
+        <w:t xml:space="preserve">4. </w:t>
+      </w:r>
+      <w:r>
+        <w:t>Use Ctrl+S to save pending work, Ctrl+F to focus search, Ctrl+A to select visible rows, and Ctrl+Z/Ctrl+Y to undo or redo local edits.</w:t>
+      </w:r>
+    </w:p>
+    <w:p>
+      <w:pPr>
+        <w:ind w:left="173" w:hanging="173"/>
+      </w:pPr>
+      <w:r>
+        <w:rPr>
+          <w:b/>
+          <w:color w:val="8055D9"/>
+        </w:rPr>
+        <w:t xml:space="preserve">5. </w:t>
+      </w:r>
+      <w:r>
+        <w:t>Click a thumbnail for the fast media viewer or confidence for stored recognition evidence.</w:t>
+      </w:r>
+    </w:p>
+    <w:p>
+      <w:pPr>
+        <w:spacing w:after="80"/>
+        <w:jc w:val="center"/>
+      </w:pPr>
+      <w:r>
+        <w:drawing>
+          <wp:inline xmlns:a="http://schemas.openxmlformats.org/drawingml/2006/main" xmlns:pic="http://schemas.openxmlformats.org/drawingml/2006/picture">
+            <wp:extent cx="6400800" cy="3364865"/>
+            <wp:docPr id="17" name="Picture 17"/>
+            <wp:cNvGraphicFramePr>
+              <a:graphicFrameLocks noChangeAspect="1"/>
+            </wp:cNvGraphicFramePr>
+            <a:graphic>
+              <a:graphicData uri="http://schemas.openxmlformats.org/drawingml/2006/picture">
+                <pic:pic>
+                  <pic:nvPicPr>
+                    <pic:cNvPr id="0" name="09-batch-editor-bulk-price-part-01.png"/>
+                    <pic:cNvPicPr/>
+                  </pic:nvPicPr>
+                  <pic:blipFill>
+                    <a:blip r:embed="rId26"/>
+                    <a:stretch>
+                      <a:fillRect/>
+                    </a:stretch>
+                  </pic:blipFill>
+                  <pic:spPr>
+                    <a:xfrm>
+                      <a:off x="0" y="0"/>
+                      <a:ext cx="6400800" cy="3364865"/>
+                    </a:xfrm>
+                    <a:prstGeom prst="rect"/>
+                  </pic:spPr>
+                </pic:pic>
+              </a:graphicData>
+            </a:graphic>
+          </wp:inline>
+        </w:drawing>
+      </w:r>
+    </w:p>
+    <w:p>
+      <w:pPr>
+        <w:spacing w:after="160"/>
+        <w:jc w:val="center"/>
+      </w:pPr>
+      <w:r>
+        <w:rPr>
+          <w:i/>
+          <w:color w:val="6A6475"/>
+          <w:sz w:val="16"/>
+        </w:rPr>
+        <w:t>Batch Editor with health, confidence, and bulk controls - view 1 of 3</w:t>
+      </w:r>
+    </w:p>
+    <w:p>
+      <w:r>
+        <w:br w:type="page"/>
+      </w:r>
+    </w:p>
+    <w:p>
+      <w:pPr>
+        <w:spacing w:after="80"/>
+        <w:jc w:val="center"/>
+      </w:pPr>
+      <w:r>
+        <w:drawing>
+          <wp:inline xmlns:a="http://schemas.openxmlformats.org/drawingml/2006/main" xmlns:pic="http://schemas.openxmlformats.org/drawingml/2006/picture">
+            <wp:extent cx="6400800" cy="3564890"/>
+            <wp:docPr id="18" name="Picture 18"/>
+            <wp:cNvGraphicFramePr>
+              <a:graphicFrameLocks noChangeAspect="1"/>
+            </wp:cNvGraphicFramePr>
+            <a:graphic>
+              <a:graphicData uri="http://schemas.openxmlformats.org/drawingml/2006/picture">
+                <pic:pic>
+                  <pic:nvPicPr>
+                    <pic:cNvPr id="0" name="09-batch-editor-bulk-price-part-02.png"/>
+                    <pic:cNvPicPr/>
+                  </pic:nvPicPr>
+                  <pic:blipFill>
+                    <a:blip r:embed="rId27"/>
+                    <a:stretch>
+                      <a:fillRect/>
+                    </a:stretch>
+                  </pic:blipFill>
+                  <pic:spPr>
+                    <a:xfrm>
+                      <a:off x="0" y="0"/>
+                      <a:ext cx="6400800" cy="3564890"/>
+                    </a:xfrm>
+                    <a:prstGeom prst="rect"/>
+                  </pic:spPr>
+                </pic:pic>
+              </a:graphicData>
+            </a:graphic>
+          </wp:inline>
+        </w:drawing>
+      </w:r>
+    </w:p>
+    <w:p>
+      <w:pPr>
+        <w:spacing w:after="160"/>
+        <w:jc w:val="center"/>
+      </w:pPr>
+      <w:r>
+        <w:rPr>
+          <w:i/>
+          <w:color w:val="6A6475"/>
+          <w:sz w:val="16"/>
+        </w:rPr>
+        <w:t>Batch Editor with health, confidence, and bulk controls - view 2 of 3</w:t>
+      </w:r>
+    </w:p>
+    <w:p>
+      <w:r>
+        <w:br w:type="page"/>
+      </w:r>
+    </w:p>
+    <w:p>
+      <w:pPr>
+        <w:spacing w:after="80"/>
+        <w:jc w:val="center"/>
+      </w:pPr>
+      <w:r>
+        <w:drawing>
+          <wp:inline xmlns:a="http://schemas.openxmlformats.org/drawingml/2006/main" xmlns:pic="http://schemas.openxmlformats.org/drawingml/2006/picture">
+            <wp:extent cx="6400800" cy="3364865"/>
+            <wp:docPr id="19" name="Picture 19"/>
+            <wp:cNvGraphicFramePr>
+              <a:graphicFrameLocks noChangeAspect="1"/>
+            </wp:cNvGraphicFramePr>
+            <a:graphic>
+              <a:graphicData uri="http://schemas.openxmlformats.org/drawingml/2006/picture">
+                <pic:pic>
+                  <pic:nvPicPr>
+                    <pic:cNvPr id="0" name="09-batch-editor-bulk-price-part-03.png"/>
+                    <pic:cNvPicPr/>
+                  </pic:nvPicPr>
+                  <pic:blipFill>
+                    <a:blip r:embed="rId28"/>
+                    <a:stretch>
+                      <a:fillRect/>
+                    </a:stretch>
+                  </pic:blipFill>
+                  <pic:spPr>
+                    <a:xfrm>
+                      <a:off x="0" y="0"/>
+                      <a:ext cx="6400800" cy="3364865"/>
+                    </a:xfrm>
+                    <a:prstGeom prst="rect"/>
+                  </pic:spPr>
+                </pic:pic>
+              </a:graphicData>
+            </a:graphic>
+          </wp:inline>
+        </w:drawing>
+      </w:r>
+    </w:p>
+    <w:p>
+      <w:pPr>
+        <w:spacing w:after="160"/>
+        <w:jc w:val="center"/>
+      </w:pPr>
+      <w:r>
+        <w:rPr>
+          <w:i/>
+          <w:color w:val="6A6475"/>
+          <w:sz w:val="16"/>
+        </w:rPr>
+        <w:t>Batch Editor with health, confidence, and bulk controls - view 3 of 3</w:t>
+      </w:r>
+    </w:p>
+    <w:p>
+      <w:r>
+        <w:br w:type="page"/>
+      </w:r>
+    </w:p>
+    <w:p>
+      <w:pPr>
+        <w:pStyle w:val="Heading1"/>
+      </w:pPr>
+      <w:r>
+        <w:t>10. Command Palette and Bulk Operations</w:t>
+      </w:r>
+    </w:p>
+    <w:p>
+      <w:r>
+        <w:t>The command palette supplements visible controls and keeps frequent actions keyboard-accessible.</w:t>
+      </w:r>
+    </w:p>
+    <w:p>
+      <w:pPr>
+        <w:ind w:left="173" w:hanging="173"/>
+      </w:pPr>
+      <w:r>
+        <w:rPr>
+          <w:b/>
+          <w:color w:val="8055D9"/>
+        </w:rPr>
+        <w:t xml:space="preserve">1. </w:t>
+      </w:r>
+      <w:r>
+        <w:t>Press Ctrl+Shift+P to open the command palette.</w:t>
+      </w:r>
+    </w:p>
+    <w:p>
+      <w:pPr>
+        <w:ind w:left="173" w:hanging="173"/>
+      </w:pPr>
+      <w:r>
+        <w:rPr>
+          <w:b/>
+          <w:color w:val="8055D9"/>
+        </w:rPr>
+        <w:t xml:space="preserve">2. </w:t>
+      </w:r>
+      <w:r>
+        <w:t>Jump to Review, Batch Editor, Publish, Import, Diagnostics, CSV tools, or batch rollback.</w:t>
+      </w:r>
+    </w:p>
+    <w:p>
+      <w:pPr>
+        <w:ind w:left="173" w:hanging="173"/>
+      </w:pPr>
+      <w:r>
+        <w:rPr>
+          <w:b/>
+          <w:color w:val="8055D9"/>
+        </w:rPr>
+        <w:t xml:space="preserve">3. </w:t>
+      </w:r>
+      <w:r>
+        <w:t>Select rows and preview bulk operations before applying them.</w:t>
+      </w:r>
+    </w:p>
+    <w:p>
+      <w:pPr>
+        <w:ind w:left="173" w:hanging="173"/>
+      </w:pPr>
+      <w:r>
+        <w:rPr>
+          <w:b/>
+          <w:color w:val="8055D9"/>
+        </w:rPr>
+        <w:t xml:space="preserve">4. </w:t>
+      </w:r>
+      <w:r>
+        <w:t>For ToonieTape work, select the intended rows, choose Bulk Price, enter $4.00, inspect the affected count, then Apply.</w:t>
+      </w:r>
+    </w:p>
+    <w:p>
+      <w:pPr>
+        <w:ind w:left="173" w:hanging="173"/>
+      </w:pPr>
+      <w:r>
+        <w:rPr>
+          <w:b/>
+          <w:color w:val="8055D9"/>
+        </w:rPr>
+        <w:t xml:space="preserve">5. </w:t>
+      </w:r>
+      <w:r>
+        <w:t>SnapIMS creates a checkpoint before large destructive operations.</w:t>
+      </w:r>
+    </w:p>
+    <w:p>
+      <w:pPr>
+        <w:spacing w:after="80"/>
+        <w:jc w:val="center"/>
+      </w:pPr>
+      <w:r>
+        <w:drawing>
+          <wp:inline xmlns:a="http://schemas.openxmlformats.org/drawingml/2006/main" xmlns:pic="http://schemas.openxmlformats.org/drawingml/2006/picture">
+            <wp:extent cx="6400800" cy="3364865"/>
+            <wp:docPr id="20" name="Picture 20"/>
+            <wp:cNvGraphicFramePr>
+              <a:graphicFrameLocks noChangeAspect="1"/>
+            </wp:cNvGraphicFramePr>
+            <a:graphic>
+              <a:graphicData uri="http://schemas.openxmlformats.org/drawingml/2006/picture">
+                <pic:pic>
+                  <pic:nvPicPr>
+                    <pic:cNvPr id="0" name="09-batch-editor-bulk-price-part-01.png"/>
+                    <pic:cNvPicPr/>
+                  </pic:nvPicPr>
+                  <pic:blipFill>
+                    <a:blip r:embed="rId26"/>
+                    <a:stretch>
+                      <a:fillRect/>
+                    </a:stretch>
+                  </pic:blipFill>
+                  <pic:spPr>
+                    <a:xfrm>
+                      <a:off x="0" y="0"/>
+                      <a:ext cx="6400800" cy="3364865"/>
+                    </a:xfrm>
+                    <a:prstGeom prst="rect"/>
+                  </pic:spPr>
+                </pic:pic>
+              </a:graphicData>
+            </a:graphic>
+          </wp:inline>
+        </w:drawing>
+      </w:r>
+    </w:p>
+    <w:p>
+      <w:pPr>
+        <w:spacing w:after="160"/>
+        <w:jc w:val="center"/>
+      </w:pPr>
+      <w:r>
+        <w:rPr>
+          <w:i/>
+          <w:color w:val="6A6475"/>
+          <w:sz w:val="16"/>
+        </w:rPr>
+        <w:t>Keyboard command palette - view 1 of 3</w:t>
+      </w:r>
+    </w:p>
+    <w:p>
+      <w:r>
+        <w:br w:type="page"/>
+      </w:r>
+    </w:p>
+    <w:p>
+      <w:pPr>
+        <w:spacing w:after="80"/>
+        <w:jc w:val="center"/>
+      </w:pPr>
+      <w:r>
+        <w:drawing>
+          <wp:inline xmlns:a="http://schemas.openxmlformats.org/drawingml/2006/main" xmlns:pic="http://schemas.openxmlformats.org/drawingml/2006/picture">
+            <wp:extent cx="6400800" cy="3564890"/>
+            <wp:docPr id="21" name="Picture 21"/>
+            <wp:cNvGraphicFramePr>
+              <a:graphicFrameLocks noChangeAspect="1"/>
+            </wp:cNvGraphicFramePr>
+            <a:graphic>
+              <a:graphicData uri="http://schemas.openxmlformats.org/drawingml/2006/picture">
+                <pic:pic>
+                  <pic:nvPicPr>
+                    <pic:cNvPr id="0" name="10-command-palette-part-02.png"/>
+                    <pic:cNvPicPr/>
+                  </pic:nvPicPr>
+                  <pic:blipFill>
+                    <a:blip r:embed="rId29"/>
+                    <a:stretch>
+                      <a:fillRect/>
+                    </a:stretch>
+                  </pic:blipFill>
+                  <pic:spPr>
+                    <a:xfrm>
+                      <a:off x="0" y="0"/>
+                      <a:ext cx="6400800" cy="3564890"/>
+                    </a:xfrm>
+                    <a:prstGeom prst="rect"/>
+                  </pic:spPr>
+                </pic:pic>
+              </a:graphicData>
+            </a:graphic>
+          </wp:inline>
+        </w:drawing>
+      </w:r>
+    </w:p>
+    <w:p>
+      <w:pPr>
+        <w:spacing w:after="160"/>
+        <w:jc w:val="center"/>
+      </w:pPr>
+      <w:r>
+        <w:rPr>
+          <w:i/>
+          <w:color w:val="6A6475"/>
+          <w:sz w:val="16"/>
+        </w:rPr>
+        <w:t>Keyboard command palette - view 2 of 3</w:t>
+      </w:r>
+    </w:p>
+    <w:p>
+      <w:r>
+        <w:br w:type="page"/>
+      </w:r>
+    </w:p>
+    <w:p>
+      <w:pPr>
+        <w:spacing w:after="80"/>
+        <w:jc w:val="center"/>
+      </w:pPr>
+      <w:r>
+        <w:drawing>
+          <wp:inline xmlns:a="http://schemas.openxmlformats.org/drawingml/2006/main" xmlns:pic="http://schemas.openxmlformats.org/drawingml/2006/picture">
+            <wp:extent cx="6400800" cy="3364865"/>
+            <wp:docPr id="22" name="Picture 22"/>
+            <wp:cNvGraphicFramePr>
+              <a:graphicFrameLocks noChangeAspect="1"/>
+            </wp:cNvGraphicFramePr>
+            <a:graphic>
+              <a:graphicData uri="http://schemas.openxmlformats.org/drawingml/2006/picture">
+                <pic:pic>
+                  <pic:nvPicPr>
+                    <pic:cNvPr id="0" name="10-command-palette-part-03.png"/>
+                    <pic:cNvPicPr/>
+                  </pic:nvPicPr>
+                  <pic:blipFill>
+                    <a:blip r:embed="rId30"/>
+                    <a:stretch>
+                      <a:fillRect/>
+                    </a:stretch>
+                  </pic:blipFill>
+                  <pic:spPr>
+                    <a:xfrm>
+                      <a:off x="0" y="0"/>
+                      <a:ext cx="6400800" cy="3364865"/>
+                    </a:xfrm>
+                    <a:prstGeom prst="rect"/>
+                  </pic:spPr>
+                </pic:pic>
+              </a:graphicData>
+            </a:graphic>
+          </wp:inline>
+        </w:drawing>
+      </w:r>
+    </w:p>
+    <w:p>
+      <w:pPr>
+        <w:spacing w:after="160"/>
+        <w:jc w:val="center"/>
+      </w:pPr>
+      <w:r>
+        <w:rPr>
+          <w:i/>
+          <w:color w:val="6A6475"/>
+          <w:sz w:val="16"/>
+        </w:rPr>
+        <w:t>Keyboard command palette - view 3 of 3</w:t>
+      </w:r>
+    </w:p>
+    <w:p>
+      <w:r>
+        <w:br w:type="page"/>
+      </w:r>
+    </w:p>
+    <w:p>
+      <w:pPr>
+        <w:pStyle w:val="Heading1"/>
+      </w:pPr>
+      <w:r>
+        <w:t>11. CSV Round Trip and Difference Preview</w:t>
+      </w:r>
+    </w:p>
+    <w:p>
+      <w:r>
+        <w:t>CSV remains available for external spreadsheet work, but uploaded values are never applied blindly.</w:t>
+      </w:r>
+    </w:p>
+    <w:p>
+      <w:pPr>
+        <w:ind w:left="173" w:hanging="173"/>
+      </w:pPr>
+      <w:r>
+        <w:rPr>
+          <w:b/>
+          <w:color w:val="8055D9"/>
+        </w:rPr>
+        <w:t xml:space="preserve">1. </w:t>
+      </w:r>
+      <w:r>
+        <w:t>Download the current working CSV from Publish or Batch Tools.</w:t>
+      </w:r>
+    </w:p>
+    <w:p>
+      <w:pPr>
+        <w:ind w:left="173" w:hanging="173"/>
+      </w:pPr>
+      <w:r>
+        <w:rPr>
+          <w:b/>
+          <w:color w:val="8055D9"/>
+        </w:rPr>
+        <w:t xml:space="preserve">2. </w:t>
+      </w:r>
+      <w:r>
+        <w:t>Edit the file in Excel or LibreOffice without changing immutable Item IDs.</w:t>
+      </w:r>
+    </w:p>
+    <w:p>
+      <w:pPr>
+        <w:ind w:left="173" w:hanging="173"/>
+      </w:pPr>
+      <w:r>
+        <w:rPr>
+          <w:b/>
+          <w:color w:val="8055D9"/>
+        </w:rPr>
+        <w:t xml:space="preserve">3. </w:t>
+      </w:r>
+      <w:r>
+        <w:t>Upload the edited CSV. SnapIMS stages it instead of modifying the batch immediately.</w:t>
+      </w:r>
+    </w:p>
+    <w:p>
+      <w:pPr>
+        <w:ind w:left="173" w:hanging="173"/>
+      </w:pPr>
+      <w:r>
+        <w:rPr>
+          <w:b/>
+          <w:color w:val="8055D9"/>
+        </w:rPr>
+        <w:t xml:space="preserve">4. </w:t>
+      </w:r>
+      <w:r>
+        <w:t>Use the Difference Preview to inspect matched rows, missing items, validation errors, and field-level changes.</w:t>
+      </w:r>
+    </w:p>
+    <w:p>
+      <w:pPr>
+        <w:ind w:left="173" w:hanging="173"/>
+      </w:pPr>
+      <w:r>
+        <w:rPr>
+          <w:b/>
+          <w:color w:val="8055D9"/>
+        </w:rPr>
+        <w:t xml:space="preserve">5. </w:t>
+      </w:r>
+      <w:r>
+        <w:t>Cancel to prove no values changed, or confirm Apply Valid Changes after all blocking errors are resolved.</w:t>
+      </w:r>
+    </w:p>
+    <w:p>
+      <w:pPr>
+        <w:ind w:left="173" w:hanging="173"/>
+      </w:pPr>
+      <w:r>
+        <w:rPr>
+          <w:b/>
+          <w:color w:val="8055D9"/>
+        </w:rPr>
+        <w:t xml:space="preserve">6. </w:t>
+      </w:r>
+      <w:r>
+        <w:t>Use Undo CSV Import to restore the durable checkpoint.</w:t>
+      </w:r>
+    </w:p>
+    <w:p>
+      <w:pPr>
+        <w:spacing w:after="80"/>
+        <w:jc w:val="center"/>
+      </w:pPr>
+      <w:r>
+        <w:drawing>
+          <wp:inline xmlns:a="http://schemas.openxmlformats.org/drawingml/2006/main" xmlns:pic="http://schemas.openxmlformats.org/drawingml/2006/picture">
+            <wp:extent cx="6400800" cy="3769360"/>
+            <wp:docPr id="23" name="Picture 23"/>
+            <wp:cNvGraphicFramePr>
+              <a:graphicFrameLocks noChangeAspect="1"/>
+            </wp:cNvGraphicFramePr>
+            <a:graphic>
+              <a:graphicData uri="http://schemas.openxmlformats.org/drawingml/2006/picture">
+                <pic:pic>
+                  <pic:nvPicPr>
+                    <pic:cNvPr id="0" name="11-csv-difference-preview-part-01.png"/>
+                    <pic:cNvPicPr/>
+                  </pic:nvPicPr>
+                  <pic:blipFill>
+                    <a:blip r:embed="rId31"/>
+                    <a:stretch>
+                      <a:fillRect/>
+                    </a:stretch>
+                  </pic:blipFill>
+                  <pic:spPr>
+                    <a:xfrm>
+                      <a:off x="0" y="0"/>
+                      <a:ext cx="6400800" cy="3769360"/>
+                    </a:xfrm>
+                    <a:prstGeom prst="rect"/>
+                  </pic:spPr>
+                </pic:pic>
+              </a:graphicData>
+            </a:graphic>
+          </wp:inline>
+        </w:drawing>
+      </w:r>
+    </w:p>
+    <w:p>
+      <w:pPr>
+        <w:spacing w:after="160"/>
+        <w:jc w:val="center"/>
+      </w:pPr>
+      <w:r>
+        <w:rPr>
+          <w:i/>
+          <w:color w:val="6A6475"/>
+          <w:sz w:val="16"/>
+        </w:rPr>
+        <w:t>CSV difference preview before application - view 1 of 3</w:t>
+      </w:r>
+    </w:p>
+    <w:p>
+      <w:r>
+        <w:br w:type="page"/>
+      </w:r>
+    </w:p>
+    <w:p>
+      <w:pPr>
+        <w:spacing w:after="80"/>
+        <w:jc w:val="center"/>
+      </w:pPr>
+      <w:r>
+        <w:drawing>
+          <wp:inline xmlns:a="http://schemas.openxmlformats.org/drawingml/2006/main" xmlns:pic="http://schemas.openxmlformats.org/drawingml/2006/picture">
+            <wp:extent cx="6400800" cy="3969385"/>
+            <wp:docPr id="24" name="Picture 24"/>
+            <wp:cNvGraphicFramePr>
+              <a:graphicFrameLocks noChangeAspect="1"/>
+            </wp:cNvGraphicFramePr>
+            <a:graphic>
+              <a:graphicData uri="http://schemas.openxmlformats.org/drawingml/2006/picture">
+                <pic:pic>
+                  <pic:nvPicPr>
+                    <pic:cNvPr id="0" name="11-csv-difference-preview-part-02.png"/>
+                    <pic:cNvPicPr/>
+                  </pic:nvPicPr>
+                  <pic:blipFill>
+                    <a:blip r:embed="rId32"/>
+                    <a:stretch>
+                      <a:fillRect/>
+                    </a:stretch>
+                  </pic:blipFill>
+                  <pic:spPr>
+                    <a:xfrm>
+                      <a:off x="0" y="0"/>
+                      <a:ext cx="6400800" cy="3969385"/>
+                    </a:xfrm>
+                    <a:prstGeom prst="rect"/>
+                  </pic:spPr>
+                </pic:pic>
+              </a:graphicData>
+            </a:graphic>
+          </wp:inline>
+        </w:drawing>
+      </w:r>
+    </w:p>
+    <w:p>
+      <w:pPr>
+        <w:spacing w:after="160"/>
+        <w:jc w:val="center"/>
+      </w:pPr>
+      <w:r>
+        <w:rPr>
+          <w:i/>
+          <w:color w:val="6A6475"/>
+          <w:sz w:val="16"/>
+        </w:rPr>
+        <w:t>CSV difference preview before application - view 2 of 3</w:t>
+      </w:r>
+    </w:p>
+    <w:p>
+      <w:r>
+        <w:br w:type="page"/>
+      </w:r>
+    </w:p>
+    <w:p>
+      <w:pPr>
+        <w:spacing w:after="80"/>
+        <w:jc w:val="center"/>
+      </w:pPr>
+      <w:r>
+        <w:drawing>
+          <wp:inline xmlns:a="http://schemas.openxmlformats.org/drawingml/2006/main" xmlns:pic="http://schemas.openxmlformats.org/drawingml/2006/picture">
+            <wp:extent cx="6400800" cy="3764915"/>
+            <wp:docPr id="25" name="Picture 25"/>
+            <wp:cNvGraphicFramePr>
+              <a:graphicFrameLocks noChangeAspect="1"/>
+            </wp:cNvGraphicFramePr>
+            <a:graphic>
+              <a:graphicData uri="http://schemas.openxmlformats.org/drawingml/2006/picture">
+                <pic:pic>
+                  <pic:nvPicPr>
+                    <pic:cNvPr id="0" name="11-csv-difference-preview-part-03.png"/>
+                    <pic:cNvPicPr/>
+                  </pic:nvPicPr>
+                  <pic:blipFill>
+                    <a:blip r:embed="rId33"/>
+                    <a:stretch>
+                      <a:fillRect/>
+                    </a:stretch>
+                  </pic:blipFill>
+                  <pic:spPr>
+                    <a:xfrm>
+                      <a:off x="0" y="0"/>
+                      <a:ext cx="6400800" cy="3764915"/>
+                    </a:xfrm>
+                    <a:prstGeom prst="rect"/>
+                  </pic:spPr>
+                </pic:pic>
+              </a:graphicData>
+            </a:graphic>
+          </wp:inline>
+        </w:drawing>
+      </w:r>
+    </w:p>
+    <w:p>
+      <w:pPr>
+        <w:spacing w:after="160"/>
+        <w:jc w:val="center"/>
+      </w:pPr>
+      <w:r>
+        <w:rPr>
+          <w:i/>
+          <w:color w:val="6A6475"/>
+          <w:sz w:val="16"/>
+        </w:rPr>
+        <w:t>CSV difference preview before application - view 3 of 3</w:t>
+      </w:r>
+    </w:p>
+    <w:p>
+      <w:r>
+        <w:br w:type="page"/>
+      </w:r>
+    </w:p>
+    <w:p>
+      <w:pPr>
+        <w:pStyle w:val="Heading1"/>
+      </w:pPr>
+      <w:r>
+        <w:t>12. External Review</w:t>
+      </w:r>
+    </w:p>
+    <w:p>
+      <w:r>
+        <w:t>A valid CSV can satisfy review for large intentionally uniform batches, but only after explicit operator confirmation.</w:t>
+      </w:r>
+    </w:p>
+    <w:p>
+      <w:pPr>
+        <w:ind w:left="173" w:hanging="173"/>
+      </w:pPr>
+      <w:r>
+        <w:rPr>
+          <w:b/>
+          <w:color w:val="8055D9"/>
+        </w:rPr>
+        <w:t xml:space="preserve">1. </w:t>
+      </w:r>
+      <w:r>
+        <w:t>Apply the validated CSV changes first.</w:t>
+      </w:r>
+    </w:p>
+    <w:p>
+      <w:pPr>
+        <w:ind w:left="173" w:hanging="173"/>
+      </w:pPr>
+      <w:r>
+        <w:rPr>
+          <w:b/>
+          <w:color w:val="8055D9"/>
+        </w:rPr>
+        <w:t xml:space="preserve">2. </w:t>
+      </w:r>
+      <w:r>
+        <w:t>Confirm that all required titles exist, SKUs are unique, and no blocking row remains.</w:t>
+      </w:r>
+    </w:p>
+    <w:p>
+      <w:pPr>
+        <w:ind w:left="173" w:hanging="173"/>
+      </w:pPr>
+      <w:r>
+        <w:rPr>
+          <w:b/>
+          <w:color w:val="8055D9"/>
+        </w:rPr>
+        <w:t xml:space="preserve">3. </w:t>
+      </w:r>
+      <w:r>
+        <w:t>Choose Mark Uploaded Batch as Externally Reviewed.</w:t>
+      </w:r>
+    </w:p>
+    <w:p>
+      <w:pPr>
+        <w:ind w:left="173" w:hanging="173"/>
+      </w:pPr>
+      <w:r>
+        <w:rPr>
+          <w:b/>
+          <w:color w:val="8055D9"/>
+        </w:rPr>
+        <w:t xml:space="preserve">4. </w:t>
+      </w:r>
+      <w:r>
+        <w:t>Accept the responsibility statement. SnapIMS records CSV_EXTERNAL_REVIEW as the review source.</w:t>
+      </w:r>
+    </w:p>
+    <w:p>
+      <w:pPr>
+        <w:ind w:left="173" w:hanging="173"/>
+      </w:pPr>
+      <w:r>
+        <w:rPr>
+          <w:b/>
+          <w:color w:val="8055D9"/>
+        </w:rPr>
+        <w:t xml:space="preserve">5. </w:t>
+      </w:r>
+      <w:r>
+        <w:t>Rows with unresolved errors remain unfinished.</w:t>
+      </w:r>
+    </w:p>
+    <w:p>
+      <w:pPr>
+        <w:spacing w:after="80"/>
+        <w:jc w:val="center"/>
+      </w:pPr>
+      <w:r>
+        <w:drawing>
+          <wp:inline xmlns:a="http://schemas.openxmlformats.org/drawingml/2006/main" xmlns:pic="http://schemas.openxmlformats.org/drawingml/2006/picture">
+            <wp:extent cx="6400800" cy="3453765"/>
+            <wp:docPr id="26" name="Picture 26"/>
+            <wp:cNvGraphicFramePr>
+              <a:graphicFrameLocks noChangeAspect="1"/>
+            </wp:cNvGraphicFramePr>
+            <a:graphic>
+              <a:graphicData uri="http://schemas.openxmlformats.org/drawingml/2006/picture">
+                <pic:pic>
+                  <pic:nvPicPr>
+                    <pic:cNvPr id="0" name="12-csv-applied-part-01.png"/>
+                    <pic:cNvPicPr/>
+                  </pic:nvPicPr>
+                  <pic:blipFill>
+                    <a:blip r:embed="rId34"/>
+                    <a:stretch>
+                      <a:fillRect/>
+                    </a:stretch>
+                  </pic:blipFill>
+                  <pic:spPr>
+                    <a:xfrm>
+                      <a:off x="0" y="0"/>
+                      <a:ext cx="6400800" cy="3453765"/>
+                    </a:xfrm>
+                    <a:prstGeom prst="rect"/>
+                  </pic:spPr>
+                </pic:pic>
+              </a:graphicData>
+            </a:graphic>
+          </wp:inline>
+        </w:drawing>
+      </w:r>
+    </w:p>
+    <w:p>
+      <w:pPr>
+        <w:spacing w:after="160"/>
+        <w:jc w:val="center"/>
+      </w:pPr>
+      <w:r>
+        <w:rPr>
+          <w:i/>
+          <w:color w:val="6A6475"/>
+          <w:sz w:val="16"/>
+        </w:rPr>
+        <w:t>Applied CSV values in the authoritative working batch - view 1 of 2</w:t>
+      </w:r>
+    </w:p>
+    <w:p>
+      <w:r>
+        <w:br w:type="page"/>
+      </w:r>
+    </w:p>
+    <w:p>
+      <w:pPr>
+        <w:spacing w:after="80"/>
+        <w:jc w:val="center"/>
+      </w:pPr>
+      <w:r>
+        <w:drawing>
+          <wp:inline xmlns:a="http://schemas.openxmlformats.org/drawingml/2006/main" xmlns:pic="http://schemas.openxmlformats.org/drawingml/2006/picture">
+            <wp:extent cx="6400800" cy="3449320"/>
+            <wp:docPr id="27" name="Picture 27"/>
+            <wp:cNvGraphicFramePr>
+              <a:graphicFrameLocks noChangeAspect="1"/>
+            </wp:cNvGraphicFramePr>
+            <a:graphic>
+              <a:graphicData uri="http://schemas.openxmlformats.org/drawingml/2006/picture">
+                <pic:pic>
+                  <pic:nvPicPr>
+                    <pic:cNvPr id="0" name="12-csv-applied-part-02.png"/>
+                    <pic:cNvPicPr/>
+                  </pic:nvPicPr>
+                  <pic:blipFill>
+                    <a:blip r:embed="rId35"/>
+                    <a:stretch>
+                      <a:fillRect/>
+                    </a:stretch>
+                  </pic:blipFill>
+                  <pic:spPr>
+                    <a:xfrm>
+                      <a:off x="0" y="0"/>
+                      <a:ext cx="6400800" cy="3449320"/>
+                    </a:xfrm>
+                    <a:prstGeom prst="rect"/>
+                  </pic:spPr>
+                </pic:pic>
+              </a:graphicData>
+            </a:graphic>
+          </wp:inline>
+        </w:drawing>
+      </w:r>
+    </w:p>
+    <w:p>
+      <w:pPr>
+        <w:spacing w:after="160"/>
+        <w:jc w:val="center"/>
+      </w:pPr>
+      <w:r>
+        <w:rPr>
+          <w:i/>
+          <w:color w:val="6A6475"/>
+          <w:sz w:val="16"/>
+        </w:rPr>
+        <w:t>Applied CSV values in the authoritative working batch - view 2 of 2</w:t>
+      </w:r>
+    </w:p>
+    <w:p>
+      <w:r>
+        <w:br w:type="page"/>
+      </w:r>
+    </w:p>
+    <w:p>
+      <w:pPr>
+        <w:pStyle w:val="Heading1"/>
+      </w:pPr>
+      <w:r>
+        <w:t>13. Publish</w:t>
+      </w:r>
+    </w:p>
+    <w:p>
+      <w:r>
+        <w:t>Publish validates the authoritative working batch regardless of whether edits came from AI, Review, Batch Editor, or CSV.</w:t>
+      </w:r>
+    </w:p>
+    <w:p>
+      <w:pPr>
+        <w:ind w:left="173" w:hanging="173"/>
+      </w:pPr>
+      <w:r>
+        <w:rPr>
+          <w:b/>
+          <w:color w:val="8055D9"/>
+        </w:rPr>
+        <w:t xml:space="preserve">1. </w:t>
+      </w:r>
+      <w:r>
+        <w:t>Review all publish blockers and follow links back to the affected item or editor row.</w:t>
+      </w:r>
+    </w:p>
+    <w:p>
+      <w:pPr>
+        <w:ind w:left="173" w:hanging="173"/>
+      </w:pPr>
+      <w:r>
+        <w:rPr>
+          <w:b/>
+          <w:color w:val="8055D9"/>
+        </w:rPr>
+        <w:t xml:space="preserve">2. </w:t>
+      </w:r>
+      <w:r>
+        <w:t>Use Shopify simulation before any live publishing test.</w:t>
+      </w:r>
+    </w:p>
+    <w:p>
+      <w:pPr>
+        <w:ind w:left="173" w:hanging="173"/>
+      </w:pPr>
+      <w:r>
+        <w:rPr>
+          <w:b/>
+          <w:color w:val="8055D9"/>
+        </w:rPr>
+        <w:t xml:space="preserve">3. </w:t>
+      </w:r>
+      <w:r>
+        <w:t>Download the final CSV and reconcile it against the physical batch.</w:t>
+      </w:r>
+    </w:p>
+    <w:p>
+      <w:pPr>
+        <w:ind w:left="173" w:hanging="173"/>
+      </w:pPr>
+      <w:r>
+        <w:rPr>
+          <w:b/>
+          <w:color w:val="8055D9"/>
+        </w:rPr>
+        <w:t xml:space="preserve">4. </w:t>
+      </w:r>
+      <w:r>
+        <w:t>Live publishing must create drafts, use idempotency checkpoints, and never duplicate a product on retry.</w:t>
+      </w:r>
+    </w:p>
+    <w:p>
+      <w:pPr>
+        <w:ind w:left="173" w:hanging="173"/>
+      </w:pPr>
+      <w:r>
+        <w:rPr>
+          <w:b/>
+          <w:color w:val="8055D9"/>
+        </w:rPr>
+        <w:t xml:space="preserve">5. </w:t>
+      </w:r>
+      <w:r>
+        <w:t>A live Shopify draft remains a 1.0 acceptance requirement.</w:t>
+      </w:r>
+    </w:p>
+    <w:p>
+      <w:pPr>
+        <w:spacing w:after="80"/>
+        <w:jc w:val="center"/>
+      </w:pPr>
+      <w:r>
+        <w:drawing>
+          <wp:inline xmlns:a="http://schemas.openxmlformats.org/drawingml/2006/main" xmlns:pic="http://schemas.openxmlformats.org/drawingml/2006/picture">
+            <wp:extent cx="6400800" cy="3515995"/>
+            <wp:docPr id="28" name="Picture 28"/>
+            <wp:cNvGraphicFramePr>
+              <a:graphicFrameLocks noChangeAspect="1"/>
+            </wp:cNvGraphicFramePr>
+            <a:graphic>
+              <a:graphicData uri="http://schemas.openxmlformats.org/drawingml/2006/picture">
+                <pic:pic>
+                  <pic:nvPicPr>
+                    <pic:cNvPr id="0" name="13-publish-simulation-part-01.png"/>
+                    <pic:cNvPicPr/>
+                  </pic:nvPicPr>
+                  <pic:blipFill>
+                    <a:blip r:embed="rId36"/>
+                    <a:stretch>
+                      <a:fillRect/>
+                    </a:stretch>
+                  </pic:blipFill>
+                  <pic:spPr>
+                    <a:xfrm>
+                      <a:off x="0" y="0"/>
+                      <a:ext cx="6400800" cy="3515995"/>
+                    </a:xfrm>
+                    <a:prstGeom prst="rect"/>
+                  </pic:spPr>
+                </pic:pic>
+              </a:graphicData>
+            </a:graphic>
+          </wp:inline>
+        </w:drawing>
+      </w:r>
+    </w:p>
+    <w:p>
+      <w:pPr>
+        <w:spacing w:after="160"/>
+        <w:jc w:val="center"/>
+      </w:pPr>
+      <w:r>
+        <w:rPr>
+          <w:i/>
+          <w:color w:val="6A6475"/>
+          <w:sz w:val="16"/>
+        </w:rPr>
+        <w:t>Publish validation and Shopify simulation - view 1 of 4</w:t>
+      </w:r>
+    </w:p>
+    <w:p>
+      <w:r>
+        <w:br w:type="page"/>
+      </w:r>
+    </w:p>
+    <w:p>
+      <w:pPr>
+        <w:spacing w:after="80"/>
+        <w:jc w:val="center"/>
+      </w:pPr>
+      <w:r>
+        <w:drawing>
+          <wp:inline xmlns:a="http://schemas.openxmlformats.org/drawingml/2006/main" xmlns:pic="http://schemas.openxmlformats.org/drawingml/2006/picture">
+            <wp:extent cx="6400800" cy="3716020"/>
+            <wp:docPr id="29" name="Picture 29"/>
+            <wp:cNvGraphicFramePr>
+              <a:graphicFrameLocks noChangeAspect="1"/>
+            </wp:cNvGraphicFramePr>
+            <a:graphic>
+              <a:graphicData uri="http://schemas.openxmlformats.org/drawingml/2006/picture">
+                <pic:pic>
+                  <pic:nvPicPr>
+                    <pic:cNvPr id="0" name="13-publish-simulation-part-02.png"/>
+                    <pic:cNvPicPr/>
+                  </pic:nvPicPr>
+                  <pic:blipFill>
+                    <a:blip r:embed="rId37"/>
+                    <a:stretch>
+                      <a:fillRect/>
+                    </a:stretch>
+                  </pic:blipFill>
+                  <pic:spPr>
+                    <a:xfrm>
+                      <a:off x="0" y="0"/>
+                      <a:ext cx="6400800" cy="3716020"/>
+                    </a:xfrm>
+                    <a:prstGeom prst="rect"/>
+                  </pic:spPr>
+                </pic:pic>
+              </a:graphicData>
+            </a:graphic>
+          </wp:inline>
+        </w:drawing>
+      </w:r>
+    </w:p>
+    <w:p>
+      <w:pPr>
+        <w:spacing w:after="160"/>
+        <w:jc w:val="center"/>
+      </w:pPr>
+      <w:r>
+        <w:rPr>
+          <w:i/>
+          <w:color w:val="6A6475"/>
+          <w:sz w:val="16"/>
+        </w:rPr>
+        <w:t>Publish validation and Shopify simulation - view 2 of 4</w:t>
+      </w:r>
+    </w:p>
+    <w:p>
+      <w:r>
+        <w:br w:type="page"/>
+      </w:r>
+    </w:p>
+    <w:p>
+      <w:pPr>
+        <w:spacing w:after="80"/>
+        <w:jc w:val="center"/>
+      </w:pPr>
+      <w:r>
+        <w:drawing>
+          <wp:inline xmlns:a="http://schemas.openxmlformats.org/drawingml/2006/main" xmlns:pic="http://schemas.openxmlformats.org/drawingml/2006/picture">
+            <wp:extent cx="6400800" cy="3716020"/>
+            <wp:docPr id="30" name="Picture 30"/>
+            <wp:cNvGraphicFramePr>
+              <a:graphicFrameLocks noChangeAspect="1"/>
+            </wp:cNvGraphicFramePr>
+            <a:graphic>
+              <a:graphicData uri="http://schemas.openxmlformats.org/drawingml/2006/picture">
+                <pic:pic>
+                  <pic:nvPicPr>
+                    <pic:cNvPr id="0" name="13-publish-simulation-part-03.png"/>
+                    <pic:cNvPicPr/>
+                  </pic:nvPicPr>
+                  <pic:blipFill>
+                    <a:blip r:embed="rId38"/>
+                    <a:stretch>
+                      <a:fillRect/>
+                    </a:stretch>
+                  </pic:blipFill>
+                  <pic:spPr>
+                    <a:xfrm>
+                      <a:off x="0" y="0"/>
+                      <a:ext cx="6400800" cy="3716020"/>
+                    </a:xfrm>
+                    <a:prstGeom prst="rect"/>
+                  </pic:spPr>
+                </pic:pic>
+              </a:graphicData>
+            </a:graphic>
+          </wp:inline>
+        </w:drawing>
+      </w:r>
+    </w:p>
+    <w:p>
+      <w:pPr>
+        <w:spacing w:after="160"/>
+        <w:jc w:val="center"/>
+      </w:pPr>
+      <w:r>
+        <w:rPr>
+          <w:i/>
+          <w:color w:val="6A6475"/>
+          <w:sz w:val="16"/>
+        </w:rPr>
+        <w:t>Publish validation and Shopify simulation - view 3 of 4</w:t>
+      </w:r>
+    </w:p>
+    <w:p>
+      <w:r>
+        <w:br w:type="page"/>
+      </w:r>
+    </w:p>
+    <w:p>
+      <w:pPr>
+        <w:spacing w:after="80"/>
+        <w:jc w:val="center"/>
+      </w:pPr>
+      <w:r>
+        <w:drawing>
+          <wp:inline xmlns:a="http://schemas.openxmlformats.org/drawingml/2006/main" xmlns:pic="http://schemas.openxmlformats.org/drawingml/2006/picture">
+            <wp:extent cx="6400800" cy="3502660"/>
+            <wp:docPr id="31" name="Picture 31"/>
+            <wp:cNvGraphicFramePr>
+              <a:graphicFrameLocks noChangeAspect="1"/>
+            </wp:cNvGraphicFramePr>
+            <a:graphic>
+              <a:graphicData uri="http://schemas.openxmlformats.org/drawingml/2006/picture">
+                <pic:pic>
+                  <pic:nvPicPr>
+                    <pic:cNvPr id="0" name="13-publish-simulation-part-04.png"/>
+                    <pic:cNvPicPr/>
+                  </pic:nvPicPr>
+                  <pic:blipFill>
+                    <a:blip r:embed="rId39"/>
+                    <a:stretch>
+                      <a:fillRect/>
+                    </a:stretch>
+                  </pic:blipFill>
+                  <pic:spPr>
+                    <a:xfrm>
+                      <a:off x="0" y="0"/>
+                      <a:ext cx="6400800" cy="3502660"/>
+                    </a:xfrm>
+                    <a:prstGeom prst="rect"/>
+                  </pic:spPr>
+                </pic:pic>
+              </a:graphicData>
+            </a:graphic>
+          </wp:inline>
+        </w:drawing>
+      </w:r>
+    </w:p>
+    <w:p>
+      <w:pPr>
+        <w:spacing w:after="160"/>
+        <w:jc w:val="center"/>
+      </w:pPr>
+      <w:r>
+        <w:rPr>
+          <w:i/>
+          <w:color w:val="6A6475"/>
+          <w:sz w:val="16"/>
+        </w:rPr>
+        <w:t>Publish validation and Shopify simulation - view 4 of 4</w:t>
+      </w:r>
+    </w:p>
+    <w:p>
+      <w:r>
+        <w:br w:type="page"/>
+      </w:r>
+    </w:p>
+    <w:p>
+      <w:pPr>
+        <w:pStyle w:val="Heading1"/>
+      </w:pPr>
+      <w:r>
+        <w:t>14. Diagnostics and Catalog Recovery</w:t>
+      </w:r>
+    </w:p>
+    <w:p>
+      <w:r>
+        <w:t>Diagnostics reports inventory health and the independent permanent Movie catalog without leaking credentials.</w:t>
+      </w:r>
+    </w:p>
+    <w:p>
+      <w:pPr>
+        <w:ind w:left="173" w:hanging="173"/>
+      </w:pPr>
+      <w:r>
+        <w:rPr>
+          <w:b/>
+          <w:color w:val="8055D9"/>
+        </w:rPr>
+        <w:t xml:space="preserve">1. </w:t>
+      </w:r>
+      <w:r>
+        <w:t>Confirm Inventory integrity is ok, Inventory FK violations are zero, and Inventory schema is 7 for this integration build.</w:t>
+      </w:r>
+    </w:p>
+    <w:p>
+      <w:pPr>
+        <w:ind w:left="173" w:hanging="173"/>
+      </w:pPr>
+      <w:r>
+        <w:rPr>
+          <w:b/>
+          <w:color w:val="8055D9"/>
+        </w:rPr>
+        <w:t xml:space="preserve">2. </w:t>
+      </w:r>
+      <w:r>
+        <w:t>Confirm Catalog integrity is ok, Catalog FK violations are zero, and Catalog schema is 1.</w:t>
+      </w:r>
+    </w:p>
+    <w:p>
+      <w:pPr>
+        <w:ind w:left="173" w:hanging="173"/>
+      </w:pPr>
+      <w:r>
+        <w:rPr>
+          <w:b/>
+          <w:color w:val="8055D9"/>
+        </w:rPr>
+        <w:t xml:space="preserve">3. </w:t>
+      </w:r>
+      <w:r>
+        <w:t>Review Movie, alias, linked-item, local-hit, Wikipedia-call, ambiguous, failed-job, stale-link, database-size, and FTS values.</w:t>
+      </w:r>
+    </w:p>
+    <w:p>
+      <w:pPr>
+        <w:ind w:left="173" w:hanging="173"/>
+      </w:pPr>
+      <w:r>
+        <w:rPr>
+          <w:b/>
+          <w:color w:val="8055D9"/>
+        </w:rPr>
+        <w:t xml:space="preserve">4. </w:t>
+      </w:r>
+      <w:r>
+        <w:t>Use Back up catalog before migrations, bulk imports, merge, split, restore, or server movement.</w:t>
+      </w:r>
+    </w:p>
+    <w:p>
+      <w:pPr>
+        <w:ind w:left="173" w:hanging="173"/>
+      </w:pPr>
+      <w:r>
+        <w:rPr>
+          <w:b/>
+          <w:color w:val="8055D9"/>
+        </w:rPr>
+        <w:t xml:space="preserve">5. </w:t>
+      </w:r>
+      <w:r>
+        <w:t>Use Rebuild search index only as a maintenance action; it does not rebuild the authoritative Movie data.</w:t>
+      </w:r>
+    </w:p>
+    <w:p>
+      <w:pPr>
+        <w:ind w:left="173" w:hanging="173"/>
+      </w:pPr>
+      <w:r>
+        <w:rPr>
+          <w:b/>
+          <w:color w:val="8055D9"/>
+        </w:rPr>
+        <w:t xml:space="preserve">6. </w:t>
+      </w:r>
+      <w:r>
+        <w:t>Retry failed lookups after correcting connectivity or provider errors. Recognition history and physical Items remain intact.</w:t>
+      </w:r>
+    </w:p>
+    <w:p>
+      <w:pPr>
+        <w:ind w:left="173" w:hanging="173"/>
+      </w:pPr>
+      <w:r>
+        <w:rPr>
+          <w:b/>
+          <w:color w:val="8055D9"/>
+        </w:rPr>
+        <w:t xml:space="preserve">7. </w:t>
+      </w:r>
+      <w:r>
+        <w:t>If movie_catalog.sqlite3 is unavailable or incompatible, do not delete it. Inventory, Review, Approve &amp; Next, CSV, and Shopify simulation continue without pretending catalog metadata exists.</w:t>
+      </w:r>
+    </w:p>
+    <w:p>
+      <w:pPr>
+        <w:spacing w:after="80"/>
+        <w:jc w:val="center"/>
+      </w:pPr>
+      <w:r>
+        <w:drawing>
+          <wp:inline xmlns:a="http://schemas.openxmlformats.org/drawingml/2006/main" xmlns:pic="http://schemas.openxmlformats.org/drawingml/2006/picture">
+            <wp:extent cx="6400800" cy="3747135"/>
+            <wp:docPr id="32" name="Picture 32"/>
+            <wp:cNvGraphicFramePr>
+              <a:graphicFrameLocks noChangeAspect="1"/>
+            </wp:cNvGraphicFramePr>
+            <a:graphic>
+              <a:graphicData uri="http://schemas.openxmlformats.org/drawingml/2006/picture">
+                <pic:pic>
+                  <pic:nvPicPr>
+                    <pic:cNvPr id="0" name="08-catalog-diagnostics-part-01.png"/>
+                    <pic:cNvPicPr/>
+                  </pic:nvPicPr>
+                  <pic:blipFill>
+                    <a:blip r:embed="rId40"/>
+                    <a:stretch>
+                      <a:fillRect/>
+                    </a:stretch>
+                  </pic:blipFill>
+                  <pic:spPr>
+                    <a:xfrm>
+                      <a:off x="0" y="0"/>
+                      <a:ext cx="6400800" cy="3747135"/>
+                    </a:xfrm>
+                    <a:prstGeom prst="rect"/>
+                  </pic:spPr>
+                </pic:pic>
+              </a:graphicData>
+            </a:graphic>
+          </wp:inline>
+        </w:drawing>
+      </w:r>
+    </w:p>
+    <w:p>
+      <w:pPr>
+        <w:spacing w:after="160"/>
+        <w:jc w:val="center"/>
+      </w:pPr>
+      <w:r>
+        <w:rPr>
+          <w:i/>
+          <w:color w:val="6A6475"/>
+          <w:sz w:val="16"/>
+        </w:rPr>
+        <w:t>Independent inventory and permanent local movie-catalog diagnostics - view 1 of 4</w:t>
+      </w:r>
+    </w:p>
+    <w:p>
+      <w:r>
+        <w:br w:type="page"/>
+      </w:r>
+    </w:p>
+    <w:p>
+      <w:pPr>
+        <w:spacing w:after="80"/>
+        <w:jc w:val="center"/>
+      </w:pPr>
+      <w:r>
+        <w:drawing>
+          <wp:inline xmlns:a="http://schemas.openxmlformats.org/drawingml/2006/main" xmlns:pic="http://schemas.openxmlformats.org/drawingml/2006/picture">
+            <wp:extent cx="6400800" cy="3947160"/>
+            <wp:docPr id="33" name="Picture 33"/>
+            <wp:cNvGraphicFramePr>
+              <a:graphicFrameLocks noChangeAspect="1"/>
+            </wp:cNvGraphicFramePr>
+            <a:graphic>
+              <a:graphicData uri="http://schemas.openxmlformats.org/drawingml/2006/picture">
+                <pic:pic>
+                  <pic:nvPicPr>
+                    <pic:cNvPr id="0" name="08-catalog-diagnostics-part-02.png"/>
+                    <pic:cNvPicPr/>
+                  </pic:nvPicPr>
+                  <pic:blipFill>
+                    <a:blip r:embed="rId41"/>
+                    <a:stretch>
+                      <a:fillRect/>
+                    </a:stretch>
+                  </pic:blipFill>
+                  <pic:spPr>
+                    <a:xfrm>
+                      <a:off x="0" y="0"/>
+                      <a:ext cx="6400800" cy="3947160"/>
+                    </a:xfrm>
+                    <a:prstGeom prst="rect"/>
+                  </pic:spPr>
+                </pic:pic>
+              </a:graphicData>
+            </a:graphic>
+          </wp:inline>
+        </w:drawing>
+      </w:r>
+    </w:p>
+    <w:p>
+      <w:pPr>
+        <w:spacing w:after="160"/>
+        <w:jc w:val="center"/>
+      </w:pPr>
+      <w:r>
+        <w:rPr>
+          <w:i/>
+          <w:color w:val="6A6475"/>
+          <w:sz w:val="16"/>
+        </w:rPr>
+        <w:t>Independent inventory and permanent local movie-catalog diagnostics - view 2 of 4</w:t>
+      </w:r>
+    </w:p>
+    <w:p>
+      <w:r>
+        <w:br w:type="page"/>
+      </w:r>
+    </w:p>
+    <w:p>
+      <w:pPr>
+        <w:spacing w:after="80"/>
+        <w:jc w:val="center"/>
+      </w:pPr>
+      <w:r>
+        <w:drawing>
+          <wp:inline xmlns:a="http://schemas.openxmlformats.org/drawingml/2006/main" xmlns:pic="http://schemas.openxmlformats.org/drawingml/2006/picture">
+            <wp:extent cx="6400800" cy="3947160"/>
+            <wp:docPr id="34" name="Picture 34"/>
+            <wp:cNvGraphicFramePr>
+              <a:graphicFrameLocks noChangeAspect="1"/>
+            </wp:cNvGraphicFramePr>
+            <a:graphic>
+              <a:graphicData uri="http://schemas.openxmlformats.org/drawingml/2006/picture">
+                <pic:pic>
+                  <pic:nvPicPr>
+                    <pic:cNvPr id="0" name="08-catalog-diagnostics-part-03.png"/>
+                    <pic:cNvPicPr/>
+                  </pic:nvPicPr>
+                  <pic:blipFill>
+                    <a:blip r:embed="rId42"/>
+                    <a:stretch>
+                      <a:fillRect/>
+                    </a:stretch>
+                  </pic:blipFill>
+                  <pic:spPr>
+                    <a:xfrm>
+                      <a:off x="0" y="0"/>
+                      <a:ext cx="6400800" cy="3947160"/>
+                    </a:xfrm>
+                    <a:prstGeom prst="rect"/>
+                  </pic:spPr>
+                </pic:pic>
+              </a:graphicData>
+            </a:graphic>
+          </wp:inline>
+        </w:drawing>
+      </w:r>
+    </w:p>
+    <w:p>
+      <w:pPr>
+        <w:spacing w:after="160"/>
+        <w:jc w:val="center"/>
+      </w:pPr>
+      <w:r>
+        <w:rPr>
+          <w:i/>
+          <w:color w:val="6A6475"/>
+          <w:sz w:val="16"/>
+        </w:rPr>
+        <w:t>Independent inventory and permanent local movie-catalog diagnostics - view 3 of 4</w:t>
+      </w:r>
+    </w:p>
+    <w:p>
+      <w:r>
+        <w:br w:type="page"/>
+      </w:r>
+    </w:p>
+    <w:p>
+      <w:pPr>
+        <w:spacing w:after="80"/>
+        <w:jc w:val="center"/>
+      </w:pPr>
+      <w:r>
+        <w:drawing>
+          <wp:inline xmlns:a="http://schemas.openxmlformats.org/drawingml/2006/main" xmlns:pic="http://schemas.openxmlformats.org/drawingml/2006/picture">
+            <wp:extent cx="6400800" cy="3747135"/>
+            <wp:docPr id="35" name="Picture 35"/>
+            <wp:cNvGraphicFramePr>
+              <a:graphicFrameLocks noChangeAspect="1"/>
+            </wp:cNvGraphicFramePr>
+            <a:graphic>
+              <a:graphicData uri="http://schemas.openxmlformats.org/drawingml/2006/picture">
+                <pic:pic>
+                  <pic:nvPicPr>
+                    <pic:cNvPr id="0" name="08-catalog-diagnostics-part-04.png"/>
+                    <pic:cNvPicPr/>
+                  </pic:nvPicPr>
+                  <pic:blipFill>
+                    <a:blip r:embed="rId43"/>
+                    <a:stretch>
+                      <a:fillRect/>
+                    </a:stretch>
+                  </pic:blipFill>
+                  <pic:spPr>
+                    <a:xfrm>
+                      <a:off x="0" y="0"/>
+                      <a:ext cx="6400800" cy="3747135"/>
+                    </a:xfrm>
+                    <a:prstGeom prst="rect"/>
+                  </pic:spPr>
+                </pic:pic>
+              </a:graphicData>
+            </a:graphic>
+          </wp:inline>
+        </w:drawing>
+      </w:r>
+    </w:p>
+    <w:p>
+      <w:pPr>
+        <w:spacing w:after="160"/>
+        <w:jc w:val="center"/>
+      </w:pPr>
+      <w:r>
+        <w:rPr>
+          <w:i/>
+          <w:color w:val="6A6475"/>
+          <w:sz w:val="16"/>
+        </w:rPr>
+        <w:t>Independent inventory and permanent local movie-catalog diagnostics - view 4 of 4</w:t>
+      </w:r>
+    </w:p>
+    <w:p>
+      <w:r>
+        <w:br w:type="page"/>
+      </w:r>
+    </w:p>
+    <w:p>
+      <w:pPr>
+        <w:pStyle w:val="Heading1"/>
+      </w:pPr>
+      <w:r>
+        <w:t>15. End-of-Batch Checklist</w:t>
+      </w:r>
+    </w:p>
+    <w:p>
+      <w:pPr>
+        <w:ind w:left="173" w:hanging="173"/>
+      </w:pPr>
+      <w:r>
+        <w:rPr>
+          <w:b/>
+          <w:color w:val="8055D9"/>
+        </w:rPr>
+        <w:t xml:space="preserve">1. </w:t>
+      </w:r>
+      <w:r>
+        <w:t>Unfinished count is zero, or every remaining item is intentionally postponed and understood.</w:t>
+      </w:r>
+    </w:p>
+    <w:p>
+      <w:pPr>
+        <w:ind w:left="173" w:hanging="173"/>
+      </w:pPr>
+      <w:r>
+        <w:rPr>
+          <w:b/>
+          <w:color w:val="8055D9"/>
+        </w:rPr>
+        <w:t xml:space="preserve">2. </w:t>
+      </w:r>
+      <w:r>
+        <w:t>No failed recognition state lacks an operator decision.</w:t>
+      </w:r>
+    </w:p>
+    <w:p>
+      <w:pPr>
+        <w:ind w:left="173" w:hanging="173"/>
+      </w:pPr>
+      <w:r>
+        <w:rPr>
+          <w:b/>
+          <w:color w:val="8055D9"/>
+        </w:rPr>
+        <w:t xml:space="preserve">3. </w:t>
+      </w:r>
+      <w:r>
+        <w:t>Required titles, prices, quantities, locations, and SKUs pass validation.</w:t>
+      </w:r>
+    </w:p>
+    <w:p>
+      <w:pPr>
+        <w:ind w:left="173" w:hanging="173"/>
+      </w:pPr>
+      <w:r>
+        <w:rPr>
+          <w:b/>
+          <w:color w:val="8055D9"/>
+        </w:rPr>
+        <w:t xml:space="preserve">4. </w:t>
+      </w:r>
+      <w:r>
+        <w:t>Low-confidence, ambiguous, failed, and flagged items were reviewed using stored evidence or the original photographs.</w:t>
+      </w:r>
+    </w:p>
+    <w:p>
+      <w:pPr>
+        <w:ind w:left="173" w:hanging="173"/>
+      </w:pPr>
+      <w:r>
+        <w:rPr>
+          <w:b/>
+          <w:color w:val="8055D9"/>
+        </w:rPr>
+        <w:t xml:space="preserve">5. </w:t>
+      </w:r>
+      <w:r>
+        <w:t>Every Local Match or New Catalog Record agrees with the photograph; no same-title remake was silently accepted.</w:t>
+      </w:r>
+    </w:p>
+    <w:p>
+      <w:pPr>
+        <w:ind w:left="173" w:hanging="173"/>
+      </w:pPr>
+      <w:r>
+        <w:rPr>
+          <w:b/>
+          <w:color w:val="8055D9"/>
+        </w:rPr>
+        <w:t xml:space="preserve">6. </w:t>
+      </w:r>
+      <w:r>
+        <w:t>The final CSV contains both immutable Item ID and the intended local Movie ID, while item-specific Price, Discount, condition, shelf, and quantity remain unchanged.</w:t>
+      </w:r>
+    </w:p>
+    <w:p>
+      <w:pPr>
+        <w:ind w:left="173" w:hanging="173"/>
+      </w:pPr>
+      <w:r>
+        <w:rPr>
+          <w:b/>
+          <w:color w:val="8055D9"/>
+        </w:rPr>
+        <w:t xml:space="preserve">7. </w:t>
+      </w:r>
+      <w:r>
+        <w:t>Catalog integrity is ok, catalog foreign-key violations are zero, and a recent catalog backup exists.</w:t>
+      </w:r>
+    </w:p>
+    <w:p>
+      <w:pPr>
+        <w:ind w:left="173" w:hanging="173"/>
+      </w:pPr>
+      <w:r>
+        <w:rPr>
+          <w:b/>
+          <w:color w:val="8055D9"/>
+        </w:rPr>
+        <w:t xml:space="preserve">8. </w:t>
+      </w:r>
+      <w:r>
+        <w:t>Bulk edits and CSV replacements were checkpointed and verified.</w:t>
+      </w:r>
+    </w:p>
+    <w:p>
+      <w:pPr>
+        <w:ind w:left="173" w:hanging="173"/>
+      </w:pPr>
+      <w:r>
+        <w:rPr>
+          <w:b/>
+          <w:color w:val="8055D9"/>
+        </w:rPr>
+        <w:t xml:space="preserve">9. </w:t>
+      </w:r>
+      <w:r>
+        <w:t>Shopify simulation completed without duplicate or idempotency warnings.</w:t>
+      </w:r>
+    </w:p>
+    <w:p>
+      <w:pPr>
+        <w:ind w:left="173" w:hanging="173"/>
+      </w:pPr>
+      <w:r>
+        <w:rPr>
+          <w:b/>
+          <w:color w:val="8055D9"/>
+        </w:rPr>
+        <w:t xml:space="preserve">10. </w:t>
+      </w:r>
+      <w:r>
+        <w:t>The final CSV was downloaded and reconciled against the physical batch.</w:t>
+      </w:r>
+    </w:p>
+    <w:p>
+      <w:pPr>
+        <w:ind w:left="173" w:hanging="173"/>
+      </w:pPr>
+      <w:r>
+        <w:rPr>
+          <w:b/>
+          <w:color w:val="8055D9"/>
+        </w:rPr>
+        <w:t xml:space="preserve">11. </w:t>
+      </w:r>
+      <w:r>
+        <w:t>SnapIMS was restarted once and the current batch state remained correct.</w:t>
+      </w:r>
+    </w:p>
+    <w:p>
+      <w:pPr>
+        <w:ind w:left="173" w:hanging="173"/>
+      </w:pPr>
+      <w:r>
+        <w:rPr>
+          <w:b/>
+          <w:color w:val="8055D9"/>
+        </w:rPr>
+        <w:t xml:space="preserve">12. </w:t>
+      </w:r>
+      <w:r>
+        <w:t>Do not label the project 1.0 until the real 20-tape Pixel pilot, live AI, live Shopify draft, CSV reconciliation, restart durability, final guide walkthrough, and browser verification all pass.</w:t>
+      </w:r>
+    </w:p>
+    <w:tbl>
+      <w:tblPr>
+        <w:tblW w:type="auto" w:w="0"/>
+        <w:tblLayout w:type="autofit"/>
+        <w:tblLook w:firstColumn="1" w:firstRow="1" w:lastColumn="0" w:lastRow="0" w:noHBand="0" w:noVBand="1" w:val="04A0"/>
+      </w:tblPr>
+      <w:tblGrid>
+        <w:gridCol w:w="10224"/>
+      </w:tblGrid>
+      <w:tr>
+        <w:tc>
+          <w:tcPr>
+            <w:tcW w:type="dxa" w:w="10224"/>
+            <w:shd w:fill="FCE8EC"/>
+            <w:vAlign w:val="center"/>
+          </w:tcPr>
+          <w:p>
+            <w:pPr>
+              <w:spacing w:after="60"/>
+            </w:pPr>
+            <w:r>
+              <w:rPr>
+                <w:b/>
+                <w:color w:val="A9364D"/>
+              </w:rPr>
+              <w:t>Operator rule</w:t>
+            </w:r>
+          </w:p>
+          <w:p>
+            <w:pPr>
+              <w:spacing w:after="0"/>
+            </w:pPr>
+            <w:r>
+              <w:t>When SnapIMS reports an error, do not delete the database or originals. Preserve the traceback, copy Diagnostics, and recover from the last checkpoint or backup.</w:t>
+            </w:r>
+          </w:p>
+        </w:tc>
+      </w:tr>
+    </w:tbl>
+    <w:p/>
     <w:sectPr>
+      <w:footerReference w:type="default" r:id="rId9"/>
       <w:pgSz w:w="12240" w:h="15840"/>
-      <w:pgMar w:top="792" w:right="936" w:bottom="792" w:left="936" w:header="720" w:footer="720" w:gutter="0"/>
+      <w:pgMar w:top="864" w:right="1008" w:bottom="792" w:left="1008" w:header="288" w:footer="360" w:gutter="0"/>
       <w:cols w:space="720"/>
       <w:docGrid w:linePitch="360"/>
     </w:sectPr>
   </w:body>
 </w:document>
+</file>
+
+<file path=word/footer1.xml><?xml version="1.0" encoding="utf-8"?>
+<w:ftr xmlns:m="http://schemas.openxmlformats.org/officeDocument/2006/math" xmlns:mc="http://schemas.openxmlformats.org/markup-compatibility/2006" xmlns:mo="http://schemas.microsoft.com/office/mac/office/2008/main" xmlns:mv="urn:schemas-microsoft-com:mac:vml" xmlns:o="urn:schemas-microsoft-com:office:office" xmlns:r="http://schemas.openxmlformats.org/officeDocument/2006/relationships" xmlns:v="urn:schemas-microsoft-com:vml" xmlns:w10="urn:schemas-microsoft-com:office:word" xmlns:w14="http://schemas.microsoft.com/office/word/2010/wordml" xmlns:w="http://schemas.openxmlformats.org/wordprocessingml/2006/main" xmlns:wne="http://schemas.microsoft.com/office/word/2006/wordml" xmlns:wp14="http://schemas.microsoft.com/office/word/2010/wordprocessingDrawing" xmlns:wp="http://schemas.openxmlformats.org/drawingml/2006/wordprocessingDrawing" xmlns:wpc="http://schemas.microsoft.com/office/word/2010/wordprocessingCanvas" xmlns:wpg="http://schemas.microsoft.com/office/word/2010/wordprocessingGroup" xmlns:wpi="http://schemas.microsoft.com/office/word/2010/wordprocessingInk" xmlns:wps="http://schemas.microsoft.com/office/word/2010/wordprocessingShape" mc:Ignorable="w14 wp14">
+  <w:p>
+    <w:pPr>
+      <w:pStyle w:val="Footer"/>
+      <w:jc w:val="center"/>
+    </w:pPr>
+    <w:r>
+      <w:rPr>
+        <w:color w:val="6A6475"/>
+        <w:sz w:val="16"/>
+      </w:rPr>
+      <w:t xml:space="preserve">SnapIMS 0.6.0 + SLMC-0.1.0 Operator Guide  |  </w:t>
+      <w:fldChar w:fldCharType="begin"/>
+      <w:instrText xml:space="preserve"> PAGE </w:instrText>
+      <w:fldChar w:fldCharType="separate"/>
+      <w:t>1</w:t>
+      <w:fldChar w:fldCharType="end"/>
+    </w:r>
+  </w:p>
+</w:ftr>
 </file>
 
 <file path=word/numbering.xml><?xml version="1.0" encoding="utf-8"?>
@@ -1785,8 +4220,12 @@
     <w:name w:val="Normal"/>
     <w:qFormat/>
     <w:rsid w:val="00FC693F"/>
+    <w:pPr>
+      <w:spacing w:after="120" w:line="259" w:lineRule="auto"/>
+    </w:pPr>
     <w:rPr>
-      <w:rFonts w:ascii="Arial" w:hAnsi="Arial"/>
+      <w:rFonts w:ascii="Liberation Sans" w:hAnsi="Liberation Sans"/>
+      <w:color w:val="211C2D"/>
       <w:sz w:val="20"/>
     </w:rPr>
   </w:style>
@@ -1849,11 +4288,11 @@
       <w:outlineLvl w:val="0"/>
     </w:pPr>
     <w:rPr>
-      <w:rFonts w:asciiTheme="majorHAnsi" w:eastAsiaTheme="majorEastAsia" w:hAnsiTheme="majorHAnsi" w:cstheme="majorBidi" w:ascii="Arial" w:hAnsi="Arial"/>
+      <w:rFonts w:asciiTheme="majorHAnsi" w:eastAsiaTheme="majorEastAsia" w:hAnsiTheme="majorHAnsi" w:cstheme="majorBidi" w:ascii="Liberation Sans" w:hAnsi="Liberation Sans"/>
       <w:b/>
       <w:bCs/>
-      <w:color w:val="365F91" w:themeColor="accent1" w:themeShade="BF"/>
-      <w:sz w:val="38"/>
+      <w:color w:val="8055D9"/>
+      <w:sz w:val="40"/>
       <w:szCs w:val="28"/>
     </w:rPr>
   </w:style>
@@ -1873,10 +4312,10 @@
       <w:outlineLvl w:val="1"/>
     </w:pPr>
     <w:rPr>
-      <w:rFonts w:asciiTheme="majorHAnsi" w:eastAsiaTheme="majorEastAsia" w:hAnsiTheme="majorHAnsi" w:cstheme="majorBidi" w:ascii="Arial" w:hAnsi="Arial"/>
+      <w:rFonts w:asciiTheme="majorHAnsi" w:eastAsiaTheme="majorEastAsia" w:hAnsiTheme="majorHAnsi" w:cstheme="majorBidi" w:ascii="Liberation Sans" w:hAnsi="Liberation Sans"/>
       <w:b/>
       <w:bCs/>
-      <w:color w:val="4F81BD" w:themeColor="accent1"/>
+      <w:color w:val="211C2D"/>
       <w:sz w:val="28"/>
       <w:szCs w:val="26"/>
     </w:rPr>
@@ -1897,10 +4336,11 @@
       <w:outlineLvl w:val="2"/>
     </w:pPr>
     <w:rPr>
-      <w:rFonts w:asciiTheme="majorHAnsi" w:eastAsiaTheme="majorEastAsia" w:hAnsiTheme="majorHAnsi" w:cstheme="majorBidi"/>
+      <w:rFonts w:asciiTheme="majorHAnsi" w:eastAsiaTheme="majorEastAsia" w:hAnsiTheme="majorHAnsi" w:cstheme="majorBidi" w:ascii="Liberation Sans" w:hAnsi="Liberation Sans"/>
       <w:b/>
       <w:bCs/>
-      <w:color w:val="4F81BD" w:themeColor="accent1"/>
+      <w:color w:val="8055D9"/>
+      <w:sz w:val="22"/>
     </w:rPr>
   </w:style>
   <w:style w:type="paragraph" w:styleId="Heading4">
@@ -2138,11 +4578,12 @@
       <w:contextualSpacing/>
     </w:pPr>
     <w:rPr>
-      <w:rFonts w:asciiTheme="majorHAnsi" w:eastAsiaTheme="majorEastAsia" w:hAnsiTheme="majorHAnsi" w:cstheme="majorBidi" w:ascii="Arial" w:hAnsi="Arial"/>
-      <w:color w:val="17365D" w:themeColor="text2" w:themeShade="BF"/>
+      <w:rFonts w:asciiTheme="majorHAnsi" w:eastAsiaTheme="majorEastAsia" w:hAnsiTheme="majorHAnsi" w:cstheme="majorBidi" w:ascii="Liberation Sans" w:hAnsi="Liberation Sans"/>
+      <w:b/>
+      <w:color w:val="211C2D"/>
       <w:spacing w:val="5"/>
       <w:kern w:val="28"/>
-      <w:sz w:val="56"/>
+      <w:sz w:val="60"/>
       <w:szCs w:val="52"/>
     </w:rPr>
   </w:style>
@@ -2175,12 +4616,13 @@
       </w:numPr>
     </w:pPr>
     <w:rPr>
-      <w:rFonts w:asciiTheme="majorHAnsi" w:eastAsiaTheme="majorEastAsia" w:hAnsiTheme="majorHAnsi" w:cstheme="majorBidi"/>
+      <w:rFonts w:asciiTheme="majorHAnsi" w:eastAsiaTheme="majorEastAsia" w:hAnsiTheme="majorHAnsi" w:cstheme="majorBidi" w:ascii="Liberation Sans" w:hAnsi="Liberation Sans"/>
+      <w:b w:val="0"/>
       <w:i/>
       <w:iCs/>
-      <w:color w:val="4F81BD" w:themeColor="accent1"/>
+      <w:color w:val="6A6475"/>
       <w:spacing w:val="15"/>
-      <w:sz w:val="24"/>
+      <w:sz w:val="26"/>
       <w:szCs w:val="24"/>
     </w:rPr>
   </w:style>

</xml_diff>